<commit_message>
Updated Star Schema (higher resolution)
</commit_message>
<xml_diff>
--- a/docs/Citibike.docx
+++ b/docs/Citibike.docx
@@ -636,7 +636,7 @@
           <w:lang w:val="de-AT" w:eastAsia="de-AT"/>
         </w:rPr>
         <w:drawing>
-          <wp:inline distT="0" distB="0" distL="0" distR="0" wp14:anchorId="60E7A0F6" wp14:editId="2CE3F5E6">
+          <wp:inline distT="0" distB="0" distL="0" distR="0" wp14:anchorId="60E7A0F6" wp14:editId="32C0A951">
             <wp:extent cx="1350010" cy="350520"/>
             <wp:effectExtent l="0" t="0" r="0" b="0"/>
             <wp:docPr id="1" name="Bild 1"/>
@@ -5395,9 +5395,9 @@
           <w:lang w:val="en-US"/>
         </w:rPr>
         <w:drawing>
-          <wp:inline distT="0" distB="0" distL="0" distR="0" wp14:anchorId="122DD878" wp14:editId="1F5DAC05">
-            <wp:extent cx="4647363" cy="3873640"/>
-            <wp:effectExtent l="0" t="0" r="1270" b="0"/>
+          <wp:inline distT="0" distB="0" distL="0" distR="0" wp14:anchorId="122DD878" wp14:editId="054E9542">
+            <wp:extent cx="4607263" cy="3876596"/>
+            <wp:effectExtent l="0" t="0" r="3175" b="0"/>
             <wp:docPr id="3" name="Bild 3"/>
             <wp:cNvGraphicFramePr>
               <a:graphicFrameLocks xmlns:a="http://schemas.openxmlformats.org/drawingml/2006/main"/>
@@ -5406,20 +5406,19 @@
               <a:graphicData uri="http://schemas.openxmlformats.org/drawingml/2006/picture">
                 <pic:pic xmlns:pic="http://schemas.openxmlformats.org/drawingml/2006/picture">
                   <pic:nvPicPr>
-                    <pic:cNvPr id="0" name="Picture 3"/>
+                    <pic:cNvPr id="3" name="Bild 3"/>
                     <pic:cNvPicPr>
                       <a:picLocks/>
                     </pic:cNvPicPr>
                   </pic:nvPicPr>
                   <pic:blipFill>
-                    <a:blip r:embed="rId16">
+                    <a:blip r:embed="rId16" cstate="print">
                       <a:extLst>
                         <a:ext uri="{28A0092B-C50C-407E-A947-70E740481C1C}">
                           <a14:useLocalDpi xmlns:a14="http://schemas.microsoft.com/office/drawing/2010/main" val="0"/>
                         </a:ext>
                       </a:extLst>
                     </a:blip>
-                    <a:srcRect/>
                     <a:stretch>
                       <a:fillRect/>
                     </a:stretch>
@@ -5427,7 +5426,7 @@
                   <pic:spPr bwMode="auto">
                     <a:xfrm>
                       <a:off x="0" y="0"/>
-                      <a:ext cx="4650909" cy="3876596"/>
+                      <a:ext cx="4607263" cy="3876596"/>
                     </a:xfrm>
                     <a:prstGeom prst="rect">
                       <a:avLst/>
@@ -5480,7 +5479,16 @@
         <w:fldChar w:fldCharType="end"/>
       </w:r>
       <w:r>
-        <w:t xml:space="preserve"> - Data Model</w:t>
+        <w:t xml:space="preserve"> </w:t>
+      </w:r>
+      <w:r>
+        <w:t>–</w:t>
+      </w:r>
+      <w:r>
+        <w:t xml:space="preserve"> </w:t>
+      </w:r>
+      <w:r>
+        <w:t>Star Schema</w:t>
       </w:r>
     </w:p>
     <w:p>
@@ -5621,7 +5629,19 @@
         <w:fldChar w:fldCharType="end"/>
       </w:r>
       <w:r>
-        <w:t xml:space="preserve"> - Data Model (PBI)</w:t>
+        <w:t xml:space="preserve"> </w:t>
+      </w:r>
+      <w:r>
+        <w:t>–</w:t>
+      </w:r>
+      <w:r>
+        <w:t xml:space="preserve"> </w:t>
+      </w:r>
+      <w:r>
+        <w:t xml:space="preserve">Star Schema </w:t>
+      </w:r>
+      <w:r>
+        <w:t>(PBI)</w:t>
       </w:r>
     </w:p>
     <w:p>

</xml_diff>

<commit_message>
Fixed error in contents table
</commit_message>
<xml_diff>
--- a/docs/Citibike.docx
+++ b/docs/Citibike.docx
@@ -636,7 +636,7 @@
           <w:lang w:val="de-AT" w:eastAsia="de-AT"/>
         </w:rPr>
         <w:drawing>
-          <wp:inline distT="0" distB="0" distL="0" distR="0" wp14:anchorId="60E7A0F6" wp14:editId="451AA303">
+          <wp:inline distT="0" distB="0" distL="0" distR="0" wp14:anchorId="60E7A0F6" wp14:editId="5E67ED6F">
             <wp:extent cx="1350010" cy="350520"/>
             <wp:effectExtent l="0" t="0" r="0" b="0"/>
             <wp:docPr id="1" name="Bild 1"/>
@@ -2610,7 +2610,7 @@
         </w:rPr>
         <w:fldChar w:fldCharType="separate"/>
       </w:r>
-      <w:hyperlink w:anchor="_Toc224059546" w:history="1">
+      <w:hyperlink w:anchor="_Toc224585516" w:history="1">
         <w:r>
           <w:rPr>
             <w:rStyle w:val="Hyperlink"/>
@@ -2662,7 +2662,7 @@
             <w:noProof/>
             <w:webHidden/>
           </w:rPr>
-          <w:instrText xml:space="preserve"> PAGEREF _Toc224059546 \h </w:instrText>
+          <w:instrText xml:space="preserve"> PAGEREF _Toc224585516 \h </w:instrText>
         </w:r>
         <w:r>
           <w:rPr>
@@ -2705,7 +2705,7 @@
           <w14:ligatures w14:val="standardContextual"/>
         </w:rPr>
       </w:pPr>
-      <w:hyperlink w:anchor="_Toc224059547" w:history="1">
+      <w:hyperlink w:anchor="_Toc224585517" w:history="1">
         <w:r>
           <w:rPr>
             <w:rStyle w:val="Hyperlink"/>
@@ -2752,7 +2752,7 @@
             <w:noProof/>
             <w:webHidden/>
           </w:rPr>
-          <w:instrText xml:space="preserve"> PAGEREF _Toc224059547 \h </w:instrText>
+          <w:instrText xml:space="preserve"> PAGEREF _Toc224585517 \h </w:instrText>
         </w:r>
         <w:r>
           <w:rPr>
@@ -2796,7 +2796,7 @@
           <w14:ligatures w14:val="standardContextual"/>
         </w:rPr>
       </w:pPr>
-      <w:hyperlink w:anchor="_Toc224059548" w:history="1">
+      <w:hyperlink w:anchor="_Toc224585518" w:history="1">
         <w:r>
           <w:rPr>
             <w:rStyle w:val="Hyperlink"/>
@@ -2844,7 +2844,7 @@
             <w:noProof/>
             <w:webHidden/>
           </w:rPr>
-          <w:instrText xml:space="preserve"> PAGEREF _Toc224059548 \h </w:instrText>
+          <w:instrText xml:space="preserve"> PAGEREF _Toc224585518 \h </w:instrText>
         </w:r>
         <w:r>
           <w:rPr>
@@ -2888,7 +2888,7 @@
           <w14:ligatures w14:val="standardContextual"/>
         </w:rPr>
       </w:pPr>
-      <w:hyperlink w:anchor="_Toc224059549" w:history="1">
+      <w:hyperlink w:anchor="_Toc224585519" w:history="1">
         <w:r>
           <w:rPr>
             <w:rStyle w:val="Hyperlink"/>
@@ -2936,7 +2936,7 @@
             <w:noProof/>
             <w:webHidden/>
           </w:rPr>
-          <w:instrText xml:space="preserve"> PAGEREF _Toc224059549 \h </w:instrText>
+          <w:instrText xml:space="preserve"> PAGEREF _Toc224585519 \h </w:instrText>
         </w:r>
         <w:r>
           <w:rPr>
@@ -2980,7 +2980,7 @@
           <w14:ligatures w14:val="standardContextual"/>
         </w:rPr>
       </w:pPr>
-      <w:hyperlink w:anchor="_Toc224059550" w:history="1">
+      <w:hyperlink w:anchor="_Toc224585520" w:history="1">
         <w:r>
           <w:rPr>
             <w:rStyle w:val="Hyperlink"/>
@@ -3028,7 +3028,7 @@
             <w:noProof/>
             <w:webHidden/>
           </w:rPr>
-          <w:instrText xml:space="preserve"> PAGEREF _Toc224059550 \h </w:instrText>
+          <w:instrText xml:space="preserve"> PAGEREF _Toc224585520 \h </w:instrText>
         </w:r>
         <w:r>
           <w:rPr>
@@ -3072,7 +3072,7 @@
           <w14:ligatures w14:val="standardContextual"/>
         </w:rPr>
       </w:pPr>
-      <w:hyperlink w:anchor="_Toc224059551" w:history="1">
+      <w:hyperlink w:anchor="_Toc224585521" w:history="1">
         <w:r>
           <w:rPr>
             <w:rStyle w:val="Hyperlink"/>
@@ -3120,7 +3120,7 @@
             <w:noProof/>
             <w:webHidden/>
           </w:rPr>
-          <w:instrText xml:space="preserve"> PAGEREF _Toc224059551 \h </w:instrText>
+          <w:instrText xml:space="preserve"> PAGEREF _Toc224585521 \h </w:instrText>
         </w:r>
         <w:r>
           <w:rPr>
@@ -3163,7 +3163,7 @@
           <w14:ligatures w14:val="standardContextual"/>
         </w:rPr>
       </w:pPr>
-      <w:hyperlink w:anchor="_Toc224059552" w:history="1">
+      <w:hyperlink w:anchor="_Toc224585522" w:history="1">
         <w:r>
           <w:rPr>
             <w:rStyle w:val="Hyperlink"/>
@@ -3210,7 +3210,7 @@
             <w:noProof/>
             <w:webHidden/>
           </w:rPr>
-          <w:instrText xml:space="preserve"> PAGEREF _Toc224059552 \h </w:instrText>
+          <w:instrText xml:space="preserve"> PAGEREF _Toc224585522 \h </w:instrText>
         </w:r>
         <w:r>
           <w:rPr>
@@ -3256,7 +3256,7 @@
           <w14:ligatures w14:val="standardContextual"/>
         </w:rPr>
       </w:pPr>
-      <w:hyperlink w:anchor="_Toc224059553" w:history="1">
+      <w:hyperlink w:anchor="_Toc224585523" w:history="1">
         <w:r>
           <w:rPr>
             <w:rStyle w:val="Hyperlink"/>
@@ -3308,7 +3308,95 @@
             <w:noProof/>
             <w:webHidden/>
           </w:rPr>
-          <w:instrText xml:space="preserve"> PAGEREF _Toc224059553 \h </w:instrText>
+          <w:instrText xml:space="preserve"> PAGEREF _Toc224585523 \h </w:instrText>
+        </w:r>
+        <w:r>
+          <w:rPr>
+            <w:noProof/>
+            <w:webHidden/>
+          </w:rPr>
+        </w:r>
+        <w:r>
+          <w:rPr>
+            <w:noProof/>
+            <w:webHidden/>
+          </w:rPr>
+          <w:fldChar w:fldCharType="separate"/>
+        </w:r>
+        <w:r>
+          <w:rPr>
+            <w:noProof/>
+            <w:webHidden/>
+          </w:rPr>
+          <w:t>6</w:t>
+        </w:r>
+        <w:r>
+          <w:rPr>
+            <w:noProof/>
+            <w:webHidden/>
+          </w:rPr>
+          <w:fldChar w:fldCharType="end"/>
+        </w:r>
+      </w:hyperlink>
+    </w:p>
+    <w:p>
+      <w:pPr>
+        <w:pStyle w:val="Verzeichnis2"/>
+        <w:rPr>
+          <w:rFonts w:asciiTheme="minorHAnsi" w:eastAsiaTheme="minorEastAsia" w:hAnsiTheme="minorHAnsi" w:cstheme="minorBidi"/>
+          <w:bCs w:val="0"/>
+          <w:noProof/>
+          <w:kern w:val="2"/>
+          <w:lang w:val="de-AT"/>
+          <w14:ligatures w14:val="standardContextual"/>
+        </w:rPr>
+      </w:pPr>
+      <w:hyperlink w:anchor="_Toc224585524" w:history="1">
+        <w:r>
+          <w:rPr>
+            <w:rStyle w:val="Hyperlink"/>
+            <w:noProof/>
+          </w:rPr>
+          <w:t>2.1</w:t>
+        </w:r>
+        <w:r>
+          <w:rPr>
+            <w:rFonts w:asciiTheme="minorHAnsi" w:eastAsiaTheme="minorEastAsia" w:hAnsiTheme="minorHAnsi" w:cstheme="minorBidi"/>
+            <w:bCs w:val="0"/>
+            <w:noProof/>
+            <w:kern w:val="2"/>
+            <w:lang w:val="de-AT"/>
+            <w14:ligatures w14:val="standardContextual"/>
+          </w:rPr>
+          <w:tab/>
+        </w:r>
+        <w:r>
+          <w:rPr>
+            <w:rStyle w:val="Hyperlink"/>
+            <w:noProof/>
+          </w:rPr>
+          <w:t>Star Schema</w:t>
+        </w:r>
+        <w:r>
+          <w:rPr>
+            <w:noProof/>
+            <w:webHidden/>
+          </w:rPr>
+          <w:tab/>
+        </w:r>
+        <w:r>
+          <w:rPr>
+            <w:noProof/>
+            <w:webHidden/>
+          </w:rPr>
+          <w:fldChar w:fldCharType="begin"/>
+        </w:r>
+        <w:r>
+          <w:rPr>
+            <w:noProof/>
+            <w:webHidden/>
+          </w:rPr>
+          <w:instrText xml:space="preserve"> PAGEREF _Toc224585524 \h </w:instrText>
         </w:r>
         <w:r>
           <w:rPr>
@@ -3354,7 +3442,7 @@
           <w14:ligatures w14:val="standardContextual"/>
         </w:rPr>
       </w:pPr>
-      <w:hyperlink w:anchor="_Toc224059554" w:history="1">
+      <w:hyperlink w:anchor="_Toc224585525" w:history="1">
         <w:r>
           <w:rPr>
             <w:rStyle w:val="Hyperlink"/>
@@ -3406,7 +3494,7 @@
             <w:noProof/>
             <w:webHidden/>
           </w:rPr>
-          <w:instrText xml:space="preserve"> PAGEREF _Toc224059554 \h </w:instrText>
+          <w:instrText xml:space="preserve"> PAGEREF _Toc224585525 \h </w:instrText>
         </w:r>
         <w:r>
           <w:rPr>
@@ -3449,7 +3537,7 @@
           <w14:ligatures w14:val="standardContextual"/>
         </w:rPr>
       </w:pPr>
-      <w:hyperlink w:anchor="_Toc224059555" w:history="1">
+      <w:hyperlink w:anchor="_Toc224585526" w:history="1">
         <w:r>
           <w:rPr>
             <w:rStyle w:val="Hyperlink"/>
@@ -3494,7 +3582,7 @@
             <w:noProof/>
             <w:webHidden/>
           </w:rPr>
-          <w:instrText xml:space="preserve"> PAGEREF _Toc224059555 \h </w:instrText>
+          <w:instrText xml:space="preserve"> PAGEREF _Toc224585526 \h </w:instrText>
         </w:r>
         <w:r>
           <w:rPr>
@@ -3537,7 +3625,7 @@
           <w14:ligatures w14:val="standardContextual"/>
         </w:rPr>
       </w:pPr>
-      <w:hyperlink w:anchor="_Toc224059556" w:history="1">
+      <w:hyperlink w:anchor="_Toc224585527" w:history="1">
         <w:r>
           <w:rPr>
             <w:rStyle w:val="Hyperlink"/>
@@ -3563,7 +3651,7 @@
             <w:noProof/>
             <w:lang w:val="en-GB"/>
           </w:rPr>
-          <w:t>ETL concept</w:t>
+          <w:t>Flow Diagram</w:t>
         </w:r>
         <w:r>
           <w:rPr>
@@ -3584,7 +3672,7 @@
             <w:noProof/>
             <w:webHidden/>
           </w:rPr>
-          <w:instrText xml:space="preserve"> PAGEREF _Toc224059556 \h </w:instrText>
+          <w:instrText xml:space="preserve"> PAGEREF _Toc224585527 \h </w:instrText>
         </w:r>
         <w:r>
           <w:rPr>
@@ -3604,7 +3692,7 @@
             <w:noProof/>
             <w:webHidden/>
           </w:rPr>
-          <w:t>7</w:t>
+          <w:t>8</w:t>
         </w:r>
         <w:r>
           <w:rPr>
@@ -3630,7 +3718,7 @@
           <w14:ligatures w14:val="standardContextual"/>
         </w:rPr>
       </w:pPr>
-      <w:hyperlink w:anchor="_Toc224059557" w:history="1">
+      <w:hyperlink w:anchor="_Toc224585528" w:history="1">
         <w:r>
           <w:rPr>
             <w:rStyle w:val="Hyperlink"/>
@@ -3679,7 +3767,7 @@
             <w:noProof/>
             <w:webHidden/>
           </w:rPr>
-          <w:instrText xml:space="preserve"> PAGEREF _Toc224059557 \h </w:instrText>
+          <w:instrText xml:space="preserve"> PAGEREF _Toc224585528 \h </w:instrText>
         </w:r>
         <w:r>
           <w:rPr>
@@ -3699,7 +3787,7 @@
             <w:noProof/>
             <w:webHidden/>
           </w:rPr>
-          <w:t>8</w:t>
+          <w:t>9</w:t>
         </w:r>
         <w:r>
           <w:rPr>
@@ -3725,7 +3813,7 @@
           <w14:ligatures w14:val="standardContextual"/>
         </w:rPr>
       </w:pPr>
-      <w:hyperlink w:anchor="_Toc224059558" w:history="1">
+      <w:hyperlink w:anchor="_Toc224585529" w:history="1">
         <w:r>
           <w:rPr>
             <w:rStyle w:val="Hyperlink"/>
@@ -3774,7 +3862,7 @@
             <w:noProof/>
             <w:webHidden/>
           </w:rPr>
-          <w:instrText xml:space="preserve"> PAGEREF _Toc224059558 \h </w:instrText>
+          <w:instrText xml:space="preserve"> PAGEREF _Toc224585529 \h </w:instrText>
         </w:r>
         <w:r>
           <w:rPr>
@@ -3817,7 +3905,7 @@
           <w14:ligatures w14:val="standardContextual"/>
         </w:rPr>
       </w:pPr>
-      <w:hyperlink w:anchor="_Toc224059559" w:history="1">
+      <w:hyperlink w:anchor="_Toc224585530" w:history="1">
         <w:r>
           <w:rPr>
             <w:rStyle w:val="Hyperlink"/>
@@ -3862,7 +3950,7 @@
             <w:noProof/>
             <w:webHidden/>
           </w:rPr>
-          <w:instrText xml:space="preserve"> PAGEREF _Toc224059559 \h </w:instrText>
+          <w:instrText xml:space="preserve"> PAGEREF _Toc224585530 \h </w:instrText>
         </w:r>
         <w:r>
           <w:rPr>
@@ -3908,7 +3996,7 @@
           <w14:ligatures w14:val="standardContextual"/>
         </w:rPr>
       </w:pPr>
-      <w:hyperlink w:anchor="_Toc224059560" w:history="1">
+      <w:hyperlink w:anchor="_Toc224585531" w:history="1">
         <w:r>
           <w:rPr>
             <w:rStyle w:val="Hyperlink"/>
@@ -3957,7 +4045,7 @@
             <w:noProof/>
             <w:webHidden/>
           </w:rPr>
-          <w:instrText xml:space="preserve"> PAGEREF _Toc224059560 \h </w:instrText>
+          <w:instrText xml:space="preserve"> PAGEREF _Toc224585531 \h </w:instrText>
         </w:r>
         <w:r>
           <w:rPr>
@@ -3977,7 +4065,7 @@
             <w:noProof/>
             <w:webHidden/>
           </w:rPr>
-          <w:t>10</w:t>
+          <w:t>9</w:t>
         </w:r>
         <w:r>
           <w:rPr>
@@ -4046,7 +4134,7 @@
           <w:lang w:val="en-US"/>
         </w:rPr>
       </w:pPr>
-      <w:bookmarkStart w:id="8" w:name="_Toc224059546"/>
+      <w:bookmarkStart w:id="8" w:name="_Toc224585516"/>
       <w:r>
         <w:rPr>
           <w:rFonts w:ascii="Arial" w:hAnsi="Arial" w:cs="Arial"/>
@@ -4064,7 +4152,7 @@
           <w:lang w:val="en-US"/>
         </w:rPr>
       </w:pPr>
-      <w:bookmarkStart w:id="9" w:name="_Toc224059547"/>
+      <w:bookmarkStart w:id="9" w:name="_Toc224585517"/>
       <w:r>
         <w:rPr>
           <w:lang w:val="en-US"/>
@@ -4080,7 +4168,7 @@
           <w:lang w:val="de-AT"/>
         </w:rPr>
       </w:pPr>
-      <w:bookmarkStart w:id="10" w:name="_Toc224059548"/>
+      <w:bookmarkStart w:id="10" w:name="_Toc224585518"/>
       <w:r>
         <w:rPr>
           <w:lang w:val="de-AT"/>
@@ -4427,7 +4515,7 @@
           <w:lang w:val="de-AT"/>
         </w:rPr>
       </w:pPr>
-      <w:bookmarkStart w:id="11" w:name="_Toc224059549"/>
+      <w:bookmarkStart w:id="11" w:name="_Toc224585519"/>
       <w:r>
         <w:rPr>
           <w:lang w:val="de-AT"/>
@@ -4515,7 +4603,7 @@
           <w:lang w:val="de-AT"/>
         </w:rPr>
       </w:pPr>
-      <w:bookmarkStart w:id="12" w:name="_Toc224059550"/>
+      <w:bookmarkStart w:id="12" w:name="_Toc224585520"/>
       <w:r>
         <w:rPr>
           <w:lang w:val="de-AT"/>
@@ -4966,7 +5054,7 @@
           <w:lang w:val="de-AT"/>
         </w:rPr>
       </w:pPr>
-      <w:bookmarkStart w:id="13" w:name="_Toc224059551"/>
+      <w:bookmarkStart w:id="13" w:name="_Toc224585521"/>
       <w:r>
         <w:rPr>
           <w:lang w:val="de-AT"/>
@@ -5206,7 +5294,7 @@
           <w:lang w:val="en-US"/>
         </w:rPr>
       </w:pPr>
-      <w:bookmarkStart w:id="14" w:name="_Toc224059552"/>
+      <w:bookmarkStart w:id="14" w:name="_Toc224585522"/>
       <w:r>
         <w:rPr>
           <w:lang w:val="en-US"/>
@@ -5351,7 +5439,7 @@
           <w:lang w:val="en-US"/>
         </w:rPr>
       </w:pPr>
-      <w:bookmarkStart w:id="15" w:name="_Toc224059553"/>
+      <w:bookmarkStart w:id="15" w:name="_Toc224585523"/>
       <w:bookmarkEnd w:id="5"/>
       <w:bookmarkEnd w:id="6"/>
       <w:bookmarkEnd w:id="7"/>
@@ -5364,6 +5452,16 @@
         <w:t>Data Model</w:t>
       </w:r>
       <w:bookmarkEnd w:id="15"/>
+    </w:p>
+    <w:p>
+      <w:pPr>
+        <w:pStyle w:val="berschrift2"/>
+      </w:pPr>
+      <w:bookmarkStart w:id="16" w:name="_Toc224585524"/>
+      <w:r>
+        <w:t>Star Schema</w:t>
+      </w:r>
+      <w:bookmarkEnd w:id="16"/>
     </w:p>
     <w:p>
       <w:pPr>
@@ -5656,7 +5754,7 @@
           <w:lang w:val="en-US"/>
         </w:rPr>
       </w:pPr>
-      <w:bookmarkStart w:id="16" w:name="_Toc224059554"/>
+      <w:bookmarkStart w:id="17" w:name="_Toc224585525"/>
       <w:r>
         <w:rPr>
           <w:rFonts w:ascii="Arial" w:hAnsi="Arial" w:cs="Arial"/>
@@ -5665,17 +5763,17 @@
         <w:lastRenderedPageBreak/>
         <w:t>ETL Concept</w:t>
       </w:r>
-      <w:bookmarkEnd w:id="16"/>
+      <w:bookmarkEnd w:id="17"/>
     </w:p>
     <w:p>
       <w:pPr>
         <w:pStyle w:val="berschrift2"/>
       </w:pPr>
-      <w:bookmarkStart w:id="17" w:name="_Toc224059555"/>
+      <w:bookmarkStart w:id="18" w:name="_Toc224585526"/>
       <w:r>
         <w:t>Data Map</w:t>
       </w:r>
-      <w:bookmarkEnd w:id="17"/>
+      <w:bookmarkEnd w:id="18"/>
     </w:p>
     <w:p>
       <w:pPr>
@@ -5793,6 +5891,7 @@
           <w:lang w:val="en-GB"/>
         </w:rPr>
       </w:pPr>
+      <w:bookmarkStart w:id="19" w:name="_Toc224585527"/>
       <w:r>
         <w:rPr>
           <w:lang w:val="en-GB"/>
@@ -5800,6 +5899,7 @@
         <w:lastRenderedPageBreak/>
         <w:t>Flow Diagram</w:t>
       </w:r>
+      <w:bookmarkEnd w:id="19"/>
     </w:p>
     <w:p>
       <w:pPr>
@@ -5905,11 +6005,11 @@
       <w:pPr>
         <w:pStyle w:val="berschrift1"/>
       </w:pPr>
-      <w:bookmarkStart w:id="18" w:name="_Toc224059557"/>
+      <w:bookmarkStart w:id="20" w:name="_Toc224585528"/>
       <w:r>
         <w:t>ETL implementation</w:t>
       </w:r>
-      <w:bookmarkEnd w:id="18"/>
+      <w:bookmarkEnd w:id="20"/>
     </w:p>
     <w:p>
       <w:pPr>
@@ -6011,14 +6111,14 @@
       <w:pPr>
         <w:pStyle w:val="berschrift1"/>
       </w:pPr>
-      <w:bookmarkStart w:id="19" w:name="_Toc224059558"/>
+      <w:bookmarkStart w:id="21" w:name="_Toc224585529"/>
       <w:r>
         <w:t>Data modelling and</w:t>
       </w:r>
       <w:r>
         <w:t xml:space="preserve"> BI</w:t>
       </w:r>
-      <w:bookmarkEnd w:id="19"/>
+      <w:bookmarkEnd w:id="21"/>
     </w:p>
     <w:p>
       <w:pPr>
@@ -6031,11 +6131,11 @@
       <w:pPr>
         <w:pStyle w:val="berschrift2"/>
       </w:pPr>
-      <w:bookmarkStart w:id="20" w:name="_Toc224059559"/>
+      <w:bookmarkStart w:id="22" w:name="_Toc224585530"/>
       <w:r>
         <w:t>Data modelling</w:t>
       </w:r>
-      <w:bookmarkEnd w:id="20"/>
+      <w:bookmarkEnd w:id="22"/>
     </w:p>
     <w:p>
       <w:pPr>
@@ -6182,11 +6282,11 @@
       <w:pPr>
         <w:pStyle w:val="berschrift1"/>
       </w:pPr>
-      <w:bookmarkStart w:id="21" w:name="_Toc224059560"/>
+      <w:bookmarkStart w:id="23" w:name="_Toc224585531"/>
       <w:r>
         <w:t>BI Implementation</w:t>
       </w:r>
-      <w:bookmarkEnd w:id="21"/>
+      <w:bookmarkEnd w:id="23"/>
     </w:p>
     <w:p>
       <w:pPr>

</xml_diff>

<commit_message>
Updated Header/Footer and added description for ELT Flow diagram
</commit_message>
<xml_diff>
--- a/docs/Citibike.docx
+++ b/docs/Citibike.docx
@@ -636,7 +636,7 @@
           <w:lang w:val="de-AT" w:eastAsia="de-AT"/>
         </w:rPr>
         <w:drawing>
-          <wp:inline distT="0" distB="0" distL="0" distR="0" wp14:anchorId="60E7A0F6" wp14:editId="5E67ED6F">
+          <wp:inline distT="0" distB="0" distL="0" distR="0" wp14:anchorId="60E7A0F6" wp14:editId="07A76459">
             <wp:extent cx="1350010" cy="350520"/>
             <wp:effectExtent l="0" t="0" r="0" b="0"/>
             <wp:docPr id="1" name="Bild 1"/>
@@ -5903,6 +5903,34 @@
     </w:p>
     <w:p>
       <w:pPr>
+        <w:rPr>
+          <w:rFonts w:cs="Arial"/>
+          <w:iCs/>
+          <w:noProof/>
+          <w:sz w:val="20"/>
+          <w:lang w:val="de-AT"/>
+        </w:rPr>
+      </w:pPr>
+      <w:r>
+        <w:rPr>
+          <w:rFonts w:cs="Arial"/>
+          <w:iCs/>
+          <w:noProof/>
+          <w:sz w:val="20"/>
+          <w:lang w:val="de-AT"/>
+        </w:rPr>
+        <w:t>Der ETL-Prozess integriert CitiBike-Fahrtdaten aus CSV-Dateien mit historischen Wetterdaten aus der Open-Meteo API. In der Extract-Phase werden beide Quellen mit Python eingelesen. In der Transform-Phase werden Datumsformate vereinheitlicht, irrelevante Attribute entfernt, fehlende Werte geprüft, Dubletten gelöscht und ungültige Werte wie negative Fahrtdauern bereinigt. Anschließend werden die Wetterdaten über einen gemeinsamen date_key mit den Fahrtdaten verknüpft. In der Load-Phase werden die bereinigten und integrierten Daten in ein PostgreSQL Data Warehouse geladen, das als Star Schema mit Fact- und Dimensionstabellen modelliert ist. Die Umsetzung erfolgt mit Python, pandas, requests, SQLAlchemy und PostgreSQL. Zur Sicherstellung der Datenqualität werden Plausibilitätsprüfungen, Standardisierungen und Integritätskontrollen durchgeführt.</w:t>
+      </w:r>
+    </w:p>
+    <w:p>
+      <w:pPr>
+        <w:rPr>
+          <w:lang w:val="de-AT"/>
+        </w:rPr>
+      </w:pPr>
+    </w:p>
+    <w:p>
+      <w:pPr>
         <w:keepNext/>
         <w:spacing w:before="100" w:beforeAutospacing="1" w:after="100" w:afterAutospacing="1"/>
         <w:jc w:val="center"/>
@@ -6375,9 +6403,6 @@
   <w:p>
     <w:pPr>
       <w:pStyle w:val="Fuzeile"/>
-      <w:pBdr>
-        <w:top w:val="none" w:sz="0" w:space="0" w:color="auto"/>
-      </w:pBdr>
       <w:rPr>
         <w:rStyle w:val="Seitenzahl"/>
         <w:rFonts w:ascii="Arial" w:hAnsi="Arial"/>
@@ -6588,7 +6613,14 @@
               <w:sz w:val="16"/>
               <w:szCs w:val="16"/>
             </w:rPr>
-            <w:t>0.1</w:t>
+            <w:t>0.</w:t>
+          </w:r>
+          <w:r>
+            <w:rPr>
+              <w:sz w:val="16"/>
+              <w:szCs w:val="16"/>
+            </w:rPr>
+            <w:t>4</w:t>
           </w:r>
         </w:p>
       </w:tc>
@@ -6632,7 +6664,7 @@
               <w:sz w:val="16"/>
               <w:szCs w:val="16"/>
             </w:rPr>
-            <w:t>Citibike_0_1.docx</w:t>
+            <w:t>Citibike.docx</w:t>
           </w:r>
         </w:p>
       </w:tc>
@@ -6653,7 +6685,14 @@
               <w:sz w:val="16"/>
               <w:szCs w:val="16"/>
             </w:rPr>
-            <w:t>09.03.2026</w:t>
+            <w:t>16</w:t>
+          </w:r>
+          <w:r>
+            <w:rPr>
+              <w:sz w:val="16"/>
+              <w:szCs w:val="16"/>
+            </w:rPr>
+            <w:t>.03.2026</w:t>
           </w:r>
         </w:p>
       </w:tc>
@@ -6791,13 +6830,32 @@
   <w:p>
     <w:pPr>
       <w:pStyle w:val="Fuzeile"/>
-      <w:rPr>
-        <w:rStyle w:val="Seitenzahl"/>
+      <w:pBdr>
+        <w:top w:val="none" w:sz="0" w:space="0" w:color="auto"/>
+      </w:pBdr>
+      <w:rPr>
         <w:color w:val="0000FF"/>
         <w:lang w:val="de-DE"/>
       </w:rPr>
     </w:pPr>
   </w:p>
+  <w:p>
+    <w:pPr>
+      <w:pStyle w:val="Fuzeile"/>
+      <w:pBdr>
+        <w:top w:val="none" w:sz="0" w:space="0" w:color="auto"/>
+      </w:pBdr>
+      <w:rPr>
+        <w:color w:val="0000FF"/>
+        <w:lang w:val="de-DE"/>
+      </w:rPr>
+    </w:pPr>
+  </w:p>
+</w:ftr>
+</file>
+
+<file path=word/footer3.xml><?xml version="1.0" encoding="utf-8"?>
+<w:ftr xmlns:wpc="http://schemas.microsoft.com/office/word/2010/wordprocessingCanvas" xmlns:cx="http://schemas.microsoft.com/office/drawing/2014/chartex" xmlns:cx1="http://schemas.microsoft.com/office/drawing/2015/9/8/chartex" xmlns:cx2="http://schemas.microsoft.com/office/drawing/2015/10/21/chartex" xmlns:cx3="http://schemas.microsoft.com/office/drawing/2016/5/9/chartex" xmlns:cx4="http://schemas.microsoft.com/office/drawing/2016/5/10/chartex" xmlns:cx5="http://schemas.microsoft.com/office/drawing/2016/5/11/chartex" xmlns:cx6="http://schemas.microsoft.com/office/drawing/2016/5/12/chartex" xmlns:cx7="http://schemas.microsoft.com/office/drawing/2016/5/13/chartex" xmlns:cx8="http://schemas.microsoft.com/office/drawing/2016/5/14/chartex" xmlns:mc="http://schemas.openxmlformats.org/markup-compatibility/2006" xmlns:aink="http://schemas.microsoft.com/office/drawing/2016/ink" xmlns:am3d="http://schemas.microsoft.com/office/drawing/2017/model3d" xmlns:o="urn:schemas-microsoft-com:office:office" xmlns:oel="http://schemas.microsoft.com/office/2019/extlst" xmlns:r="http://schemas.openxmlformats.org/officeDocument/2006/relationships" xmlns:m="http://schemas.openxmlformats.org/officeDocument/2006/math" xmlns:v="urn:schemas-microsoft-com:vml" xmlns:wp14="http://schemas.microsoft.com/office/word/2010/wordprocessingDrawing" xmlns:wp="http://schemas.openxmlformats.org/drawingml/2006/wordprocessingDrawing" xmlns:w10="urn:schemas-microsoft-com:office:word" xmlns:w="http://schemas.openxmlformats.org/wordprocessingml/2006/main" xmlns:w14="http://schemas.microsoft.com/office/word/2010/wordml" xmlns:w15="http://schemas.microsoft.com/office/word/2012/wordml" xmlns:w16cex="http://schemas.microsoft.com/office/word/2018/wordml/cex" xmlns:w16cid="http://schemas.microsoft.com/office/word/2016/wordml/cid" xmlns:w16="http://schemas.microsoft.com/office/word/2018/wordml" xmlns:w16du="http://schemas.microsoft.com/office/word/2023/wordml/word16du" xmlns:w16sdtdh="http://schemas.microsoft.com/office/word/2020/wordml/sdtdatahash" xmlns:w16sdtfl="http://schemas.microsoft.com/office/word/2024/wordml/sdtformatlock" xmlns:w16se="http://schemas.microsoft.com/office/word/2015/wordml/symex" xmlns:wpg="http://schemas.microsoft.com/office/word/2010/wordprocessingGroup" xmlns:wpi="http://schemas.microsoft.com/office/word/2010/wordprocessingInk" xmlns:wne="http://schemas.microsoft.com/office/word/2006/wordml" xmlns:wps="http://schemas.microsoft.com/office/word/2010/wordprocessingShape" mc:Ignorable="w14 w15 w16se w16cid w16 w16cex w16sdtdh w16sdtfl w16du wp14">
   <w:p>
     <w:pPr>
       <w:pStyle w:val="Fuzeile"/>
@@ -7009,7 +7067,14 @@
               <w:sz w:val="16"/>
               <w:szCs w:val="16"/>
             </w:rPr>
-            <w:t>0.1</w:t>
+            <w:t>0.</w:t>
+          </w:r>
+          <w:r>
+            <w:rPr>
+              <w:sz w:val="16"/>
+              <w:szCs w:val="16"/>
+            </w:rPr>
+            <w:t>4</w:t>
           </w:r>
         </w:p>
       </w:tc>
@@ -7053,7 +7118,7 @@
               <w:sz w:val="16"/>
               <w:szCs w:val="16"/>
             </w:rPr>
-            <w:t>Citibike_0_1.docx</w:t>
+            <w:t>Citibike.docx</w:t>
           </w:r>
         </w:p>
       </w:tc>
@@ -7074,416 +7139,14 @@
               <w:sz w:val="16"/>
               <w:szCs w:val="16"/>
             </w:rPr>
-            <w:t>09.03.2026</w:t>
-          </w:r>
-        </w:p>
-      </w:tc>
-      <w:tc>
-        <w:tcPr>
-          <w:tcW w:w="1276" w:type="dxa"/>
-        </w:tcPr>
-        <w:p>
-          <w:pPr>
-            <w:pStyle w:val="Fuzeile"/>
-            <w:rPr>
-              <w:sz w:val="16"/>
-              <w:szCs w:val="16"/>
-            </w:rPr>
-          </w:pPr>
-        </w:p>
-      </w:tc>
-      <w:tc>
-        <w:tcPr>
-          <w:tcW w:w="708" w:type="dxa"/>
-        </w:tcPr>
-        <w:p>
-          <w:pPr>
-            <w:pStyle w:val="Fuzeile"/>
-            <w:pBdr>
-              <w:top w:val="none" w:sz="0" w:space="0" w:color="auto"/>
-            </w:pBdr>
-            <w:rPr>
-              <w:sz w:val="16"/>
-              <w:szCs w:val="16"/>
-            </w:rPr>
-          </w:pPr>
-          <w:r>
-            <w:rPr>
-              <w:sz w:val="16"/>
-              <w:szCs w:val="16"/>
-            </w:rPr>
-            <w:fldChar w:fldCharType="begin"/>
+            <w:t>16</w:t>
           </w:r>
           <w:r>
             <w:rPr>
               <w:sz w:val="16"/>
               <w:szCs w:val="16"/>
             </w:rPr>
-            <w:instrText xml:space="preserve"> PAGE </w:instrText>
-          </w:r>
-          <w:r>
-            <w:rPr>
-              <w:sz w:val="16"/>
-              <w:szCs w:val="16"/>
-            </w:rPr>
-            <w:fldChar w:fldCharType="separate"/>
-          </w:r>
-          <w:r>
-            <w:rPr>
-              <w:noProof/>
-              <w:sz w:val="16"/>
-              <w:szCs w:val="16"/>
-            </w:rPr>
-            <w:t>9</w:t>
-          </w:r>
-          <w:r>
-            <w:rPr>
-              <w:sz w:val="16"/>
-              <w:szCs w:val="16"/>
-            </w:rPr>
-            <w:fldChar w:fldCharType="end"/>
-          </w:r>
-          <w:r>
-            <w:rPr>
-              <w:sz w:val="16"/>
-              <w:szCs w:val="16"/>
-            </w:rPr>
-            <w:t xml:space="preserve"> / </w:t>
-          </w:r>
-          <w:r>
-            <w:rPr>
-              <w:sz w:val="16"/>
-              <w:szCs w:val="16"/>
-            </w:rPr>
-            <w:fldChar w:fldCharType="begin"/>
-          </w:r>
-          <w:r>
-            <w:rPr>
-              <w:sz w:val="16"/>
-              <w:szCs w:val="16"/>
-            </w:rPr>
-            <w:instrText xml:space="preserve"> NUMPAGES </w:instrText>
-          </w:r>
-          <w:r>
-            <w:rPr>
-              <w:sz w:val="16"/>
-              <w:szCs w:val="16"/>
-            </w:rPr>
-            <w:fldChar w:fldCharType="separate"/>
-          </w:r>
-          <w:r>
-            <w:rPr>
-              <w:noProof/>
-              <w:sz w:val="16"/>
-              <w:szCs w:val="16"/>
-            </w:rPr>
-            <w:t>9</w:t>
-          </w:r>
-          <w:r>
-            <w:rPr>
-              <w:sz w:val="16"/>
-              <w:szCs w:val="16"/>
-            </w:rPr>
-            <w:fldChar w:fldCharType="end"/>
-          </w:r>
-        </w:p>
-      </w:tc>
-    </w:tr>
-  </w:tbl>
-  <w:p>
-    <w:pPr>
-      <w:pStyle w:val="Fuzeile"/>
-      <w:rPr>
-        <w:color w:val="0000FF"/>
-        <w:lang w:val="de-DE"/>
-      </w:rPr>
-    </w:pPr>
-  </w:p>
-</w:ftr>
-</file>
-
-<file path=word/footer3.xml><?xml version="1.0" encoding="utf-8"?>
-<w:ftr xmlns:wpc="http://schemas.microsoft.com/office/word/2010/wordprocessingCanvas" xmlns:cx="http://schemas.microsoft.com/office/drawing/2014/chartex" xmlns:cx1="http://schemas.microsoft.com/office/drawing/2015/9/8/chartex" xmlns:cx2="http://schemas.microsoft.com/office/drawing/2015/10/21/chartex" xmlns:cx3="http://schemas.microsoft.com/office/drawing/2016/5/9/chartex" xmlns:cx4="http://schemas.microsoft.com/office/drawing/2016/5/10/chartex" xmlns:cx5="http://schemas.microsoft.com/office/drawing/2016/5/11/chartex" xmlns:cx6="http://schemas.microsoft.com/office/drawing/2016/5/12/chartex" xmlns:cx7="http://schemas.microsoft.com/office/drawing/2016/5/13/chartex" xmlns:cx8="http://schemas.microsoft.com/office/drawing/2016/5/14/chartex" xmlns:mc="http://schemas.openxmlformats.org/markup-compatibility/2006" xmlns:aink="http://schemas.microsoft.com/office/drawing/2016/ink" xmlns:am3d="http://schemas.microsoft.com/office/drawing/2017/model3d" xmlns:o="urn:schemas-microsoft-com:office:office" xmlns:oel="http://schemas.microsoft.com/office/2019/extlst" xmlns:r="http://schemas.openxmlformats.org/officeDocument/2006/relationships" xmlns:m="http://schemas.openxmlformats.org/officeDocument/2006/math" xmlns:v="urn:schemas-microsoft-com:vml" xmlns:wp14="http://schemas.microsoft.com/office/word/2010/wordprocessingDrawing" xmlns:wp="http://schemas.openxmlformats.org/drawingml/2006/wordprocessingDrawing" xmlns:w10="urn:schemas-microsoft-com:office:word" xmlns:w="http://schemas.openxmlformats.org/wordprocessingml/2006/main" xmlns:w14="http://schemas.microsoft.com/office/word/2010/wordml" xmlns:w15="http://schemas.microsoft.com/office/word/2012/wordml" xmlns:w16cex="http://schemas.microsoft.com/office/word/2018/wordml/cex" xmlns:w16cid="http://schemas.microsoft.com/office/word/2016/wordml/cid" xmlns:w16="http://schemas.microsoft.com/office/word/2018/wordml" xmlns:w16du="http://schemas.microsoft.com/office/word/2023/wordml/word16du" xmlns:w16sdtdh="http://schemas.microsoft.com/office/word/2020/wordml/sdtdatahash" xmlns:w16sdtfl="http://schemas.microsoft.com/office/word/2024/wordml/sdtformatlock" xmlns:w16se="http://schemas.microsoft.com/office/word/2015/wordml/symex" xmlns:wpg="http://schemas.microsoft.com/office/word/2010/wordprocessingGroup" xmlns:wpi="http://schemas.microsoft.com/office/word/2010/wordprocessingInk" xmlns:wne="http://schemas.microsoft.com/office/word/2006/wordml" xmlns:wps="http://schemas.microsoft.com/office/word/2010/wordprocessingShape" mc:Ignorable="w14 w15 w16se w16cid w16 w16cex w16sdtdh w16sdtfl w16du wp14">
-  <w:p>
-    <w:pPr>
-      <w:pStyle w:val="Fuzeile"/>
-      <w:pBdr>
-        <w:top w:val="none" w:sz="0" w:space="0" w:color="auto"/>
-      </w:pBdr>
-      <w:rPr>
-        <w:color w:val="0000FF"/>
-        <w:lang w:val="de-DE"/>
-      </w:rPr>
-    </w:pPr>
-  </w:p>
-  <w:tbl>
-    <w:tblPr>
-      <w:tblW w:w="8930" w:type="dxa"/>
-      <w:jc w:val="center"/>
-      <w:tblBorders>
-        <w:top w:val="single" w:sz="4" w:space="0" w:color="auto"/>
-        <w:left w:val="single" w:sz="4" w:space="0" w:color="auto"/>
-        <w:bottom w:val="single" w:sz="4" w:space="0" w:color="auto"/>
-        <w:right w:val="single" w:sz="4" w:space="0" w:color="auto"/>
-        <w:insideH w:val="single" w:sz="4" w:space="0" w:color="auto"/>
-        <w:insideV w:val="single" w:sz="4" w:space="0" w:color="auto"/>
-      </w:tblBorders>
-      <w:tblLayout w:type="fixed"/>
-      <w:tblLook w:val="0000" w:firstRow="0" w:lastRow="0" w:firstColumn="0" w:lastColumn="0" w:noHBand="0" w:noVBand="0"/>
-    </w:tblPr>
-    <w:tblGrid>
-      <w:gridCol w:w="864"/>
-      <w:gridCol w:w="1688"/>
-      <w:gridCol w:w="2835"/>
-      <w:gridCol w:w="1559"/>
-      <w:gridCol w:w="1276"/>
-      <w:gridCol w:w="708"/>
-    </w:tblGrid>
-    <w:tr>
-      <w:trPr>
-        <w:jc w:val="center"/>
-      </w:trPr>
-      <w:tc>
-        <w:tcPr>
-          <w:tcW w:w="864" w:type="dxa"/>
-        </w:tcPr>
-        <w:p>
-          <w:pPr>
-            <w:pStyle w:val="Fuzeile"/>
-            <w:rPr>
-              <w:sz w:val="16"/>
-              <w:szCs w:val="16"/>
-            </w:rPr>
-          </w:pPr>
-          <w:r>
-            <w:rPr>
-              <w:sz w:val="16"/>
-              <w:szCs w:val="16"/>
-            </w:rPr>
-            <w:t>Version</w:t>
-          </w:r>
-        </w:p>
-      </w:tc>
-      <w:tc>
-        <w:tcPr>
-          <w:tcW w:w="1688" w:type="dxa"/>
-        </w:tcPr>
-        <w:p>
-          <w:pPr>
-            <w:pStyle w:val="Fuzeile"/>
-            <w:rPr>
-              <w:sz w:val="16"/>
-              <w:szCs w:val="16"/>
-            </w:rPr>
-          </w:pPr>
-          <w:r>
-            <w:rPr>
-              <w:sz w:val="16"/>
-              <w:szCs w:val="16"/>
-            </w:rPr>
-            <w:t>Aut</w:t>
-          </w:r>
-          <w:r>
-            <w:rPr>
-              <w:sz w:val="16"/>
-              <w:szCs w:val="16"/>
-            </w:rPr>
-            <w:t>h</w:t>
-          </w:r>
-          <w:r>
-            <w:rPr>
-              <w:sz w:val="16"/>
-              <w:szCs w:val="16"/>
-            </w:rPr>
-            <w:t>or</w:t>
-          </w:r>
-        </w:p>
-      </w:tc>
-      <w:tc>
-        <w:tcPr>
-          <w:tcW w:w="2835" w:type="dxa"/>
-        </w:tcPr>
-        <w:p>
-          <w:pPr>
-            <w:pStyle w:val="Fuzeile"/>
-            <w:rPr>
-              <w:sz w:val="16"/>
-              <w:szCs w:val="16"/>
-            </w:rPr>
-          </w:pPr>
-          <w:r>
-            <w:rPr>
-              <w:sz w:val="16"/>
-              <w:szCs w:val="16"/>
-            </w:rPr>
-            <w:t>Filename</w:t>
-          </w:r>
-        </w:p>
-      </w:tc>
-      <w:tc>
-        <w:tcPr>
-          <w:tcW w:w="1559" w:type="dxa"/>
-          <w:tcMar>
-            <w:left w:w="57" w:type="dxa"/>
-            <w:right w:w="57" w:type="dxa"/>
-          </w:tcMar>
-        </w:tcPr>
-        <w:p>
-          <w:pPr>
-            <w:pStyle w:val="Fuzeile"/>
-            <w:ind w:left="44"/>
-            <w:rPr>
-              <w:sz w:val="16"/>
-              <w:szCs w:val="16"/>
-            </w:rPr>
-          </w:pPr>
-          <w:r>
-            <w:rPr>
-              <w:sz w:val="16"/>
-              <w:szCs w:val="16"/>
-            </w:rPr>
-            <w:t>Last Change</w:t>
-          </w:r>
-        </w:p>
-      </w:tc>
-      <w:tc>
-        <w:tcPr>
-          <w:tcW w:w="1276" w:type="dxa"/>
-        </w:tcPr>
-        <w:p>
-          <w:pPr>
-            <w:pStyle w:val="Fuzeile"/>
-            <w:rPr>
-              <w:sz w:val="16"/>
-              <w:szCs w:val="16"/>
-            </w:rPr>
-          </w:pPr>
-          <w:r>
-            <w:rPr>
-              <w:sz w:val="16"/>
-              <w:szCs w:val="16"/>
-            </w:rPr>
-            <w:t>Print date</w:t>
-          </w:r>
-          <w:r>
-            <w:rPr>
-              <w:sz w:val="16"/>
-              <w:szCs w:val="16"/>
-            </w:rPr>
-            <w:tab/>
-          </w:r>
-        </w:p>
-      </w:tc>
-      <w:tc>
-        <w:tcPr>
-          <w:tcW w:w="708" w:type="dxa"/>
-        </w:tcPr>
-        <w:p>
-          <w:pPr>
-            <w:pStyle w:val="Fuzeile"/>
-            <w:rPr>
-              <w:sz w:val="16"/>
-              <w:szCs w:val="16"/>
-            </w:rPr>
-          </w:pPr>
-          <w:r>
-            <w:rPr>
-              <w:sz w:val="16"/>
-              <w:szCs w:val="16"/>
-            </w:rPr>
-            <w:t>page</w:t>
-          </w:r>
-        </w:p>
-      </w:tc>
-    </w:tr>
-    <w:tr>
-      <w:trPr>
-        <w:trHeight w:val="188"/>
-        <w:jc w:val="center"/>
-      </w:trPr>
-      <w:tc>
-        <w:tcPr>
-          <w:tcW w:w="864" w:type="dxa"/>
-        </w:tcPr>
-        <w:p>
-          <w:pPr>
-            <w:pStyle w:val="Fuzeile"/>
-            <w:rPr>
-              <w:sz w:val="16"/>
-              <w:szCs w:val="16"/>
-            </w:rPr>
-          </w:pPr>
-          <w:r>
-            <w:rPr>
-              <w:sz w:val="16"/>
-              <w:szCs w:val="16"/>
-            </w:rPr>
-            <w:t>0.1</w:t>
-          </w:r>
-        </w:p>
-      </w:tc>
-      <w:tc>
-        <w:tcPr>
-          <w:tcW w:w="1688" w:type="dxa"/>
-        </w:tcPr>
-        <w:p>
-          <w:pPr>
-            <w:pStyle w:val="Fuzeile"/>
-            <w:rPr>
-              <w:sz w:val="16"/>
-              <w:szCs w:val="16"/>
-            </w:rPr>
-          </w:pPr>
-          <w:proofErr w:type="spellStart"/>
-          <w:r>
-            <w:rPr>
-              <w:sz w:val="16"/>
-              <w:szCs w:val="16"/>
-            </w:rPr>
-            <w:t>CD_citibike</w:t>
-          </w:r>
-          <w:proofErr w:type="spellEnd"/>
-        </w:p>
-      </w:tc>
-      <w:tc>
-        <w:tcPr>
-          <w:tcW w:w="2835" w:type="dxa"/>
-        </w:tcPr>
-        <w:p>
-          <w:pPr>
-            <w:pStyle w:val="Fuzeile"/>
-            <w:rPr>
-              <w:sz w:val="16"/>
-              <w:szCs w:val="16"/>
-            </w:rPr>
-          </w:pPr>
-          <w:r>
-            <w:rPr>
-              <w:sz w:val="16"/>
-              <w:szCs w:val="16"/>
-            </w:rPr>
-            <w:t>Citibike_0_1.docx</w:t>
-          </w:r>
-        </w:p>
-      </w:tc>
-      <w:tc>
-        <w:tcPr>
-          <w:tcW w:w="1559" w:type="dxa"/>
-        </w:tcPr>
-        <w:p>
-          <w:pPr>
-            <w:pStyle w:val="Fuzeile"/>
-            <w:rPr>
-              <w:sz w:val="16"/>
-              <w:szCs w:val="16"/>
-            </w:rPr>
-          </w:pPr>
-          <w:r>
-            <w:rPr>
-              <w:sz w:val="16"/>
-              <w:szCs w:val="16"/>
-            </w:rPr>
-            <w:t>09.03.2026</w:t>
+            <w:t>.03.2026</w:t>
           </w:r>
         </w:p>
       </w:tc>
@@ -7766,52 +7429,10 @@
     </w:pPr>
     <w:r>
       <w:rPr>
-        <w:color w:val="0000FF"/>
-      </w:rPr>
-      <w:t>Projektmanagementhandbuch 1. Semester BWI</w:t>
-    </w:r>
-    <w:r>
-      <w:rPr>
-        <w:color w:val="0000FF"/>
-      </w:rPr>
-      <w:tab/>
-    </w:r>
-    <w:r>
-      <w:rPr>
-        <w:color w:val="0000FF"/>
-      </w:rPr>
-      <w:tab/>
-    </w:r>
-    <w:r>
-      <w:rPr>
-        <w:color w:val="0000FF"/>
-      </w:rPr>
-      <w:tab/>
-    </w:r>
-    <w:r>
-      <w:rPr>
-        <w:color w:val="0000FF"/>
-      </w:rPr>
-      <w:tab/>
-    </w:r>
-    <w:r>
-      <w:rPr>
-        <w:color w:val="0000FF"/>
-      </w:rPr>
-      <w:tab/>
-    </w:r>
-    <w:r>
-      <w:rPr>
-        <w:color w:val="0000FF"/>
-      </w:rPr>
-      <w:tab/>
-    </w:r>
-    <w:r>
-      <w:rPr>
-        <w:color w:val="0000FF"/>
-      </w:rPr>
-      <w:tab/>
-      <w:t>Fallstudie 1</w:t>
+        <w:color w:val="000000"/>
+        <w:lang w:val="en-US"/>
+      </w:rPr>
+      <w:t>DWBI Case Study</w:t>
     </w:r>
   </w:p>
   <w:p>

</xml_diff>

<commit_message>
Updated Data Map in word document
</commit_message>
<xml_diff>
--- a/docs/Citibike.docx
+++ b/docs/Citibike.docx
@@ -636,7 +636,7 @@
           <w:lang w:val="de-AT" w:eastAsia="de-AT"/>
         </w:rPr>
         <w:drawing>
-          <wp:inline distT="0" distB="0" distL="0" distR="0" wp14:anchorId="60E7A0F6" wp14:editId="07A76459">
+          <wp:inline distT="0" distB="0" distL="0" distR="0" wp14:anchorId="60E7A0F6" wp14:editId="3612142E">
             <wp:extent cx="1350010" cy="350520"/>
             <wp:effectExtent l="0" t="0" r="0" b="0"/>
             <wp:docPr id="1" name="Bild 1"/>
@@ -5785,10 +5785,10 @@
           <w:noProof/>
         </w:rPr>
         <w:drawing>
-          <wp:inline distT="0" distB="0" distL="0" distR="0" wp14:anchorId="3A4D622E" wp14:editId="2478B092">
-            <wp:extent cx="9603340" cy="2638425"/>
-            <wp:effectExtent l="0" t="0" r="0" b="3175"/>
-            <wp:docPr id="2121408083" name="Grafik 1" descr="Ein Bild, das Text, Screenshot, Quittung, Schwarzweiß enthält.&#10;&#10;KI-generierte Inhalte können fehlerhaft sein."/>
+          <wp:inline distT="0" distB="0" distL="0" distR="0" wp14:anchorId="3A4D622E" wp14:editId="52843C81">
+            <wp:extent cx="9535885" cy="2743200"/>
+            <wp:effectExtent l="0" t="0" r="1905" b="0"/>
+            <wp:docPr id="2121408083" name="Grafik 1"/>
             <wp:cNvGraphicFramePr>
               <a:graphicFrameLocks xmlns:a="http://schemas.openxmlformats.org/drawingml/2006/main" noChangeAspect="1"/>
             </wp:cNvGraphicFramePr>
@@ -5796,7 +5796,7 @@
               <a:graphicData uri="http://schemas.openxmlformats.org/drawingml/2006/picture">
                 <pic:pic xmlns:pic="http://schemas.openxmlformats.org/drawingml/2006/picture">
                   <pic:nvPicPr>
-                    <pic:cNvPr id="2121408083" name="Grafik 1" descr="Ein Bild, das Text, Screenshot, Quittung, Schwarzweiß enthält.&#10;&#10;KI-generierte Inhalte können fehlerhaft sein."/>
+                    <pic:cNvPr id="2121408083" name="Grafik 1"/>
                     <pic:cNvPicPr/>
                   </pic:nvPicPr>
                   <pic:blipFill>
@@ -5814,7 +5814,7 @@
                   <pic:spPr>
                     <a:xfrm>
                       <a:off x="0" y="0"/>
-                      <a:ext cx="9620631" cy="2643176"/>
+                      <a:ext cx="9547541" cy="2746553"/>
                     </a:xfrm>
                     <a:prstGeom prst="rect">
                       <a:avLst/>

</xml_diff>

<commit_message>
Added surrogate Keys to DataMap
</commit_message>
<xml_diff>
--- a/docs/Citibike.docx
+++ b/docs/Citibike.docx
@@ -345,7 +345,7 @@
           <w:szCs w:val="28"/>
           <w:lang w:val="en-US"/>
         </w:rPr>
-        <w:t>4</w:t>
+        <w:t>5</w:t>
       </w:r>
     </w:p>
     <w:p>
@@ -535,12 +535,9 @@
           <w:szCs w:val="28"/>
           <w:lang w:val="en-US"/>
         </w:rPr>
-        <w:t>16</w:t>
-      </w:r>
-    </w:p>
-    <w:p>
-      <w:pPr>
-        <w:jc w:val="center"/>
+        <w:t>1</w:t>
+      </w:r>
+      <w:r>
         <w:rPr>
           <w:rFonts w:cs="Arial"/>
           <w:b/>
@@ -549,7 +546,8 @@
           <w:szCs w:val="28"/>
           <w:lang w:val="en-US"/>
         </w:rPr>
-      </w:pPr>
+        <w:t>7</w:t>
+      </w:r>
     </w:p>
     <w:p>
       <w:pPr>
@@ -618,6 +616,19 @@
     </w:p>
     <w:p>
       <w:pPr>
+        <w:jc w:val="center"/>
+        <w:rPr>
+          <w:rFonts w:cs="Arial"/>
+          <w:b/>
+          <w:color w:val="404040"/>
+          <w:sz w:val="28"/>
+          <w:szCs w:val="28"/>
+          <w:lang w:val="en-US"/>
+        </w:rPr>
+      </w:pPr>
+    </w:p>
+    <w:p>
+      <w:pPr>
         <w:tabs>
           <w:tab w:val="left" w:pos="1455"/>
         </w:tabs>
@@ -636,7 +647,7 @@
           <w:lang w:val="de-AT" w:eastAsia="de-AT"/>
         </w:rPr>
         <w:drawing>
-          <wp:inline distT="0" distB="0" distL="0" distR="0" wp14:anchorId="60E7A0F6" wp14:editId="3612142E">
+          <wp:inline distT="0" distB="0" distL="0" distR="0" wp14:anchorId="60E7A0F6" wp14:editId="1626AED4">
             <wp:extent cx="1350010" cy="350520"/>
             <wp:effectExtent l="0" t="0" r="0" b="0"/>
             <wp:docPr id="1" name="Bild 1"/>
@@ -1354,6 +1365,14 @@
                 <w:lang w:val="en-US"/>
               </w:rPr>
             </w:pPr>
+            <w:r>
+              <w:rPr>
+                <w:rFonts w:cs="Arial"/>
+                <w:sz w:val="20"/>
+                <w:lang w:val="en-US"/>
+              </w:rPr>
+              <w:t>0.5</w:t>
+            </w:r>
           </w:p>
         </w:tc>
         <w:tc>
@@ -1369,6 +1388,14 @@
                 <w:lang w:val="en-US"/>
               </w:rPr>
             </w:pPr>
+            <w:r>
+              <w:rPr>
+                <w:rFonts w:cs="Arial"/>
+                <w:sz w:val="20"/>
+                <w:lang w:val="en-US"/>
+              </w:rPr>
+              <w:t>17.03.2026</w:t>
+            </w:r>
           </w:p>
         </w:tc>
         <w:tc>
@@ -1384,6 +1411,24 @@
                 <w:lang w:val="en-US"/>
               </w:rPr>
             </w:pPr>
+            <w:proofErr w:type="spellStart"/>
+            <w:r>
+              <w:rPr>
+                <w:rFonts w:cs="Arial"/>
+                <w:sz w:val="20"/>
+                <w:lang w:val="en-US"/>
+              </w:rPr>
+              <w:t>DataMap</w:t>
+            </w:r>
+            <w:proofErr w:type="spellEnd"/>
+            <w:r>
+              <w:rPr>
+                <w:rFonts w:cs="Arial"/>
+                <w:sz w:val="20"/>
+                <w:lang w:val="en-US"/>
+              </w:rPr>
+              <w:t xml:space="preserve"> update</w:t>
+            </w:r>
           </w:p>
         </w:tc>
         <w:tc>
@@ -1399,6 +1444,14 @@
                 <w:lang w:val="en-US"/>
               </w:rPr>
             </w:pPr>
+            <w:r>
+              <w:rPr>
+                <w:rFonts w:cs="Arial"/>
+                <w:sz w:val="20"/>
+                <w:lang w:val="en-US"/>
+              </w:rPr>
+              <w:t>Holzer Florentin</w:t>
+            </w:r>
           </w:p>
         </w:tc>
       </w:tr>
@@ -5785,9 +5838,9 @@
           <w:noProof/>
         </w:rPr>
         <w:drawing>
-          <wp:inline distT="0" distB="0" distL="0" distR="0" wp14:anchorId="3A4D622E" wp14:editId="52843C81">
-            <wp:extent cx="9535885" cy="2743200"/>
-            <wp:effectExtent l="0" t="0" r="1905" b="0"/>
+          <wp:inline distT="0" distB="0" distL="0" distR="0" wp14:anchorId="3A4D622E" wp14:editId="4AB70358">
+            <wp:extent cx="9584366" cy="3317358"/>
+            <wp:effectExtent l="0" t="0" r="4445" b="0"/>
             <wp:docPr id="2121408083" name="Grafik 1"/>
             <wp:cNvGraphicFramePr>
               <a:graphicFrameLocks xmlns:a="http://schemas.openxmlformats.org/drawingml/2006/main" noChangeAspect="1"/>
@@ -5814,7 +5867,7 @@
                   <pic:spPr>
                     <a:xfrm>
                       <a:off x="0" y="0"/>
-                      <a:ext cx="9547541" cy="2746553"/>
+                      <a:ext cx="9667666" cy="3346190"/>
                     </a:xfrm>
                     <a:prstGeom prst="rect">
                       <a:avLst/>
@@ -6620,7 +6673,7 @@
               <w:sz w:val="16"/>
               <w:szCs w:val="16"/>
             </w:rPr>
-            <w:t>4</w:t>
+            <w:t>5</w:t>
           </w:r>
         </w:p>
       </w:tc>
@@ -6685,7 +6738,14 @@
               <w:sz w:val="16"/>
               <w:szCs w:val="16"/>
             </w:rPr>
-            <w:t>16</w:t>
+            <w:t>1</w:t>
+          </w:r>
+          <w:r>
+            <w:rPr>
+              <w:sz w:val="16"/>
+              <w:szCs w:val="16"/>
+            </w:rPr>
+            <w:t>7</w:t>
           </w:r>
           <w:r>
             <w:rPr>

</xml_diff>

<commit_message>
Flow Diagram and ETL Description updated
</commit_message>
<xml_diff>
--- a/docs/Citibike.docx
+++ b/docs/Citibike.docx
@@ -1,6 +1,6 @@
 
 <file path=word/document.xml><?xml version="1.0" encoding="utf-8"?>
-<w:document xmlns:wpc="http://schemas.microsoft.com/office/word/2010/wordprocessingCanvas" xmlns:cx="http://schemas.microsoft.com/office/drawing/2014/chartex" xmlns:cx1="http://schemas.microsoft.com/office/drawing/2015/9/8/chartex" xmlns:cx2="http://schemas.microsoft.com/office/drawing/2015/10/21/chartex" xmlns:cx3="http://schemas.microsoft.com/office/drawing/2016/5/9/chartex" xmlns:cx4="http://schemas.microsoft.com/office/drawing/2016/5/10/chartex" xmlns:cx5="http://schemas.microsoft.com/office/drawing/2016/5/11/chartex" xmlns:cx6="http://schemas.microsoft.com/office/drawing/2016/5/12/chartex" xmlns:cx7="http://schemas.microsoft.com/office/drawing/2016/5/13/chartex" xmlns:cx8="http://schemas.microsoft.com/office/drawing/2016/5/14/chartex" xmlns:mc="http://schemas.openxmlformats.org/markup-compatibility/2006" xmlns:aink="http://schemas.microsoft.com/office/drawing/2016/ink" xmlns:am3d="http://schemas.microsoft.com/office/drawing/2017/model3d" xmlns:o="urn:schemas-microsoft-com:office:office" xmlns:r="http://schemas.openxmlformats.org/officeDocument/2006/relationships" xmlns:m="http://schemas.openxmlformats.org/officeDocument/2006/math" xmlns:v="urn:schemas-microsoft-com:vml" xmlns:wp14="http://schemas.microsoft.com/office/word/2010/wordprocessingDrawing" xmlns:wp="http://schemas.openxmlformats.org/drawingml/2006/wordprocessingDrawing" xmlns:w10="urn:schemas-microsoft-com:office:word" xmlns:w="http://schemas.openxmlformats.org/wordprocessingml/2006/main" xmlns:w14="http://schemas.microsoft.com/office/word/2010/wordml" xmlns:w15="http://schemas.microsoft.com/office/word/2012/wordml" xmlns:w16cex="http://schemas.microsoft.com/office/word/2018/wordml/cex" xmlns:w16cid="http://schemas.microsoft.com/office/word/2016/wordml/cid" xmlns:w16="http://schemas.microsoft.com/office/word/2018/wordml" xmlns:w16sdtdh="http://schemas.microsoft.com/office/word/2020/wordml/sdtdatahash" xmlns:w16se="http://schemas.microsoft.com/office/word/2015/wordml/symex" xmlns:wpg="http://schemas.microsoft.com/office/word/2010/wordprocessingGroup" xmlns:wpi="http://schemas.microsoft.com/office/word/2010/wordprocessingInk" xmlns:wne="http://schemas.microsoft.com/office/word/2006/wordml" xmlns:wps="http://schemas.microsoft.com/office/word/2010/wordprocessingShape" mc:Ignorable="w14 w15 w16se w16cid w16 w16cex w16sdtdh wp14">
+<w:document xmlns:wpc="http://schemas.microsoft.com/office/word/2010/wordprocessingCanvas" xmlns:cx="http://schemas.microsoft.com/office/drawing/2014/chartex" xmlns:cx1="http://schemas.microsoft.com/office/drawing/2015/9/8/chartex" xmlns:cx2="http://schemas.microsoft.com/office/drawing/2015/10/21/chartex" xmlns:cx3="http://schemas.microsoft.com/office/drawing/2016/5/9/chartex" xmlns:cx4="http://schemas.microsoft.com/office/drawing/2016/5/10/chartex" xmlns:cx5="http://schemas.microsoft.com/office/drawing/2016/5/11/chartex" xmlns:cx6="http://schemas.microsoft.com/office/drawing/2016/5/12/chartex" xmlns:cx7="http://schemas.microsoft.com/office/drawing/2016/5/13/chartex" xmlns:cx8="http://schemas.microsoft.com/office/drawing/2016/5/14/chartex" xmlns:mc="http://schemas.openxmlformats.org/markup-compatibility/2006" xmlns:aink="http://schemas.microsoft.com/office/drawing/2016/ink" xmlns:am3d="http://schemas.microsoft.com/office/drawing/2017/model3d" xmlns:o="urn:schemas-microsoft-com:office:office" xmlns:oel="http://schemas.microsoft.com/office/2019/extlst" xmlns:r="http://schemas.openxmlformats.org/officeDocument/2006/relationships" xmlns:m="http://schemas.openxmlformats.org/officeDocument/2006/math" xmlns:v="urn:schemas-microsoft-com:vml" xmlns:wp14="http://schemas.microsoft.com/office/word/2010/wordprocessingDrawing" xmlns:wp="http://schemas.openxmlformats.org/drawingml/2006/wordprocessingDrawing" xmlns:w10="urn:schemas-microsoft-com:office:word" xmlns:w="http://schemas.openxmlformats.org/wordprocessingml/2006/main" xmlns:w14="http://schemas.microsoft.com/office/word/2010/wordml" xmlns:w15="http://schemas.microsoft.com/office/word/2012/wordml" xmlns:w16cex="http://schemas.microsoft.com/office/word/2018/wordml/cex" xmlns:w16cid="http://schemas.microsoft.com/office/word/2016/wordml/cid" xmlns:w16="http://schemas.microsoft.com/office/word/2018/wordml" xmlns:w16du="http://schemas.microsoft.com/office/word/2023/wordml/word16du" xmlns:w16sdtdh="http://schemas.microsoft.com/office/word/2020/wordml/sdtdatahash" xmlns:w16sdtfl="http://schemas.microsoft.com/office/word/2024/wordml/sdtformatlock" xmlns:w16se="http://schemas.microsoft.com/office/word/2015/wordml/symex" xmlns:wpg="http://schemas.microsoft.com/office/word/2010/wordprocessingGroup" xmlns:wpi="http://schemas.microsoft.com/office/word/2010/wordprocessingInk" xmlns:wne="http://schemas.microsoft.com/office/word/2006/wordml" xmlns:wps="http://schemas.microsoft.com/office/word/2010/wordprocessingShape" mc:Ignorable="w14 w15 w16se w16cid w16 w16cex w16sdtdh w16sdtfl w16du wp14">
   <w:body>
     <w:p>
       <w:pPr>
@@ -33,7 +33,7 @@
           <w:color w:val="0070C0"/>
           <w:sz w:val="72"/>
           <w:szCs w:val="72"/>
-          <w:lang w:val="de-AT"/>
+          <w:lang w:val="en-GB"/>
         </w:rPr>
       </w:pPr>
       <w:r>
@@ -43,7 +43,7 @@
           <w:color w:val="0070C0"/>
           <w:sz w:val="72"/>
           <w:szCs w:val="72"/>
-          <w:lang w:val="de-AT"/>
+          <w:lang w:val="en-GB"/>
         </w:rPr>
         <w:t>DW/BI Case Study</w:t>
       </w:r>
@@ -55,7 +55,7 @@
           <w:rFonts w:cs="Arial"/>
           <w:color w:val="0000FF"/>
           <w:sz w:val="40"/>
-          <w:lang w:val="de-AT"/>
+          <w:lang w:val="en-GB"/>
         </w:rPr>
       </w:pPr>
     </w:p>
@@ -66,7 +66,7 @@
           <w:rFonts w:cs="Arial"/>
           <w:color w:val="0000FF"/>
           <w:sz w:val="40"/>
-          <w:lang w:val="de-AT"/>
+          <w:lang w:val="en-GB"/>
         </w:rPr>
       </w:pPr>
     </w:p>
@@ -77,7 +77,7 @@
           <w:rFonts w:cs="Arial"/>
           <w:color w:val="0000FF"/>
           <w:sz w:val="40"/>
-          <w:lang w:val="de-AT"/>
+          <w:lang w:val="en-GB"/>
         </w:rPr>
       </w:pPr>
     </w:p>
@@ -88,7 +88,7 @@
           <w:rFonts w:cs="Arial"/>
           <w:color w:val="0000FF"/>
           <w:sz w:val="40"/>
-          <w:lang w:val="de-AT"/>
+          <w:lang w:val="en-GB"/>
         </w:rPr>
       </w:pPr>
     </w:p>
@@ -100,7 +100,7 @@
           <w:b/>
           <w:color w:val="0070C0"/>
           <w:sz w:val="48"/>
-          <w:lang w:val="de-AT"/>
+          <w:lang w:val="en-GB"/>
         </w:rPr>
       </w:pPr>
       <w:r>
@@ -113,7 +113,7 @@
       <w:r>
         <w:rPr>
           <w:rFonts w:cs="Arial"/>
-          <w:lang w:val="de-AT"/>
+          <w:lang w:val="en-GB"/>
         </w:rPr>
         <w:instrText xml:space="preserve"> DOCPROPERTY "projektname"  \* MERGEFORMAT </w:instrText>
       </w:r>
@@ -130,7 +130,7 @@
           <w:b/>
           <w:color w:val="0070C0"/>
           <w:sz w:val="48"/>
-          <w:lang w:val="de-AT"/>
+          <w:lang w:val="en-GB"/>
         </w:rPr>
         <w:t>CITIBIKE</w:t>
       </w:r>
@@ -149,7 +149,7 @@
           <w:rFonts w:cs="Arial"/>
           <w:color w:val="0000FF"/>
           <w:sz w:val="40"/>
-          <w:lang w:val="de-AT"/>
+          <w:lang w:val="en-GB"/>
         </w:rPr>
       </w:pPr>
     </w:p>
@@ -160,7 +160,7 @@
           <w:rFonts w:cs="Arial"/>
           <w:color w:val="0000FF"/>
           <w:sz w:val="40"/>
-          <w:lang w:val="de-AT"/>
+          <w:lang w:val="en-GB"/>
         </w:rPr>
       </w:pPr>
     </w:p>
@@ -170,7 +170,7 @@
         <w:rPr>
           <w:rFonts w:cs="Arial"/>
           <w:color w:val="000000"/>
-          <w:lang w:val="de-AT"/>
+          <w:lang w:val="en-GB"/>
         </w:rPr>
       </w:pPr>
     </w:p>
@@ -180,7 +180,7 @@
         <w:rPr>
           <w:rFonts w:cs="Arial"/>
           <w:color w:val="000000"/>
-          <w:lang w:val="de-AT"/>
+          <w:lang w:val="en-GB"/>
         </w:rPr>
       </w:pPr>
     </w:p>
@@ -190,7 +190,7 @@
         <w:rPr>
           <w:rFonts w:cs="Arial"/>
           <w:color w:val="000000"/>
-          <w:lang w:val="de-AT"/>
+          <w:lang w:val="en-GB"/>
         </w:rPr>
       </w:pPr>
     </w:p>
@@ -200,7 +200,7 @@
         <w:rPr>
           <w:rFonts w:cs="Arial"/>
           <w:color w:val="000000"/>
-          <w:lang w:val="de-AT"/>
+          <w:lang w:val="en-GB"/>
         </w:rPr>
       </w:pPr>
     </w:p>
@@ -210,7 +210,7 @@
         <w:rPr>
           <w:rFonts w:cs="Arial"/>
           <w:color w:val="000000"/>
-          <w:lang w:val="de-AT"/>
+          <w:lang w:val="en-GB"/>
         </w:rPr>
       </w:pPr>
     </w:p>
@@ -220,7 +220,7 @@
         <w:rPr>
           <w:rFonts w:cs="Arial"/>
           <w:color w:val="000000"/>
-          <w:lang w:val="de-AT"/>
+          <w:lang w:val="en-GB"/>
         </w:rPr>
       </w:pPr>
     </w:p>
@@ -230,7 +230,7 @@
         <w:rPr>
           <w:rFonts w:cs="Arial"/>
           <w:color w:val="000000"/>
-          <w:lang w:val="de-AT"/>
+          <w:lang w:val="en-GB"/>
         </w:rPr>
       </w:pPr>
     </w:p>
@@ -240,7 +240,7 @@
         <w:rPr>
           <w:rFonts w:cs="Arial"/>
           <w:color w:val="000000"/>
-          <w:lang w:val="de-AT"/>
+          <w:lang w:val="en-GB"/>
         </w:rPr>
       </w:pPr>
     </w:p>
@@ -250,7 +250,7 @@
         <w:rPr>
           <w:rFonts w:cs="Arial"/>
           <w:color w:val="000000"/>
-          <w:lang w:val="de-AT"/>
+          <w:lang w:val="en-GB"/>
         </w:rPr>
       </w:pPr>
     </w:p>
@@ -260,7 +260,7 @@
         <w:rPr>
           <w:rFonts w:cs="Arial"/>
           <w:color w:val="000000"/>
-          <w:lang w:val="de-AT"/>
+          <w:lang w:val="en-GB"/>
         </w:rPr>
       </w:pPr>
     </w:p>
@@ -270,7 +270,7 @@
         <w:rPr>
           <w:rFonts w:cs="Arial"/>
           <w:color w:val="000000"/>
-          <w:lang w:val="de-AT"/>
+          <w:lang w:val="en-GB"/>
         </w:rPr>
       </w:pPr>
     </w:p>
@@ -280,7 +280,7 @@
         <w:rPr>
           <w:rFonts w:cs="Arial"/>
           <w:color w:val="000000"/>
-          <w:lang w:val="de-AT"/>
+          <w:lang w:val="en-GB"/>
         </w:rPr>
       </w:pPr>
     </w:p>
@@ -290,7 +290,7 @@
         <w:rPr>
           <w:rFonts w:cs="Arial"/>
           <w:color w:val="000000"/>
-          <w:lang w:val="de-AT"/>
+          <w:lang w:val="en-GB"/>
         </w:rPr>
       </w:pPr>
     </w:p>
@@ -303,7 +303,7 @@
           <w:color w:val="404040"/>
           <w:sz w:val="28"/>
           <w:szCs w:val="28"/>
-          <w:lang w:val="de-AT"/>
+          <w:lang w:val="en-GB"/>
         </w:rPr>
       </w:pPr>
       <w:r>
@@ -313,7 +313,7 @@
           <w:color w:val="404040"/>
           <w:sz w:val="28"/>
           <w:szCs w:val="28"/>
-          <w:lang w:val="de-AT"/>
+          <w:lang w:val="en-GB"/>
         </w:rPr>
         <w:t xml:space="preserve">Version </w:t>
       </w:r>
@@ -324,7 +324,7 @@
           <w:color w:val="404040"/>
           <w:sz w:val="28"/>
           <w:szCs w:val="28"/>
-          <w:lang w:val="de-AT"/>
+          <w:lang w:val="en-GB"/>
         </w:rPr>
         <w:t>0</w:t>
       </w:r>
@@ -335,7 +335,7 @@
           <w:color w:val="404040"/>
           <w:sz w:val="28"/>
           <w:szCs w:val="28"/>
-          <w:lang w:val="de-AT"/>
+          <w:lang w:val="en-GB"/>
         </w:rPr>
         <w:t>.</w:t>
       </w:r>
@@ -346,7 +346,7 @@
           <w:color w:val="404040"/>
           <w:sz w:val="28"/>
           <w:szCs w:val="28"/>
-          <w:lang w:val="de-AT"/>
+          <w:lang w:val="en-GB"/>
         </w:rPr>
         <w:t>6</w:t>
       </w:r>
@@ -363,7 +363,6 @@
           <w:lang w:val="de-AT"/>
         </w:rPr>
       </w:pPr>
-      <w:proofErr w:type="spellStart"/>
       <w:r>
         <w:rPr>
           <w:rFonts w:cs="Arial"/>
@@ -375,7 +374,6 @@
         </w:rPr>
         <w:t>CD_citibike</w:t>
       </w:r>
-      <w:proofErr w:type="spellEnd"/>
     </w:p>
     <w:p>
       <w:pPr>
@@ -413,7 +411,6 @@
           <w:lang w:val="de-AT"/>
         </w:rPr>
       </w:pPr>
-      <w:proofErr w:type="spellStart"/>
       <w:r>
         <w:rPr>
           <w:rFonts w:cs="Arial"/>
@@ -423,10 +420,12 @@
           <w:szCs w:val="28"/>
           <w:lang w:val="de-AT"/>
         </w:rPr>
-        <w:t>Murhamer</w:t>
-      </w:r>
-      <w:proofErr w:type="spellEnd"/>
-      <w:r>
+        <w:t>Murhamer Serge Robert, Weber Benjamin</w:t>
+      </w:r>
+    </w:p>
+    <w:p>
+      <w:pPr>
+        <w:jc w:val="center"/>
         <w:rPr>
           <w:rFonts w:cs="Arial"/>
           <w:b/>
@@ -435,12 +434,8 @@
           <w:szCs w:val="28"/>
           <w:lang w:val="de-AT"/>
         </w:rPr>
-        <w:t xml:space="preserve"> Serge Robert, Weber Benjamin</w:t>
-      </w:r>
-    </w:p>
-    <w:p>
-      <w:pPr>
-        <w:jc w:val="center"/>
+      </w:pPr>
+      <w:r>
         <w:rPr>
           <w:rFonts w:cs="Arial"/>
           <w:b/>
@@ -449,7 +444,8 @@
           <w:szCs w:val="28"/>
           <w:lang w:val="de-AT"/>
         </w:rPr>
-      </w:pPr>
+        <w:t>Date</w:t>
+      </w:r>
       <w:r>
         <w:rPr>
           <w:rFonts w:cs="Arial"/>
@@ -459,7 +455,7 @@
           <w:szCs w:val="28"/>
           <w:lang w:val="de-AT"/>
         </w:rPr>
-        <w:t>Date</w:t>
+        <w:t xml:space="preserve">: </w:t>
       </w:r>
       <w:r>
         <w:rPr>
@@ -470,7 +466,7 @@
           <w:szCs w:val="28"/>
           <w:lang w:val="de-AT"/>
         </w:rPr>
-        <w:t xml:space="preserve">: </w:t>
+        <w:t>2026-03-</w:t>
       </w:r>
       <w:r>
         <w:rPr>
@@ -481,9 +477,12 @@
           <w:szCs w:val="28"/>
           <w:lang w:val="de-AT"/>
         </w:rPr>
-        <w:t>2026-03-</w:t>
-      </w:r>
-      <w:r>
+        <w:t>23</w:t>
+      </w:r>
+    </w:p>
+    <w:p>
+      <w:pPr>
+        <w:jc w:val="center"/>
         <w:rPr>
           <w:rFonts w:cs="Arial"/>
           <w:b/>
@@ -492,8 +491,7 @@
           <w:szCs w:val="28"/>
           <w:lang w:val="de-AT"/>
         </w:rPr>
-        <w:t>23</w:t>
-      </w:r>
+      </w:pPr>
     </w:p>
     <w:p>
       <w:pPr>
@@ -562,19 +560,6 @@
     </w:p>
     <w:p>
       <w:pPr>
-        <w:jc w:val="center"/>
-        <w:rPr>
-          <w:rFonts w:cs="Arial"/>
-          <w:b/>
-          <w:color w:val="404040"/>
-          <w:sz w:val="28"/>
-          <w:szCs w:val="28"/>
-          <w:lang w:val="de-AT"/>
-        </w:rPr>
-      </w:pPr>
-    </w:p>
-    <w:p>
-      <w:pPr>
         <w:tabs>
           <w:tab w:val="left" w:pos="1455"/>
         </w:tabs>
@@ -593,7 +578,7 @@
           <w:lang w:val="de-AT" w:eastAsia="de-AT"/>
         </w:rPr>
         <w:drawing>
-          <wp:inline distT="0" distB="0" distL="0" distR="0" wp14:anchorId="60E7A0F6" wp14:editId="1626AED4">
+          <wp:inline distT="0" distB="0" distL="0" distR="0" wp14:anchorId="60E7A0F6" wp14:editId="14E6B246">
             <wp:extent cx="1350010" cy="350520"/>
             <wp:effectExtent l="0" t="0" r="0" b="0"/>
             <wp:docPr id="1" name="Bild 1"/>
@@ -648,14 +633,14 @@
         <w:rPr>
           <w:rFonts w:cs="Arial"/>
           <w:sz w:val="44"/>
-          <w:lang w:val="de-AT"/>
+          <w:lang w:val="en-GB"/>
         </w:rPr>
       </w:pPr>
       <w:r>
         <w:rPr>
           <w:rFonts w:cs="Arial"/>
           <w:sz w:val="44"/>
-          <w:lang w:val="de-AT"/>
+          <w:lang w:val="en-GB"/>
         </w:rPr>
         <w:br w:type="page"/>
       </w:r>
@@ -663,7 +648,7 @@
         <w:rPr>
           <w:rFonts w:cs="Arial"/>
           <w:sz w:val="44"/>
-          <w:lang w:val="de-AT"/>
+          <w:lang w:val="en-GB"/>
         </w:rPr>
         <w:lastRenderedPageBreak/>
         <w:t>Change Log</w:t>
@@ -673,7 +658,7 @@
       <w:pPr>
         <w:rPr>
           <w:rFonts w:cs="Arial"/>
-          <w:lang w:val="de-AT"/>
+          <w:lang w:val="en-GB"/>
         </w:rPr>
       </w:pPr>
       <w:bookmarkStart w:id="0" w:name="_Toc480014310"/>
@@ -704,9 +689,22 @@
           <w:noProof/>
           <w:color w:val="943634"/>
           <w:sz w:val="20"/>
-          <w:lang w:val="de-AT"/>
-        </w:rPr>
-        <w:t>Information: Enter the document history and the current state. Pay attention to the regular data maintenance. Use the above table “Legend” for the right description.</w:t>
+          <w:lang w:val="en-GB"/>
+        </w:rPr>
+        <w:t xml:space="preserve">Information: Enter the document history and the current state. Pay attention to the regular data maintenance. </w:t>
+      </w:r>
+      <w:r>
+        <w:rPr>
+          <w:rFonts w:cs="Arial"/>
+          <w:b/>
+          <w:bCs/>
+          <w:i/>
+          <w:noProof/>
+          <w:color w:val="943634"/>
+          <w:sz w:val="20"/>
+          <w:lang w:val="de-AT"/>
+        </w:rPr>
+        <w:t>Use the above table “Legend” for the right description.</w:t>
       </w:r>
     </w:p>
     <w:p>
@@ -776,20 +774,8 @@
                 <w:sz w:val="20"/>
                 <w:lang w:val="de-AT"/>
               </w:rPr>
-              <w:t xml:space="preserve">Version </w:t>
+              <w:t>Version number</w:t>
             </w:r>
-            <w:proofErr w:type="spellStart"/>
-            <w:r>
-              <w:rPr>
-                <w:rFonts w:cs="Arial"/>
-                <w:b/>
-                <w:bCs/>
-                <w:sz w:val="20"/>
-                <w:lang w:val="de-AT"/>
-              </w:rPr>
-              <w:t>number</w:t>
-            </w:r>
-            <w:proofErr w:type="spellEnd"/>
           </w:p>
         </w:tc>
         <w:tc>
@@ -953,14 +939,14 @@
               <w:rPr>
                 <w:rFonts w:cs="Arial"/>
                 <w:sz w:val="20"/>
-                <w:lang w:val="de-AT"/>
+                <w:lang w:val="en-GB"/>
               </w:rPr>
             </w:pPr>
             <w:r>
               <w:rPr>
                 <w:rFonts w:cs="Arial"/>
                 <w:sz w:val="20"/>
-                <w:lang w:val="de-AT"/>
+                <w:lang w:val="en-GB"/>
               </w:rPr>
               <w:t>Business Case and Data Model</w:t>
             </w:r>
@@ -1159,25 +1145,7 @@
                 <w:sz w:val="20"/>
                 <w:lang w:val="de-AT"/>
               </w:rPr>
-              <w:t xml:space="preserve">Flow </w:t>
-            </w:r>
-            <w:proofErr w:type="spellStart"/>
-            <w:r>
-              <w:rPr>
-                <w:rFonts w:cs="Arial"/>
-                <w:sz w:val="20"/>
-                <w:lang w:val="de-AT"/>
-              </w:rPr>
-              <w:t>Diagram</w:t>
-            </w:r>
-            <w:proofErr w:type="spellEnd"/>
-            <w:r>
-              <w:rPr>
-                <w:rFonts w:cs="Arial"/>
-                <w:sz w:val="20"/>
-                <w:lang w:val="de-AT"/>
-              </w:rPr>
-              <w:t xml:space="preserve"> hinzugefügt</w:t>
+              <w:t>Flow Diagram hinzugefügt</w:t>
             </w:r>
           </w:p>
         </w:tc>
@@ -1275,25 +1243,7 @@
                 <w:sz w:val="20"/>
                 <w:lang w:val="de-AT"/>
               </w:rPr>
-              <w:t xml:space="preserve">Data </w:t>
-            </w:r>
-            <w:proofErr w:type="spellStart"/>
-            <w:r>
-              <w:rPr>
-                <w:rFonts w:cs="Arial"/>
-                <w:sz w:val="20"/>
-                <w:lang w:val="de-AT"/>
-              </w:rPr>
-              <w:t>Diagram</w:t>
-            </w:r>
-            <w:proofErr w:type="spellEnd"/>
-            <w:r>
-              <w:rPr>
-                <w:rFonts w:cs="Arial"/>
-                <w:sz w:val="20"/>
-                <w:lang w:val="de-AT"/>
-              </w:rPr>
-              <w:t xml:space="preserve"> hinzugefügt</w:t>
+              <w:t>Data Diagram hinzugefügt</w:t>
             </w:r>
           </w:p>
         </w:tc>
@@ -1385,23 +1335,13 @@
                 <w:lang w:val="de-AT"/>
               </w:rPr>
             </w:pPr>
-            <w:proofErr w:type="spellStart"/>
             <w:r>
               <w:rPr>
                 <w:rFonts w:cs="Arial"/>
                 <w:sz w:val="20"/>
                 <w:lang w:val="de-AT"/>
               </w:rPr>
-              <w:t>DataMap</w:t>
-            </w:r>
-            <w:proofErr w:type="spellEnd"/>
-            <w:r>
-              <w:rPr>
-                <w:rFonts w:cs="Arial"/>
-                <w:sz w:val="20"/>
-                <w:lang w:val="de-AT"/>
-              </w:rPr>
-              <w:t xml:space="preserve"> update</w:t>
+              <w:t>DataMap update</w:t>
             </w:r>
           </w:p>
         </w:tc>
@@ -1523,16 +1463,7 @@
                 <w:sz w:val="20"/>
                 <w:lang w:val="de-AT"/>
               </w:rPr>
-              <w:t xml:space="preserve"> </w:t>
-            </w:r>
-            <w:proofErr w:type="spellStart"/>
-            <w:r>
-              <w:rPr>
-                <w:rFonts w:cs="Arial"/>
-                <w:sz w:val="20"/>
-                <w:lang w:val="de-AT"/>
-              </w:rPr>
-              <w:t>i</w:t>
+              <w:t xml:space="preserve"> i</w:t>
             </w:r>
             <w:r>
               <w:rPr>
@@ -1540,16 +1471,7 @@
                 <w:sz w:val="20"/>
                 <w:lang w:val="de-AT"/>
               </w:rPr>
-              <w:t>mplementation</w:t>
-            </w:r>
-            <w:proofErr w:type="spellEnd"/>
-            <w:r>
-              <w:rPr>
-                <w:rFonts w:cs="Arial"/>
-                <w:sz w:val="20"/>
-                <w:lang w:val="de-AT"/>
-              </w:rPr>
-              <w:t xml:space="preserve"> hinzugefügt</w:t>
+              <w:t>mplementation hinzugefügt</w:t>
             </w:r>
           </w:p>
         </w:tc>
@@ -2321,41 +2243,14 @@
               <w:rPr>
                 <w:rFonts w:cs="Arial"/>
                 <w:sz w:val="20"/>
-                <w:lang w:val="de-AT"/>
+                <w:lang w:val="en-GB"/>
               </w:rPr>
             </w:pPr>
             <w:r>
               <w:rPr>
                 <w:rFonts w:cs="Arial"/>
                 <w:sz w:val="20"/>
-                <w:lang w:val="de-AT"/>
-              </w:rPr>
-              <w:t xml:space="preserve">In </w:t>
-            </w:r>
-            <w:proofErr w:type="spellStart"/>
-            <w:r>
-              <w:rPr>
-                <w:rFonts w:cs="Arial"/>
-                <w:sz w:val="20"/>
-                <w:lang w:val="de-AT"/>
-              </w:rPr>
-              <w:t>work</w:t>
-            </w:r>
-            <w:proofErr w:type="spellEnd"/>
-          </w:p>
-          <w:p>
-            <w:pPr>
-              <w:rPr>
-                <w:rFonts w:cs="Arial"/>
-                <w:sz w:val="20"/>
-                <w:lang w:val="de-AT"/>
-              </w:rPr>
-            </w:pPr>
-            <w:r>
-              <w:rPr>
-                <w:rFonts w:cs="Arial"/>
-                <w:sz w:val="20"/>
-                <w:lang w:val="de-AT"/>
+                <w:lang w:val="en-GB"/>
               </w:rPr>
               <w:t xml:space="preserve">In </w:t>
             </w:r>
@@ -2363,7 +2258,32 @@
               <w:rPr>
                 <w:rFonts w:cs="Arial"/>
                 <w:sz w:val="20"/>
-                <w:lang w:val="de-AT"/>
+                <w:lang w:val="en-GB"/>
+              </w:rPr>
+              <w:t>work</w:t>
+            </w:r>
+          </w:p>
+          <w:p>
+            <w:pPr>
+              <w:rPr>
+                <w:rFonts w:cs="Arial"/>
+                <w:sz w:val="20"/>
+                <w:lang w:val="en-GB"/>
+              </w:rPr>
+            </w:pPr>
+            <w:r>
+              <w:rPr>
+                <w:rFonts w:cs="Arial"/>
+                <w:sz w:val="20"/>
+                <w:lang w:val="en-GB"/>
+              </w:rPr>
+              <w:t xml:space="preserve">In </w:t>
+            </w:r>
+            <w:r>
+              <w:rPr>
+                <w:rFonts w:cs="Arial"/>
+                <w:sz w:val="20"/>
+                <w:lang w:val="en-GB"/>
               </w:rPr>
               <w:t>r</w:t>
             </w:r>
@@ -2371,7 +2291,7 @@
               <w:rPr>
                 <w:rFonts w:cs="Arial"/>
                 <w:sz w:val="20"/>
-                <w:lang w:val="de-AT"/>
+                <w:lang w:val="en-GB"/>
               </w:rPr>
               <w:t xml:space="preserve">eview </w:t>
             </w:r>
@@ -2381,55 +2301,25 @@
               <w:rPr>
                 <w:rFonts w:cs="Arial"/>
                 <w:sz w:val="20"/>
-                <w:lang w:val="de-AT"/>
+                <w:lang w:val="en-GB"/>
               </w:rPr>
             </w:pPr>
-            <w:proofErr w:type="spellStart"/>
             <w:r>
               <w:rPr>
                 <w:rFonts w:cs="Arial"/>
                 <w:sz w:val="20"/>
-                <w:lang w:val="de-AT"/>
+                <w:lang w:val="en-GB"/>
               </w:rPr>
               <w:t>Released</w:t>
             </w:r>
-            <w:proofErr w:type="spellEnd"/>
             <w:r>
               <w:rPr>
                 <w:rFonts w:cs="Arial"/>
                 <w:sz w:val="20"/>
-                <w:lang w:val="de-AT"/>
+                <w:lang w:val="en-GB"/>
               </w:rPr>
-              <w:t xml:space="preserve">, </w:t>
+              <w:t>, freed version</w:t>
             </w:r>
-            <w:proofErr w:type="spellStart"/>
-            <w:r>
-              <w:rPr>
-                <w:rFonts w:cs="Arial"/>
-                <w:sz w:val="20"/>
-                <w:lang w:val="de-AT"/>
-              </w:rPr>
-              <w:t>freed</w:t>
-            </w:r>
-            <w:proofErr w:type="spellEnd"/>
-            <w:r>
-              <w:rPr>
-                <w:rFonts w:cs="Arial"/>
-                <w:sz w:val="20"/>
-                <w:lang w:val="de-AT"/>
-              </w:rPr>
-              <w:t xml:space="preserve"> </w:t>
-            </w:r>
-            <w:proofErr w:type="spellStart"/>
-            <w:r>
-              <w:rPr>
-                <w:rFonts w:cs="Arial"/>
-                <w:sz w:val="20"/>
-                <w:lang w:val="de-AT"/>
-              </w:rPr>
-              <w:t>version</w:t>
-            </w:r>
-            <w:proofErr w:type="spellEnd"/>
           </w:p>
         </w:tc>
       </w:tr>
@@ -2447,7 +2337,6 @@
                 <w:szCs w:val="20"/>
               </w:rPr>
             </w:pPr>
-            <w:proofErr w:type="spellStart"/>
             <w:r>
               <w:rPr>
                 <w:b/>
@@ -2457,7 +2346,6 @@
               </w:rPr>
               <w:t>Versioning</w:t>
             </w:r>
-            <w:proofErr w:type="spellEnd"/>
           </w:p>
         </w:tc>
         <w:tc>
@@ -2550,180 +2438,68 @@
               <w:rPr>
                 <w:rFonts w:cs="Arial"/>
                 <w:sz w:val="20"/>
-                <w:lang w:val="de-AT"/>
+                <w:lang w:val="en-GB"/>
               </w:rPr>
             </w:pPr>
             <w:r>
               <w:rPr>
                 <w:rFonts w:cs="Arial"/>
                 <w:sz w:val="20"/>
-                <w:lang w:val="de-AT"/>
+                <w:lang w:val="en-GB"/>
               </w:rPr>
-              <w:t xml:space="preserve">Not </w:t>
+              <w:t>Not approved version</w:t>
             </w:r>
-            <w:proofErr w:type="spellStart"/>
-            <w:r>
-              <w:rPr>
-                <w:rFonts w:cs="Arial"/>
-                <w:sz w:val="20"/>
-                <w:lang w:val="de-AT"/>
-              </w:rPr>
-              <w:t>approved</w:t>
-            </w:r>
-            <w:proofErr w:type="spellEnd"/>
-            <w:r>
-              <w:rPr>
-                <w:rFonts w:cs="Arial"/>
-                <w:sz w:val="20"/>
-                <w:lang w:val="de-AT"/>
-              </w:rPr>
-              <w:t xml:space="preserve"> </w:t>
-            </w:r>
-            <w:proofErr w:type="spellStart"/>
-            <w:r>
-              <w:rPr>
-                <w:rFonts w:cs="Arial"/>
-                <w:sz w:val="20"/>
-                <w:lang w:val="de-AT"/>
-              </w:rPr>
-              <w:t>version</w:t>
-            </w:r>
-            <w:proofErr w:type="spellEnd"/>
           </w:p>
           <w:p>
             <w:pPr>
               <w:rPr>
                 <w:rFonts w:cs="Arial"/>
                 <w:sz w:val="20"/>
-                <w:lang w:val="de-AT"/>
+                <w:lang w:val="en-GB"/>
               </w:rPr>
             </w:pPr>
             <w:r>
               <w:rPr>
                 <w:rFonts w:cs="Arial"/>
                 <w:sz w:val="20"/>
-                <w:lang w:val="de-AT"/>
+                <w:lang w:val="en-GB"/>
               </w:rPr>
-              <w:t xml:space="preserve">First </w:t>
+              <w:t>First released version</w:t>
             </w:r>
-            <w:proofErr w:type="spellStart"/>
-            <w:r>
-              <w:rPr>
-                <w:rFonts w:cs="Arial"/>
-                <w:sz w:val="20"/>
-                <w:lang w:val="de-AT"/>
-              </w:rPr>
-              <w:t>released</w:t>
-            </w:r>
-            <w:proofErr w:type="spellEnd"/>
-            <w:r>
-              <w:rPr>
-                <w:rFonts w:cs="Arial"/>
-                <w:sz w:val="20"/>
-                <w:lang w:val="de-AT"/>
-              </w:rPr>
-              <w:t xml:space="preserve"> </w:t>
-            </w:r>
-            <w:proofErr w:type="spellStart"/>
-            <w:r>
-              <w:rPr>
-                <w:rFonts w:cs="Arial"/>
-                <w:sz w:val="20"/>
-                <w:lang w:val="de-AT"/>
-              </w:rPr>
-              <w:t>version</w:t>
-            </w:r>
-            <w:proofErr w:type="spellEnd"/>
           </w:p>
           <w:p>
             <w:pPr>
               <w:rPr>
                 <w:rFonts w:cs="Arial"/>
                 <w:sz w:val="20"/>
-                <w:lang w:val="de-AT"/>
+                <w:lang w:val="en-GB"/>
               </w:rPr>
             </w:pPr>
             <w:r>
               <w:rPr>
                 <w:rFonts w:cs="Arial"/>
                 <w:sz w:val="20"/>
-                <w:lang w:val="de-AT"/>
+                <w:lang w:val="en-GB"/>
               </w:rPr>
-              <w:t xml:space="preserve">Extended </w:t>
+              <w:t>Extended first version</w:t>
             </w:r>
-            <w:proofErr w:type="spellStart"/>
-            <w:r>
-              <w:rPr>
-                <w:rFonts w:cs="Arial"/>
-                <w:sz w:val="20"/>
-                <w:lang w:val="de-AT"/>
-              </w:rPr>
-              <w:t>first</w:t>
-            </w:r>
-            <w:proofErr w:type="spellEnd"/>
-            <w:r>
-              <w:rPr>
-                <w:rFonts w:cs="Arial"/>
-                <w:sz w:val="20"/>
-                <w:lang w:val="de-AT"/>
-              </w:rPr>
-              <w:t xml:space="preserve"> </w:t>
-            </w:r>
-            <w:proofErr w:type="spellStart"/>
-            <w:r>
-              <w:rPr>
-                <w:rFonts w:cs="Arial"/>
-                <w:sz w:val="20"/>
-                <w:lang w:val="de-AT"/>
-              </w:rPr>
-              <w:t>version</w:t>
-            </w:r>
-            <w:proofErr w:type="spellEnd"/>
           </w:p>
           <w:p>
             <w:pPr>
               <w:rPr>
                 <w:rFonts w:cs="Arial"/>
                 <w:sz w:val="20"/>
-                <w:lang w:val="de-AT"/>
+                <w:lang w:val="en-GB"/>
               </w:rPr>
             </w:pPr>
             <w:r>
               <w:rPr>
                 <w:rFonts w:cs="Arial"/>
                 <w:sz w:val="20"/>
-                <w:lang w:val="de-AT"/>
+                <w:lang w:val="en-GB"/>
               </w:rPr>
-              <w:t xml:space="preserve">Second </w:t>
+              <w:t>Second released version</w:t>
             </w:r>
-            <w:proofErr w:type="spellStart"/>
-            <w:r>
-              <w:rPr>
-                <w:rFonts w:cs="Arial"/>
-                <w:sz w:val="20"/>
-                <w:lang w:val="de-AT"/>
-              </w:rPr>
-              <w:t>released</w:t>
-            </w:r>
-            <w:proofErr w:type="spellEnd"/>
-            <w:r>
-              <w:rPr>
-                <w:rFonts w:cs="Arial"/>
-                <w:sz w:val="20"/>
-                <w:lang w:val="de-AT"/>
-              </w:rPr>
-              <w:t xml:space="preserve"> </w:t>
-            </w:r>
-            <w:proofErr w:type="spellStart"/>
-            <w:r>
-              <w:rPr>
-                <w:rFonts w:cs="Arial"/>
-                <w:sz w:val="20"/>
-                <w:lang w:val="de-AT"/>
-              </w:rPr>
-              <w:t>version</w:t>
-            </w:r>
-            <w:proofErr w:type="spellEnd"/>
           </w:p>
         </w:tc>
       </w:tr>
@@ -2732,7 +2508,7 @@
       <w:pPr>
         <w:rPr>
           <w:rFonts w:cs="Arial"/>
-          <w:lang w:val="de-AT"/>
+          <w:lang w:val="en-GB"/>
         </w:rPr>
       </w:pPr>
       <w:bookmarkStart w:id="5" w:name="_Toc480014326"/>
@@ -2747,33 +2523,22 @@
       <w:pPr>
         <w:rPr>
           <w:rFonts w:cs="Arial"/>
-          <w:lang w:val="de-AT"/>
-        </w:rPr>
-      </w:pPr>
-      <w:proofErr w:type="spellStart"/>
+          <w:lang w:val="en-GB"/>
+        </w:rPr>
+      </w:pPr>
       <w:r>
         <w:rPr>
           <w:rFonts w:cs="Arial"/>
           <w:b/>
           <w:bCs/>
-          <w:lang w:val="de-AT"/>
-        </w:rPr>
-        <w:t>Github</w:t>
-      </w:r>
-      <w:proofErr w:type="spellEnd"/>
+          <w:lang w:val="en-GB"/>
+        </w:rPr>
+        <w:t>Github-Link:</w:t>
+      </w:r>
       <w:r>
         <w:rPr>
           <w:rFonts w:cs="Arial"/>
-          <w:b/>
-          <w:bCs/>
-          <w:lang w:val="de-AT"/>
-        </w:rPr>
-        <w:t>-Link:</w:t>
-      </w:r>
-      <w:r>
-        <w:rPr>
-          <w:rFonts w:cs="Arial"/>
-          <w:lang w:val="de-AT"/>
+          <w:lang w:val="en-GB"/>
         </w:rPr>
         <w:t xml:space="preserve"> </w:t>
       </w:r>
@@ -2782,7 +2547,7 @@
           <w:rPr>
             <w:rStyle w:val="Hyperlink"/>
             <w:rFonts w:cs="Arial"/>
-            <w:lang w:val="de-AT"/>
+            <w:lang w:val="en-GB"/>
           </w:rPr>
           <w:t>https://github.com/floholzer/Citibike_Project</w:t>
         </w:r>
@@ -2790,7 +2555,7 @@
       <w:r>
         <w:rPr>
           <w:rFonts w:cs="Arial"/>
-          <w:lang w:val="de-AT"/>
+          <w:lang w:val="en-GB"/>
         </w:rPr>
         <w:t xml:space="preserve"> </w:t>
       </w:r>
@@ -2809,7 +2574,7 @@
           <w:rFonts w:cs="Arial"/>
           <w:sz w:val="44"/>
           <w:szCs w:val="44"/>
-          <w:lang w:val="de-AT"/>
+          <w:lang w:val="en-GB"/>
         </w:rPr>
         <w:br w:type="page"/>
       </w:r>
@@ -2821,27 +2586,7 @@
           <w:lang w:val="de-AT"/>
         </w:rPr>
         <w:lastRenderedPageBreak/>
-        <w:t xml:space="preserve">Table </w:t>
-      </w:r>
-      <w:proofErr w:type="spellStart"/>
-      <w:r>
-        <w:rPr>
-          <w:rFonts w:cs="Arial"/>
-          <w:sz w:val="44"/>
-          <w:szCs w:val="44"/>
-          <w:lang w:val="de-AT"/>
-        </w:rPr>
-        <w:t>of</w:t>
-      </w:r>
-      <w:proofErr w:type="spellEnd"/>
-      <w:r>
-        <w:rPr>
-          <w:rFonts w:cs="Arial"/>
-          <w:sz w:val="44"/>
-          <w:szCs w:val="44"/>
-          <w:lang w:val="de-AT"/>
-        </w:rPr>
-        <w:t xml:space="preserve"> Content</w:t>
+        <w:t>Table of Content</w:t>
       </w:r>
     </w:p>
     <w:p>
@@ -5053,9 +4798,15 @@
     <w:p>
       <w:pPr>
         <w:pStyle w:val="berschrift2"/>
+        <w:rPr>
+          <w:lang w:val="en-GB"/>
+        </w:rPr>
       </w:pPr>
       <w:bookmarkStart w:id="9" w:name="_Toc225192399"/>
       <w:r>
+        <w:rPr>
+          <w:lang w:val="en-GB"/>
+        </w:rPr>
         <w:t>Proposal for Improving the Business Case</w:t>
       </w:r>
       <w:bookmarkEnd w:id="9"/>
@@ -5098,7 +4849,6 @@
         </w:rPr>
         <w:t xml:space="preserve">Datensatz: </w:t>
       </w:r>
-      <w:proofErr w:type="spellStart"/>
       <w:r>
         <w:rPr>
           <w:rFonts w:cs="Arial"/>
@@ -5108,9 +4858,8 @@
           <w:szCs w:val="22"/>
           <w:lang w:val="de-AT"/>
         </w:rPr>
-        <w:t>Citibike</w:t>
-      </w:r>
-      <w:proofErr w:type="spellEnd"/>
+        <w:t>Citibike Usage (Nutzungsdaten des New Yorker Fahrradverleihsystems).</w:t>
+      </w:r>
       <w:r>
         <w:rPr>
           <w:rFonts w:cs="Arial"/>
@@ -5120,10 +4869,12 @@
           <w:szCs w:val="22"/>
           <w:lang w:val="de-AT"/>
         </w:rPr>
-        <w:t xml:space="preserve"> </w:t>
-      </w:r>
-      <w:proofErr w:type="spellStart"/>
-      <w:r>
+        <w:br/>
+        <w:t>Zusätzlicher Datensatz: Historische Wetterdaten open-meteo.com</w:t>
+      </w:r>
+    </w:p>
+    <w:p>
+      <w:pPr>
         <w:rPr>
           <w:rFonts w:cs="Arial"/>
           <w:bCs/>
@@ -5132,9 +4883,18 @@
           <w:szCs w:val="22"/>
           <w:lang w:val="de-AT"/>
         </w:rPr>
-        <w:t>Usage</w:t>
-      </w:r>
-      <w:proofErr w:type="spellEnd"/>
+      </w:pPr>
+      <w:r>
+        <w:rPr>
+          <w:rFonts w:cs="Arial"/>
+          <w:b/>
+          <w:iCs/>
+          <w:sz w:val="22"/>
+          <w:szCs w:val="22"/>
+          <w:lang w:val="de-AT"/>
+        </w:rPr>
+        <w:t>Titel des Use Cases</w:t>
+      </w:r>
       <w:r>
         <w:rPr>
           <w:rFonts w:cs="Arial"/>
@@ -5144,9 +4904,11 @@
           <w:szCs w:val="22"/>
           <w:lang w:val="de-AT"/>
         </w:rPr>
-        <w:t xml:space="preserve"> (Nutzungsdaten des New Yorker Fahrradverleihsystems).</w:t>
-      </w:r>
-      <w:r>
+        <w:t>: Einfluss der Wetterbedingungen auf Citibike-Usage und Conversion (Casual to Member)</w:t>
+      </w:r>
+    </w:p>
+    <w:p>
+      <w:pPr>
         <w:rPr>
           <w:rFonts w:cs="Arial"/>
           <w:bCs/>
@@ -5155,12 +4917,19 @@
           <w:szCs w:val="22"/>
           <w:lang w:val="de-AT"/>
         </w:rPr>
-        <w:br/>
-        <w:t>Zusätzlicher Datensatz: Historische Wetterdaten open-meteo.com</w:t>
-      </w:r>
-    </w:p>
-    <w:p>
-      <w:pPr>
+      </w:pPr>
+      <w:r>
+        <w:rPr>
+          <w:rFonts w:cs="Arial"/>
+          <w:b/>
+          <w:iCs/>
+          <w:sz w:val="22"/>
+          <w:szCs w:val="22"/>
+          <w:lang w:val="de-AT"/>
+        </w:rPr>
+        <w:t>Ausrichtung:</w:t>
+      </w:r>
+      <w:r>
         <w:rPr>
           <w:rFonts w:cs="Arial"/>
           <w:bCs/>
@@ -5169,6 +4938,47 @@
           <w:szCs w:val="22"/>
           <w:lang w:val="de-AT"/>
         </w:rPr>
+        <w:t xml:space="preserve"> Verknüpfung von CitiBike-Fahrtdaten mit Wetterdaten um zu analysieren, wie Wetterbedingungen die Nutzungshäufigkeit und Conversion beeinflussen.</w:t>
+      </w:r>
+    </w:p>
+    <w:p>
+      <w:pPr>
+        <w:rPr>
+          <w:rFonts w:cs="Arial"/>
+          <w:bCs/>
+          <w:iCs/>
+          <w:sz w:val="22"/>
+          <w:szCs w:val="22"/>
+          <w:lang w:val="de-AT"/>
+        </w:rPr>
+      </w:pPr>
+    </w:p>
+    <w:p>
+      <w:pPr>
+        <w:pStyle w:val="berschrift3"/>
+        <w:rPr>
+          <w:lang w:val="de-AT"/>
+        </w:rPr>
+      </w:pPr>
+      <w:bookmarkStart w:id="11" w:name="_Toc225192401"/>
+      <w:r>
+        <w:rPr>
+          <w:lang w:val="de-AT"/>
+        </w:rPr>
+        <w:t>Stakeholder</w:t>
+      </w:r>
+      <w:bookmarkEnd w:id="11"/>
+    </w:p>
+    <w:p>
+      <w:pPr>
+        <w:rPr>
+          <w:rFonts w:cs="Arial"/>
+          <w:bCs/>
+          <w:iCs/>
+          <w:sz w:val="22"/>
+          <w:szCs w:val="22"/>
+          <w:lang w:val="en-GB"/>
+        </w:rPr>
       </w:pPr>
       <w:r>
         <w:rPr>
@@ -5177,9 +4987,9 @@
           <w:iCs/>
           <w:sz w:val="22"/>
           <w:szCs w:val="22"/>
-          <w:lang w:val="de-AT"/>
-        </w:rPr>
-        <w:t>Titel des Use Cases</w:t>
+          <w:lang w:val="en-GB"/>
+        </w:rPr>
+        <w:t>Primärer Stakeholder</w:t>
       </w:r>
       <w:r>
         <w:rPr>
@@ -5188,24 +4998,41 @@
           <w:iCs/>
           <w:sz w:val="22"/>
           <w:szCs w:val="22"/>
-          <w:lang w:val="de-AT"/>
-        </w:rPr>
-        <w:t xml:space="preserve">: Einfluss der Wetterbedingungen auf </w:t>
-      </w:r>
-      <w:proofErr w:type="spellStart"/>
-      <w:r>
+          <w:lang w:val="en-GB"/>
+        </w:rPr>
+        <w:t>: Operatives Management von CitiBike</w:t>
+      </w:r>
+    </w:p>
+    <w:p>
+      <w:pPr>
         <w:rPr>
           <w:rFonts w:cs="Arial"/>
           <w:bCs/>
           <w:iCs/>
           <w:sz w:val="22"/>
           <w:szCs w:val="22"/>
-          <w:lang w:val="de-AT"/>
-        </w:rPr>
-        <w:t>Citibike-Usage</w:t>
-      </w:r>
-      <w:proofErr w:type="spellEnd"/>
-      <w:r>
+          <w:lang w:val="en-GB"/>
+        </w:rPr>
+      </w:pPr>
+    </w:p>
+    <w:p>
+      <w:pPr>
+        <w:pStyle w:val="berschrift3"/>
+        <w:rPr>
+          <w:lang w:val="de-AT"/>
+        </w:rPr>
+      </w:pPr>
+      <w:bookmarkStart w:id="12" w:name="_Toc225192402"/>
+      <w:r>
+        <w:rPr>
+          <w:lang w:val="de-AT"/>
+        </w:rPr>
+        <w:t>Business Case</w:t>
+      </w:r>
+      <w:bookmarkEnd w:id="12"/>
+    </w:p>
+    <w:p>
+      <w:pPr>
         <w:rPr>
           <w:rFonts w:cs="Arial"/>
           <w:bCs/>
@@ -5214,9 +5041,18 @@
           <w:szCs w:val="22"/>
           <w:lang w:val="de-AT"/>
         </w:rPr>
-        <w:t xml:space="preserve"> und </w:t>
-      </w:r>
-      <w:proofErr w:type="spellStart"/>
+      </w:pPr>
+      <w:r>
+        <w:rPr>
+          <w:rFonts w:cs="Arial"/>
+          <w:b/>
+          <w:iCs/>
+          <w:sz w:val="22"/>
+          <w:szCs w:val="22"/>
+          <w:lang w:val="de-AT"/>
+        </w:rPr>
+        <w:t>Current Approach (Aktuelle Situation):</w:t>
+      </w:r>
       <w:r>
         <w:rPr>
           <w:rFonts w:cs="Arial"/>
@@ -5226,10 +5062,11 @@
           <w:szCs w:val="22"/>
           <w:lang w:val="de-AT"/>
         </w:rPr>
-        <w:t>Conversion</w:t>
-      </w:r>
-      <w:proofErr w:type="spellEnd"/>
-      <w:r>
+        <w:t xml:space="preserve"> Die operative Steuerung des Bike-Sharing-Systems basiert primär auf historischen Fahrtdaten und Erfahrungswerten. Externe Einflussfaktoren – insbesondere das Wetter – werden bislang nicht systematisch in die Analyse der Nutzung einbezogen. Dadurch fehlen fundierte Erkenntnisse darüber, wie sich Temperatur und Niederschlag konkret auf Nachfrage, Stationsauslastung und Nutzersegmente auswirken.</w:t>
+      </w:r>
+    </w:p>
+    <w:p>
+      <w:pPr>
         <w:rPr>
           <w:rFonts w:cs="Arial"/>
           <w:bCs/>
@@ -5238,9 +5075,18 @@
           <w:szCs w:val="22"/>
           <w:lang w:val="de-AT"/>
         </w:rPr>
-        <w:t xml:space="preserve"> (</w:t>
-      </w:r>
-      <w:proofErr w:type="spellStart"/>
+      </w:pPr>
+      <w:r>
+        <w:rPr>
+          <w:rFonts w:cs="Arial"/>
+          <w:b/>
+          <w:iCs/>
+          <w:sz w:val="22"/>
+          <w:szCs w:val="22"/>
+          <w:lang w:val="de-AT"/>
+        </w:rPr>
+        <w:t>Future Approach (Geplanter Ansatz):</w:t>
+      </w:r>
       <w:r>
         <w:rPr>
           <w:rFonts w:cs="Arial"/>
@@ -5250,10 +5096,11 @@
           <w:szCs w:val="22"/>
           <w:lang w:val="de-AT"/>
         </w:rPr>
-        <w:t>Casual</w:t>
-      </w:r>
-      <w:proofErr w:type="spellEnd"/>
-      <w:r>
+        <w:t xml:space="preserve"> Entwicklung eines BI-Dashboards, das Fahrtdaten multidimensional analysiert und mit historischen Wetterdaten (z. B. Temperatur, Niederschlag) verknüpft. Ziel ist es, Transparenz über wetterbedingte Nutzungsmuster zu schaffen, besonders in Bezug auf Unterschiede zwischen Member- und Casual-Nutzern. Die gewonnenen Erkenntnisse dienen als Entscheidungsgrundlage für eine datenbasierte operative Steuerung und sollen folgende Leitfragen beantworten: </w:t>
+      </w:r>
+    </w:p>
+    <w:p>
+      <w:pPr>
         <w:rPr>
           <w:rFonts w:cs="Arial"/>
           <w:bCs/>
@@ -5262,9 +5109,7 @@
           <w:szCs w:val="22"/>
           <w:lang w:val="de-AT"/>
         </w:rPr>
-        <w:t xml:space="preserve"> </w:t>
-      </w:r>
-      <w:proofErr w:type="spellStart"/>
+      </w:pPr>
       <w:r>
         <w:rPr>
           <w:rFonts w:cs="Arial"/>
@@ -5274,10 +5119,11 @@
           <w:szCs w:val="22"/>
           <w:lang w:val="de-AT"/>
         </w:rPr>
-        <w:t>to</w:t>
-      </w:r>
-      <w:proofErr w:type="spellEnd"/>
-      <w:r>
+        <w:t>Wie verändert sich die Anzahl und Dauer der Fahrten bei unterschiedlichen Wetterbedingungen (Temperatur, Regen, Wind)?</w:t>
+      </w:r>
+    </w:p>
+    <w:p>
+      <w:pPr>
         <w:rPr>
           <w:rFonts w:cs="Arial"/>
           <w:bCs/>
@@ -5286,11 +5132,8 @@
           <w:szCs w:val="22"/>
           <w:lang w:val="de-AT"/>
         </w:rPr>
-        <w:t xml:space="preserve"> Member)</w:t>
-      </w:r>
-    </w:p>
-    <w:p>
-      <w:pPr>
+      </w:pPr>
+      <w:r>
         <w:rPr>
           <w:rFonts w:cs="Arial"/>
           <w:bCs/>
@@ -5299,8 +5142,46 @@
           <w:szCs w:val="22"/>
           <w:lang w:val="de-AT"/>
         </w:rPr>
-      </w:pPr>
-      <w:r>
+        <w:t>Welche Stationen oder Stadtbereiche reagieren besonders stark auf Wetterveränderungen?</w:t>
+      </w:r>
+    </w:p>
+    <w:p>
+      <w:pPr>
+        <w:rPr>
+          <w:rFonts w:cs="Arial"/>
+          <w:bCs/>
+          <w:iCs/>
+          <w:sz w:val="22"/>
+          <w:szCs w:val="22"/>
+          <w:lang w:val="de-AT"/>
+        </w:rPr>
+      </w:pPr>
+      <w:r>
+        <w:rPr>
+          <w:rFonts w:cs="Arial"/>
+          <w:bCs/>
+          <w:iCs/>
+          <w:sz w:val="22"/>
+          <w:szCs w:val="22"/>
+          <w:lang w:val="de-AT"/>
+        </w:rPr>
+        <w:t xml:space="preserve">Wie viele Gelegenheitsnutzer schließen pro Jahr ein Abo ab? </w:t>
+      </w:r>
+    </w:p>
+    <w:p>
+      <w:pPr>
+        <w:rPr>
+          <w:rFonts w:cs="Arial"/>
+          <w:bCs/>
+          <w:iCs/>
+          <w:sz w:val="22"/>
+          <w:szCs w:val="22"/>
+          <w:lang w:val="de-AT"/>
+        </w:rPr>
+      </w:pPr>
+    </w:p>
+    <w:p>
+      <w:pPr>
         <w:rPr>
           <w:rFonts w:cs="Arial"/>
           <w:b/>
@@ -5309,9 +5190,21 @@
           <w:szCs w:val="22"/>
           <w:lang w:val="de-AT"/>
         </w:rPr>
-        <w:t>Ausrichtung:</w:t>
-      </w:r>
-      <w:r>
+      </w:pPr>
+      <w:r>
+        <w:rPr>
+          <w:rFonts w:cs="Arial"/>
+          <w:b/>
+          <w:iCs/>
+          <w:sz w:val="22"/>
+          <w:szCs w:val="22"/>
+          <w:lang w:val="de-AT"/>
+        </w:rPr>
+        <w:t>Scope Statement (Geltungsbereich):</w:t>
+      </w:r>
+    </w:p>
+    <w:p>
+      <w:pPr>
         <w:rPr>
           <w:rFonts w:cs="Arial"/>
           <w:bCs/>
@@ -5320,9 +5213,7 @@
           <w:szCs w:val="22"/>
           <w:lang w:val="de-AT"/>
         </w:rPr>
-        <w:t xml:space="preserve"> Verknüpfung von </w:t>
-      </w:r>
-      <w:proofErr w:type="spellStart"/>
+      </w:pPr>
       <w:r>
         <w:rPr>
           <w:rFonts w:cs="Arial"/>
@@ -5332,10 +5223,11 @@
           <w:szCs w:val="22"/>
           <w:lang w:val="de-AT"/>
         </w:rPr>
-        <w:t>CitiBike</w:t>
-      </w:r>
-      <w:proofErr w:type="spellEnd"/>
-      <w:r>
+        <w:t>In scope: Trip-Daten (Startzeit, Dauer), Start- und End-Stationen (inkl. Geokoordinaten für Map-Visualisierung), User-Typen (Casual/Member) sowie die Integration externer, historischer Wetterdaten (Tageshöchsttemperatur, Niederschlag).</w:t>
+      </w:r>
+    </w:p>
+    <w:p>
+      <w:pPr>
         <w:rPr>
           <w:rFonts w:cs="Arial"/>
           <w:bCs/>
@@ -5344,9 +5236,7 @@
           <w:szCs w:val="22"/>
           <w:lang w:val="de-AT"/>
         </w:rPr>
-        <w:t xml:space="preserve">-Fahrtdaten mit </w:t>
-      </w:r>
-      <w:proofErr w:type="gramStart"/>
+      </w:pPr>
       <w:r>
         <w:rPr>
           <w:rFonts w:cs="Arial"/>
@@ -5356,10 +5246,11 @@
           <w:szCs w:val="22"/>
           <w:lang w:val="de-AT"/>
         </w:rPr>
-        <w:t>Wetterdaten</w:t>
-      </w:r>
-      <w:proofErr w:type="gramEnd"/>
-      <w:r>
+        <w:t>Out of scope: operative Wartungsdaten der Fahrräder, Rebalancing-Logistik sowie die detaillierte Analyse von Einzelkosten pro Ride</w:t>
+      </w:r>
+    </w:p>
+    <w:p>
+      <w:pPr>
         <w:rPr>
           <w:rFonts w:cs="Arial"/>
           <w:bCs/>
@@ -5368,10 +5259,26 @@
           <w:szCs w:val="22"/>
           <w:lang w:val="de-AT"/>
         </w:rPr>
-        <w:t xml:space="preserve"> um zu analysieren, wie Wetterbedingungen die Nutzungshäufigkeit und </w:t>
-      </w:r>
-      <w:proofErr w:type="spellStart"/>
-      <w:r>
+      </w:pPr>
+    </w:p>
+    <w:p>
+      <w:pPr>
+        <w:pStyle w:val="berschrift3"/>
+        <w:rPr>
+          <w:lang w:val="de-AT"/>
+        </w:rPr>
+      </w:pPr>
+      <w:bookmarkStart w:id="13" w:name="_Toc225192403"/>
+      <w:r>
+        <w:rPr>
+          <w:lang w:val="de-AT"/>
+        </w:rPr>
+        <w:t>Kennzahlen &amp; Metriken (Quantitative Analyse)</w:t>
+      </w:r>
+      <w:bookmarkEnd w:id="13"/>
+    </w:p>
+    <w:p>
+      <w:pPr>
         <w:rPr>
           <w:rFonts w:cs="Arial"/>
           <w:bCs/>
@@ -5380,9 +5287,7 @@
           <w:szCs w:val="22"/>
           <w:lang w:val="de-AT"/>
         </w:rPr>
-        <w:t>Conversion</w:t>
-      </w:r>
-      <w:proofErr w:type="spellEnd"/>
+      </w:pPr>
       <w:r>
         <w:rPr>
           <w:rFonts w:cs="Arial"/>
@@ -5392,7 +5297,7 @@
           <w:szCs w:val="22"/>
           <w:lang w:val="de-AT"/>
         </w:rPr>
-        <w:t xml:space="preserve"> beeinflussen.</w:t>
+        <w:t>Um den Erfolg der BI-Initiative messbar zu machen, werden folgende Performance Indikatoren zur Bewertung des aktuellen Zustandes und der zukünftigen Verbesserung herangezogen:</w:t>
       </w:r>
     </w:p>
     <w:p>
@@ -5406,25 +5311,7 @@
           <w:lang w:val="de-AT"/>
         </w:rPr>
       </w:pPr>
-    </w:p>
-    <w:p>
-      <w:pPr>
-        <w:pStyle w:val="berschrift3"/>
-        <w:rPr>
-          <w:lang w:val="de-AT"/>
-        </w:rPr>
-      </w:pPr>
-      <w:bookmarkStart w:id="11" w:name="_Toc225192401"/>
-      <w:r>
-        <w:rPr>
-          <w:lang w:val="de-AT"/>
-        </w:rPr>
-        <w:t>Stakeholder</w:t>
-      </w:r>
-      <w:bookmarkEnd w:id="11"/>
-    </w:p>
-    <w:p>
-      <w:pPr>
+      <w:r>
         <w:rPr>
           <w:rFonts w:cs="Arial"/>
           <w:bCs/>
@@ -5433,19 +5320,11 @@
           <w:szCs w:val="22"/>
           <w:lang w:val="de-AT"/>
         </w:rPr>
-      </w:pPr>
-      <w:r>
-        <w:rPr>
-          <w:rFonts w:cs="Arial"/>
-          <w:b/>
-          <w:iCs/>
-          <w:sz w:val="22"/>
-          <w:szCs w:val="22"/>
-          <w:lang w:val="de-AT"/>
-        </w:rPr>
-        <w:t>Primärer Stakeholder</w:t>
-      </w:r>
-      <w:r>
+        <w:t>Total Rides pro Wetterkategorie</w:t>
+      </w:r>
+    </w:p>
+    <w:p>
+      <w:pPr>
         <w:rPr>
           <w:rFonts w:cs="Arial"/>
           <w:bCs/>
@@ -5454,9 +5333,7 @@
           <w:szCs w:val="22"/>
           <w:lang w:val="de-AT"/>
         </w:rPr>
-        <w:t xml:space="preserve">: Operatives Management von </w:t>
-      </w:r>
-      <w:proofErr w:type="spellStart"/>
+      </w:pPr>
       <w:r>
         <w:rPr>
           <w:rFonts w:cs="Arial"/>
@@ -5466,9 +5343,8 @@
           <w:szCs w:val="22"/>
           <w:lang w:val="de-AT"/>
         </w:rPr>
-        <w:t>CitiBike</w:t>
-      </w:r>
-      <w:proofErr w:type="spellEnd"/>
+        <w:t>Average Ride Duration je Wetterlage</w:t>
+      </w:r>
     </w:p>
     <w:p>
       <w:pPr>
@@ -5481,25 +5357,7 @@
           <w:lang w:val="de-AT"/>
         </w:rPr>
       </w:pPr>
-    </w:p>
-    <w:p>
-      <w:pPr>
-        <w:pStyle w:val="berschrift3"/>
-        <w:rPr>
-          <w:lang w:val="de-AT"/>
-        </w:rPr>
-      </w:pPr>
-      <w:bookmarkStart w:id="12" w:name="_Toc225192402"/>
-      <w:r>
-        <w:rPr>
-          <w:lang w:val="de-AT"/>
-        </w:rPr>
-        <w:t>Business Case</w:t>
-      </w:r>
-      <w:bookmarkEnd w:id="12"/>
-    </w:p>
-    <w:p>
-      <w:pPr>
+      <w:r>
         <w:rPr>
           <w:rFonts w:cs="Arial"/>
           <w:bCs/>
@@ -5508,563 +5366,7 @@
           <w:szCs w:val="22"/>
           <w:lang w:val="de-AT"/>
         </w:rPr>
-      </w:pPr>
-      <w:proofErr w:type="spellStart"/>
-      <w:r>
-        <w:rPr>
-          <w:rFonts w:cs="Arial"/>
-          <w:b/>
-          <w:iCs/>
-          <w:sz w:val="22"/>
-          <w:szCs w:val="22"/>
-          <w:lang w:val="de-AT"/>
-        </w:rPr>
-        <w:t>Current</w:t>
-      </w:r>
-      <w:proofErr w:type="spellEnd"/>
-      <w:r>
-        <w:rPr>
-          <w:rFonts w:cs="Arial"/>
-          <w:b/>
-          <w:iCs/>
-          <w:sz w:val="22"/>
-          <w:szCs w:val="22"/>
-          <w:lang w:val="de-AT"/>
-        </w:rPr>
-        <w:t xml:space="preserve"> Approach (Aktuelle Situation):</w:t>
-      </w:r>
-      <w:r>
-        <w:rPr>
-          <w:rFonts w:cs="Arial"/>
-          <w:bCs/>
-          <w:iCs/>
-          <w:sz w:val="22"/>
-          <w:szCs w:val="22"/>
-          <w:lang w:val="de-AT"/>
-        </w:rPr>
-        <w:t xml:space="preserve"> Die operative Steuerung des Bike-Sharing-Systems basiert primär auf historischen Fahrtdaten und Erfahrungswerten. Externe Einflussfaktoren – insbesondere das Wetter – werden bislang nicht systematisch in die Analyse der Nutzung einbezogen. Dadurch fehlen fundierte Erkenntnisse darüber, wie sich Temperatur und Niederschlag konkret auf Nachfrage, Stationsauslastung und Nutzersegmente auswirken.</w:t>
-      </w:r>
-    </w:p>
-    <w:p>
-      <w:pPr>
-        <w:rPr>
-          <w:rFonts w:cs="Arial"/>
-          <w:bCs/>
-          <w:iCs/>
-          <w:sz w:val="22"/>
-          <w:szCs w:val="22"/>
-          <w:lang w:val="de-AT"/>
-        </w:rPr>
-      </w:pPr>
-      <w:r>
-        <w:rPr>
-          <w:rFonts w:cs="Arial"/>
-          <w:b/>
-          <w:iCs/>
-          <w:sz w:val="22"/>
-          <w:szCs w:val="22"/>
-          <w:lang w:val="de-AT"/>
-        </w:rPr>
-        <w:t>Future Approach (Geplanter Ansatz):</w:t>
-      </w:r>
-      <w:r>
-        <w:rPr>
-          <w:rFonts w:cs="Arial"/>
-          <w:bCs/>
-          <w:iCs/>
-          <w:sz w:val="22"/>
-          <w:szCs w:val="22"/>
-          <w:lang w:val="de-AT"/>
-        </w:rPr>
-        <w:t xml:space="preserve"> Entwicklung eines BI-Dashboards, das Fahrtdaten multidimensional analysiert und mit historischen Wetterdaten (z. B. Temperatur, Niederschlag) verknüpft. Ziel ist es, Transparenz über wetterbedingte Nutzungsmuster zu schaffen, besonders in Bezug auf Unterschiede zwischen Member- und </w:t>
-      </w:r>
-      <w:proofErr w:type="spellStart"/>
-      <w:r>
-        <w:rPr>
-          <w:rFonts w:cs="Arial"/>
-          <w:bCs/>
-          <w:iCs/>
-          <w:sz w:val="22"/>
-          <w:szCs w:val="22"/>
-          <w:lang w:val="de-AT"/>
-        </w:rPr>
-        <w:t>Casual</w:t>
-      </w:r>
-      <w:proofErr w:type="spellEnd"/>
-      <w:r>
-        <w:rPr>
-          <w:rFonts w:cs="Arial"/>
-          <w:bCs/>
-          <w:iCs/>
-          <w:sz w:val="22"/>
-          <w:szCs w:val="22"/>
-          <w:lang w:val="de-AT"/>
-        </w:rPr>
-        <w:t xml:space="preserve">-Nutzern. Die gewonnenen Erkenntnisse dienen als Entscheidungsgrundlage für eine datenbasierte operative Steuerung und sollen folgende Leitfragen beantworten: </w:t>
-      </w:r>
-    </w:p>
-    <w:p>
-      <w:pPr>
-        <w:rPr>
-          <w:rFonts w:cs="Arial"/>
-          <w:bCs/>
-          <w:iCs/>
-          <w:sz w:val="22"/>
-          <w:szCs w:val="22"/>
-          <w:lang w:val="de-AT"/>
-        </w:rPr>
-      </w:pPr>
-      <w:r>
-        <w:rPr>
-          <w:rFonts w:cs="Arial"/>
-          <w:bCs/>
-          <w:iCs/>
-          <w:sz w:val="22"/>
-          <w:szCs w:val="22"/>
-          <w:lang w:val="de-AT"/>
-        </w:rPr>
-        <w:t>Wie verändert sich die Anzahl und Dauer der Fahrten bei unterschiedlichen Wetterbedingungen (Temperatur, Regen, Wind)?</w:t>
-      </w:r>
-    </w:p>
-    <w:p>
-      <w:pPr>
-        <w:rPr>
-          <w:rFonts w:cs="Arial"/>
-          <w:bCs/>
-          <w:iCs/>
-          <w:sz w:val="22"/>
-          <w:szCs w:val="22"/>
-          <w:lang w:val="de-AT"/>
-        </w:rPr>
-      </w:pPr>
-      <w:r>
-        <w:rPr>
-          <w:rFonts w:cs="Arial"/>
-          <w:bCs/>
-          <w:iCs/>
-          <w:sz w:val="22"/>
-          <w:szCs w:val="22"/>
-          <w:lang w:val="de-AT"/>
-        </w:rPr>
-        <w:t>Welche Stationen oder Stadtbereiche reagieren besonders stark auf Wetterveränderungen?</w:t>
-      </w:r>
-    </w:p>
-    <w:p>
-      <w:pPr>
-        <w:rPr>
-          <w:rFonts w:cs="Arial"/>
-          <w:bCs/>
-          <w:iCs/>
-          <w:sz w:val="22"/>
-          <w:szCs w:val="22"/>
-          <w:lang w:val="de-AT"/>
-        </w:rPr>
-      </w:pPr>
-      <w:r>
-        <w:rPr>
-          <w:rFonts w:cs="Arial"/>
-          <w:bCs/>
-          <w:iCs/>
-          <w:sz w:val="22"/>
-          <w:szCs w:val="22"/>
-          <w:lang w:val="de-AT"/>
-        </w:rPr>
-        <w:t xml:space="preserve">Wie viele Gelegenheitsnutzer schließen pro Jahr ein Abo ab? </w:t>
-      </w:r>
-    </w:p>
-    <w:p>
-      <w:pPr>
-        <w:rPr>
-          <w:rFonts w:cs="Arial"/>
-          <w:bCs/>
-          <w:iCs/>
-          <w:sz w:val="22"/>
-          <w:szCs w:val="22"/>
-          <w:lang w:val="de-AT"/>
-        </w:rPr>
-      </w:pPr>
-    </w:p>
-    <w:p>
-      <w:pPr>
-        <w:rPr>
-          <w:rFonts w:cs="Arial"/>
-          <w:b/>
-          <w:iCs/>
-          <w:sz w:val="22"/>
-          <w:szCs w:val="22"/>
-          <w:lang w:val="de-AT"/>
-        </w:rPr>
-      </w:pPr>
-      <w:proofErr w:type="spellStart"/>
-      <w:r>
-        <w:rPr>
-          <w:rFonts w:cs="Arial"/>
-          <w:b/>
-          <w:iCs/>
-          <w:sz w:val="22"/>
-          <w:szCs w:val="22"/>
-          <w:lang w:val="de-AT"/>
-        </w:rPr>
-        <w:t>Scope</w:t>
-      </w:r>
-      <w:proofErr w:type="spellEnd"/>
-      <w:r>
-        <w:rPr>
-          <w:rFonts w:cs="Arial"/>
-          <w:b/>
-          <w:iCs/>
-          <w:sz w:val="22"/>
-          <w:szCs w:val="22"/>
-          <w:lang w:val="de-AT"/>
-        </w:rPr>
-        <w:t xml:space="preserve"> Statement (Geltungsbereich):</w:t>
-      </w:r>
-    </w:p>
-    <w:p>
-      <w:pPr>
-        <w:rPr>
-          <w:rFonts w:cs="Arial"/>
-          <w:bCs/>
-          <w:iCs/>
-          <w:sz w:val="22"/>
-          <w:szCs w:val="22"/>
-          <w:lang w:val="de-AT"/>
-        </w:rPr>
-      </w:pPr>
-      <w:r>
-        <w:rPr>
-          <w:rFonts w:cs="Arial"/>
-          <w:bCs/>
-          <w:iCs/>
-          <w:sz w:val="22"/>
-          <w:szCs w:val="22"/>
-          <w:lang w:val="de-AT"/>
-        </w:rPr>
-        <w:t xml:space="preserve">In </w:t>
-      </w:r>
-      <w:proofErr w:type="spellStart"/>
-      <w:r>
-        <w:rPr>
-          <w:rFonts w:cs="Arial"/>
-          <w:bCs/>
-          <w:iCs/>
-          <w:sz w:val="22"/>
-          <w:szCs w:val="22"/>
-          <w:lang w:val="de-AT"/>
-        </w:rPr>
-        <w:t>scope</w:t>
-      </w:r>
-      <w:proofErr w:type="spellEnd"/>
-      <w:r>
-        <w:rPr>
-          <w:rFonts w:cs="Arial"/>
-          <w:bCs/>
-          <w:iCs/>
-          <w:sz w:val="22"/>
-          <w:szCs w:val="22"/>
-          <w:lang w:val="de-AT"/>
-        </w:rPr>
-        <w:t xml:space="preserve">: Trip-Daten (Startzeit, Dauer), Start- und End-Stationen (inkl. Geokoordinaten für </w:t>
-      </w:r>
-      <w:proofErr w:type="spellStart"/>
-      <w:r>
-        <w:rPr>
-          <w:rFonts w:cs="Arial"/>
-          <w:bCs/>
-          <w:iCs/>
-          <w:sz w:val="22"/>
-          <w:szCs w:val="22"/>
-          <w:lang w:val="de-AT"/>
-        </w:rPr>
-        <w:t>Map</w:t>
-      </w:r>
-      <w:proofErr w:type="spellEnd"/>
-      <w:r>
-        <w:rPr>
-          <w:rFonts w:cs="Arial"/>
-          <w:bCs/>
-          <w:iCs/>
-          <w:sz w:val="22"/>
-          <w:szCs w:val="22"/>
-          <w:lang w:val="de-AT"/>
-        </w:rPr>
-        <w:t>-Visualisierung), User-Typen (</w:t>
-      </w:r>
-      <w:proofErr w:type="spellStart"/>
-      <w:r>
-        <w:rPr>
-          <w:rFonts w:cs="Arial"/>
-          <w:bCs/>
-          <w:iCs/>
-          <w:sz w:val="22"/>
-          <w:szCs w:val="22"/>
-          <w:lang w:val="de-AT"/>
-        </w:rPr>
-        <w:t>Casual</w:t>
-      </w:r>
-      <w:proofErr w:type="spellEnd"/>
-      <w:r>
-        <w:rPr>
-          <w:rFonts w:cs="Arial"/>
-          <w:bCs/>
-          <w:iCs/>
-          <w:sz w:val="22"/>
-          <w:szCs w:val="22"/>
-          <w:lang w:val="de-AT"/>
-        </w:rPr>
-        <w:t>/Member) sowie die Integration externer, historischer Wetterdaten (Tageshöchsttemperatur, Niederschlag).</w:t>
-      </w:r>
-    </w:p>
-    <w:p>
-      <w:pPr>
-        <w:rPr>
-          <w:rFonts w:cs="Arial"/>
-          <w:bCs/>
-          <w:iCs/>
-          <w:sz w:val="22"/>
-          <w:szCs w:val="22"/>
-          <w:lang w:val="de-AT"/>
-        </w:rPr>
-      </w:pPr>
-      <w:r>
-        <w:rPr>
-          <w:rFonts w:cs="Arial"/>
-          <w:bCs/>
-          <w:iCs/>
-          <w:sz w:val="22"/>
-          <w:szCs w:val="22"/>
-          <w:lang w:val="de-AT"/>
-        </w:rPr>
-        <w:t xml:space="preserve">Out </w:t>
-      </w:r>
-      <w:proofErr w:type="spellStart"/>
-      <w:r>
-        <w:rPr>
-          <w:rFonts w:cs="Arial"/>
-          <w:bCs/>
-          <w:iCs/>
-          <w:sz w:val="22"/>
-          <w:szCs w:val="22"/>
-          <w:lang w:val="de-AT"/>
-        </w:rPr>
-        <w:t>of</w:t>
-      </w:r>
-      <w:proofErr w:type="spellEnd"/>
-      <w:r>
-        <w:rPr>
-          <w:rFonts w:cs="Arial"/>
-          <w:bCs/>
-          <w:iCs/>
-          <w:sz w:val="22"/>
-          <w:szCs w:val="22"/>
-          <w:lang w:val="de-AT"/>
-        </w:rPr>
-        <w:t xml:space="preserve"> </w:t>
-      </w:r>
-      <w:proofErr w:type="spellStart"/>
-      <w:r>
-        <w:rPr>
-          <w:rFonts w:cs="Arial"/>
-          <w:bCs/>
-          <w:iCs/>
-          <w:sz w:val="22"/>
-          <w:szCs w:val="22"/>
-          <w:lang w:val="de-AT"/>
-        </w:rPr>
-        <w:t>scope</w:t>
-      </w:r>
-      <w:proofErr w:type="spellEnd"/>
-      <w:r>
-        <w:rPr>
-          <w:rFonts w:cs="Arial"/>
-          <w:bCs/>
-          <w:iCs/>
-          <w:sz w:val="22"/>
-          <w:szCs w:val="22"/>
-          <w:lang w:val="de-AT"/>
-        </w:rPr>
-        <w:t xml:space="preserve">: operative Wartungsdaten der Fahrräder, </w:t>
-      </w:r>
-      <w:proofErr w:type="spellStart"/>
-      <w:r>
-        <w:rPr>
-          <w:rFonts w:cs="Arial"/>
-          <w:bCs/>
-          <w:iCs/>
-          <w:sz w:val="22"/>
-          <w:szCs w:val="22"/>
-          <w:lang w:val="de-AT"/>
-        </w:rPr>
-        <w:t>Rebalancing</w:t>
-      </w:r>
-      <w:proofErr w:type="spellEnd"/>
-      <w:r>
-        <w:rPr>
-          <w:rFonts w:cs="Arial"/>
-          <w:bCs/>
-          <w:iCs/>
-          <w:sz w:val="22"/>
-          <w:szCs w:val="22"/>
-          <w:lang w:val="de-AT"/>
-        </w:rPr>
-        <w:t>-Logistik sowie die detaillierte Analyse von Einzelkosten pro Ride</w:t>
-      </w:r>
-    </w:p>
-    <w:p>
-      <w:pPr>
-        <w:rPr>
-          <w:rFonts w:cs="Arial"/>
-          <w:bCs/>
-          <w:iCs/>
-          <w:sz w:val="22"/>
-          <w:szCs w:val="22"/>
-          <w:lang w:val="de-AT"/>
-        </w:rPr>
-      </w:pPr>
-    </w:p>
-    <w:p>
-      <w:pPr>
-        <w:pStyle w:val="berschrift3"/>
-        <w:rPr>
-          <w:lang w:val="de-AT"/>
-        </w:rPr>
-      </w:pPr>
-      <w:bookmarkStart w:id="13" w:name="_Toc225192403"/>
-      <w:r>
-        <w:rPr>
-          <w:lang w:val="de-AT"/>
-        </w:rPr>
-        <w:t>Kennzahlen &amp; Metriken (Quantitative Analyse)</w:t>
-      </w:r>
-      <w:bookmarkEnd w:id="13"/>
-    </w:p>
-    <w:p>
-      <w:pPr>
-        <w:rPr>
-          <w:rFonts w:cs="Arial"/>
-          <w:bCs/>
-          <w:iCs/>
-          <w:sz w:val="22"/>
-          <w:szCs w:val="22"/>
-          <w:lang w:val="de-AT"/>
-        </w:rPr>
-      </w:pPr>
-      <w:r>
-        <w:rPr>
-          <w:rFonts w:cs="Arial"/>
-          <w:bCs/>
-          <w:iCs/>
-          <w:sz w:val="22"/>
-          <w:szCs w:val="22"/>
-          <w:lang w:val="de-AT"/>
-        </w:rPr>
-        <w:t>Um den Erfolg der BI-Initiative messbar zu machen, werden folgende Performance Indikatoren zur Bewertung des aktuellen Zustandes und der zukünftigen Verbesserung herangezogen:</w:t>
-      </w:r>
-    </w:p>
-    <w:p>
-      <w:pPr>
-        <w:rPr>
-          <w:rFonts w:cs="Arial"/>
-          <w:bCs/>
-          <w:iCs/>
-          <w:sz w:val="22"/>
-          <w:szCs w:val="22"/>
-          <w:lang w:val="de-AT"/>
-        </w:rPr>
-      </w:pPr>
-      <w:r>
-        <w:rPr>
-          <w:rFonts w:cs="Arial"/>
-          <w:bCs/>
-          <w:iCs/>
-          <w:sz w:val="22"/>
-          <w:szCs w:val="22"/>
-          <w:lang w:val="de-AT"/>
-        </w:rPr>
-        <w:t>Total Rides pro Wetterkategorie</w:t>
-      </w:r>
-    </w:p>
-    <w:p>
-      <w:pPr>
-        <w:rPr>
-          <w:rFonts w:cs="Arial"/>
-          <w:bCs/>
-          <w:iCs/>
-          <w:sz w:val="22"/>
-          <w:szCs w:val="22"/>
-          <w:lang w:val="de-AT"/>
-        </w:rPr>
-      </w:pPr>
-      <w:r>
-        <w:rPr>
-          <w:rFonts w:cs="Arial"/>
-          <w:bCs/>
-          <w:iCs/>
-          <w:sz w:val="22"/>
-          <w:szCs w:val="22"/>
-          <w:lang w:val="de-AT"/>
-        </w:rPr>
-        <w:t>Average Ride Duration je Wetterlage</w:t>
-      </w:r>
-    </w:p>
-    <w:p>
-      <w:pPr>
-        <w:rPr>
-          <w:rFonts w:cs="Arial"/>
-          <w:bCs/>
-          <w:iCs/>
-          <w:sz w:val="22"/>
-          <w:szCs w:val="22"/>
-          <w:lang w:val="de-AT"/>
-        </w:rPr>
-      </w:pPr>
-      <w:proofErr w:type="spellStart"/>
-      <w:r>
-        <w:rPr>
-          <w:rFonts w:cs="Arial"/>
-          <w:bCs/>
-          <w:iCs/>
-          <w:sz w:val="22"/>
-          <w:szCs w:val="22"/>
-          <w:lang w:val="de-AT"/>
-        </w:rPr>
-        <w:t>Weather</w:t>
-      </w:r>
-      <w:proofErr w:type="spellEnd"/>
-      <w:r>
-        <w:rPr>
-          <w:rFonts w:cs="Arial"/>
-          <w:bCs/>
-          <w:iCs/>
-          <w:sz w:val="22"/>
-          <w:szCs w:val="22"/>
-          <w:lang w:val="de-AT"/>
-        </w:rPr>
-        <w:t>-</w:t>
-      </w:r>
-      <w:proofErr w:type="spellStart"/>
-      <w:r>
-        <w:rPr>
-          <w:rFonts w:cs="Arial"/>
-          <w:bCs/>
-          <w:iCs/>
-          <w:sz w:val="22"/>
-          <w:szCs w:val="22"/>
-          <w:lang w:val="de-AT"/>
-        </w:rPr>
-        <w:t>Sensitivity</w:t>
-      </w:r>
-      <w:proofErr w:type="spellEnd"/>
-      <w:r>
-        <w:rPr>
-          <w:rFonts w:cs="Arial"/>
-          <w:bCs/>
-          <w:iCs/>
-          <w:sz w:val="22"/>
-          <w:szCs w:val="22"/>
-          <w:lang w:val="de-AT"/>
-        </w:rPr>
-        <w:t>-Score: Prozentuale Veränderung des Fahrtenvolumens und Fahrtendauer pro Station bei Regen vs. Sonnenschein.</w:t>
+        <w:t>Weather-Sensitivity-Score: Prozentuale Veränderung des Fahrtenvolumens und Fahrtendauer pro Station bei Regen vs. Sonnenschein.</w:t>
       </w:r>
     </w:p>
     <w:p>
@@ -6089,7 +5391,6 @@
           <w:docGrid w:linePitch="326"/>
         </w:sectPr>
       </w:pPr>
-      <w:proofErr w:type="spellStart"/>
       <w:r>
         <w:rPr>
           <w:rFonts w:cs="Arial"/>
@@ -6099,67 +5400,7 @@
           <w:szCs w:val="22"/>
           <w:lang w:val="de-AT"/>
         </w:rPr>
-        <w:t>Conversion</w:t>
-      </w:r>
-      <w:proofErr w:type="spellEnd"/>
-      <w:r>
-        <w:rPr>
-          <w:rFonts w:cs="Arial"/>
-          <w:bCs/>
-          <w:iCs/>
-          <w:sz w:val="22"/>
-          <w:szCs w:val="22"/>
-          <w:lang w:val="de-AT"/>
-        </w:rPr>
-        <w:t>-Rate (</w:t>
-      </w:r>
-      <w:proofErr w:type="spellStart"/>
-      <w:r>
-        <w:rPr>
-          <w:rFonts w:cs="Arial"/>
-          <w:bCs/>
-          <w:iCs/>
-          <w:sz w:val="22"/>
-          <w:szCs w:val="22"/>
-          <w:lang w:val="de-AT"/>
-        </w:rPr>
-        <w:t>Casual</w:t>
-      </w:r>
-      <w:proofErr w:type="spellEnd"/>
-      <w:r>
-        <w:rPr>
-          <w:rFonts w:cs="Arial"/>
-          <w:bCs/>
-          <w:iCs/>
-          <w:sz w:val="22"/>
-          <w:szCs w:val="22"/>
-          <w:lang w:val="de-AT"/>
-        </w:rPr>
-        <w:t xml:space="preserve"> </w:t>
-      </w:r>
-      <w:proofErr w:type="spellStart"/>
-      <w:r>
-        <w:rPr>
-          <w:rFonts w:cs="Arial"/>
-          <w:bCs/>
-          <w:iCs/>
-          <w:sz w:val="22"/>
-          <w:szCs w:val="22"/>
-          <w:lang w:val="de-AT"/>
-        </w:rPr>
-        <w:t>to</w:t>
-      </w:r>
-      <w:proofErr w:type="spellEnd"/>
-      <w:r>
-        <w:rPr>
-          <w:rFonts w:cs="Arial"/>
-          <w:bCs/>
-          <w:iCs/>
-          <w:sz w:val="22"/>
-          <w:szCs w:val="22"/>
-          <w:lang w:val="de-AT"/>
-        </w:rPr>
-        <w:t xml:space="preserve"> Member): Der prozentuale Anteil der Gelegenheitsnutzer.</w:t>
+        <w:t>Conversion-Rate (Casual to Member): Der prozentuale Anteil der Gelegenheitsnutzer.</w:t>
       </w:r>
     </w:p>
     <w:p>
@@ -6844,17 +6085,9 @@
         <w:rPr>
           <w:lang w:val="de-AT"/>
         </w:rPr>
-        <w:t xml:space="preserve"> - Data </w:t>
-      </w:r>
-      <w:proofErr w:type="spellStart"/>
-      <w:r>
-        <w:rPr>
-          <w:lang w:val="de-AT"/>
-        </w:rPr>
-        <w:t>Map</w:t>
+        <w:t xml:space="preserve"> - Data Map</w:t>
       </w:r>
       <w:bookmarkEnd w:id="22"/>
-      <w:proofErr w:type="spellEnd"/>
     </w:p>
     <w:p>
       <w:pPr>
@@ -6929,10 +6162,10 @@
           <w:lang w:val="de-AT"/>
         </w:rPr>
         <w:drawing>
-          <wp:inline distT="0" distB="0" distL="0" distR="0" wp14:anchorId="67879F27" wp14:editId="0E98A668">
-            <wp:extent cx="1587500" cy="6032500"/>
-            <wp:effectExtent l="0" t="0" r="0" b="0"/>
-            <wp:docPr id="1815106551" name="Grafik 1" descr="Ein Bild, das Text, Quittung, Screenshot, Schrift enthält.&#10;&#10;KI-generierte Inhalte können fehlerhaft sein."/>
+          <wp:inline distT="0" distB="0" distL="0" distR="0" wp14:anchorId="67879F27" wp14:editId="1152D656">
+            <wp:extent cx="1561986" cy="6032500"/>
+            <wp:effectExtent l="0" t="0" r="635" b="6350"/>
+            <wp:docPr id="1815106551" name="Grafik 1"/>
             <wp:cNvGraphicFramePr>
               <a:graphicFrameLocks xmlns:a="http://schemas.openxmlformats.org/drawingml/2006/main" noChangeAspect="1"/>
             </wp:cNvGraphicFramePr>
@@ -6940,11 +6173,11 @@
               <a:graphicData uri="http://schemas.openxmlformats.org/drawingml/2006/picture">
                 <pic:pic xmlns:pic="http://schemas.openxmlformats.org/drawingml/2006/picture">
                   <pic:nvPicPr>
-                    <pic:cNvPr id="1815106551" name="Grafik 1" descr="Ein Bild, das Text, Quittung, Screenshot, Schrift enthält.&#10;&#10;KI-generierte Inhalte können fehlerhaft sein."/>
+                    <pic:cNvPr id="1815106551" name="Grafik 1"/>
                     <pic:cNvPicPr/>
                   </pic:nvPicPr>
                   <pic:blipFill>
-                    <a:blip r:embed="rId19" cstate="print">
+                    <a:blip r:embed="rId19">
                       <a:extLst>
                         <a:ext uri="{28A0092B-C50C-407E-A947-70E740481C1C}">
                           <a14:useLocalDpi xmlns:a14="http://schemas.microsoft.com/office/drawing/2010/main" val="0"/>
@@ -6958,7 +6191,7 @@
                   <pic:spPr>
                     <a:xfrm>
                       <a:off x="0" y="0"/>
-                      <a:ext cx="1587500" cy="6032500"/>
+                      <a:ext cx="1561986" cy="6032500"/>
                     </a:xfrm>
                     <a:prstGeom prst="rect">
                       <a:avLst/>
@@ -7072,10 +6305,9 @@
           <w:rFonts w:cs="Arial"/>
           <w:sz w:val="20"/>
           <w:szCs w:val="16"/>
-          <w:lang w:val="de-AT"/>
-        </w:rPr>
-      </w:pPr>
-      <w:proofErr w:type="spellStart"/>
+          <w:lang w:val="en-GB"/>
+        </w:rPr>
+      </w:pPr>
       <w:r>
         <w:rPr>
           <w:rFonts w:cs="Arial"/>
@@ -7083,28 +6315,16 @@
           <w:bCs/>
           <w:sz w:val="20"/>
           <w:szCs w:val="16"/>
-          <w:lang w:val="de-AT"/>
-        </w:rPr>
-        <w:t>Github</w:t>
-      </w:r>
-      <w:proofErr w:type="spellEnd"/>
-      <w:r>
-        <w:rPr>
-          <w:rFonts w:cs="Arial"/>
-          <w:b/>
-          <w:bCs/>
-          <w:sz w:val="20"/>
-          <w:szCs w:val="16"/>
-          <w:lang w:val="de-AT"/>
-        </w:rPr>
-        <w:t>:</w:t>
+          <w:lang w:val="en-GB"/>
+        </w:rPr>
+        <w:t>Github:</w:t>
       </w:r>
       <w:r>
         <w:rPr>
           <w:rFonts w:cs="Arial"/>
           <w:sz w:val="20"/>
           <w:szCs w:val="16"/>
-          <w:lang w:val="de-AT"/>
+          <w:lang w:val="en-GB"/>
         </w:rPr>
         <w:t xml:space="preserve"> </w:t>
       </w:r>
@@ -7115,7 +6335,7 @@
             <w:rFonts w:cs="Arial"/>
             <w:sz w:val="20"/>
             <w:szCs w:val="16"/>
-            <w:lang w:val="de-AT"/>
+            <w:lang w:val="en-GB"/>
           </w:rPr>
           <w:t>https://github.com/floholzer/Citibike_Project</w:t>
         </w:r>
@@ -7125,7 +6345,7 @@
           <w:rFonts w:cs="Arial"/>
           <w:sz w:val="20"/>
           <w:szCs w:val="16"/>
-          <w:lang w:val="de-AT"/>
+          <w:lang w:val="en-GB"/>
         </w:rPr>
         <w:t xml:space="preserve"> </w:t>
       </w:r>
@@ -7133,7 +6353,7 @@
     <w:p>
       <w:pPr>
         <w:rPr>
-          <w:lang w:val="de-AT"/>
+          <w:lang w:val="en-GB"/>
         </w:rPr>
       </w:pPr>
     </w:p>
@@ -7181,6 +6401,7 @@
           <w:lang w:val="de-AT"/>
         </w:rPr>
         <w:br/>
+        <w:t>Die CitiBike-Fahrtdaten werden aus CSV-Dateien extrahiert. Zusätzlich werden historische Wetterdaten über die API von Open-Meteo abgerufen</w:t>
       </w:r>
       <w:r>
         <w:rPr>
@@ -7188,41 +6409,7 @@
           <w:szCs w:val="16"/>
           <w:lang w:val="de-AT"/>
         </w:rPr>
-        <w:t xml:space="preserve">Die </w:t>
-      </w:r>
-      <w:proofErr w:type="spellStart"/>
-      <w:r>
-        <w:rPr>
-          <w:sz w:val="20"/>
-          <w:szCs w:val="16"/>
-          <w:lang w:val="de-AT"/>
-        </w:rPr>
-        <w:t>CitiBike</w:t>
-      </w:r>
-      <w:proofErr w:type="spellEnd"/>
-      <w:r>
-        <w:rPr>
-          <w:sz w:val="20"/>
-          <w:szCs w:val="16"/>
-          <w:lang w:val="de-AT"/>
-        </w:rPr>
-        <w:t>-Fahrtdaten werden aus CSV-Dateien extrahiert.</w:t>
-      </w:r>
-      <w:r>
-        <w:rPr>
-          <w:sz w:val="20"/>
-          <w:szCs w:val="16"/>
-          <w:lang w:val="de-AT"/>
-        </w:rPr>
-        <w:t xml:space="preserve"> </w:t>
-      </w:r>
-      <w:r>
-        <w:rPr>
-          <w:sz w:val="20"/>
-          <w:szCs w:val="16"/>
-          <w:lang w:val="de-AT"/>
-        </w:rPr>
-        <w:t xml:space="preserve">Zusätzlich werden historische Wetterdaten über die API von Open-Meteo abgerufen. </w:t>
+        <w:t>. Anschließend werden die Daten bereinigt (Doppel, fehlende Werte, …).</w:t>
       </w:r>
     </w:p>
     <w:p>
@@ -7306,41 +6493,13 @@
           <w:lang w:val="de-AT"/>
         </w:rPr>
       </w:pPr>
-      <w:proofErr w:type="spellStart"/>
       <w:r>
         <w:rPr>
           <w:sz w:val="20"/>
           <w:szCs w:val="16"/>
           <w:lang w:val="de-AT"/>
         </w:rPr>
-        <w:t>pandas</w:t>
-      </w:r>
-      <w:proofErr w:type="spellEnd"/>
-      <w:r>
-        <w:rPr>
-          <w:sz w:val="20"/>
-          <w:szCs w:val="16"/>
-          <w:lang w:val="de-AT"/>
-        </w:rPr>
-        <w:t xml:space="preserve"> (</w:t>
-      </w:r>
-      <w:proofErr w:type="spellStart"/>
-      <w:r>
-        <w:rPr>
-          <w:sz w:val="20"/>
-          <w:szCs w:val="16"/>
-          <w:lang w:val="de-AT"/>
-        </w:rPr>
-        <w:t>read_csv</w:t>
-      </w:r>
-      <w:proofErr w:type="spellEnd"/>
-      <w:r>
-        <w:rPr>
-          <w:sz w:val="20"/>
-          <w:szCs w:val="16"/>
-          <w:lang w:val="de-AT"/>
-        </w:rPr>
-        <w:t>)</w:t>
+        <w:t>pandas (read_csv)</w:t>
       </w:r>
     </w:p>
     <w:p>
@@ -7357,75 +6516,47 @@
           <w:lang w:val="de-AT"/>
         </w:rPr>
       </w:pPr>
-      <w:proofErr w:type="spellStart"/>
       <w:r>
         <w:rPr>
           <w:sz w:val="20"/>
           <w:szCs w:val="16"/>
           <w:lang w:val="de-AT"/>
         </w:rPr>
-        <w:t>requests</w:t>
-      </w:r>
-      <w:proofErr w:type="spellEnd"/>
-      <w:r>
+        <w:t>requests (API Calls)</w:t>
+      </w:r>
+    </w:p>
+    <w:p>
+      <w:pPr>
+        <w:pStyle w:val="berschrift3"/>
+        <w:rPr>
+          <w:lang w:val="de-AT"/>
+        </w:rPr>
+      </w:pPr>
+      <w:bookmarkStart w:id="28" w:name="_Toc225192413"/>
+      <w:r>
+        <w:rPr>
+          <w:lang w:val="de-AT"/>
+        </w:rPr>
+        <w:t>Transform-Phase</w:t>
+      </w:r>
+      <w:bookmarkEnd w:id="28"/>
+    </w:p>
+    <w:p>
+      <w:pPr>
+        <w:jc w:val="left"/>
         <w:rPr>
           <w:sz w:val="20"/>
           <w:szCs w:val="16"/>
           <w:lang w:val="de-AT"/>
         </w:rPr>
-        <w:t xml:space="preserve"> (</w:t>
-      </w:r>
-      <w:proofErr w:type="gramStart"/>
+      </w:pPr>
       <w:r>
         <w:rPr>
           <w:sz w:val="20"/>
           <w:szCs w:val="16"/>
           <w:lang w:val="de-AT"/>
         </w:rPr>
-        <w:t>API Calls</w:t>
-      </w:r>
-      <w:proofErr w:type="gramEnd"/>
-      <w:r>
-        <w:rPr>
-          <w:sz w:val="20"/>
-          <w:szCs w:val="16"/>
-          <w:lang w:val="de-AT"/>
-        </w:rPr>
-        <w:t>)</w:t>
-      </w:r>
-    </w:p>
-    <w:p>
-      <w:pPr>
-        <w:pStyle w:val="berschrift3"/>
-        <w:rPr>
-          <w:lang w:val="de-AT"/>
-        </w:rPr>
-      </w:pPr>
-      <w:bookmarkStart w:id="28" w:name="_Toc225192413"/>
-      <w:r>
-        <w:rPr>
-          <w:lang w:val="de-AT"/>
-        </w:rPr>
-        <w:t>Transform-Phase</w:t>
-      </w:r>
-      <w:bookmarkEnd w:id="28"/>
-    </w:p>
-    <w:p>
-      <w:pPr>
-        <w:jc w:val="left"/>
-        <w:rPr>
-          <w:sz w:val="20"/>
-          <w:szCs w:val="16"/>
-          <w:lang w:val="de-AT"/>
-        </w:rPr>
-      </w:pPr>
-      <w:r>
-        <w:rPr>
-          <w:sz w:val="20"/>
-          <w:szCs w:val="16"/>
-          <w:lang w:val="de-AT"/>
-        </w:rPr>
-        <w:t>Die Rohdaten werden vor dem Laden bereinigt und vorbereitet:</w:t>
+        <w:t>Die Rohdaten werden vor dem Laden vorbereitet:</w:t>
       </w:r>
     </w:p>
     <w:p>
@@ -7448,25 +6579,7 @@
           <w:szCs w:val="16"/>
           <w:lang w:val="de-AT"/>
         </w:rPr>
-        <w:t>Umwandlung von Datumsfeldern (</w:t>
-      </w:r>
-      <w:proofErr w:type="spellStart"/>
-      <w:r>
-        <w:rPr>
-          <w:sz w:val="20"/>
-          <w:szCs w:val="16"/>
-          <w:lang w:val="de-AT"/>
-        </w:rPr>
-        <w:t>datetime</w:t>
-      </w:r>
-      <w:proofErr w:type="spellEnd"/>
-      <w:r>
-        <w:rPr>
-          <w:sz w:val="20"/>
-          <w:szCs w:val="16"/>
-          <w:lang w:val="de-AT"/>
-        </w:rPr>
-        <w:t>)</w:t>
+        <w:t>Umwandlung von Datumsfeldern (datetime)</w:t>
       </w:r>
     </w:p>
     <w:p>
@@ -7512,16 +6625,11 @@
           <w:szCs w:val="16"/>
           <w:lang w:val="de-AT"/>
         </w:rPr>
-        <w:t>Entfernen von Duplikaten</w:t>
-      </w:r>
-    </w:p>
-    <w:p>
-      <w:pPr>
-        <w:pStyle w:val="Listenabsatz"/>
-        <w:numPr>
-          <w:ilvl w:val="0"/>
-          <w:numId w:val="45"/>
-        </w:numPr>
+        <w:t>Erstellung eines date_key</w:t>
+      </w:r>
+    </w:p>
+    <w:p>
+      <w:pPr>
         <w:jc w:val="left"/>
         <w:rPr>
           <w:sz w:val="20"/>
@@ -7529,118 +6637,126 @@
           <w:lang w:val="de-AT"/>
         </w:rPr>
       </w:pPr>
-      <w:r>
+    </w:p>
+    <w:p>
+      <w:pPr>
+        <w:jc w:val="left"/>
         <w:rPr>
           <w:sz w:val="20"/>
           <w:szCs w:val="16"/>
           <w:lang w:val="de-AT"/>
         </w:rPr>
-        <w:t>Behandlung fehlender Werte</w:t>
-      </w:r>
-    </w:p>
-    <w:p>
-      <w:pPr>
-        <w:pStyle w:val="Listenabsatz"/>
-        <w:numPr>
-          <w:ilvl w:val="0"/>
-          <w:numId w:val="45"/>
-        </w:numPr>
-        <w:jc w:val="left"/>
+      </w:pPr>
+      <w:r>
         <w:rPr>
           <w:sz w:val="20"/>
           <w:szCs w:val="16"/>
           <w:lang w:val="de-AT"/>
         </w:rPr>
-      </w:pPr>
-      <w:r>
+        <w:t>Nach dem Laden werden SQL-Skripte ausgeführt:</w:t>
+      </w:r>
+    </w:p>
+    <w:p>
+      <w:pPr>
+        <w:jc w:val="left"/>
         <w:rPr>
           <w:sz w:val="20"/>
           <w:szCs w:val="16"/>
-          <w:lang w:val="de-AT"/>
-        </w:rPr>
-        <w:t xml:space="preserve">Erstellung eines </w:t>
-      </w:r>
-      <w:proofErr w:type="spellStart"/>
+          <w:lang w:val="en-GB"/>
+        </w:rPr>
+      </w:pPr>
       <w:r>
         <w:rPr>
           <w:sz w:val="20"/>
           <w:szCs w:val="16"/>
-          <w:lang w:val="de-AT"/>
-        </w:rPr>
-        <w:t>date_key</w:t>
-      </w:r>
-      <w:proofErr w:type="spellEnd"/>
-    </w:p>
-    <w:p>
-      <w:pPr>
-        <w:jc w:val="left"/>
+          <w:lang w:val="en-GB"/>
+        </w:rPr>
+        <w:t>sql_transformations/</w:t>
+      </w:r>
+      <w:r>
         <w:rPr>
           <w:sz w:val="20"/>
           <w:szCs w:val="16"/>
-          <w:lang w:val="de-AT"/>
-        </w:rPr>
-      </w:pPr>
-    </w:p>
-    <w:p>
-      <w:pPr>
+          <w:lang w:val="en-GB"/>
+        </w:rPr>
+        <w:tab/>
+        <w:t>01_create_dim_station.sql</w:t>
+      </w:r>
+    </w:p>
+    <w:p>
+      <w:pPr>
+        <w:ind w:left="1418" w:firstLine="709"/>
         <w:jc w:val="left"/>
         <w:rPr>
           <w:sz w:val="20"/>
           <w:szCs w:val="16"/>
-          <w:lang w:val="de-AT"/>
+          <w:lang w:val="en-GB"/>
         </w:rPr>
       </w:pPr>
       <w:r>
         <w:rPr>
           <w:sz w:val="20"/>
           <w:szCs w:val="16"/>
-          <w:lang w:val="de-AT"/>
-        </w:rPr>
-        <w:t>Nach dem Laden werden SQL-Skripte ausgeführt:</w:t>
-      </w:r>
-    </w:p>
-    <w:p>
-      <w:pPr>
+          <w:lang w:val="en-GB"/>
+        </w:rPr>
+        <w:t>02_create_dim_date.sql</w:t>
+      </w:r>
+    </w:p>
+    <w:p>
+      <w:pPr>
+        <w:ind w:left="1418" w:firstLine="709"/>
         <w:jc w:val="left"/>
         <w:rPr>
           <w:sz w:val="20"/>
           <w:szCs w:val="16"/>
-          <w:lang w:val="de-AT"/>
-        </w:rPr>
-      </w:pPr>
-      <w:proofErr w:type="spellStart"/>
+          <w:lang w:val="en-GB"/>
+        </w:rPr>
+      </w:pPr>
       <w:r>
         <w:rPr>
           <w:sz w:val="20"/>
           <w:szCs w:val="16"/>
-          <w:lang w:val="de-AT"/>
-        </w:rPr>
-        <w:t>sql_transformations</w:t>
-      </w:r>
-      <w:proofErr w:type="spellEnd"/>
-      <w:r>
+          <w:lang w:val="en-GB"/>
+        </w:rPr>
+        <w:t>03_create_dim_bike.sql</w:t>
+      </w:r>
+    </w:p>
+    <w:p>
+      <w:pPr>
+        <w:ind w:left="1418" w:firstLine="709"/>
+        <w:jc w:val="left"/>
         <w:rPr>
           <w:sz w:val="20"/>
           <w:szCs w:val="16"/>
-          <w:lang w:val="de-AT"/>
-        </w:rPr>
-        <w:t>/</w:t>
-      </w:r>
+          <w:lang w:val="en-GB"/>
+        </w:rPr>
+      </w:pPr>
       <w:r>
         <w:rPr>
           <w:sz w:val="20"/>
           <w:szCs w:val="16"/>
-          <w:lang w:val="de-AT"/>
-        </w:rPr>
-        <w:tab/>
-      </w:r>
-      <w:r>
+          <w:lang w:val="en-GB"/>
+        </w:rPr>
+        <w:t>04_create_fact_trips.sql</w:t>
+      </w:r>
+    </w:p>
+    <w:p>
+      <w:pPr>
+        <w:ind w:left="1418" w:firstLine="709"/>
+        <w:jc w:val="left"/>
         <w:rPr>
           <w:sz w:val="20"/>
           <w:szCs w:val="16"/>
-          <w:lang w:val="de-AT"/>
-        </w:rPr>
-        <w:t>01_create_dim_station.sql</w:t>
+          <w:lang w:val="en-GB"/>
+        </w:rPr>
+      </w:pPr>
+      <w:r>
+        <w:rPr>
+          <w:sz w:val="20"/>
+          <w:szCs w:val="16"/>
+          <w:lang w:val="en-GB"/>
+        </w:rPr>
+        <w:t>05_create_dim_weather.sql</w:t>
       </w:r>
     </w:p>
     <w:p>
@@ -7650,90 +6766,14 @@
         <w:rPr>
           <w:sz w:val="20"/>
           <w:szCs w:val="16"/>
-          <w:lang w:val="de-AT"/>
+          <w:lang w:val="en-GB"/>
         </w:rPr>
       </w:pPr>
       <w:r>
         <w:rPr>
           <w:sz w:val="20"/>
           <w:szCs w:val="16"/>
-          <w:lang w:val="de-AT"/>
-        </w:rPr>
-        <w:t>02_create_dim_date.sql</w:t>
-      </w:r>
-    </w:p>
-    <w:p>
-      <w:pPr>
-        <w:ind w:left="1418" w:firstLine="709"/>
-        <w:jc w:val="left"/>
-        <w:rPr>
-          <w:sz w:val="20"/>
-          <w:szCs w:val="16"/>
-          <w:lang w:val="de-AT"/>
-        </w:rPr>
-      </w:pPr>
-      <w:r>
-        <w:rPr>
-          <w:sz w:val="20"/>
-          <w:szCs w:val="16"/>
-          <w:lang w:val="de-AT"/>
-        </w:rPr>
-        <w:t>03_create_dim_bike.sql</w:t>
-      </w:r>
-    </w:p>
-    <w:p>
-      <w:pPr>
-        <w:ind w:left="1418" w:firstLine="709"/>
-        <w:jc w:val="left"/>
-        <w:rPr>
-          <w:sz w:val="20"/>
-          <w:szCs w:val="16"/>
-          <w:lang w:val="de-AT"/>
-        </w:rPr>
-      </w:pPr>
-      <w:r>
-        <w:rPr>
-          <w:sz w:val="20"/>
-          <w:szCs w:val="16"/>
-          <w:lang w:val="de-AT"/>
-        </w:rPr>
-        <w:t>04_create_fact_trips.sql</w:t>
-      </w:r>
-    </w:p>
-    <w:p>
-      <w:pPr>
-        <w:ind w:left="1418" w:firstLine="709"/>
-        <w:jc w:val="left"/>
-        <w:rPr>
-          <w:sz w:val="20"/>
-          <w:szCs w:val="16"/>
-          <w:lang w:val="de-AT"/>
-        </w:rPr>
-      </w:pPr>
-      <w:r>
-        <w:rPr>
-          <w:sz w:val="20"/>
-          <w:szCs w:val="16"/>
-          <w:lang w:val="de-AT"/>
-        </w:rPr>
-        <w:t>05_create_dim_weather.sql</w:t>
-      </w:r>
-    </w:p>
-    <w:p>
-      <w:pPr>
-        <w:ind w:left="1418" w:firstLine="709"/>
-        <w:jc w:val="left"/>
-        <w:rPr>
-          <w:sz w:val="20"/>
-          <w:szCs w:val="16"/>
-          <w:lang w:val="de-AT"/>
-        </w:rPr>
-      </w:pPr>
-      <w:r>
-        <w:rPr>
-          <w:sz w:val="20"/>
-          <w:szCs w:val="16"/>
-          <w:lang w:val="de-AT"/>
+          <w:lang w:val="en-GB"/>
         </w:rPr>
         <w:t>06_create_dim_user_type.sql</w:t>
       </w:r>
@@ -8005,7 +7045,6 @@
         </w:rPr>
         <w:t xml:space="preserve"> </w:t>
       </w:r>
-      <w:proofErr w:type="spellStart"/>
       <w:r>
         <w:rPr>
           <w:sz w:val="20"/>
@@ -8014,7 +7053,6 @@
         </w:rPr>
         <w:t>fact_trips</w:t>
       </w:r>
-      <w:proofErr w:type="spellEnd"/>
     </w:p>
     <w:p>
       <w:pPr>
@@ -8041,7 +7079,6 @@
         </w:rPr>
         <w:t xml:space="preserve"> </w:t>
       </w:r>
-      <w:proofErr w:type="spellStart"/>
       <w:r>
         <w:rPr>
           <w:sz w:val="20"/>
@@ -8050,7 +7087,6 @@
         </w:rPr>
         <w:t>dim_station</w:t>
       </w:r>
-      <w:proofErr w:type="spellEnd"/>
       <w:r>
         <w:rPr>
           <w:sz w:val="20"/>
@@ -8059,7 +7095,6 @@
         </w:rPr>
         <w:t xml:space="preserve">, </w:t>
       </w:r>
-      <w:proofErr w:type="spellStart"/>
       <w:r>
         <w:rPr>
           <w:sz w:val="20"/>
@@ -8068,7 +7103,6 @@
         </w:rPr>
         <w:t>dim_date</w:t>
       </w:r>
-      <w:proofErr w:type="spellEnd"/>
       <w:r>
         <w:rPr>
           <w:sz w:val="20"/>
@@ -8077,7 +7111,6 @@
         </w:rPr>
         <w:t xml:space="preserve">, </w:t>
       </w:r>
-      <w:proofErr w:type="spellStart"/>
       <w:r>
         <w:rPr>
           <w:sz w:val="20"/>
@@ -8086,7 +7119,6 @@
         </w:rPr>
         <w:t>dim_bike</w:t>
       </w:r>
-      <w:proofErr w:type="spellEnd"/>
       <w:r>
         <w:rPr>
           <w:sz w:val="20"/>
@@ -8095,7 +7127,6 @@
         </w:rPr>
         <w:t xml:space="preserve">, </w:t>
       </w:r>
-      <w:proofErr w:type="spellStart"/>
       <w:r>
         <w:rPr>
           <w:sz w:val="20"/>
@@ -8104,7 +7135,6 @@
         </w:rPr>
         <w:t>dim_user_type</w:t>
       </w:r>
-      <w:proofErr w:type="spellEnd"/>
       <w:r>
         <w:rPr>
           <w:sz w:val="20"/>
@@ -8113,7 +7143,6 @@
         </w:rPr>
         <w:t xml:space="preserve">, </w:t>
       </w:r>
-      <w:proofErr w:type="spellStart"/>
       <w:r>
         <w:rPr>
           <w:sz w:val="20"/>
@@ -8122,7 +7151,6 @@
         </w:rPr>
         <w:t>dim_weather</w:t>
       </w:r>
-      <w:proofErr w:type="spellEnd"/>
       <w:r>
         <w:rPr>
           <w:sz w:val="20"/>
@@ -8161,42 +7189,44 @@
           <w:szCs w:val="16"/>
           <w:lang w:val="de-AT"/>
         </w:rPr>
-        <w:t>Python (</w:t>
-      </w:r>
-      <w:proofErr w:type="spellStart"/>
+        <w:t>Python (SQLAlchemy / DB-Verbindung)</w:t>
+      </w:r>
       <w:r>
         <w:rPr>
           <w:sz w:val="20"/>
           <w:szCs w:val="16"/>
           <w:lang w:val="de-AT"/>
         </w:rPr>
-        <w:t>SQLAlchemy</w:t>
-      </w:r>
-      <w:proofErr w:type="spellEnd"/>
+        <w:t xml:space="preserve">, </w:t>
+      </w:r>
       <w:r>
         <w:rPr>
           <w:sz w:val="20"/>
           <w:szCs w:val="16"/>
           <w:lang w:val="de-AT"/>
         </w:rPr>
-        <w:t xml:space="preserve"> / DB-Verbindung)</w:t>
-      </w:r>
-      <w:r>
+        <w:t>SQL (CREATE TABLE + INSERT)</w:t>
+      </w:r>
+    </w:p>
+    <w:p>
+      <w:pPr>
+        <w:jc w:val="left"/>
         <w:rPr>
           <w:sz w:val="20"/>
           <w:szCs w:val="16"/>
           <w:lang w:val="de-AT"/>
         </w:rPr>
-        <w:t xml:space="preserve">, </w:t>
-      </w:r>
-      <w:r>
+      </w:pPr>
+    </w:p>
+    <w:p>
+      <w:pPr>
+        <w:jc w:val="left"/>
         <w:rPr>
           <w:sz w:val="20"/>
           <w:szCs w:val="16"/>
           <w:lang w:val="de-AT"/>
         </w:rPr>
-        <w:t>SQL (CREATE TABLE + INSERT)</w:t>
-      </w:r>
+      </w:pPr>
     </w:p>
     <w:p>
       <w:pPr>
@@ -8210,6 +7240,33 @@
     </w:p>
     <w:p>
       <w:pPr>
+        <w:pStyle w:val="berschrift2"/>
+      </w:pPr>
+      <w:bookmarkStart w:id="30" w:name="_Toc225192415"/>
+      <w:r>
+        <w:lastRenderedPageBreak/>
+        <w:t>Ergebnis</w:t>
+      </w:r>
+      <w:bookmarkEnd w:id="30"/>
+    </w:p>
+    <w:p>
+      <w:pPr>
+        <w:pStyle w:val="berschrift3"/>
+        <w:rPr>
+          <w:lang w:val="de-AT"/>
+        </w:rPr>
+      </w:pPr>
+      <w:bookmarkStart w:id="31" w:name="_Toc225192416"/>
+      <w:r>
+        <w:rPr>
+          <w:lang w:val="de-AT"/>
+        </w:rPr>
+        <w:t>Pipeline-Ausführung</w:t>
+      </w:r>
+      <w:bookmarkEnd w:id="31"/>
+    </w:p>
+    <w:p>
+      <w:pPr>
         <w:jc w:val="left"/>
         <w:rPr>
           <w:sz w:val="20"/>
@@ -8217,43 +7274,14 @@
           <w:lang w:val="de-AT"/>
         </w:rPr>
       </w:pPr>
-    </w:p>
-    <w:p>
-      <w:pPr>
-        <w:jc w:val="left"/>
+      <w:r>
         <w:rPr>
           <w:sz w:val="20"/>
           <w:szCs w:val="16"/>
           <w:lang w:val="de-AT"/>
         </w:rPr>
-      </w:pPr>
-    </w:p>
-    <w:p>
-      <w:pPr>
-        <w:pStyle w:val="berschrift2"/>
-      </w:pPr>
-      <w:bookmarkStart w:id="30" w:name="_Toc225192415"/>
-      <w:r>
-        <w:lastRenderedPageBreak/>
-        <w:t>Ergebnis</w:t>
-      </w:r>
-      <w:bookmarkEnd w:id="30"/>
-    </w:p>
-    <w:p>
-      <w:pPr>
-        <w:pStyle w:val="berschrift3"/>
-        <w:rPr>
-          <w:lang w:val="de-AT"/>
-        </w:rPr>
-      </w:pPr>
-      <w:bookmarkStart w:id="31" w:name="_Toc225192416"/>
-      <w:r>
-        <w:rPr>
-          <w:lang w:val="de-AT"/>
-        </w:rPr>
-        <w:t>Pipeline-Ausführung</w:t>
-      </w:r>
-      <w:bookmarkEnd w:id="31"/>
+        <w:t>„start_pipeline.bat“ ausführen:</w:t>
+      </w:r>
     </w:p>
     <w:p>
       <w:pPr>
@@ -8264,24 +7292,6 @@
           <w:lang w:val="de-AT"/>
         </w:rPr>
       </w:pPr>
-      <w:r>
-        <w:rPr>
-          <w:sz w:val="20"/>
-          <w:szCs w:val="16"/>
-          <w:lang w:val="de-AT"/>
-        </w:rPr>
-        <w:t>„start_pipeline.bat“ ausführen:</w:t>
-      </w:r>
-    </w:p>
-    <w:p>
-      <w:pPr>
-        <w:jc w:val="left"/>
-        <w:rPr>
-          <w:sz w:val="20"/>
-          <w:szCs w:val="16"/>
-          <w:lang w:val="de-AT"/>
-        </w:rPr>
-      </w:pPr>
     </w:p>
     <w:p>
       <w:pPr>
@@ -8290,6 +7300,7 @@
       </w:pPr>
       <w:r>
         <w:rPr>
+          <w:noProof/>
           <w:sz w:val="20"/>
           <w:szCs w:val="16"/>
           <w:lang w:val="de-AT"/>
@@ -8400,6 +7411,7 @@
       </w:pPr>
       <w:r>
         <w:rPr>
+          <w:noProof/>
           <w:sz w:val="20"/>
           <w:szCs w:val="16"/>
           <w:lang w:val="de-AT"/>
@@ -8495,6 +7507,7 @@
       <w:r>
         <w:rPr>
           <w:rFonts w:cs="Arial"/>
+          <w:noProof/>
           <w:lang w:val="de-AT"/>
         </w:rPr>
         <w:lastRenderedPageBreak/>
@@ -8589,17 +7602,9 @@
         <w:rPr>
           <w:lang w:val="de-AT"/>
         </w:rPr>
-        <w:t xml:space="preserve">Nutzung der Daten in </w:t>
-      </w:r>
-      <w:proofErr w:type="spellStart"/>
-      <w:r>
-        <w:rPr>
-          <w:lang w:val="de-AT"/>
-        </w:rPr>
-        <w:t>PowerBI</w:t>
+        <w:t>Nutzung der Daten in PowerBI</w:t>
       </w:r>
       <w:bookmarkEnd w:id="36"/>
-      <w:proofErr w:type="spellEnd"/>
     </w:p>
     <w:p>
       <w:pPr>
@@ -8625,6 +7630,7 @@
       </w:pPr>
       <w:r>
         <w:rPr>
+          <w:noProof/>
           <w:lang w:val="de-AT"/>
         </w:rPr>
         <w:drawing>
@@ -8732,6 +7738,7 @@
       </w:pPr>
       <w:r>
         <w:rPr>
+          <w:noProof/>
           <w:sz w:val="20"/>
           <w:szCs w:val="16"/>
           <w:lang w:val="de-AT"/>
@@ -8805,14 +7812,9 @@
         <w:fldChar w:fldCharType="end"/>
       </w:r>
       <w:r>
-        <w:t xml:space="preserve">: Tabellen laden - </w:t>
-      </w:r>
-      <w:proofErr w:type="spellStart"/>
-      <w:r>
-        <w:t>dim_bike</w:t>
+        <w:t>: Tabellen laden - dim_bike</w:t>
       </w:r>
       <w:bookmarkEnd w:id="38"/>
-      <w:proofErr w:type="spellEnd"/>
     </w:p>
     <w:p>
       <w:pPr>
@@ -8821,6 +7823,7 @@
       </w:pPr>
       <w:r>
         <w:rPr>
+          <w:noProof/>
           <w:sz w:val="20"/>
           <w:szCs w:val="16"/>
           <w:lang w:val="de-AT"/>
@@ -8915,6 +7918,7 @@
       </w:pPr>
       <w:r>
         <w:rPr>
+          <w:noProof/>
           <w:sz w:val="20"/>
           <w:szCs w:val="16"/>
           <w:lang w:val="de-AT"/>
@@ -8990,12 +7994,10 @@
       <w:r>
         <w:t xml:space="preserve">: Tabellen laden - </w:t>
       </w:r>
-      <w:proofErr w:type="spellStart"/>
       <w:r>
         <w:t>dim_station</w:t>
       </w:r>
       <w:bookmarkEnd w:id="40"/>
-      <w:proofErr w:type="spellEnd"/>
     </w:p>
     <w:p>
       <w:pPr>
@@ -9004,6 +8006,7 @@
       </w:pPr>
       <w:r>
         <w:rPr>
+          <w:noProof/>
           <w:sz w:val="20"/>
           <w:szCs w:val="16"/>
           <w:lang w:val="de-AT"/>
@@ -9075,12 +8078,10 @@
       <w:r>
         <w:t xml:space="preserve">: Tabellen laden - </w:t>
       </w:r>
-      <w:proofErr w:type="spellStart"/>
       <w:r>
         <w:t>dim_user_type</w:t>
       </w:r>
       <w:bookmarkEnd w:id="41"/>
-      <w:proofErr w:type="spellEnd"/>
     </w:p>
     <w:p>
       <w:pPr>
@@ -9099,6 +8100,7 @@
     <w:p>
       <w:r>
         <w:rPr>
+          <w:noProof/>
           <w:sz w:val="20"/>
           <w:szCs w:val="16"/>
           <w:lang w:val="de-AT"/>
@@ -9246,12 +8248,10 @@
       <w:r>
         <w:t xml:space="preserve">: Tabellen laden - </w:t>
       </w:r>
-      <w:proofErr w:type="spellStart"/>
       <w:r>
         <w:t>dim_weather</w:t>
       </w:r>
       <w:bookmarkEnd w:id="42"/>
-      <w:proofErr w:type="spellEnd"/>
     </w:p>
     <w:p/>
     <w:p>
@@ -9261,6 +8261,7 @@
       </w:pPr>
       <w:r>
         <w:rPr>
+          <w:noProof/>
           <w:sz w:val="20"/>
           <w:szCs w:val="16"/>
           <w:lang w:val="de-AT"/>
@@ -9405,12 +8406,10 @@
       <w:r>
         <w:t xml:space="preserve">: Tabellen laden - </w:t>
       </w:r>
-      <w:proofErr w:type="spellStart"/>
       <w:r>
         <w:t>fact_trips</w:t>
       </w:r>
       <w:bookmarkEnd w:id="43"/>
-      <w:proofErr w:type="spellEnd"/>
     </w:p>
     <w:p>
       <w:pPr>
@@ -9482,6 +8481,7 @@
       </w:pPr>
       <w:r>
         <w:rPr>
+          <w:noProof/>
           <w:lang w:val="de-AT"/>
         </w:rPr>
         <w:drawing>
@@ -9555,14 +8555,9 @@
         <w:fldChar w:fldCharType="end"/>
       </w:r>
       <w:r>
-        <w:t xml:space="preserve">: Modellansicht </w:t>
-      </w:r>
-      <w:proofErr w:type="spellStart"/>
-      <w:r>
-        <w:t>PowerBI</w:t>
+        <w:t>: Modellansicht PowerBI</w:t>
       </w:r>
       <w:bookmarkEnd w:id="44"/>
-      <w:proofErr w:type="spellEnd"/>
     </w:p>
     <w:p>
       <w:pPr>
@@ -9638,7 +8633,7 @@
           <w:noProof/>
           <w:color w:val="943634"/>
           <w:sz w:val="20"/>
-          <w:lang w:val="de-AT"/>
+          <w:lang w:val="en-GB"/>
         </w:rPr>
       </w:pPr>
       <w:r>
@@ -9650,7 +8645,7 @@
           <w:noProof/>
           <w:color w:val="943634"/>
           <w:sz w:val="20"/>
-          <w:lang w:val="de-AT"/>
+          <w:lang w:val="en-GB"/>
         </w:rPr>
         <w:t xml:space="preserve">Insert a screenshot of </w:t>
       </w:r>
@@ -9663,7 +8658,7 @@
           <w:noProof/>
           <w:color w:val="943634"/>
           <w:sz w:val="20"/>
-          <w:lang w:val="de-AT"/>
+          <w:lang w:val="en-GB"/>
         </w:rPr>
         <w:t>data model modelled in PowerBI</w:t>
       </w:r>
@@ -9676,7 +8671,7 @@
           <w:noProof/>
           <w:color w:val="943634"/>
           <w:sz w:val="20"/>
-          <w:lang w:val="de-AT"/>
+          <w:lang w:val="en-GB"/>
         </w:rPr>
         <w:t xml:space="preserve"> </w:t>
       </w:r>
@@ -9695,7 +8690,7 @@
           <w:noProof/>
           <w:color w:val="943634"/>
           <w:sz w:val="20"/>
-          <w:lang w:val="de-AT"/>
+          <w:lang w:val="en-GB"/>
         </w:rPr>
       </w:pPr>
       <w:r>
@@ -9707,7 +8702,7 @@
           <w:noProof/>
           <w:color w:val="943634"/>
           <w:sz w:val="20"/>
-          <w:lang w:val="de-AT"/>
+          <w:lang w:val="en-GB"/>
         </w:rPr>
         <w:t xml:space="preserve">Important: include screenshots for the configuration of all dimensions, including the created hierarchies if applicable. </w:t>
       </w:r>
@@ -9715,7 +8710,7 @@
     <w:p>
       <w:pPr>
         <w:rPr>
-          <w:lang w:val="de-AT"/>
+          <w:lang w:val="en-GB"/>
         </w:rPr>
       </w:pPr>
     </w:p>
@@ -9733,14 +8728,14 @@
           <w:noProof/>
           <w:color w:val="943634"/>
           <w:sz w:val="20"/>
-          <w:lang w:val="de-AT"/>
-        </w:rPr>
-      </w:pPr>
-    </w:p>
-    <w:p>
-      <w:pPr>
-        <w:rPr>
-          <w:lang w:val="de-AT"/>
+          <w:lang w:val="en-GB"/>
+        </w:rPr>
+      </w:pPr>
+    </w:p>
+    <w:p>
+      <w:pPr>
+        <w:rPr>
+          <w:lang w:val="en-GB"/>
         </w:rPr>
       </w:pPr>
     </w:p>
@@ -9769,7 +8764,7 @@
           <w:noProof/>
           <w:color w:val="943634"/>
           <w:sz w:val="20"/>
-          <w:lang w:val="de-AT"/>
+          <w:lang w:val="en-GB"/>
         </w:rPr>
         <w:t>Present your BI implementation with a few screenshots, list your questions from section 2 and the answers to those questions.</w:t>
       </w:r>
@@ -9782,9 +8777,22 @@
           <w:noProof/>
           <w:color w:val="943634"/>
           <w:sz w:val="20"/>
-          <w:lang w:val="de-AT"/>
-        </w:rPr>
-        <w:t xml:space="preserve"> The screenshots should show that drill-down is supported.</w:t>
+          <w:lang w:val="en-GB"/>
+        </w:rPr>
+        <w:t xml:space="preserve"> </w:t>
+      </w:r>
+      <w:r>
+        <w:rPr>
+          <w:rFonts w:cs="Arial"/>
+          <w:b/>
+          <w:bCs/>
+          <w:i/>
+          <w:noProof/>
+          <w:color w:val="943634"/>
+          <w:sz w:val="20"/>
+          <w:lang w:val="de-AT"/>
+        </w:rPr>
+        <w:t>The screenshots should show that drill-down is supported.</w:t>
       </w:r>
     </w:p>
     <w:p>
@@ -11305,7 +10313,7 @@
 </file>
 
 <file path=word/endnotes.xml><?xml version="1.0" encoding="utf-8"?>
-<w:endnotes xmlns:wpc="http://schemas.microsoft.com/office/word/2010/wordprocessingCanvas" xmlns:cx="http://schemas.microsoft.com/office/drawing/2014/chartex" xmlns:cx1="http://schemas.microsoft.com/office/drawing/2015/9/8/chartex" xmlns:cx2="http://schemas.microsoft.com/office/drawing/2015/10/21/chartex" xmlns:cx3="http://schemas.microsoft.com/office/drawing/2016/5/9/chartex" xmlns:cx4="http://schemas.microsoft.com/office/drawing/2016/5/10/chartex" xmlns:cx5="http://schemas.microsoft.com/office/drawing/2016/5/11/chartex" xmlns:cx6="http://schemas.microsoft.com/office/drawing/2016/5/12/chartex" xmlns:cx7="http://schemas.microsoft.com/office/drawing/2016/5/13/chartex" xmlns:cx8="http://schemas.microsoft.com/office/drawing/2016/5/14/chartex" xmlns:mc="http://schemas.openxmlformats.org/markup-compatibility/2006" xmlns:aink="http://schemas.microsoft.com/office/drawing/2016/ink" xmlns:am3d="http://schemas.microsoft.com/office/drawing/2017/model3d" xmlns:o="urn:schemas-microsoft-com:office:office" xmlns:r="http://schemas.openxmlformats.org/officeDocument/2006/relationships" xmlns:m="http://schemas.openxmlformats.org/officeDocument/2006/math" xmlns:v="urn:schemas-microsoft-com:vml" xmlns:wp14="http://schemas.microsoft.com/office/word/2010/wordprocessingDrawing" xmlns:wp="http://schemas.openxmlformats.org/drawingml/2006/wordprocessingDrawing" xmlns:w10="urn:schemas-microsoft-com:office:word" xmlns:w="http://schemas.openxmlformats.org/wordprocessingml/2006/main" xmlns:w14="http://schemas.microsoft.com/office/word/2010/wordml" xmlns:w15="http://schemas.microsoft.com/office/word/2012/wordml" xmlns:w16cex="http://schemas.microsoft.com/office/word/2018/wordml/cex" xmlns:w16cid="http://schemas.microsoft.com/office/word/2016/wordml/cid" xmlns:w16="http://schemas.microsoft.com/office/word/2018/wordml" xmlns:w16sdtdh="http://schemas.microsoft.com/office/word/2020/wordml/sdtdatahash" xmlns:w16se="http://schemas.microsoft.com/office/word/2015/wordml/symex" xmlns:wpg="http://schemas.microsoft.com/office/word/2010/wordprocessingGroup" xmlns:wpi="http://schemas.microsoft.com/office/word/2010/wordprocessingInk" xmlns:wne="http://schemas.microsoft.com/office/word/2006/wordml" xmlns:wps="http://schemas.microsoft.com/office/word/2010/wordprocessingShape" mc:Ignorable="w14 w15 w16se w16cid w16 w16cex w16sdtdh wp14">
+<w:endnotes xmlns:wpc="http://schemas.microsoft.com/office/word/2010/wordprocessingCanvas" xmlns:cx="http://schemas.microsoft.com/office/drawing/2014/chartex" xmlns:cx1="http://schemas.microsoft.com/office/drawing/2015/9/8/chartex" xmlns:cx2="http://schemas.microsoft.com/office/drawing/2015/10/21/chartex" xmlns:cx3="http://schemas.microsoft.com/office/drawing/2016/5/9/chartex" xmlns:cx4="http://schemas.microsoft.com/office/drawing/2016/5/10/chartex" xmlns:cx5="http://schemas.microsoft.com/office/drawing/2016/5/11/chartex" xmlns:cx6="http://schemas.microsoft.com/office/drawing/2016/5/12/chartex" xmlns:cx7="http://schemas.microsoft.com/office/drawing/2016/5/13/chartex" xmlns:cx8="http://schemas.microsoft.com/office/drawing/2016/5/14/chartex" xmlns:mc="http://schemas.openxmlformats.org/markup-compatibility/2006" xmlns:aink="http://schemas.microsoft.com/office/drawing/2016/ink" xmlns:am3d="http://schemas.microsoft.com/office/drawing/2017/model3d" xmlns:o="urn:schemas-microsoft-com:office:office" xmlns:oel="http://schemas.microsoft.com/office/2019/extlst" xmlns:r="http://schemas.openxmlformats.org/officeDocument/2006/relationships" xmlns:m="http://schemas.openxmlformats.org/officeDocument/2006/math" xmlns:v="urn:schemas-microsoft-com:vml" xmlns:wp14="http://schemas.microsoft.com/office/word/2010/wordprocessingDrawing" xmlns:wp="http://schemas.openxmlformats.org/drawingml/2006/wordprocessingDrawing" xmlns:w10="urn:schemas-microsoft-com:office:word" xmlns:w="http://schemas.openxmlformats.org/wordprocessingml/2006/main" xmlns:w14="http://schemas.microsoft.com/office/word/2010/wordml" xmlns:w15="http://schemas.microsoft.com/office/word/2012/wordml" xmlns:w16cex="http://schemas.microsoft.com/office/word/2018/wordml/cex" xmlns:w16cid="http://schemas.microsoft.com/office/word/2016/wordml/cid" xmlns:w16="http://schemas.microsoft.com/office/word/2018/wordml" xmlns:w16du="http://schemas.microsoft.com/office/word/2023/wordml/word16du" xmlns:w16sdtdh="http://schemas.microsoft.com/office/word/2020/wordml/sdtdatahash" xmlns:w16sdtfl="http://schemas.microsoft.com/office/word/2024/wordml/sdtformatlock" xmlns:w16se="http://schemas.microsoft.com/office/word/2015/wordml/symex" xmlns:wpg="http://schemas.microsoft.com/office/word/2010/wordprocessingGroup" xmlns:wpi="http://schemas.microsoft.com/office/word/2010/wordprocessingInk" xmlns:wne="http://schemas.microsoft.com/office/word/2006/wordml" xmlns:wps="http://schemas.microsoft.com/office/word/2010/wordprocessingShape" mc:Ignorable="w14 w15 w16se w16cid w16 w16cex w16sdtdh w16sdtfl w16du wp14">
   <w:endnote w:type="separator" w:id="-1">
     <w:p>
       <w:r>
@@ -11324,7 +10332,7 @@
 </file>
 
 <file path=word/footer1.xml><?xml version="1.0" encoding="utf-8"?>
-<w:ftr xmlns:wpc="http://schemas.microsoft.com/office/word/2010/wordprocessingCanvas" xmlns:cx="http://schemas.microsoft.com/office/drawing/2014/chartex" xmlns:cx1="http://schemas.microsoft.com/office/drawing/2015/9/8/chartex" xmlns:cx2="http://schemas.microsoft.com/office/drawing/2015/10/21/chartex" xmlns:cx3="http://schemas.microsoft.com/office/drawing/2016/5/9/chartex" xmlns:cx4="http://schemas.microsoft.com/office/drawing/2016/5/10/chartex" xmlns:cx5="http://schemas.microsoft.com/office/drawing/2016/5/11/chartex" xmlns:cx6="http://schemas.microsoft.com/office/drawing/2016/5/12/chartex" xmlns:cx7="http://schemas.microsoft.com/office/drawing/2016/5/13/chartex" xmlns:cx8="http://schemas.microsoft.com/office/drawing/2016/5/14/chartex" xmlns:mc="http://schemas.openxmlformats.org/markup-compatibility/2006" xmlns:aink="http://schemas.microsoft.com/office/drawing/2016/ink" xmlns:am3d="http://schemas.microsoft.com/office/drawing/2017/model3d" xmlns:o="urn:schemas-microsoft-com:office:office" xmlns:r="http://schemas.openxmlformats.org/officeDocument/2006/relationships" xmlns:m="http://schemas.openxmlformats.org/officeDocument/2006/math" xmlns:v="urn:schemas-microsoft-com:vml" xmlns:wp14="http://schemas.microsoft.com/office/word/2010/wordprocessingDrawing" xmlns:wp="http://schemas.openxmlformats.org/drawingml/2006/wordprocessingDrawing" xmlns:w10="urn:schemas-microsoft-com:office:word" xmlns:w="http://schemas.openxmlformats.org/wordprocessingml/2006/main" xmlns:w14="http://schemas.microsoft.com/office/word/2010/wordml" xmlns:w15="http://schemas.microsoft.com/office/word/2012/wordml" xmlns:w16cex="http://schemas.microsoft.com/office/word/2018/wordml/cex" xmlns:w16cid="http://schemas.microsoft.com/office/word/2016/wordml/cid" xmlns:w16="http://schemas.microsoft.com/office/word/2018/wordml" xmlns:w16sdtdh="http://schemas.microsoft.com/office/word/2020/wordml/sdtdatahash" xmlns:w16se="http://schemas.microsoft.com/office/word/2015/wordml/symex" xmlns:wpg="http://schemas.microsoft.com/office/word/2010/wordprocessingGroup" xmlns:wpi="http://schemas.microsoft.com/office/word/2010/wordprocessingInk" xmlns:wne="http://schemas.microsoft.com/office/word/2006/wordml" xmlns:wps="http://schemas.microsoft.com/office/word/2010/wordprocessingShape" mc:Ignorable="w14 w15 w16se w16cid w16 w16cex w16sdtdh wp14">
+<w:ftr xmlns:wpc="http://schemas.microsoft.com/office/word/2010/wordprocessingCanvas" xmlns:cx="http://schemas.microsoft.com/office/drawing/2014/chartex" xmlns:cx1="http://schemas.microsoft.com/office/drawing/2015/9/8/chartex" xmlns:cx2="http://schemas.microsoft.com/office/drawing/2015/10/21/chartex" xmlns:cx3="http://schemas.microsoft.com/office/drawing/2016/5/9/chartex" xmlns:cx4="http://schemas.microsoft.com/office/drawing/2016/5/10/chartex" xmlns:cx5="http://schemas.microsoft.com/office/drawing/2016/5/11/chartex" xmlns:cx6="http://schemas.microsoft.com/office/drawing/2016/5/12/chartex" xmlns:cx7="http://schemas.microsoft.com/office/drawing/2016/5/13/chartex" xmlns:cx8="http://schemas.microsoft.com/office/drawing/2016/5/14/chartex" xmlns:mc="http://schemas.openxmlformats.org/markup-compatibility/2006" xmlns:aink="http://schemas.microsoft.com/office/drawing/2016/ink" xmlns:am3d="http://schemas.microsoft.com/office/drawing/2017/model3d" xmlns:o="urn:schemas-microsoft-com:office:office" xmlns:oel="http://schemas.microsoft.com/office/2019/extlst" xmlns:r="http://schemas.openxmlformats.org/officeDocument/2006/relationships" xmlns:m="http://schemas.openxmlformats.org/officeDocument/2006/math" xmlns:v="urn:schemas-microsoft-com:vml" xmlns:wp14="http://schemas.microsoft.com/office/word/2010/wordprocessingDrawing" xmlns:wp="http://schemas.openxmlformats.org/drawingml/2006/wordprocessingDrawing" xmlns:w10="urn:schemas-microsoft-com:office:word" xmlns:w="http://schemas.openxmlformats.org/wordprocessingml/2006/main" xmlns:w14="http://schemas.microsoft.com/office/word/2010/wordml" xmlns:w15="http://schemas.microsoft.com/office/word/2012/wordml" xmlns:w16cex="http://schemas.microsoft.com/office/word/2018/wordml/cex" xmlns:w16cid="http://schemas.microsoft.com/office/word/2016/wordml/cid" xmlns:w16="http://schemas.microsoft.com/office/word/2018/wordml" xmlns:w16du="http://schemas.microsoft.com/office/word/2023/wordml/word16du" xmlns:w16sdtdh="http://schemas.microsoft.com/office/word/2020/wordml/sdtdatahash" xmlns:w16sdtfl="http://schemas.microsoft.com/office/word/2024/wordml/sdtformatlock" xmlns:w16se="http://schemas.microsoft.com/office/word/2015/wordml/symex" xmlns:wpg="http://schemas.microsoft.com/office/word/2010/wordprocessingGroup" xmlns:wpi="http://schemas.microsoft.com/office/word/2010/wordprocessingInk" xmlns:wne="http://schemas.microsoft.com/office/word/2006/wordml" xmlns:wps="http://schemas.microsoft.com/office/word/2010/wordprocessingShape" mc:Ignorable="w14 w15 w16se w16cid w16 w16cex w16sdtdh w16sdtfl w16du wp14">
   <w:p>
     <w:pPr>
       <w:pStyle w:val="Fuzeile"/>
@@ -11561,7 +10569,6 @@
               <w:szCs w:val="16"/>
             </w:rPr>
           </w:pPr>
-          <w:proofErr w:type="spellStart"/>
           <w:r>
             <w:rPr>
               <w:sz w:val="16"/>
@@ -11569,7 +10576,6 @@
             </w:rPr>
             <w:t>CD_citibike</w:t>
           </w:r>
-          <w:proofErr w:type="spellEnd"/>
         </w:p>
       </w:tc>
       <w:tc>
@@ -11758,7 +10764,7 @@
 </file>
 
 <file path=word/footer2.xml><?xml version="1.0" encoding="utf-8"?>
-<w:ftr xmlns:wpc="http://schemas.microsoft.com/office/word/2010/wordprocessingCanvas" xmlns:cx="http://schemas.microsoft.com/office/drawing/2014/chartex" xmlns:cx1="http://schemas.microsoft.com/office/drawing/2015/9/8/chartex" xmlns:cx2="http://schemas.microsoft.com/office/drawing/2015/10/21/chartex" xmlns:cx3="http://schemas.microsoft.com/office/drawing/2016/5/9/chartex" xmlns:cx4="http://schemas.microsoft.com/office/drawing/2016/5/10/chartex" xmlns:cx5="http://schemas.microsoft.com/office/drawing/2016/5/11/chartex" xmlns:cx6="http://schemas.microsoft.com/office/drawing/2016/5/12/chartex" xmlns:cx7="http://schemas.microsoft.com/office/drawing/2016/5/13/chartex" xmlns:cx8="http://schemas.microsoft.com/office/drawing/2016/5/14/chartex" xmlns:mc="http://schemas.openxmlformats.org/markup-compatibility/2006" xmlns:aink="http://schemas.microsoft.com/office/drawing/2016/ink" xmlns:am3d="http://schemas.microsoft.com/office/drawing/2017/model3d" xmlns:o="urn:schemas-microsoft-com:office:office" xmlns:r="http://schemas.openxmlformats.org/officeDocument/2006/relationships" xmlns:m="http://schemas.openxmlformats.org/officeDocument/2006/math" xmlns:v="urn:schemas-microsoft-com:vml" xmlns:wp14="http://schemas.microsoft.com/office/word/2010/wordprocessingDrawing" xmlns:wp="http://schemas.openxmlformats.org/drawingml/2006/wordprocessingDrawing" xmlns:w10="urn:schemas-microsoft-com:office:word" xmlns:w="http://schemas.openxmlformats.org/wordprocessingml/2006/main" xmlns:w14="http://schemas.microsoft.com/office/word/2010/wordml" xmlns:w15="http://schemas.microsoft.com/office/word/2012/wordml" xmlns:w16cex="http://schemas.microsoft.com/office/word/2018/wordml/cex" xmlns:w16cid="http://schemas.microsoft.com/office/word/2016/wordml/cid" xmlns:w16="http://schemas.microsoft.com/office/word/2018/wordml" xmlns:w16sdtdh="http://schemas.microsoft.com/office/word/2020/wordml/sdtdatahash" xmlns:w16se="http://schemas.microsoft.com/office/word/2015/wordml/symex" xmlns:wpg="http://schemas.microsoft.com/office/word/2010/wordprocessingGroup" xmlns:wpi="http://schemas.microsoft.com/office/word/2010/wordprocessingInk" xmlns:wne="http://schemas.microsoft.com/office/word/2006/wordml" xmlns:wps="http://schemas.microsoft.com/office/word/2010/wordprocessingShape" mc:Ignorable="w14 w15 w16se w16cid w16 w16cex w16sdtdh wp14">
+<w:ftr xmlns:wpc="http://schemas.microsoft.com/office/word/2010/wordprocessingCanvas" xmlns:cx="http://schemas.microsoft.com/office/drawing/2014/chartex" xmlns:cx1="http://schemas.microsoft.com/office/drawing/2015/9/8/chartex" xmlns:cx2="http://schemas.microsoft.com/office/drawing/2015/10/21/chartex" xmlns:cx3="http://schemas.microsoft.com/office/drawing/2016/5/9/chartex" xmlns:cx4="http://schemas.microsoft.com/office/drawing/2016/5/10/chartex" xmlns:cx5="http://schemas.microsoft.com/office/drawing/2016/5/11/chartex" xmlns:cx6="http://schemas.microsoft.com/office/drawing/2016/5/12/chartex" xmlns:cx7="http://schemas.microsoft.com/office/drawing/2016/5/13/chartex" xmlns:cx8="http://schemas.microsoft.com/office/drawing/2016/5/14/chartex" xmlns:mc="http://schemas.openxmlformats.org/markup-compatibility/2006" xmlns:aink="http://schemas.microsoft.com/office/drawing/2016/ink" xmlns:am3d="http://schemas.microsoft.com/office/drawing/2017/model3d" xmlns:o="urn:schemas-microsoft-com:office:office" xmlns:oel="http://schemas.microsoft.com/office/2019/extlst" xmlns:r="http://schemas.openxmlformats.org/officeDocument/2006/relationships" xmlns:m="http://schemas.openxmlformats.org/officeDocument/2006/math" xmlns:v="urn:schemas-microsoft-com:vml" xmlns:wp14="http://schemas.microsoft.com/office/word/2010/wordprocessingDrawing" xmlns:wp="http://schemas.openxmlformats.org/drawingml/2006/wordprocessingDrawing" xmlns:w10="urn:schemas-microsoft-com:office:word" xmlns:w="http://schemas.openxmlformats.org/wordprocessingml/2006/main" xmlns:w14="http://schemas.microsoft.com/office/word/2010/wordml" xmlns:w15="http://schemas.microsoft.com/office/word/2012/wordml" xmlns:w16cex="http://schemas.microsoft.com/office/word/2018/wordml/cex" xmlns:w16cid="http://schemas.microsoft.com/office/word/2016/wordml/cid" xmlns:w16="http://schemas.microsoft.com/office/word/2018/wordml" xmlns:w16du="http://schemas.microsoft.com/office/word/2023/wordml/word16du" xmlns:w16sdtdh="http://schemas.microsoft.com/office/word/2020/wordml/sdtdatahash" xmlns:w16sdtfl="http://schemas.microsoft.com/office/word/2024/wordml/sdtformatlock" xmlns:w16se="http://schemas.microsoft.com/office/word/2015/wordml/symex" xmlns:wpg="http://schemas.microsoft.com/office/word/2010/wordprocessingGroup" xmlns:wpi="http://schemas.microsoft.com/office/word/2010/wordprocessingInk" xmlns:wne="http://schemas.microsoft.com/office/word/2006/wordml" xmlns:wps="http://schemas.microsoft.com/office/word/2010/wordprocessingShape" mc:Ignorable="w14 w15 w16se w16cid w16 w16cex w16sdtdh w16sdtfl w16du wp14">
   <w:p>
     <w:pPr>
       <w:pStyle w:val="Fuzeile"/>
@@ -11787,7 +10793,7 @@
 </file>
 
 <file path=word/footer3.xml><?xml version="1.0" encoding="utf-8"?>
-<w:ftr xmlns:wpc="http://schemas.microsoft.com/office/word/2010/wordprocessingCanvas" xmlns:cx="http://schemas.microsoft.com/office/drawing/2014/chartex" xmlns:cx1="http://schemas.microsoft.com/office/drawing/2015/9/8/chartex" xmlns:cx2="http://schemas.microsoft.com/office/drawing/2015/10/21/chartex" xmlns:cx3="http://schemas.microsoft.com/office/drawing/2016/5/9/chartex" xmlns:cx4="http://schemas.microsoft.com/office/drawing/2016/5/10/chartex" xmlns:cx5="http://schemas.microsoft.com/office/drawing/2016/5/11/chartex" xmlns:cx6="http://schemas.microsoft.com/office/drawing/2016/5/12/chartex" xmlns:cx7="http://schemas.microsoft.com/office/drawing/2016/5/13/chartex" xmlns:cx8="http://schemas.microsoft.com/office/drawing/2016/5/14/chartex" xmlns:mc="http://schemas.openxmlformats.org/markup-compatibility/2006" xmlns:aink="http://schemas.microsoft.com/office/drawing/2016/ink" xmlns:am3d="http://schemas.microsoft.com/office/drawing/2017/model3d" xmlns:o="urn:schemas-microsoft-com:office:office" xmlns:r="http://schemas.openxmlformats.org/officeDocument/2006/relationships" xmlns:m="http://schemas.openxmlformats.org/officeDocument/2006/math" xmlns:v="urn:schemas-microsoft-com:vml" xmlns:wp14="http://schemas.microsoft.com/office/word/2010/wordprocessingDrawing" xmlns:wp="http://schemas.openxmlformats.org/drawingml/2006/wordprocessingDrawing" xmlns:w10="urn:schemas-microsoft-com:office:word" xmlns:w="http://schemas.openxmlformats.org/wordprocessingml/2006/main" xmlns:w14="http://schemas.microsoft.com/office/word/2010/wordml" xmlns:w15="http://schemas.microsoft.com/office/word/2012/wordml" xmlns:w16cex="http://schemas.microsoft.com/office/word/2018/wordml/cex" xmlns:w16cid="http://schemas.microsoft.com/office/word/2016/wordml/cid" xmlns:w16="http://schemas.microsoft.com/office/word/2018/wordml" xmlns:w16sdtdh="http://schemas.microsoft.com/office/word/2020/wordml/sdtdatahash" xmlns:w16se="http://schemas.microsoft.com/office/word/2015/wordml/symex" xmlns:wpg="http://schemas.microsoft.com/office/word/2010/wordprocessingGroup" xmlns:wpi="http://schemas.microsoft.com/office/word/2010/wordprocessingInk" xmlns:wne="http://schemas.microsoft.com/office/word/2006/wordml" xmlns:wps="http://schemas.microsoft.com/office/word/2010/wordprocessingShape" mc:Ignorable="w14 w15 w16se w16cid w16 w16cex w16sdtdh wp14">
+<w:ftr xmlns:wpc="http://schemas.microsoft.com/office/word/2010/wordprocessingCanvas" xmlns:cx="http://schemas.microsoft.com/office/drawing/2014/chartex" xmlns:cx1="http://schemas.microsoft.com/office/drawing/2015/9/8/chartex" xmlns:cx2="http://schemas.microsoft.com/office/drawing/2015/10/21/chartex" xmlns:cx3="http://schemas.microsoft.com/office/drawing/2016/5/9/chartex" xmlns:cx4="http://schemas.microsoft.com/office/drawing/2016/5/10/chartex" xmlns:cx5="http://schemas.microsoft.com/office/drawing/2016/5/11/chartex" xmlns:cx6="http://schemas.microsoft.com/office/drawing/2016/5/12/chartex" xmlns:cx7="http://schemas.microsoft.com/office/drawing/2016/5/13/chartex" xmlns:cx8="http://schemas.microsoft.com/office/drawing/2016/5/14/chartex" xmlns:mc="http://schemas.openxmlformats.org/markup-compatibility/2006" xmlns:aink="http://schemas.microsoft.com/office/drawing/2016/ink" xmlns:am3d="http://schemas.microsoft.com/office/drawing/2017/model3d" xmlns:o="urn:schemas-microsoft-com:office:office" xmlns:oel="http://schemas.microsoft.com/office/2019/extlst" xmlns:r="http://schemas.openxmlformats.org/officeDocument/2006/relationships" xmlns:m="http://schemas.openxmlformats.org/officeDocument/2006/math" xmlns:v="urn:schemas-microsoft-com:vml" xmlns:wp14="http://schemas.microsoft.com/office/word/2010/wordprocessingDrawing" xmlns:wp="http://schemas.openxmlformats.org/drawingml/2006/wordprocessingDrawing" xmlns:w10="urn:schemas-microsoft-com:office:word" xmlns:w="http://schemas.openxmlformats.org/wordprocessingml/2006/main" xmlns:w14="http://schemas.microsoft.com/office/word/2010/wordml" xmlns:w15="http://schemas.microsoft.com/office/word/2012/wordml" xmlns:w16cex="http://schemas.microsoft.com/office/word/2018/wordml/cex" xmlns:w16cid="http://schemas.microsoft.com/office/word/2016/wordml/cid" xmlns:w16="http://schemas.microsoft.com/office/word/2018/wordml" xmlns:w16du="http://schemas.microsoft.com/office/word/2023/wordml/word16du" xmlns:w16sdtdh="http://schemas.microsoft.com/office/word/2020/wordml/sdtdatahash" xmlns:w16sdtfl="http://schemas.microsoft.com/office/word/2024/wordml/sdtformatlock" xmlns:w16se="http://schemas.microsoft.com/office/word/2015/wordml/symex" xmlns:wpg="http://schemas.microsoft.com/office/word/2010/wordprocessingGroup" xmlns:wpi="http://schemas.microsoft.com/office/word/2010/wordprocessingInk" xmlns:wne="http://schemas.microsoft.com/office/word/2006/wordml" xmlns:wps="http://schemas.microsoft.com/office/word/2010/wordprocessingShape" mc:Ignorable="w14 w15 w16se w16cid w16 w16cex w16sdtdh w16sdtfl w16du wp14">
   <w:p>
     <w:pPr>
       <w:pStyle w:val="Fuzeile"/>
@@ -12022,7 +11028,6 @@
               <w:szCs w:val="16"/>
             </w:rPr>
           </w:pPr>
-          <w:proofErr w:type="spellStart"/>
           <w:r>
             <w:rPr>
               <w:sz w:val="16"/>
@@ -12030,7 +11035,6 @@
             </w:rPr>
             <w:t>CD_citibike</w:t>
           </w:r>
-          <w:proofErr w:type="spellEnd"/>
         </w:p>
       </w:tc>
       <w:tc>
@@ -12210,7 +11214,7 @@
 </file>
 
 <file path=word/footnotes.xml><?xml version="1.0" encoding="utf-8"?>
-<w:footnotes xmlns:wpc="http://schemas.microsoft.com/office/word/2010/wordprocessingCanvas" xmlns:cx="http://schemas.microsoft.com/office/drawing/2014/chartex" xmlns:cx1="http://schemas.microsoft.com/office/drawing/2015/9/8/chartex" xmlns:cx2="http://schemas.microsoft.com/office/drawing/2015/10/21/chartex" xmlns:cx3="http://schemas.microsoft.com/office/drawing/2016/5/9/chartex" xmlns:cx4="http://schemas.microsoft.com/office/drawing/2016/5/10/chartex" xmlns:cx5="http://schemas.microsoft.com/office/drawing/2016/5/11/chartex" xmlns:cx6="http://schemas.microsoft.com/office/drawing/2016/5/12/chartex" xmlns:cx7="http://schemas.microsoft.com/office/drawing/2016/5/13/chartex" xmlns:cx8="http://schemas.microsoft.com/office/drawing/2016/5/14/chartex" xmlns:mc="http://schemas.openxmlformats.org/markup-compatibility/2006" xmlns:aink="http://schemas.microsoft.com/office/drawing/2016/ink" xmlns:am3d="http://schemas.microsoft.com/office/drawing/2017/model3d" xmlns:o="urn:schemas-microsoft-com:office:office" xmlns:r="http://schemas.openxmlformats.org/officeDocument/2006/relationships" xmlns:m="http://schemas.openxmlformats.org/officeDocument/2006/math" xmlns:v="urn:schemas-microsoft-com:vml" xmlns:wp14="http://schemas.microsoft.com/office/word/2010/wordprocessingDrawing" xmlns:wp="http://schemas.openxmlformats.org/drawingml/2006/wordprocessingDrawing" xmlns:w10="urn:schemas-microsoft-com:office:word" xmlns:w="http://schemas.openxmlformats.org/wordprocessingml/2006/main" xmlns:w14="http://schemas.microsoft.com/office/word/2010/wordml" xmlns:w15="http://schemas.microsoft.com/office/word/2012/wordml" xmlns:w16cex="http://schemas.microsoft.com/office/word/2018/wordml/cex" xmlns:w16cid="http://schemas.microsoft.com/office/word/2016/wordml/cid" xmlns:w16="http://schemas.microsoft.com/office/word/2018/wordml" xmlns:w16sdtdh="http://schemas.microsoft.com/office/word/2020/wordml/sdtdatahash" xmlns:w16se="http://schemas.microsoft.com/office/word/2015/wordml/symex" xmlns:wpg="http://schemas.microsoft.com/office/word/2010/wordprocessingGroup" xmlns:wpi="http://schemas.microsoft.com/office/word/2010/wordprocessingInk" xmlns:wne="http://schemas.microsoft.com/office/word/2006/wordml" xmlns:wps="http://schemas.microsoft.com/office/word/2010/wordprocessingShape" mc:Ignorable="w14 w15 w16se w16cid w16 w16cex w16sdtdh wp14">
+<w:footnotes xmlns:wpc="http://schemas.microsoft.com/office/word/2010/wordprocessingCanvas" xmlns:cx="http://schemas.microsoft.com/office/drawing/2014/chartex" xmlns:cx1="http://schemas.microsoft.com/office/drawing/2015/9/8/chartex" xmlns:cx2="http://schemas.microsoft.com/office/drawing/2015/10/21/chartex" xmlns:cx3="http://schemas.microsoft.com/office/drawing/2016/5/9/chartex" xmlns:cx4="http://schemas.microsoft.com/office/drawing/2016/5/10/chartex" xmlns:cx5="http://schemas.microsoft.com/office/drawing/2016/5/11/chartex" xmlns:cx6="http://schemas.microsoft.com/office/drawing/2016/5/12/chartex" xmlns:cx7="http://schemas.microsoft.com/office/drawing/2016/5/13/chartex" xmlns:cx8="http://schemas.microsoft.com/office/drawing/2016/5/14/chartex" xmlns:mc="http://schemas.openxmlformats.org/markup-compatibility/2006" xmlns:aink="http://schemas.microsoft.com/office/drawing/2016/ink" xmlns:am3d="http://schemas.microsoft.com/office/drawing/2017/model3d" xmlns:o="urn:schemas-microsoft-com:office:office" xmlns:oel="http://schemas.microsoft.com/office/2019/extlst" xmlns:r="http://schemas.openxmlformats.org/officeDocument/2006/relationships" xmlns:m="http://schemas.openxmlformats.org/officeDocument/2006/math" xmlns:v="urn:schemas-microsoft-com:vml" xmlns:wp14="http://schemas.microsoft.com/office/word/2010/wordprocessingDrawing" xmlns:wp="http://schemas.openxmlformats.org/drawingml/2006/wordprocessingDrawing" xmlns:w10="urn:schemas-microsoft-com:office:word" xmlns:w="http://schemas.openxmlformats.org/wordprocessingml/2006/main" xmlns:w14="http://schemas.microsoft.com/office/word/2010/wordml" xmlns:w15="http://schemas.microsoft.com/office/word/2012/wordml" xmlns:w16cex="http://schemas.microsoft.com/office/word/2018/wordml/cex" xmlns:w16cid="http://schemas.microsoft.com/office/word/2016/wordml/cid" xmlns:w16="http://schemas.microsoft.com/office/word/2018/wordml" xmlns:w16du="http://schemas.microsoft.com/office/word/2023/wordml/word16du" xmlns:w16sdtdh="http://schemas.microsoft.com/office/word/2020/wordml/sdtdatahash" xmlns:w16sdtfl="http://schemas.microsoft.com/office/word/2024/wordml/sdtformatlock" xmlns:w16se="http://schemas.microsoft.com/office/word/2015/wordml/symex" xmlns:wpg="http://schemas.microsoft.com/office/word/2010/wordprocessingGroup" xmlns:wpi="http://schemas.microsoft.com/office/word/2010/wordprocessingInk" xmlns:wne="http://schemas.microsoft.com/office/word/2006/wordml" xmlns:wps="http://schemas.microsoft.com/office/word/2010/wordprocessingShape" mc:Ignorable="w14 w15 w16se w16cid w16 w16cex w16sdtdh w16sdtfl w16du wp14">
   <w:footnote w:type="separator" w:id="-1">
     <w:p>
       <w:r>
@@ -12229,7 +11233,7 @@
 </file>
 
 <file path=word/header1.xml><?xml version="1.0" encoding="utf-8"?>
-<w:hdr xmlns:wpc="http://schemas.microsoft.com/office/word/2010/wordprocessingCanvas" xmlns:cx="http://schemas.microsoft.com/office/drawing/2014/chartex" xmlns:cx1="http://schemas.microsoft.com/office/drawing/2015/9/8/chartex" xmlns:cx2="http://schemas.microsoft.com/office/drawing/2015/10/21/chartex" xmlns:cx3="http://schemas.microsoft.com/office/drawing/2016/5/9/chartex" xmlns:cx4="http://schemas.microsoft.com/office/drawing/2016/5/10/chartex" xmlns:cx5="http://schemas.microsoft.com/office/drawing/2016/5/11/chartex" xmlns:cx6="http://schemas.microsoft.com/office/drawing/2016/5/12/chartex" xmlns:cx7="http://schemas.microsoft.com/office/drawing/2016/5/13/chartex" xmlns:cx8="http://schemas.microsoft.com/office/drawing/2016/5/14/chartex" xmlns:mc="http://schemas.openxmlformats.org/markup-compatibility/2006" xmlns:aink="http://schemas.microsoft.com/office/drawing/2016/ink" xmlns:am3d="http://schemas.microsoft.com/office/drawing/2017/model3d" xmlns:o="urn:schemas-microsoft-com:office:office" xmlns:r="http://schemas.openxmlformats.org/officeDocument/2006/relationships" xmlns:m="http://schemas.openxmlformats.org/officeDocument/2006/math" xmlns:v="urn:schemas-microsoft-com:vml" xmlns:wp14="http://schemas.microsoft.com/office/word/2010/wordprocessingDrawing" xmlns:wp="http://schemas.openxmlformats.org/drawingml/2006/wordprocessingDrawing" xmlns:w10="urn:schemas-microsoft-com:office:word" xmlns:w="http://schemas.openxmlformats.org/wordprocessingml/2006/main" xmlns:w14="http://schemas.microsoft.com/office/word/2010/wordml" xmlns:w15="http://schemas.microsoft.com/office/word/2012/wordml" xmlns:w16cex="http://schemas.microsoft.com/office/word/2018/wordml/cex" xmlns:w16cid="http://schemas.microsoft.com/office/word/2016/wordml/cid" xmlns:w16="http://schemas.microsoft.com/office/word/2018/wordml" xmlns:w16sdtdh="http://schemas.microsoft.com/office/word/2020/wordml/sdtdatahash" xmlns:w16se="http://schemas.microsoft.com/office/word/2015/wordml/symex" xmlns:wpg="http://schemas.microsoft.com/office/word/2010/wordprocessingGroup" xmlns:wpi="http://schemas.microsoft.com/office/word/2010/wordprocessingInk" xmlns:wne="http://schemas.microsoft.com/office/word/2006/wordml" xmlns:wps="http://schemas.microsoft.com/office/word/2010/wordprocessingShape" mc:Ignorable="w14 w15 w16se w16cid w16 w16cex w16sdtdh wp14">
+<w:hdr xmlns:wpc="http://schemas.microsoft.com/office/word/2010/wordprocessingCanvas" xmlns:cx="http://schemas.microsoft.com/office/drawing/2014/chartex" xmlns:cx1="http://schemas.microsoft.com/office/drawing/2015/9/8/chartex" xmlns:cx2="http://schemas.microsoft.com/office/drawing/2015/10/21/chartex" xmlns:cx3="http://schemas.microsoft.com/office/drawing/2016/5/9/chartex" xmlns:cx4="http://schemas.microsoft.com/office/drawing/2016/5/10/chartex" xmlns:cx5="http://schemas.microsoft.com/office/drawing/2016/5/11/chartex" xmlns:cx6="http://schemas.microsoft.com/office/drawing/2016/5/12/chartex" xmlns:cx7="http://schemas.microsoft.com/office/drawing/2016/5/13/chartex" xmlns:cx8="http://schemas.microsoft.com/office/drawing/2016/5/14/chartex" xmlns:mc="http://schemas.openxmlformats.org/markup-compatibility/2006" xmlns:aink="http://schemas.microsoft.com/office/drawing/2016/ink" xmlns:am3d="http://schemas.microsoft.com/office/drawing/2017/model3d" xmlns:o="urn:schemas-microsoft-com:office:office" xmlns:oel="http://schemas.microsoft.com/office/2019/extlst" xmlns:r="http://schemas.openxmlformats.org/officeDocument/2006/relationships" xmlns:m="http://schemas.openxmlformats.org/officeDocument/2006/math" xmlns:v="urn:schemas-microsoft-com:vml" xmlns:wp14="http://schemas.microsoft.com/office/word/2010/wordprocessingDrawing" xmlns:wp="http://schemas.openxmlformats.org/drawingml/2006/wordprocessingDrawing" xmlns:w10="urn:schemas-microsoft-com:office:word" xmlns:w="http://schemas.openxmlformats.org/wordprocessingml/2006/main" xmlns:w14="http://schemas.microsoft.com/office/word/2010/wordml" xmlns:w15="http://schemas.microsoft.com/office/word/2012/wordml" xmlns:w16cex="http://schemas.microsoft.com/office/word/2018/wordml/cex" xmlns:w16cid="http://schemas.microsoft.com/office/word/2016/wordml/cid" xmlns:w16="http://schemas.microsoft.com/office/word/2018/wordml" xmlns:w16du="http://schemas.microsoft.com/office/word/2023/wordml/word16du" xmlns:w16sdtdh="http://schemas.microsoft.com/office/word/2020/wordml/sdtdatahash" xmlns:w16sdtfl="http://schemas.microsoft.com/office/word/2024/wordml/sdtformatlock" xmlns:w16se="http://schemas.microsoft.com/office/word/2015/wordml/symex" xmlns:wpg="http://schemas.microsoft.com/office/word/2010/wordprocessingGroup" xmlns:wpi="http://schemas.microsoft.com/office/word/2010/wordprocessingInk" xmlns:wne="http://schemas.microsoft.com/office/word/2006/wordml" xmlns:wps="http://schemas.microsoft.com/office/word/2010/wordprocessingShape" mc:Ignorable="w14 w15 w16se w16cid w16 w16cex w16sdtdh w16sdtfl w16du wp14">
   <w:p>
     <w:pPr>
       <w:pStyle w:val="Kopfzeile"/>
@@ -12351,7 +11355,7 @@
 </file>
 
 <file path=word/header2.xml><?xml version="1.0" encoding="utf-8"?>
-<w:hdr xmlns:wpc="http://schemas.microsoft.com/office/word/2010/wordprocessingCanvas" xmlns:cx="http://schemas.microsoft.com/office/drawing/2014/chartex" xmlns:cx1="http://schemas.microsoft.com/office/drawing/2015/9/8/chartex" xmlns:cx2="http://schemas.microsoft.com/office/drawing/2015/10/21/chartex" xmlns:cx3="http://schemas.microsoft.com/office/drawing/2016/5/9/chartex" xmlns:cx4="http://schemas.microsoft.com/office/drawing/2016/5/10/chartex" xmlns:cx5="http://schemas.microsoft.com/office/drawing/2016/5/11/chartex" xmlns:cx6="http://schemas.microsoft.com/office/drawing/2016/5/12/chartex" xmlns:cx7="http://schemas.microsoft.com/office/drawing/2016/5/13/chartex" xmlns:cx8="http://schemas.microsoft.com/office/drawing/2016/5/14/chartex" xmlns:mc="http://schemas.openxmlformats.org/markup-compatibility/2006" xmlns:aink="http://schemas.microsoft.com/office/drawing/2016/ink" xmlns:am3d="http://schemas.microsoft.com/office/drawing/2017/model3d" xmlns:o="urn:schemas-microsoft-com:office:office" xmlns:r="http://schemas.openxmlformats.org/officeDocument/2006/relationships" xmlns:m="http://schemas.openxmlformats.org/officeDocument/2006/math" xmlns:v="urn:schemas-microsoft-com:vml" xmlns:wp14="http://schemas.microsoft.com/office/word/2010/wordprocessingDrawing" xmlns:wp="http://schemas.openxmlformats.org/drawingml/2006/wordprocessingDrawing" xmlns:w10="urn:schemas-microsoft-com:office:word" xmlns:w="http://schemas.openxmlformats.org/wordprocessingml/2006/main" xmlns:w14="http://schemas.microsoft.com/office/word/2010/wordml" xmlns:w15="http://schemas.microsoft.com/office/word/2012/wordml" xmlns:w16cex="http://schemas.microsoft.com/office/word/2018/wordml/cex" xmlns:w16cid="http://schemas.microsoft.com/office/word/2016/wordml/cid" xmlns:w16="http://schemas.microsoft.com/office/word/2018/wordml" xmlns:w16sdtdh="http://schemas.microsoft.com/office/word/2020/wordml/sdtdatahash" xmlns:w16se="http://schemas.microsoft.com/office/word/2015/wordml/symex" xmlns:wpg="http://schemas.microsoft.com/office/word/2010/wordprocessingGroup" xmlns:wpi="http://schemas.microsoft.com/office/word/2010/wordprocessingInk" xmlns:wne="http://schemas.microsoft.com/office/word/2006/wordml" xmlns:wps="http://schemas.microsoft.com/office/word/2010/wordprocessingShape" mc:Ignorable="w14 w15 w16se w16cid w16 w16cex w16sdtdh wp14">
+<w:hdr xmlns:wpc="http://schemas.microsoft.com/office/word/2010/wordprocessingCanvas" xmlns:cx="http://schemas.microsoft.com/office/drawing/2014/chartex" xmlns:cx1="http://schemas.microsoft.com/office/drawing/2015/9/8/chartex" xmlns:cx2="http://schemas.microsoft.com/office/drawing/2015/10/21/chartex" xmlns:cx3="http://schemas.microsoft.com/office/drawing/2016/5/9/chartex" xmlns:cx4="http://schemas.microsoft.com/office/drawing/2016/5/10/chartex" xmlns:cx5="http://schemas.microsoft.com/office/drawing/2016/5/11/chartex" xmlns:cx6="http://schemas.microsoft.com/office/drawing/2016/5/12/chartex" xmlns:cx7="http://schemas.microsoft.com/office/drawing/2016/5/13/chartex" xmlns:cx8="http://schemas.microsoft.com/office/drawing/2016/5/14/chartex" xmlns:mc="http://schemas.openxmlformats.org/markup-compatibility/2006" xmlns:aink="http://schemas.microsoft.com/office/drawing/2016/ink" xmlns:am3d="http://schemas.microsoft.com/office/drawing/2017/model3d" xmlns:o="urn:schemas-microsoft-com:office:office" xmlns:oel="http://schemas.microsoft.com/office/2019/extlst" xmlns:r="http://schemas.openxmlformats.org/officeDocument/2006/relationships" xmlns:m="http://schemas.openxmlformats.org/officeDocument/2006/math" xmlns:v="urn:schemas-microsoft-com:vml" xmlns:wp14="http://schemas.microsoft.com/office/word/2010/wordprocessingDrawing" xmlns:wp="http://schemas.openxmlformats.org/drawingml/2006/wordprocessingDrawing" xmlns:w10="urn:schemas-microsoft-com:office:word" xmlns:w="http://schemas.openxmlformats.org/wordprocessingml/2006/main" xmlns:w14="http://schemas.microsoft.com/office/word/2010/wordml" xmlns:w15="http://schemas.microsoft.com/office/word/2012/wordml" xmlns:w16cex="http://schemas.microsoft.com/office/word/2018/wordml/cex" xmlns:w16cid="http://schemas.microsoft.com/office/word/2016/wordml/cid" xmlns:w16="http://schemas.microsoft.com/office/word/2018/wordml" xmlns:w16du="http://schemas.microsoft.com/office/word/2023/wordml/word16du" xmlns:w16sdtdh="http://schemas.microsoft.com/office/word/2020/wordml/sdtdatahash" xmlns:w16sdtfl="http://schemas.microsoft.com/office/word/2024/wordml/sdtformatlock" xmlns:w16se="http://schemas.microsoft.com/office/word/2015/wordml/symex" xmlns:wpg="http://schemas.microsoft.com/office/word/2010/wordprocessingGroup" xmlns:wpi="http://schemas.microsoft.com/office/word/2010/wordprocessingInk" xmlns:wne="http://schemas.microsoft.com/office/word/2006/wordml" xmlns:wps="http://schemas.microsoft.com/office/word/2010/wordprocessingShape" mc:Ignorable="w14 w15 w16se w16cid w16 w16cex w16sdtdh w16sdtfl w16du wp14">
   <w:p>
     <w:pPr>
       <w:pStyle w:val="Kopfzeile"/>
@@ -12382,7 +11386,7 @@
 </file>
 
 <file path=word/numbering.xml><?xml version="1.0" encoding="utf-8"?>
-<w:numbering xmlns:wpc="http://schemas.microsoft.com/office/word/2010/wordprocessingCanvas" xmlns:cx="http://schemas.microsoft.com/office/drawing/2014/chartex" xmlns:cx1="http://schemas.microsoft.com/office/drawing/2015/9/8/chartex" xmlns:cx2="http://schemas.microsoft.com/office/drawing/2015/10/21/chartex" xmlns:cx3="http://schemas.microsoft.com/office/drawing/2016/5/9/chartex" xmlns:cx4="http://schemas.microsoft.com/office/drawing/2016/5/10/chartex" xmlns:cx5="http://schemas.microsoft.com/office/drawing/2016/5/11/chartex" xmlns:cx6="http://schemas.microsoft.com/office/drawing/2016/5/12/chartex" xmlns:cx7="http://schemas.microsoft.com/office/drawing/2016/5/13/chartex" xmlns:cx8="http://schemas.microsoft.com/office/drawing/2016/5/14/chartex" xmlns:mc="http://schemas.openxmlformats.org/markup-compatibility/2006" xmlns:aink="http://schemas.microsoft.com/office/drawing/2016/ink" xmlns:am3d="http://schemas.microsoft.com/office/drawing/2017/model3d" xmlns:o="urn:schemas-microsoft-com:office:office" xmlns:r="http://schemas.openxmlformats.org/officeDocument/2006/relationships" xmlns:m="http://schemas.openxmlformats.org/officeDocument/2006/math" xmlns:v="urn:schemas-microsoft-com:vml" xmlns:wp14="http://schemas.microsoft.com/office/word/2010/wordprocessingDrawing" xmlns:wp="http://schemas.openxmlformats.org/drawingml/2006/wordprocessingDrawing" xmlns:w10="urn:schemas-microsoft-com:office:word" xmlns:w="http://schemas.openxmlformats.org/wordprocessingml/2006/main" xmlns:w14="http://schemas.microsoft.com/office/word/2010/wordml" xmlns:w15="http://schemas.microsoft.com/office/word/2012/wordml" xmlns:w16cex="http://schemas.microsoft.com/office/word/2018/wordml/cex" xmlns:w16cid="http://schemas.microsoft.com/office/word/2016/wordml/cid" xmlns:w16="http://schemas.microsoft.com/office/word/2018/wordml" xmlns:w16sdtdh="http://schemas.microsoft.com/office/word/2020/wordml/sdtdatahash" xmlns:w16se="http://schemas.microsoft.com/office/word/2015/wordml/symex" xmlns:wpg="http://schemas.microsoft.com/office/word/2010/wordprocessingGroup" xmlns:wpi="http://schemas.microsoft.com/office/word/2010/wordprocessingInk" xmlns:wne="http://schemas.microsoft.com/office/word/2006/wordml" xmlns:wps="http://schemas.microsoft.com/office/word/2010/wordprocessingShape" mc:Ignorable="w14 w15 w16se w16cid w16 w16cex w16sdtdh wp14">
+<w:numbering xmlns:wpc="http://schemas.microsoft.com/office/word/2010/wordprocessingCanvas" xmlns:cx="http://schemas.microsoft.com/office/drawing/2014/chartex" xmlns:cx1="http://schemas.microsoft.com/office/drawing/2015/9/8/chartex" xmlns:cx2="http://schemas.microsoft.com/office/drawing/2015/10/21/chartex" xmlns:cx3="http://schemas.microsoft.com/office/drawing/2016/5/9/chartex" xmlns:cx4="http://schemas.microsoft.com/office/drawing/2016/5/10/chartex" xmlns:cx5="http://schemas.microsoft.com/office/drawing/2016/5/11/chartex" xmlns:cx6="http://schemas.microsoft.com/office/drawing/2016/5/12/chartex" xmlns:cx7="http://schemas.microsoft.com/office/drawing/2016/5/13/chartex" xmlns:cx8="http://schemas.microsoft.com/office/drawing/2016/5/14/chartex" xmlns:mc="http://schemas.openxmlformats.org/markup-compatibility/2006" xmlns:aink="http://schemas.microsoft.com/office/drawing/2016/ink" xmlns:am3d="http://schemas.microsoft.com/office/drawing/2017/model3d" xmlns:o="urn:schemas-microsoft-com:office:office" xmlns:oel="http://schemas.microsoft.com/office/2019/extlst" xmlns:r="http://schemas.openxmlformats.org/officeDocument/2006/relationships" xmlns:m="http://schemas.openxmlformats.org/officeDocument/2006/math" xmlns:v="urn:schemas-microsoft-com:vml" xmlns:wp14="http://schemas.microsoft.com/office/word/2010/wordprocessingDrawing" xmlns:wp="http://schemas.openxmlformats.org/drawingml/2006/wordprocessingDrawing" xmlns:w10="urn:schemas-microsoft-com:office:word" xmlns:w="http://schemas.openxmlformats.org/wordprocessingml/2006/main" xmlns:w14="http://schemas.microsoft.com/office/word/2010/wordml" xmlns:w15="http://schemas.microsoft.com/office/word/2012/wordml" xmlns:w16cex="http://schemas.microsoft.com/office/word/2018/wordml/cex" xmlns:w16cid="http://schemas.microsoft.com/office/word/2016/wordml/cid" xmlns:w16="http://schemas.microsoft.com/office/word/2018/wordml" xmlns:w16du="http://schemas.microsoft.com/office/word/2023/wordml/word16du" xmlns:w16sdtdh="http://schemas.microsoft.com/office/word/2020/wordml/sdtdatahash" xmlns:w16sdtfl="http://schemas.microsoft.com/office/word/2024/wordml/sdtformatlock" xmlns:w16se="http://schemas.microsoft.com/office/word/2015/wordml/symex" xmlns:wpg="http://schemas.microsoft.com/office/word/2010/wordprocessingGroup" xmlns:wpi="http://schemas.microsoft.com/office/word/2010/wordprocessingInk" xmlns:wne="http://schemas.microsoft.com/office/word/2006/wordml" xmlns:wps="http://schemas.microsoft.com/office/word/2010/wordprocessingShape" mc:Ignorable="w14 w15 w16se w16cid w16 w16cex w16sdtdh w16sdtfl w16du wp14">
   <w:abstractNum w:abstractNumId="0" w15:restartNumberingAfterBreak="0">
     <w:nsid w:val="FFFFFF88"/>
     <w:multiLevelType w:val="singleLevel"/>
@@ -16044,100 +15048,100 @@
       </w:pPr>
     </w:lvl>
   </w:abstractNum>
-  <w:num w:numId="1">
+  <w:num w:numId="1" w16cid:durableId="282426512">
     <w:abstractNumId w:val="1"/>
   </w:num>
-  <w:num w:numId="2">
+  <w:num w:numId="2" w16cid:durableId="2062054633">
     <w:abstractNumId w:val="0"/>
   </w:num>
-  <w:num w:numId="3">
+  <w:num w:numId="3" w16cid:durableId="1952973396">
     <w:abstractNumId w:val="12"/>
   </w:num>
-  <w:num w:numId="4">
+  <w:num w:numId="4" w16cid:durableId="11736042">
     <w:abstractNumId w:val="9"/>
   </w:num>
-  <w:num w:numId="5">
+  <w:num w:numId="5" w16cid:durableId="925698747">
     <w:abstractNumId w:val="34"/>
   </w:num>
-  <w:num w:numId="6">
+  <w:num w:numId="6" w16cid:durableId="1948923310">
     <w:abstractNumId w:val="10"/>
   </w:num>
-  <w:num w:numId="7">
+  <w:num w:numId="7" w16cid:durableId="816803566">
     <w:abstractNumId w:val="5"/>
   </w:num>
-  <w:num w:numId="8">
+  <w:num w:numId="8" w16cid:durableId="363092030">
     <w:abstractNumId w:val="7"/>
   </w:num>
-  <w:num w:numId="9">
+  <w:num w:numId="9" w16cid:durableId="2007777463">
     <w:abstractNumId w:val="1"/>
   </w:num>
-  <w:num w:numId="10">
+  <w:num w:numId="10" w16cid:durableId="241257727">
     <w:abstractNumId w:val="33"/>
   </w:num>
-  <w:num w:numId="11">
+  <w:num w:numId="11" w16cid:durableId="1422334676">
     <w:abstractNumId w:val="26"/>
   </w:num>
-  <w:num w:numId="12">
+  <w:num w:numId="12" w16cid:durableId="1226260563">
     <w:abstractNumId w:val="17"/>
   </w:num>
-  <w:num w:numId="13">
+  <w:num w:numId="13" w16cid:durableId="945771668">
     <w:abstractNumId w:val="23"/>
   </w:num>
-  <w:num w:numId="14">
+  <w:num w:numId="14" w16cid:durableId="1801537011">
     <w:abstractNumId w:val="1"/>
   </w:num>
-  <w:num w:numId="15">
+  <w:num w:numId="15" w16cid:durableId="1699357282">
     <w:abstractNumId w:val="1"/>
   </w:num>
-  <w:num w:numId="16">
+  <w:num w:numId="16" w16cid:durableId="1438913947">
     <w:abstractNumId w:val="1"/>
   </w:num>
-  <w:num w:numId="17">
+  <w:num w:numId="17" w16cid:durableId="284432957">
     <w:abstractNumId w:val="29"/>
   </w:num>
-  <w:num w:numId="18">
+  <w:num w:numId="18" w16cid:durableId="475996212">
     <w:abstractNumId w:val="1"/>
   </w:num>
-  <w:num w:numId="19">
+  <w:num w:numId="19" w16cid:durableId="374281165">
     <w:abstractNumId w:val="35"/>
   </w:num>
-  <w:num w:numId="20">
+  <w:num w:numId="20" w16cid:durableId="1435245974">
     <w:abstractNumId w:val="1"/>
   </w:num>
-  <w:num w:numId="21">
+  <w:num w:numId="21" w16cid:durableId="1819882443">
     <w:abstractNumId w:val="1"/>
   </w:num>
-  <w:num w:numId="22">
+  <w:num w:numId="22" w16cid:durableId="1756433983">
     <w:abstractNumId w:val="21"/>
   </w:num>
-  <w:num w:numId="23">
+  <w:num w:numId="23" w16cid:durableId="1697733306">
     <w:abstractNumId w:val="13"/>
   </w:num>
-  <w:num w:numId="24">
+  <w:num w:numId="24" w16cid:durableId="1713382519">
     <w:abstractNumId w:val="3"/>
   </w:num>
-  <w:num w:numId="25">
+  <w:num w:numId="25" w16cid:durableId="1068186474">
     <w:abstractNumId w:val="28"/>
   </w:num>
-  <w:num w:numId="26">
+  <w:num w:numId="26" w16cid:durableId="581334647">
     <w:abstractNumId w:val="20"/>
   </w:num>
-  <w:num w:numId="27">
+  <w:num w:numId="27" w16cid:durableId="1074553051">
     <w:abstractNumId w:val="8"/>
   </w:num>
-  <w:num w:numId="28">
+  <w:num w:numId="28" w16cid:durableId="290786450">
     <w:abstractNumId w:val="4"/>
   </w:num>
-  <w:num w:numId="29">
+  <w:num w:numId="29" w16cid:durableId="1272277291">
     <w:abstractNumId w:val="19"/>
   </w:num>
-  <w:num w:numId="30">
+  <w:num w:numId="30" w16cid:durableId="500511257">
     <w:abstractNumId w:val="16"/>
   </w:num>
-  <w:num w:numId="31">
+  <w:num w:numId="31" w16cid:durableId="539129105">
     <w:abstractNumId w:val="32"/>
   </w:num>
-  <w:num w:numId="32">
+  <w:num w:numId="32" w16cid:durableId="1012417078">
     <w:abstractNumId w:val="1"/>
     <w:lvlOverride w:ilvl="0">
       <w:startOverride w:val="1"/>
@@ -16167,10 +15171,10 @@
       <w:startOverride w:val="1"/>
     </w:lvlOverride>
   </w:num>
-  <w:num w:numId="33">
+  <w:num w:numId="33" w16cid:durableId="596253020">
     <w:abstractNumId w:val="14"/>
   </w:num>
-  <w:num w:numId="34">
+  <w:num w:numId="34" w16cid:durableId="1516967634">
     <w:abstractNumId w:val="1"/>
     <w:lvlOverride w:ilvl="0">
       <w:startOverride w:val="1"/>
@@ -16200,7 +15204,7 @@
       <w:startOverride w:val="1"/>
     </w:lvlOverride>
   </w:num>
-  <w:num w:numId="35">
+  <w:num w:numId="35" w16cid:durableId="2053268565">
     <w:abstractNumId w:val="2"/>
     <w:lvlOverride w:ilvl="0">
       <w:lvl w:ilvl="0">
@@ -16218,7 +15222,7 @@
       </w:lvl>
     </w:lvlOverride>
   </w:num>
-  <w:num w:numId="36">
+  <w:num w:numId="36" w16cid:durableId="549152891">
     <w:abstractNumId w:val="2"/>
     <w:lvlOverride w:ilvl="0">
       <w:lvl w:ilvl="0">
@@ -16233,19 +15237,19 @@
       </w:lvl>
     </w:lvlOverride>
   </w:num>
-  <w:num w:numId="37">
+  <w:num w:numId="37" w16cid:durableId="1670668246">
     <w:abstractNumId w:val="27"/>
   </w:num>
-  <w:num w:numId="38">
+  <w:num w:numId="38" w16cid:durableId="169368827">
     <w:abstractNumId w:val="25"/>
   </w:num>
-  <w:num w:numId="39">
+  <w:num w:numId="39" w16cid:durableId="944309262">
     <w:abstractNumId w:val="15"/>
   </w:num>
-  <w:num w:numId="40">
+  <w:num w:numId="40" w16cid:durableId="1415468482">
     <w:abstractNumId w:val="6"/>
   </w:num>
-  <w:num w:numId="41">
+  <w:num w:numId="41" w16cid:durableId="1875920955">
     <w:abstractNumId w:val="22"/>
     <w:lvlOverride w:ilvl="0">
       <w:startOverride w:val="1"/>
@@ -16275,10 +15279,10 @@
       <w:startOverride w:val="1"/>
     </w:lvlOverride>
   </w:num>
-  <w:num w:numId="42">
+  <w:num w:numId="42" w16cid:durableId="1659843403">
     <w:abstractNumId w:val="30"/>
   </w:num>
-  <w:num w:numId="43">
+  <w:num w:numId="43" w16cid:durableId="223832730">
     <w:abstractNumId w:val="24"/>
     <w:lvlOverride w:ilvl="0">
       <w:startOverride w:val="1"/>
@@ -16308,20 +15312,20 @@
       <w:startOverride w:val="1"/>
     </w:lvlOverride>
   </w:num>
-  <w:num w:numId="44">
+  <w:num w:numId="44" w16cid:durableId="778257034">
     <w:abstractNumId w:val="18"/>
   </w:num>
-  <w:num w:numId="45">
+  <w:num w:numId="45" w16cid:durableId="486559503">
     <w:abstractNumId w:val="31"/>
   </w:num>
-  <w:num w:numId="46">
+  <w:num w:numId="46" w16cid:durableId="260996650">
     <w:abstractNumId w:val="11"/>
   </w:num>
 </w:numbering>
 </file>
 
 <file path=word/styles.xml><?xml version="1.0" encoding="utf-8"?>
-<w:styles xmlns:mc="http://schemas.openxmlformats.org/markup-compatibility/2006" xmlns:r="http://schemas.openxmlformats.org/officeDocument/2006/relationships" xmlns:w="http://schemas.openxmlformats.org/wordprocessingml/2006/main" xmlns:w14="http://schemas.microsoft.com/office/word/2010/wordml" xmlns:w15="http://schemas.microsoft.com/office/word/2012/wordml" xmlns:w16cex="http://schemas.microsoft.com/office/word/2018/wordml/cex" xmlns:w16cid="http://schemas.microsoft.com/office/word/2016/wordml/cid" xmlns:w16="http://schemas.microsoft.com/office/word/2018/wordml" xmlns:w16sdtdh="http://schemas.microsoft.com/office/word/2020/wordml/sdtdatahash" xmlns:w16se="http://schemas.microsoft.com/office/word/2015/wordml/symex" mc:Ignorable="w14 w15 w16se w16cid w16 w16cex w16sdtdh">
+<w:styles xmlns:mc="http://schemas.openxmlformats.org/markup-compatibility/2006" xmlns:r="http://schemas.openxmlformats.org/officeDocument/2006/relationships" xmlns:w="http://schemas.openxmlformats.org/wordprocessingml/2006/main" xmlns:w14="http://schemas.microsoft.com/office/word/2010/wordml" xmlns:w15="http://schemas.microsoft.com/office/word/2012/wordml" xmlns:w16cex="http://schemas.microsoft.com/office/word/2018/wordml/cex" xmlns:w16cid="http://schemas.microsoft.com/office/word/2016/wordml/cid" xmlns:w16="http://schemas.microsoft.com/office/word/2018/wordml" xmlns:w16du="http://schemas.microsoft.com/office/word/2023/wordml/word16du" xmlns:w16sdtdh="http://schemas.microsoft.com/office/word/2020/wordml/sdtdatahash" xmlns:w16sdtfl="http://schemas.microsoft.com/office/word/2024/wordml/sdtformatlock" xmlns:w16se="http://schemas.microsoft.com/office/word/2015/wordml/symex" mc:Ignorable="w14 w15 w16se w16cid w16 w16cex w16sdtdh w16sdtfl w16du">
   <w:docDefaults>
     <w:rPrDefault>
       <w:rPr>

</xml_diff>

<commit_message>
Abgabe Doc mit Screenshots von PBI versehen
</commit_message>
<xml_diff>
--- a/docs/Citibike.docx
+++ b/docs/Citibike.docx
@@ -348,7 +348,7 @@
           <w:szCs w:val="28"/>
           <w:lang w:val="en-GB"/>
         </w:rPr>
-        <w:t>6</w:t>
+        <w:t>7</w:t>
       </w:r>
     </w:p>
     <w:p>
@@ -363,6 +363,7 @@
           <w:lang w:val="de-AT"/>
         </w:rPr>
       </w:pPr>
+      <w:proofErr w:type="spellStart"/>
       <w:r>
         <w:rPr>
           <w:rFonts w:cs="Arial"/>
@@ -374,6 +375,7 @@
         </w:rPr>
         <w:t>CD_citibike</w:t>
       </w:r>
+      <w:proofErr w:type="spellEnd"/>
     </w:p>
     <w:p>
       <w:pPr>
@@ -466,7 +468,7 @@
           <w:szCs w:val="28"/>
           <w:lang w:val="de-AT"/>
         </w:rPr>
-        <w:t>2026-03-</w:t>
+        <w:t>2026-0</w:t>
       </w:r>
       <w:r>
         <w:rPr>
@@ -477,12 +479,9 @@
           <w:szCs w:val="28"/>
           <w:lang w:val="de-AT"/>
         </w:rPr>
-        <w:t>23</w:t>
-      </w:r>
-    </w:p>
-    <w:p>
-      <w:pPr>
-        <w:jc w:val="center"/>
+        <w:t>4</w:t>
+      </w:r>
+      <w:r>
         <w:rPr>
           <w:rFonts w:cs="Arial"/>
           <w:b/>
@@ -491,11 +490,9 @@
           <w:szCs w:val="28"/>
           <w:lang w:val="de-AT"/>
         </w:rPr>
-      </w:pPr>
-    </w:p>
-    <w:p>
-      <w:pPr>
-        <w:jc w:val="center"/>
+        <w:t>-</w:t>
+      </w:r>
+      <w:r>
         <w:rPr>
           <w:rFonts w:cs="Arial"/>
           <w:b/>
@@ -504,7 +501,8 @@
           <w:szCs w:val="28"/>
           <w:lang w:val="de-AT"/>
         </w:rPr>
-      </w:pPr>
+        <w:t>06</w:t>
+      </w:r>
     </w:p>
     <w:p>
       <w:pPr>
@@ -560,6 +558,32 @@
     </w:p>
     <w:p>
       <w:pPr>
+        <w:jc w:val="center"/>
+        <w:rPr>
+          <w:rFonts w:cs="Arial"/>
+          <w:b/>
+          <w:color w:val="404040"/>
+          <w:sz w:val="28"/>
+          <w:szCs w:val="28"/>
+          <w:lang w:val="de-AT"/>
+        </w:rPr>
+      </w:pPr>
+    </w:p>
+    <w:p>
+      <w:pPr>
+        <w:jc w:val="center"/>
+        <w:rPr>
+          <w:rFonts w:cs="Arial"/>
+          <w:b/>
+          <w:color w:val="404040"/>
+          <w:sz w:val="28"/>
+          <w:szCs w:val="28"/>
+          <w:lang w:val="de-AT"/>
+        </w:rPr>
+      </w:pPr>
+    </w:p>
+    <w:p>
+      <w:pPr>
         <w:tabs>
           <w:tab w:val="left" w:pos="1455"/>
         </w:tabs>
@@ -578,7 +602,7 @@
           <w:lang w:val="de-AT" w:eastAsia="de-AT"/>
         </w:rPr>
         <w:drawing>
-          <wp:inline distT="0" distB="0" distL="0" distR="0" wp14:anchorId="60E7A0F6" wp14:editId="14E6B246">
+          <wp:inline distT="0" distB="0" distL="0" distR="0" wp14:anchorId="60E7A0F6" wp14:editId="66D07352">
             <wp:extent cx="1350010" cy="350520"/>
             <wp:effectExtent l="0" t="0" r="0" b="0"/>
             <wp:docPr id="1" name="Bild 1"/>
@@ -774,8 +798,20 @@
                 <w:sz w:val="20"/>
                 <w:lang w:val="de-AT"/>
               </w:rPr>
-              <w:t>Version number</w:t>
+              <w:t xml:space="preserve">Version </w:t>
             </w:r>
+            <w:proofErr w:type="spellStart"/>
+            <w:r>
+              <w:rPr>
+                <w:rFonts w:cs="Arial"/>
+                <w:b/>
+                <w:bCs/>
+                <w:sz w:val="20"/>
+                <w:lang w:val="de-AT"/>
+              </w:rPr>
+              <w:t>number</w:t>
+            </w:r>
+            <w:proofErr w:type="spellEnd"/>
           </w:p>
         </w:tc>
         <w:tc>
@@ -1243,7 +1279,25 @@
                 <w:sz w:val="20"/>
                 <w:lang w:val="de-AT"/>
               </w:rPr>
-              <w:t>Data Diagram hinzugefügt</w:t>
+              <w:t xml:space="preserve">Data </w:t>
+            </w:r>
+            <w:proofErr w:type="spellStart"/>
+            <w:r>
+              <w:rPr>
+                <w:rFonts w:cs="Arial"/>
+                <w:sz w:val="20"/>
+                <w:lang w:val="de-AT"/>
+              </w:rPr>
+              <w:t>Diagram</w:t>
+            </w:r>
+            <w:proofErr w:type="spellEnd"/>
+            <w:r>
+              <w:rPr>
+                <w:rFonts w:cs="Arial"/>
+                <w:sz w:val="20"/>
+                <w:lang w:val="de-AT"/>
+              </w:rPr>
+              <w:t xml:space="preserve"> hinzugefügt</w:t>
             </w:r>
           </w:p>
         </w:tc>
@@ -1335,13 +1389,23 @@
                 <w:lang w:val="de-AT"/>
               </w:rPr>
             </w:pPr>
+            <w:proofErr w:type="spellStart"/>
             <w:r>
               <w:rPr>
                 <w:rFonts w:cs="Arial"/>
                 <w:sz w:val="20"/>
                 <w:lang w:val="de-AT"/>
               </w:rPr>
-              <w:t>DataMap update</w:t>
+              <w:t>DataMap</w:t>
+            </w:r>
+            <w:proofErr w:type="spellEnd"/>
+            <w:r>
+              <w:rPr>
+                <w:rFonts w:cs="Arial"/>
+                <w:sz w:val="20"/>
+                <w:lang w:val="de-AT"/>
+              </w:rPr>
+              <w:t xml:space="preserve"> update</w:t>
             </w:r>
           </w:p>
         </w:tc>
@@ -1463,7 +1527,16 @@
                 <w:sz w:val="20"/>
                 <w:lang w:val="de-AT"/>
               </w:rPr>
-              <w:t xml:space="preserve"> i</w:t>
+              <w:t xml:space="preserve"> </w:t>
+            </w:r>
+            <w:proofErr w:type="spellStart"/>
+            <w:r>
+              <w:rPr>
+                <w:rFonts w:cs="Arial"/>
+                <w:sz w:val="20"/>
+                <w:lang w:val="de-AT"/>
+              </w:rPr>
+              <w:t>i</w:t>
             </w:r>
             <w:r>
               <w:rPr>
@@ -1471,7 +1544,16 @@
                 <w:sz w:val="20"/>
                 <w:lang w:val="de-AT"/>
               </w:rPr>
-              <w:t>mplementation hinzugefügt</w:t>
+              <w:t>mplementation</w:t>
+            </w:r>
+            <w:proofErr w:type="spellEnd"/>
+            <w:r>
+              <w:rPr>
+                <w:rFonts w:cs="Arial"/>
+                <w:sz w:val="20"/>
+                <w:lang w:val="de-AT"/>
+              </w:rPr>
+              <w:t xml:space="preserve"> hinzugefügt</w:t>
             </w:r>
           </w:p>
         </w:tc>
@@ -1495,6 +1577,122 @@
                 <w:lang w:val="de-AT"/>
               </w:rPr>
               <w:t>Dziekan Jiri</w:t>
+            </w:r>
+          </w:p>
+        </w:tc>
+      </w:tr>
+      <w:tr>
+        <w:trPr>
+          <w:cantSplit/>
+          <w:trHeight w:val="397"/>
+        </w:trPr>
+        <w:tc>
+          <w:tcPr>
+            <w:tcW w:w="1701" w:type="dxa"/>
+          </w:tcPr>
+          <w:p>
+            <w:pPr>
+              <w:spacing w:before="60" w:after="60"/>
+              <w:rPr>
+                <w:rFonts w:cs="Arial"/>
+                <w:sz w:val="20"/>
+                <w:lang w:val="de-AT"/>
+              </w:rPr>
+            </w:pPr>
+            <w:r>
+              <w:rPr>
+                <w:rFonts w:cs="Arial"/>
+                <w:sz w:val="20"/>
+                <w:lang w:val="de-AT"/>
+              </w:rPr>
+              <w:t>0.7</w:t>
+            </w:r>
+          </w:p>
+        </w:tc>
+        <w:tc>
+          <w:tcPr>
+            <w:tcW w:w="1418" w:type="dxa"/>
+          </w:tcPr>
+          <w:p>
+            <w:pPr>
+              <w:spacing w:before="60" w:after="60"/>
+              <w:rPr>
+                <w:rFonts w:cs="Arial"/>
+                <w:sz w:val="20"/>
+                <w:lang w:val="de-AT"/>
+              </w:rPr>
+            </w:pPr>
+            <w:r>
+              <w:rPr>
+                <w:rFonts w:cs="Arial"/>
+                <w:sz w:val="20"/>
+                <w:lang w:val="de-AT"/>
+              </w:rPr>
+              <w:t>06.04.2026</w:t>
+            </w:r>
+          </w:p>
+        </w:tc>
+        <w:tc>
+          <w:tcPr>
+            <w:tcW w:w="4819" w:type="dxa"/>
+          </w:tcPr>
+          <w:p>
+            <w:pPr>
+              <w:spacing w:before="60" w:after="60"/>
+              <w:rPr>
+                <w:rFonts w:cs="Arial"/>
+                <w:sz w:val="20"/>
+                <w:lang w:val="en-US"/>
+              </w:rPr>
+            </w:pPr>
+            <w:r>
+              <w:rPr>
+                <w:rFonts w:cs="Arial"/>
+                <w:sz w:val="20"/>
+                <w:lang w:val="en-US"/>
+              </w:rPr>
+              <w:t xml:space="preserve">Kapital 6: Power BI Mockups </w:t>
+            </w:r>
+            <w:proofErr w:type="spellStart"/>
+            <w:r>
+              <w:rPr>
+                <w:rFonts w:cs="Arial"/>
+                <w:sz w:val="20"/>
+                <w:lang w:val="en-US"/>
+              </w:rPr>
+              <w:t>h</w:t>
+            </w:r>
+            <w:r>
+              <w:rPr>
+                <w:rFonts w:cs="Arial"/>
+                <w:sz w:val="20"/>
+                <w:lang w:val="en-US"/>
+              </w:rPr>
+              <w:t>inzugefügt</w:t>
+            </w:r>
+            <w:proofErr w:type="spellEnd"/>
+          </w:p>
+        </w:tc>
+        <w:tc>
+          <w:tcPr>
+            <w:tcW w:w="1985" w:type="dxa"/>
+          </w:tcPr>
+          <w:p>
+            <w:pPr>
+              <w:spacing w:before="60" w:after="60"/>
+              <w:rPr>
+                <w:rFonts w:cs="Arial"/>
+                <w:sz w:val="20"/>
+                <w:lang w:val="de-AT"/>
+              </w:rPr>
+            </w:pPr>
+            <w:r>
+              <w:rPr>
+                <w:rFonts w:cs="Arial"/>
+                <w:sz w:val="20"/>
+                <w:lang w:val="de-AT"/>
+              </w:rPr>
+              <w:t>Murhamer Robert</w:t>
             </w:r>
           </w:p>
         </w:tc>
@@ -1895,72 +2093,6 @@
           </w:p>
         </w:tc>
       </w:tr>
-      <w:tr>
-        <w:trPr>
-          <w:cantSplit/>
-          <w:trHeight w:val="397"/>
-        </w:trPr>
-        <w:tc>
-          <w:tcPr>
-            <w:tcW w:w="1701" w:type="dxa"/>
-          </w:tcPr>
-          <w:p>
-            <w:pPr>
-              <w:spacing w:before="60" w:after="60"/>
-              <w:rPr>
-                <w:rFonts w:cs="Arial"/>
-                <w:sz w:val="20"/>
-                <w:lang w:val="de-AT"/>
-              </w:rPr>
-            </w:pPr>
-          </w:p>
-        </w:tc>
-        <w:tc>
-          <w:tcPr>
-            <w:tcW w:w="1418" w:type="dxa"/>
-          </w:tcPr>
-          <w:p>
-            <w:pPr>
-              <w:spacing w:before="60" w:after="60"/>
-              <w:rPr>
-                <w:rFonts w:cs="Arial"/>
-                <w:sz w:val="20"/>
-                <w:lang w:val="de-AT"/>
-              </w:rPr>
-            </w:pPr>
-          </w:p>
-        </w:tc>
-        <w:tc>
-          <w:tcPr>
-            <w:tcW w:w="4819" w:type="dxa"/>
-          </w:tcPr>
-          <w:p>
-            <w:pPr>
-              <w:spacing w:before="60" w:after="60"/>
-              <w:rPr>
-                <w:rFonts w:cs="Arial"/>
-                <w:sz w:val="20"/>
-                <w:lang w:val="de-AT"/>
-              </w:rPr>
-            </w:pPr>
-          </w:p>
-        </w:tc>
-        <w:tc>
-          <w:tcPr>
-            <w:tcW w:w="1985" w:type="dxa"/>
-          </w:tcPr>
-          <w:p>
-            <w:pPr>
-              <w:spacing w:before="60" w:after="60"/>
-              <w:rPr>
-                <w:rFonts w:cs="Arial"/>
-                <w:sz w:val="20"/>
-                <w:lang w:val="de-AT"/>
-              </w:rPr>
-            </w:pPr>
-          </w:p>
-        </w:tc>
-      </w:tr>
     </w:tbl>
     <w:p>
       <w:pPr>
@@ -2337,6 +2469,7 @@
                 <w:szCs w:val="20"/>
               </w:rPr>
             </w:pPr>
+            <w:proofErr w:type="spellStart"/>
             <w:r>
               <w:rPr>
                 <w:b/>
@@ -2346,6 +2479,7 @@
               </w:rPr>
               <w:t>Versioning</w:t>
             </w:r>
+            <w:proofErr w:type="spellEnd"/>
           </w:p>
         </w:tc>
         <w:tc>
@@ -2526,6 +2660,7 @@
           <w:lang w:val="en-GB"/>
         </w:rPr>
       </w:pPr>
+      <w:proofErr w:type="spellStart"/>
       <w:r>
         <w:rPr>
           <w:rFonts w:cs="Arial"/>
@@ -2533,7 +2668,17 @@
           <w:bCs/>
           <w:lang w:val="en-GB"/>
         </w:rPr>
-        <w:t>Github-Link:</w:t>
+        <w:t>Github</w:t>
+      </w:r>
+      <w:proofErr w:type="spellEnd"/>
+      <w:r>
+        <w:rPr>
+          <w:rFonts w:cs="Arial"/>
+          <w:b/>
+          <w:bCs/>
+          <w:lang w:val="en-GB"/>
+        </w:rPr>
+        <w:t>-Link:</w:t>
       </w:r>
       <w:r>
         <w:rPr>
@@ -2586,7 +2731,27 @@
           <w:lang w:val="de-AT"/>
         </w:rPr>
         <w:lastRenderedPageBreak/>
-        <w:t>Table of Content</w:t>
+        <w:t xml:space="preserve">Table </w:t>
+      </w:r>
+      <w:proofErr w:type="spellStart"/>
+      <w:r>
+        <w:rPr>
+          <w:rFonts w:cs="Arial"/>
+          <w:sz w:val="44"/>
+          <w:szCs w:val="44"/>
+          <w:lang w:val="de-AT"/>
+        </w:rPr>
+        <w:t>of</w:t>
+      </w:r>
+      <w:proofErr w:type="spellEnd"/>
+      <w:r>
+        <w:rPr>
+          <w:rFonts w:cs="Arial"/>
+          <w:sz w:val="44"/>
+          <w:szCs w:val="44"/>
+          <w:lang w:val="de-AT"/>
+        </w:rPr>
+        <w:t xml:space="preserve"> Content</w:t>
       </w:r>
     </w:p>
     <w:p>
@@ -4676,7 +4841,21 @@
             <w:rStyle w:val="Hyperlink"/>
             <w:noProof/>
           </w:rPr>
-          <w:t>BI Implementation</w:t>
+          <w:t>BI Imp</w:t>
+        </w:r>
+        <w:r>
+          <w:rPr>
+            <w:rStyle w:val="Hyperlink"/>
+            <w:noProof/>
+          </w:rPr>
+          <w:t>l</w:t>
+        </w:r>
+        <w:r>
+          <w:rPr>
+            <w:rStyle w:val="Hyperlink"/>
+            <w:noProof/>
+          </w:rPr>
+          <w:t>ementation</w:t>
         </w:r>
         <w:r>
           <w:rPr>
@@ -4849,6 +5028,7 @@
         </w:rPr>
         <w:t xml:space="preserve">Datensatz: </w:t>
       </w:r>
+      <w:proofErr w:type="spellStart"/>
       <w:r>
         <w:rPr>
           <w:rFonts w:cs="Arial"/>
@@ -4858,8 +5038,9 @@
           <w:szCs w:val="22"/>
           <w:lang w:val="de-AT"/>
         </w:rPr>
-        <w:t>Citibike Usage (Nutzungsdaten des New Yorker Fahrradverleihsystems).</w:t>
-      </w:r>
+        <w:t>Citibike</w:t>
+      </w:r>
+      <w:proofErr w:type="spellEnd"/>
       <w:r>
         <w:rPr>
           <w:rFonts w:cs="Arial"/>
@@ -4869,12 +5050,10 @@
           <w:szCs w:val="22"/>
           <w:lang w:val="de-AT"/>
         </w:rPr>
-        <w:br/>
-        <w:t>Zusätzlicher Datensatz: Historische Wetterdaten open-meteo.com</w:t>
-      </w:r>
-    </w:p>
-    <w:p>
-      <w:pPr>
+        <w:t xml:space="preserve"> </w:t>
+      </w:r>
+      <w:proofErr w:type="spellStart"/>
+      <w:r>
         <w:rPr>
           <w:rFonts w:cs="Arial"/>
           <w:bCs/>
@@ -4883,6 +5062,43 @@
           <w:szCs w:val="22"/>
           <w:lang w:val="de-AT"/>
         </w:rPr>
+        <w:t>Usage</w:t>
+      </w:r>
+      <w:proofErr w:type="spellEnd"/>
+      <w:r>
+        <w:rPr>
+          <w:rFonts w:cs="Arial"/>
+          <w:bCs/>
+          <w:iCs/>
+          <w:sz w:val="22"/>
+          <w:szCs w:val="22"/>
+          <w:lang w:val="de-AT"/>
+        </w:rPr>
+        <w:t xml:space="preserve"> (Nutzungsdaten des New Yorker Fahrradverleihsystems).</w:t>
+      </w:r>
+      <w:r>
+        <w:rPr>
+          <w:rFonts w:cs="Arial"/>
+          <w:bCs/>
+          <w:iCs/>
+          <w:sz w:val="22"/>
+          <w:szCs w:val="22"/>
+          <w:lang w:val="de-AT"/>
+        </w:rPr>
+        <w:br/>
+        <w:t>Zusätzlicher Datensatz: Historische Wetterdaten open-meteo.com</w:t>
+      </w:r>
+    </w:p>
+    <w:p>
+      <w:pPr>
+        <w:rPr>
+          <w:rFonts w:cs="Arial"/>
+          <w:bCs/>
+          <w:iCs/>
+          <w:sz w:val="22"/>
+          <w:szCs w:val="22"/>
+          <w:lang w:val="de-AT"/>
+        </w:rPr>
       </w:pPr>
       <w:r>
         <w:rPr>
@@ -4904,11 +5120,10 @@
           <w:szCs w:val="22"/>
           <w:lang w:val="de-AT"/>
         </w:rPr>
-        <w:t>: Einfluss der Wetterbedingungen auf Citibike-Usage und Conversion (Casual to Member)</w:t>
-      </w:r>
-    </w:p>
-    <w:p>
-      <w:pPr>
+        <w:t xml:space="preserve">: Einfluss der Wetterbedingungen auf </w:t>
+      </w:r>
+      <w:proofErr w:type="spellStart"/>
+      <w:r>
         <w:rPr>
           <w:rFonts w:cs="Arial"/>
           <w:bCs/>
@@ -4917,6 +5132,103 @@
           <w:szCs w:val="22"/>
           <w:lang w:val="de-AT"/>
         </w:rPr>
+        <w:t>Citibike-Usage</w:t>
+      </w:r>
+      <w:proofErr w:type="spellEnd"/>
+      <w:r>
+        <w:rPr>
+          <w:rFonts w:cs="Arial"/>
+          <w:bCs/>
+          <w:iCs/>
+          <w:sz w:val="22"/>
+          <w:szCs w:val="22"/>
+          <w:lang w:val="de-AT"/>
+        </w:rPr>
+        <w:t xml:space="preserve"> und </w:t>
+      </w:r>
+      <w:proofErr w:type="spellStart"/>
+      <w:r>
+        <w:rPr>
+          <w:rFonts w:cs="Arial"/>
+          <w:bCs/>
+          <w:iCs/>
+          <w:sz w:val="22"/>
+          <w:szCs w:val="22"/>
+          <w:lang w:val="de-AT"/>
+        </w:rPr>
+        <w:t>Conversion</w:t>
+      </w:r>
+      <w:proofErr w:type="spellEnd"/>
+      <w:r>
+        <w:rPr>
+          <w:rFonts w:cs="Arial"/>
+          <w:bCs/>
+          <w:iCs/>
+          <w:sz w:val="22"/>
+          <w:szCs w:val="22"/>
+          <w:lang w:val="de-AT"/>
+        </w:rPr>
+        <w:t xml:space="preserve"> (</w:t>
+      </w:r>
+      <w:proofErr w:type="spellStart"/>
+      <w:r>
+        <w:rPr>
+          <w:rFonts w:cs="Arial"/>
+          <w:bCs/>
+          <w:iCs/>
+          <w:sz w:val="22"/>
+          <w:szCs w:val="22"/>
+          <w:lang w:val="de-AT"/>
+        </w:rPr>
+        <w:t>Casual</w:t>
+      </w:r>
+      <w:proofErr w:type="spellEnd"/>
+      <w:r>
+        <w:rPr>
+          <w:rFonts w:cs="Arial"/>
+          <w:bCs/>
+          <w:iCs/>
+          <w:sz w:val="22"/>
+          <w:szCs w:val="22"/>
+          <w:lang w:val="de-AT"/>
+        </w:rPr>
+        <w:t xml:space="preserve"> </w:t>
+      </w:r>
+      <w:proofErr w:type="spellStart"/>
+      <w:r>
+        <w:rPr>
+          <w:rFonts w:cs="Arial"/>
+          <w:bCs/>
+          <w:iCs/>
+          <w:sz w:val="22"/>
+          <w:szCs w:val="22"/>
+          <w:lang w:val="de-AT"/>
+        </w:rPr>
+        <w:t>to</w:t>
+      </w:r>
+      <w:proofErr w:type="spellEnd"/>
+      <w:r>
+        <w:rPr>
+          <w:rFonts w:cs="Arial"/>
+          <w:bCs/>
+          <w:iCs/>
+          <w:sz w:val="22"/>
+          <w:szCs w:val="22"/>
+          <w:lang w:val="de-AT"/>
+        </w:rPr>
+        <w:t xml:space="preserve"> Member)</w:t>
+      </w:r>
+    </w:p>
+    <w:p>
+      <w:pPr>
+        <w:rPr>
+          <w:rFonts w:cs="Arial"/>
+          <w:bCs/>
+          <w:iCs/>
+          <w:sz w:val="22"/>
+          <w:szCs w:val="22"/>
+          <w:lang w:val="de-AT"/>
+        </w:rPr>
       </w:pPr>
       <w:r>
         <w:rPr>
@@ -4938,7 +5250,79 @@
           <w:szCs w:val="22"/>
           <w:lang w:val="de-AT"/>
         </w:rPr>
-        <w:t xml:space="preserve"> Verknüpfung von CitiBike-Fahrtdaten mit Wetterdaten um zu analysieren, wie Wetterbedingungen die Nutzungshäufigkeit und Conversion beeinflussen.</w:t>
+        <w:t xml:space="preserve"> Verknüpfung von </w:t>
+      </w:r>
+      <w:proofErr w:type="spellStart"/>
+      <w:r>
+        <w:rPr>
+          <w:rFonts w:cs="Arial"/>
+          <w:bCs/>
+          <w:iCs/>
+          <w:sz w:val="22"/>
+          <w:szCs w:val="22"/>
+          <w:lang w:val="de-AT"/>
+        </w:rPr>
+        <w:t>CitiBike</w:t>
+      </w:r>
+      <w:proofErr w:type="spellEnd"/>
+      <w:r>
+        <w:rPr>
+          <w:rFonts w:cs="Arial"/>
+          <w:bCs/>
+          <w:iCs/>
+          <w:sz w:val="22"/>
+          <w:szCs w:val="22"/>
+          <w:lang w:val="de-AT"/>
+        </w:rPr>
+        <w:t xml:space="preserve">-Fahrtdaten mit </w:t>
+      </w:r>
+      <w:proofErr w:type="gramStart"/>
+      <w:r>
+        <w:rPr>
+          <w:rFonts w:cs="Arial"/>
+          <w:bCs/>
+          <w:iCs/>
+          <w:sz w:val="22"/>
+          <w:szCs w:val="22"/>
+          <w:lang w:val="de-AT"/>
+        </w:rPr>
+        <w:t>Wetterdaten</w:t>
+      </w:r>
+      <w:proofErr w:type="gramEnd"/>
+      <w:r>
+        <w:rPr>
+          <w:rFonts w:cs="Arial"/>
+          <w:bCs/>
+          <w:iCs/>
+          <w:sz w:val="22"/>
+          <w:szCs w:val="22"/>
+          <w:lang w:val="de-AT"/>
+        </w:rPr>
+        <w:t xml:space="preserve"> um zu analysieren, wie Wetterbedingungen die Nutzungshäufigkeit und </w:t>
+      </w:r>
+      <w:proofErr w:type="spellStart"/>
+      <w:r>
+        <w:rPr>
+          <w:rFonts w:cs="Arial"/>
+          <w:bCs/>
+          <w:iCs/>
+          <w:sz w:val="22"/>
+          <w:szCs w:val="22"/>
+          <w:lang w:val="de-AT"/>
+        </w:rPr>
+        <w:t>Conversion</w:t>
+      </w:r>
+      <w:proofErr w:type="spellEnd"/>
+      <w:r>
+        <w:rPr>
+          <w:rFonts w:cs="Arial"/>
+          <w:bCs/>
+          <w:iCs/>
+          <w:sz w:val="22"/>
+          <w:szCs w:val="22"/>
+          <w:lang w:val="de-AT"/>
+        </w:rPr>
+        <w:t xml:space="preserve"> beeinflussen.</w:t>
       </w:r>
     </w:p>
     <w:p>
@@ -4980,6 +5364,7 @@
           <w:lang w:val="en-GB"/>
         </w:rPr>
       </w:pPr>
+      <w:proofErr w:type="spellStart"/>
       <w:r>
         <w:rPr>
           <w:rFonts w:cs="Arial"/>
@@ -4989,7 +5374,19 @@
           <w:szCs w:val="22"/>
           <w:lang w:val="en-GB"/>
         </w:rPr>
-        <w:t>Primärer Stakeholder</w:t>
+        <w:t>Primärer</w:t>
+      </w:r>
+      <w:proofErr w:type="spellEnd"/>
+      <w:r>
+        <w:rPr>
+          <w:rFonts w:cs="Arial"/>
+          <w:b/>
+          <w:iCs/>
+          <w:sz w:val="22"/>
+          <w:szCs w:val="22"/>
+          <w:lang w:val="en-GB"/>
+        </w:rPr>
+        <w:t xml:space="preserve"> Stakeholder</w:t>
       </w:r>
       <w:r>
         <w:rPr>
@@ -5000,11 +5397,10 @@
           <w:szCs w:val="22"/>
           <w:lang w:val="en-GB"/>
         </w:rPr>
-        <w:t>: Operatives Management von CitiBike</w:t>
-      </w:r>
-    </w:p>
-    <w:p>
-      <w:pPr>
+        <w:t xml:space="preserve">: Operatives Management von </w:t>
+      </w:r>
+      <w:proofErr w:type="spellStart"/>
+      <w:r>
         <w:rPr>
           <w:rFonts w:cs="Arial"/>
           <w:bCs/>
@@ -5013,23 +5409,9 @@
           <w:szCs w:val="22"/>
           <w:lang w:val="en-GB"/>
         </w:rPr>
-      </w:pPr>
-    </w:p>
-    <w:p>
-      <w:pPr>
-        <w:pStyle w:val="berschrift3"/>
-        <w:rPr>
-          <w:lang w:val="de-AT"/>
-        </w:rPr>
-      </w:pPr>
-      <w:bookmarkStart w:id="12" w:name="_Toc225192402"/>
-      <w:r>
-        <w:rPr>
-          <w:lang w:val="de-AT"/>
-        </w:rPr>
-        <w:t>Business Case</w:t>
-      </w:r>
-      <w:bookmarkEnd w:id="12"/>
+        <w:t>CitiBike</w:t>
+      </w:r>
+      <w:proofErr w:type="spellEnd"/>
     </w:p>
     <w:p>
       <w:pPr>
@@ -5039,6 +5421,34 @@
           <w:iCs/>
           <w:sz w:val="22"/>
           <w:szCs w:val="22"/>
+          <w:lang w:val="en-GB"/>
+        </w:rPr>
+      </w:pPr>
+    </w:p>
+    <w:p>
+      <w:pPr>
+        <w:pStyle w:val="berschrift3"/>
+        <w:rPr>
+          <w:lang w:val="de-AT"/>
+        </w:rPr>
+      </w:pPr>
+      <w:bookmarkStart w:id="12" w:name="_Toc225192402"/>
+      <w:r>
+        <w:rPr>
+          <w:lang w:val="de-AT"/>
+        </w:rPr>
+        <w:t>Business Case</w:t>
+      </w:r>
+      <w:bookmarkEnd w:id="12"/>
+    </w:p>
+    <w:p>
+      <w:pPr>
+        <w:rPr>
+          <w:rFonts w:cs="Arial"/>
+          <w:bCs/>
+          <w:iCs/>
+          <w:sz w:val="22"/>
+          <w:szCs w:val="22"/>
           <w:lang w:val="de-AT"/>
         </w:rPr>
       </w:pPr>
@@ -5096,11 +5506,10 @@
           <w:szCs w:val="22"/>
           <w:lang w:val="de-AT"/>
         </w:rPr>
-        <w:t xml:space="preserve"> Entwicklung eines BI-Dashboards, das Fahrtdaten multidimensional analysiert und mit historischen Wetterdaten (z. B. Temperatur, Niederschlag) verknüpft. Ziel ist es, Transparenz über wetterbedingte Nutzungsmuster zu schaffen, besonders in Bezug auf Unterschiede zwischen Member- und Casual-Nutzern. Die gewonnenen Erkenntnisse dienen als Entscheidungsgrundlage für eine datenbasierte operative Steuerung und sollen folgende Leitfragen beantworten: </w:t>
-      </w:r>
-    </w:p>
-    <w:p>
-      <w:pPr>
+        <w:t xml:space="preserve"> Entwicklung eines BI-Dashboards, das Fahrtdaten multidimensional analysiert und mit historischen Wetterdaten (z. B. Temperatur, Niederschlag) verknüpft. Ziel ist es, Transparenz über wetterbedingte Nutzungsmuster zu schaffen, besonders in Bezug auf Unterschiede zwischen Member- und </w:t>
+      </w:r>
+      <w:proofErr w:type="spellStart"/>
+      <w:r>
         <w:rPr>
           <w:rFonts w:cs="Arial"/>
           <w:bCs/>
@@ -5109,7 +5518,9 @@
           <w:szCs w:val="22"/>
           <w:lang w:val="de-AT"/>
         </w:rPr>
-      </w:pPr>
+        <w:t>Casual</w:t>
+      </w:r>
+      <w:proofErr w:type="spellEnd"/>
       <w:r>
         <w:rPr>
           <w:rFonts w:cs="Arial"/>
@@ -5119,7 +5530,7 @@
           <w:szCs w:val="22"/>
           <w:lang w:val="de-AT"/>
         </w:rPr>
-        <w:t>Wie verändert sich die Anzahl und Dauer der Fahrten bei unterschiedlichen Wetterbedingungen (Temperatur, Regen, Wind)?</w:t>
+        <w:t xml:space="preserve">-Nutzern. Die gewonnenen Erkenntnisse dienen als Entscheidungsgrundlage für eine datenbasierte operative Steuerung und sollen folgende Leitfragen beantworten: </w:t>
       </w:r>
     </w:p>
     <w:p>
@@ -5142,7 +5553,7 @@
           <w:szCs w:val="22"/>
           <w:lang w:val="de-AT"/>
         </w:rPr>
-        <w:t>Welche Stationen oder Stadtbereiche reagieren besonders stark auf Wetterveränderungen?</w:t>
+        <w:t>Wie verändert sich die Anzahl und Dauer der Fahrten bei unterschiedlichen Wetterbedingungen (Temperatur, Regen, Wind)?</w:t>
       </w:r>
     </w:p>
     <w:p>
@@ -5165,7 +5576,7 @@
           <w:szCs w:val="22"/>
           <w:lang w:val="de-AT"/>
         </w:rPr>
-        <w:t xml:space="preserve">Wie viele Gelegenheitsnutzer schließen pro Jahr ein Abo ab? </w:t>
+        <w:t>Welche Stationen oder Stadtbereiche reagieren besonders stark auf Wetterveränderungen?</w:t>
       </w:r>
     </w:p>
     <w:p>
@@ -5179,6 +5590,29 @@
           <w:lang w:val="de-AT"/>
         </w:rPr>
       </w:pPr>
+      <w:r>
+        <w:rPr>
+          <w:rFonts w:cs="Arial"/>
+          <w:bCs/>
+          <w:iCs/>
+          <w:sz w:val="22"/>
+          <w:szCs w:val="22"/>
+          <w:lang w:val="de-AT"/>
+        </w:rPr>
+        <w:t xml:space="preserve">Wie viele Gelegenheitsnutzer schließen pro Jahr ein Abo ab? </w:t>
+      </w:r>
+    </w:p>
+    <w:p>
+      <w:pPr>
+        <w:rPr>
+          <w:rFonts w:cs="Arial"/>
+          <w:bCs/>
+          <w:iCs/>
+          <w:sz w:val="22"/>
+          <w:szCs w:val="22"/>
+          <w:lang w:val="de-AT"/>
+        </w:rPr>
+      </w:pPr>
     </w:p>
     <w:p>
       <w:pPr>
@@ -5223,11 +5657,10 @@
           <w:szCs w:val="22"/>
           <w:lang w:val="de-AT"/>
         </w:rPr>
-        <w:t>In scope: Trip-Daten (Startzeit, Dauer), Start- und End-Stationen (inkl. Geokoordinaten für Map-Visualisierung), User-Typen (Casual/Member) sowie die Integration externer, historischer Wetterdaten (Tageshöchsttemperatur, Niederschlag).</w:t>
-      </w:r>
-    </w:p>
-    <w:p>
-      <w:pPr>
+        <w:t xml:space="preserve">In </w:t>
+      </w:r>
+      <w:proofErr w:type="spellStart"/>
+      <w:r>
         <w:rPr>
           <w:rFonts w:cs="Arial"/>
           <w:bCs/>
@@ -5236,7 +5669,9 @@
           <w:szCs w:val="22"/>
           <w:lang w:val="de-AT"/>
         </w:rPr>
-      </w:pPr>
+        <w:t>scope</w:t>
+      </w:r>
+      <w:proofErr w:type="spellEnd"/>
       <w:r>
         <w:rPr>
           <w:rFonts w:cs="Arial"/>
@@ -5246,11 +5681,10 @@
           <w:szCs w:val="22"/>
           <w:lang w:val="de-AT"/>
         </w:rPr>
-        <w:t>Out of scope: operative Wartungsdaten der Fahrräder, Rebalancing-Logistik sowie die detaillierte Analyse von Einzelkosten pro Ride</w:t>
-      </w:r>
-    </w:p>
-    <w:p>
-      <w:pPr>
+        <w:t>: Trip-Daten (Startzeit, Dauer), Start- und End-Stationen (inkl. Geokoordinaten für Map-Visualisierung), User-Typen (</w:t>
+      </w:r>
+      <w:proofErr w:type="spellStart"/>
+      <w:r>
         <w:rPr>
           <w:rFonts w:cs="Arial"/>
           <w:bCs/>
@@ -5259,26 +5693,10 @@
           <w:szCs w:val="22"/>
           <w:lang w:val="de-AT"/>
         </w:rPr>
-      </w:pPr>
-    </w:p>
-    <w:p>
-      <w:pPr>
-        <w:pStyle w:val="berschrift3"/>
-        <w:rPr>
-          <w:lang w:val="de-AT"/>
-        </w:rPr>
-      </w:pPr>
-      <w:bookmarkStart w:id="13" w:name="_Toc225192403"/>
-      <w:r>
-        <w:rPr>
-          <w:lang w:val="de-AT"/>
-        </w:rPr>
-        <w:t>Kennzahlen &amp; Metriken (Quantitative Analyse)</w:t>
-      </w:r>
-      <w:bookmarkEnd w:id="13"/>
-    </w:p>
-    <w:p>
-      <w:pPr>
+        <w:t>Casual</w:t>
+      </w:r>
+      <w:proofErr w:type="spellEnd"/>
+      <w:r>
         <w:rPr>
           <w:rFonts w:cs="Arial"/>
           <w:bCs/>
@@ -5287,8 +5705,11 @@
           <w:szCs w:val="22"/>
           <w:lang w:val="de-AT"/>
         </w:rPr>
-      </w:pPr>
-      <w:r>
+        <w:t>/Member) sowie die Integration externer, historischer Wetterdaten (Tageshöchsttemperatur, Niederschlag).</w:t>
+      </w:r>
+    </w:p>
+    <w:p>
+      <w:pPr>
         <w:rPr>
           <w:rFonts w:cs="Arial"/>
           <w:bCs/>
@@ -5297,11 +5718,8 @@
           <w:szCs w:val="22"/>
           <w:lang w:val="de-AT"/>
         </w:rPr>
-        <w:t>Um den Erfolg der BI-Initiative messbar zu machen, werden folgende Performance Indikatoren zur Bewertung des aktuellen Zustandes und der zukünftigen Verbesserung herangezogen:</w:t>
-      </w:r>
-    </w:p>
-    <w:p>
-      <w:pPr>
+      </w:pPr>
+      <w:r>
         <w:rPr>
           <w:rFonts w:cs="Arial"/>
           <w:bCs/>
@@ -5310,7 +5728,9 @@
           <w:szCs w:val="22"/>
           <w:lang w:val="de-AT"/>
         </w:rPr>
-      </w:pPr>
+        <w:t xml:space="preserve">Out </w:t>
+      </w:r>
+      <w:proofErr w:type="spellStart"/>
       <w:r>
         <w:rPr>
           <w:rFonts w:cs="Arial"/>
@@ -5320,11 +5740,10 @@
           <w:szCs w:val="22"/>
           <w:lang w:val="de-AT"/>
         </w:rPr>
-        <w:t>Total Rides pro Wetterkategorie</w:t>
-      </w:r>
-    </w:p>
-    <w:p>
-      <w:pPr>
+        <w:t>of</w:t>
+      </w:r>
+      <w:proofErr w:type="spellEnd"/>
+      <w:r>
         <w:rPr>
           <w:rFonts w:cs="Arial"/>
           <w:bCs/>
@@ -5333,7 +5752,9 @@
           <w:szCs w:val="22"/>
           <w:lang w:val="de-AT"/>
         </w:rPr>
-      </w:pPr>
+        <w:t xml:space="preserve"> </w:t>
+      </w:r>
+      <w:proofErr w:type="spellStart"/>
       <w:r>
         <w:rPr>
           <w:rFonts w:cs="Arial"/>
@@ -5343,11 +5764,10 @@
           <w:szCs w:val="22"/>
           <w:lang w:val="de-AT"/>
         </w:rPr>
-        <w:t>Average Ride Duration je Wetterlage</w:t>
-      </w:r>
-    </w:p>
-    <w:p>
-      <w:pPr>
+        <w:t>scope</w:t>
+      </w:r>
+      <w:proofErr w:type="spellEnd"/>
+      <w:r>
         <w:rPr>
           <w:rFonts w:cs="Arial"/>
           <w:bCs/>
@@ -5356,7 +5776,9 @@
           <w:szCs w:val="22"/>
           <w:lang w:val="de-AT"/>
         </w:rPr>
-      </w:pPr>
+        <w:t xml:space="preserve">: operative Wartungsdaten der Fahrräder, </w:t>
+      </w:r>
+      <w:proofErr w:type="spellStart"/>
       <w:r>
         <w:rPr>
           <w:rFonts w:cs="Arial"/>
@@ -5366,7 +5788,163 @@
           <w:szCs w:val="22"/>
           <w:lang w:val="de-AT"/>
         </w:rPr>
-        <w:t>Weather-Sensitivity-Score: Prozentuale Veränderung des Fahrtenvolumens und Fahrtendauer pro Station bei Regen vs. Sonnenschein.</w:t>
+        <w:t>Rebalancing</w:t>
+      </w:r>
+      <w:proofErr w:type="spellEnd"/>
+      <w:r>
+        <w:rPr>
+          <w:rFonts w:cs="Arial"/>
+          <w:bCs/>
+          <w:iCs/>
+          <w:sz w:val="22"/>
+          <w:szCs w:val="22"/>
+          <w:lang w:val="de-AT"/>
+        </w:rPr>
+        <w:t>-Logistik sowie die detaillierte Analyse von Einzelkosten pro Ride</w:t>
+      </w:r>
+    </w:p>
+    <w:p>
+      <w:pPr>
+        <w:rPr>
+          <w:rFonts w:cs="Arial"/>
+          <w:bCs/>
+          <w:iCs/>
+          <w:sz w:val="22"/>
+          <w:szCs w:val="22"/>
+          <w:lang w:val="de-AT"/>
+        </w:rPr>
+      </w:pPr>
+    </w:p>
+    <w:p>
+      <w:pPr>
+        <w:pStyle w:val="berschrift3"/>
+        <w:rPr>
+          <w:lang w:val="de-AT"/>
+        </w:rPr>
+      </w:pPr>
+      <w:bookmarkStart w:id="13" w:name="_Toc225192403"/>
+      <w:r>
+        <w:rPr>
+          <w:lang w:val="de-AT"/>
+        </w:rPr>
+        <w:t>Kennzahlen &amp; Metriken (Quantitative Analyse)</w:t>
+      </w:r>
+      <w:bookmarkEnd w:id="13"/>
+    </w:p>
+    <w:p>
+      <w:pPr>
+        <w:rPr>
+          <w:rFonts w:cs="Arial"/>
+          <w:bCs/>
+          <w:iCs/>
+          <w:sz w:val="22"/>
+          <w:szCs w:val="22"/>
+          <w:lang w:val="de-AT"/>
+        </w:rPr>
+      </w:pPr>
+      <w:r>
+        <w:rPr>
+          <w:rFonts w:cs="Arial"/>
+          <w:bCs/>
+          <w:iCs/>
+          <w:sz w:val="22"/>
+          <w:szCs w:val="22"/>
+          <w:lang w:val="de-AT"/>
+        </w:rPr>
+        <w:t>Um den Erfolg der BI-Initiative messbar zu machen, werden folgende Performance Indikatoren zur Bewertung des aktuellen Zustandes und der zukünftigen Verbesserung herangezogen:</w:t>
+      </w:r>
+    </w:p>
+    <w:p>
+      <w:pPr>
+        <w:rPr>
+          <w:rFonts w:cs="Arial"/>
+          <w:bCs/>
+          <w:iCs/>
+          <w:sz w:val="22"/>
+          <w:szCs w:val="22"/>
+          <w:lang w:val="de-AT"/>
+        </w:rPr>
+      </w:pPr>
+      <w:r>
+        <w:rPr>
+          <w:rFonts w:cs="Arial"/>
+          <w:bCs/>
+          <w:iCs/>
+          <w:sz w:val="22"/>
+          <w:szCs w:val="22"/>
+          <w:lang w:val="de-AT"/>
+        </w:rPr>
+        <w:t>Total Rides pro Wetterkategorie</w:t>
+      </w:r>
+    </w:p>
+    <w:p>
+      <w:pPr>
+        <w:rPr>
+          <w:rFonts w:cs="Arial"/>
+          <w:bCs/>
+          <w:iCs/>
+          <w:sz w:val="22"/>
+          <w:szCs w:val="22"/>
+          <w:lang w:val="de-AT"/>
+        </w:rPr>
+      </w:pPr>
+      <w:r>
+        <w:rPr>
+          <w:rFonts w:cs="Arial"/>
+          <w:bCs/>
+          <w:iCs/>
+          <w:sz w:val="22"/>
+          <w:szCs w:val="22"/>
+          <w:lang w:val="de-AT"/>
+        </w:rPr>
+        <w:t>Average Ride Duration je Wetterlage</w:t>
+      </w:r>
+    </w:p>
+    <w:p>
+      <w:pPr>
+        <w:rPr>
+          <w:rFonts w:cs="Arial"/>
+          <w:bCs/>
+          <w:iCs/>
+          <w:sz w:val="22"/>
+          <w:szCs w:val="22"/>
+          <w:lang w:val="de-AT"/>
+        </w:rPr>
+      </w:pPr>
+      <w:r>
+        <w:rPr>
+          <w:rFonts w:cs="Arial"/>
+          <w:bCs/>
+          <w:iCs/>
+          <w:sz w:val="22"/>
+          <w:szCs w:val="22"/>
+          <w:lang w:val="de-AT"/>
+        </w:rPr>
+        <w:t>Weather-</w:t>
+      </w:r>
+      <w:proofErr w:type="spellStart"/>
+      <w:r>
+        <w:rPr>
+          <w:rFonts w:cs="Arial"/>
+          <w:bCs/>
+          <w:iCs/>
+          <w:sz w:val="22"/>
+          <w:szCs w:val="22"/>
+          <w:lang w:val="de-AT"/>
+        </w:rPr>
+        <w:t>Sensitivity</w:t>
+      </w:r>
+      <w:proofErr w:type="spellEnd"/>
+      <w:r>
+        <w:rPr>
+          <w:rFonts w:cs="Arial"/>
+          <w:bCs/>
+          <w:iCs/>
+          <w:sz w:val="22"/>
+          <w:szCs w:val="22"/>
+          <w:lang w:val="de-AT"/>
+        </w:rPr>
+        <w:t>-Score: Prozentuale Veränderung des Fahrtenvolumens und Fahrtendauer pro Station bei Regen vs. Sonnenschein.</w:t>
       </w:r>
     </w:p>
     <w:p>
@@ -5391,6 +5969,7 @@
           <w:docGrid w:linePitch="326"/>
         </w:sectPr>
       </w:pPr>
+      <w:proofErr w:type="spellStart"/>
       <w:r>
         <w:rPr>
           <w:rFonts w:cs="Arial"/>
@@ -5400,7 +5979,67 @@
           <w:szCs w:val="22"/>
           <w:lang w:val="de-AT"/>
         </w:rPr>
-        <w:t>Conversion-Rate (Casual to Member): Der prozentuale Anteil der Gelegenheitsnutzer.</w:t>
+        <w:t>Conversion</w:t>
+      </w:r>
+      <w:proofErr w:type="spellEnd"/>
+      <w:r>
+        <w:rPr>
+          <w:rFonts w:cs="Arial"/>
+          <w:bCs/>
+          <w:iCs/>
+          <w:sz w:val="22"/>
+          <w:szCs w:val="22"/>
+          <w:lang w:val="de-AT"/>
+        </w:rPr>
+        <w:t>-Rate (</w:t>
+      </w:r>
+      <w:proofErr w:type="spellStart"/>
+      <w:r>
+        <w:rPr>
+          <w:rFonts w:cs="Arial"/>
+          <w:bCs/>
+          <w:iCs/>
+          <w:sz w:val="22"/>
+          <w:szCs w:val="22"/>
+          <w:lang w:val="de-AT"/>
+        </w:rPr>
+        <w:t>Casual</w:t>
+      </w:r>
+      <w:proofErr w:type="spellEnd"/>
+      <w:r>
+        <w:rPr>
+          <w:rFonts w:cs="Arial"/>
+          <w:bCs/>
+          <w:iCs/>
+          <w:sz w:val="22"/>
+          <w:szCs w:val="22"/>
+          <w:lang w:val="de-AT"/>
+        </w:rPr>
+        <w:t xml:space="preserve"> </w:t>
+      </w:r>
+      <w:proofErr w:type="spellStart"/>
+      <w:r>
+        <w:rPr>
+          <w:rFonts w:cs="Arial"/>
+          <w:bCs/>
+          <w:iCs/>
+          <w:sz w:val="22"/>
+          <w:szCs w:val="22"/>
+          <w:lang w:val="de-AT"/>
+        </w:rPr>
+        <w:t>to</w:t>
+      </w:r>
+      <w:proofErr w:type="spellEnd"/>
+      <w:r>
+        <w:rPr>
+          <w:rFonts w:cs="Arial"/>
+          <w:bCs/>
+          <w:iCs/>
+          <w:sz w:val="22"/>
+          <w:szCs w:val="22"/>
+          <w:lang w:val="de-AT"/>
+        </w:rPr>
+        <w:t xml:space="preserve"> Member): Der prozentuale Anteil der Gelegenheitsnutzer.</w:t>
       </w:r>
     </w:p>
     <w:p>
@@ -5799,9 +6438,9 @@
           <w:lang w:val="de-AT"/>
         </w:rPr>
         <w:drawing>
-          <wp:inline distT="0" distB="0" distL="0" distR="0" wp14:anchorId="49B9CE4E" wp14:editId="19C444A7">
-            <wp:extent cx="5561763" cy="2753249"/>
-            <wp:effectExtent l="0" t="0" r="1270" b="9525"/>
+          <wp:inline distT="0" distB="0" distL="0" distR="0" wp14:anchorId="49B9CE4E" wp14:editId="723B9576">
+            <wp:extent cx="4142595" cy="3180494"/>
+            <wp:effectExtent l="0" t="0" r="0" b="1270"/>
             <wp:docPr id="4" name="Picture 1"/>
             <wp:cNvGraphicFramePr>
               <a:graphicFrameLocks xmlns:a="http://schemas.openxmlformats.org/drawingml/2006/main"/>
@@ -5810,7 +6449,7 @@
               <a:graphicData uri="http://schemas.openxmlformats.org/drawingml/2006/picture">
                 <pic:pic xmlns:pic="http://schemas.openxmlformats.org/drawingml/2006/picture">
                   <pic:nvPicPr>
-                    <pic:cNvPr id="0" name="Picture 1"/>
+                    <pic:cNvPr id="4" name="Picture 1"/>
                     <pic:cNvPicPr>
                       <a:picLocks/>
                     </pic:cNvPicPr>
@@ -5823,7 +6462,7 @@
                         </a:ext>
                       </a:extLst>
                     </a:blip>
-                    <a:srcRect l="7058" t="6467" r="7066" b="12973"/>
+                    <a:srcRect t="683" b="233"/>
                     <a:stretch>
                       <a:fillRect/>
                     </a:stretch>
@@ -5831,7 +6470,7 @@
                   <pic:spPr bwMode="auto">
                     <a:xfrm>
                       <a:off x="0" y="0"/>
-                      <a:ext cx="5562722" cy="2753724"/>
+                      <a:ext cx="4155913" cy="3190719"/>
                     </a:xfrm>
                     <a:prstGeom prst="rect">
                       <a:avLst/>
@@ -6308,6 +6947,7 @@
           <w:lang w:val="en-GB"/>
         </w:rPr>
       </w:pPr>
+      <w:proofErr w:type="spellStart"/>
       <w:r>
         <w:rPr>
           <w:rFonts w:cs="Arial"/>
@@ -6317,7 +6957,19 @@
           <w:szCs w:val="16"/>
           <w:lang w:val="en-GB"/>
         </w:rPr>
-        <w:t>Github:</w:t>
+        <w:t>Github</w:t>
+      </w:r>
+      <w:proofErr w:type="spellEnd"/>
+      <w:r>
+        <w:rPr>
+          <w:rFonts w:cs="Arial"/>
+          <w:b/>
+          <w:bCs/>
+          <w:sz w:val="20"/>
+          <w:szCs w:val="16"/>
+          <w:lang w:val="en-GB"/>
+        </w:rPr>
+        <w:t>:</w:t>
       </w:r>
       <w:r>
         <w:rPr>
@@ -6401,7 +7053,25 @@
           <w:lang w:val="de-AT"/>
         </w:rPr>
         <w:br/>
-        <w:t>Die CitiBike-Fahrtdaten werden aus CSV-Dateien extrahiert. Zusätzlich werden historische Wetterdaten über die API von Open-Meteo abgerufen</w:t>
+        <w:t xml:space="preserve">Die </w:t>
+      </w:r>
+      <w:proofErr w:type="spellStart"/>
+      <w:r>
+        <w:rPr>
+          <w:sz w:val="20"/>
+          <w:szCs w:val="16"/>
+          <w:lang w:val="de-AT"/>
+        </w:rPr>
+        <w:t>CitiBike</w:t>
+      </w:r>
+      <w:proofErr w:type="spellEnd"/>
+      <w:r>
+        <w:rPr>
+          <w:sz w:val="20"/>
+          <w:szCs w:val="16"/>
+          <w:lang w:val="de-AT"/>
+        </w:rPr>
+        <w:t>-Fahrtdaten werden aus CSV-Dateien extrahiert. Zusätzlich werden historische Wetterdaten über die API von Open-Meteo abgerufen</w:t>
       </w:r>
       <w:r>
         <w:rPr>
@@ -6493,13 +7163,41 @@
           <w:lang w:val="de-AT"/>
         </w:rPr>
       </w:pPr>
+      <w:proofErr w:type="spellStart"/>
       <w:r>
         <w:rPr>
           <w:sz w:val="20"/>
           <w:szCs w:val="16"/>
           <w:lang w:val="de-AT"/>
         </w:rPr>
-        <w:t>pandas (read_csv)</w:t>
+        <w:t>pandas</w:t>
+      </w:r>
+      <w:proofErr w:type="spellEnd"/>
+      <w:r>
+        <w:rPr>
+          <w:sz w:val="20"/>
+          <w:szCs w:val="16"/>
+          <w:lang w:val="de-AT"/>
+        </w:rPr>
+        <w:t xml:space="preserve"> (</w:t>
+      </w:r>
+      <w:proofErr w:type="spellStart"/>
+      <w:r>
+        <w:rPr>
+          <w:sz w:val="20"/>
+          <w:szCs w:val="16"/>
+          <w:lang w:val="de-AT"/>
+        </w:rPr>
+        <w:t>read_csv</w:t>
+      </w:r>
+      <w:proofErr w:type="spellEnd"/>
+      <w:r>
+        <w:rPr>
+          <w:sz w:val="20"/>
+          <w:szCs w:val="16"/>
+          <w:lang w:val="de-AT"/>
+        </w:rPr>
+        <w:t>)</w:t>
       </w:r>
     </w:p>
     <w:p>
@@ -6516,13 +7214,41 @@
           <w:lang w:val="de-AT"/>
         </w:rPr>
       </w:pPr>
+      <w:proofErr w:type="spellStart"/>
       <w:r>
         <w:rPr>
           <w:sz w:val="20"/>
           <w:szCs w:val="16"/>
           <w:lang w:val="de-AT"/>
         </w:rPr>
-        <w:t>requests (API Calls)</w:t>
+        <w:t>requests</w:t>
+      </w:r>
+      <w:proofErr w:type="spellEnd"/>
+      <w:r>
+        <w:rPr>
+          <w:sz w:val="20"/>
+          <w:szCs w:val="16"/>
+          <w:lang w:val="de-AT"/>
+        </w:rPr>
+        <w:t xml:space="preserve"> (</w:t>
+      </w:r>
+      <w:proofErr w:type="gramStart"/>
+      <w:r>
+        <w:rPr>
+          <w:sz w:val="20"/>
+          <w:szCs w:val="16"/>
+          <w:lang w:val="de-AT"/>
+        </w:rPr>
+        <w:t>API Calls</w:t>
+      </w:r>
+      <w:proofErr w:type="gramEnd"/>
+      <w:r>
+        <w:rPr>
+          <w:sz w:val="20"/>
+          <w:szCs w:val="16"/>
+          <w:lang w:val="de-AT"/>
+        </w:rPr>
+        <w:t>)</w:t>
       </w:r>
     </w:p>
     <w:p>
@@ -6579,7 +7305,25 @@
           <w:szCs w:val="16"/>
           <w:lang w:val="de-AT"/>
         </w:rPr>
-        <w:t>Umwandlung von Datumsfeldern (datetime)</w:t>
+        <w:t>Umwandlung von Datumsfeldern (</w:t>
+      </w:r>
+      <w:proofErr w:type="spellStart"/>
+      <w:r>
+        <w:rPr>
+          <w:sz w:val="20"/>
+          <w:szCs w:val="16"/>
+          <w:lang w:val="de-AT"/>
+        </w:rPr>
+        <w:t>datetime</w:t>
+      </w:r>
+      <w:proofErr w:type="spellEnd"/>
+      <w:r>
+        <w:rPr>
+          <w:sz w:val="20"/>
+          <w:szCs w:val="16"/>
+          <w:lang w:val="de-AT"/>
+        </w:rPr>
+        <w:t>)</w:t>
       </w:r>
     </w:p>
     <w:p>
@@ -6625,8 +7369,18 @@
           <w:szCs w:val="16"/>
           <w:lang w:val="de-AT"/>
         </w:rPr>
-        <w:t>Erstellung eines date_key</w:t>
-      </w:r>
+        <w:t xml:space="preserve">Erstellung eines </w:t>
+      </w:r>
+      <w:proofErr w:type="spellStart"/>
+      <w:r>
+        <w:rPr>
+          <w:sz w:val="20"/>
+          <w:szCs w:val="16"/>
+          <w:lang w:val="de-AT"/>
+        </w:rPr>
+        <w:t>date_key</w:t>
+      </w:r>
+      <w:proofErr w:type="spellEnd"/>
     </w:p>
     <w:p>
       <w:pPr>
@@ -6665,13 +7419,23 @@
           <w:lang w:val="en-GB"/>
         </w:rPr>
       </w:pPr>
+      <w:proofErr w:type="spellStart"/>
       <w:r>
         <w:rPr>
           <w:sz w:val="20"/>
           <w:szCs w:val="16"/>
           <w:lang w:val="en-GB"/>
         </w:rPr>
-        <w:t>sql_transformations/</w:t>
+        <w:t>sql_transformations</w:t>
+      </w:r>
+      <w:proofErr w:type="spellEnd"/>
+      <w:r>
+        <w:rPr>
+          <w:sz w:val="20"/>
+          <w:szCs w:val="16"/>
+          <w:lang w:val="en-GB"/>
+        </w:rPr>
+        <w:t>/</w:t>
       </w:r>
       <w:r>
         <w:rPr>
@@ -7045,6 +7809,7 @@
         </w:rPr>
         <w:t xml:space="preserve"> </w:t>
       </w:r>
+      <w:proofErr w:type="spellStart"/>
       <w:r>
         <w:rPr>
           <w:sz w:val="20"/>
@@ -7053,6 +7818,7 @@
         </w:rPr>
         <w:t>fact_trips</w:t>
       </w:r>
+      <w:proofErr w:type="spellEnd"/>
     </w:p>
     <w:p>
       <w:pPr>
@@ -7079,6 +7845,7 @@
         </w:rPr>
         <w:t xml:space="preserve"> </w:t>
       </w:r>
+      <w:proofErr w:type="spellStart"/>
       <w:r>
         <w:rPr>
           <w:sz w:val="20"/>
@@ -7087,6 +7854,7 @@
         </w:rPr>
         <w:t>dim_station</w:t>
       </w:r>
+      <w:proofErr w:type="spellEnd"/>
       <w:r>
         <w:rPr>
           <w:sz w:val="20"/>
@@ -7095,6 +7863,7 @@
         </w:rPr>
         <w:t xml:space="preserve">, </w:t>
       </w:r>
+      <w:proofErr w:type="spellStart"/>
       <w:r>
         <w:rPr>
           <w:sz w:val="20"/>
@@ -7103,6 +7872,7 @@
         </w:rPr>
         <w:t>dim_date</w:t>
       </w:r>
+      <w:proofErr w:type="spellEnd"/>
       <w:r>
         <w:rPr>
           <w:sz w:val="20"/>
@@ -7111,6 +7881,7 @@
         </w:rPr>
         <w:t xml:space="preserve">, </w:t>
       </w:r>
+      <w:proofErr w:type="spellStart"/>
       <w:r>
         <w:rPr>
           <w:sz w:val="20"/>
@@ -7119,6 +7890,7 @@
         </w:rPr>
         <w:t>dim_bike</w:t>
       </w:r>
+      <w:proofErr w:type="spellEnd"/>
       <w:r>
         <w:rPr>
           <w:sz w:val="20"/>
@@ -7127,6 +7899,7 @@
         </w:rPr>
         <w:t xml:space="preserve">, </w:t>
       </w:r>
+      <w:proofErr w:type="spellStart"/>
       <w:r>
         <w:rPr>
           <w:sz w:val="20"/>
@@ -7135,6 +7908,7 @@
         </w:rPr>
         <w:t>dim_user_type</w:t>
       </w:r>
+      <w:proofErr w:type="spellEnd"/>
       <w:r>
         <w:rPr>
           <w:sz w:val="20"/>
@@ -7143,6 +7917,7 @@
         </w:rPr>
         <w:t xml:space="preserve">, </w:t>
       </w:r>
+      <w:proofErr w:type="spellStart"/>
       <w:r>
         <w:rPr>
           <w:sz w:val="20"/>
@@ -7151,6 +7926,7 @@
         </w:rPr>
         <w:t>dim_weather</w:t>
       </w:r>
+      <w:proofErr w:type="spellEnd"/>
       <w:r>
         <w:rPr>
           <w:sz w:val="20"/>
@@ -7189,7 +7965,25 @@
           <w:szCs w:val="16"/>
           <w:lang w:val="de-AT"/>
         </w:rPr>
-        <w:t>Python (SQLAlchemy / DB-Verbindung)</w:t>
+        <w:t>Python (</w:t>
+      </w:r>
+      <w:proofErr w:type="spellStart"/>
+      <w:r>
+        <w:rPr>
+          <w:sz w:val="20"/>
+          <w:szCs w:val="16"/>
+          <w:lang w:val="de-AT"/>
+        </w:rPr>
+        <w:t>SQLAlchemy</w:t>
+      </w:r>
+      <w:proofErr w:type="spellEnd"/>
+      <w:r>
+        <w:rPr>
+          <w:sz w:val="20"/>
+          <w:szCs w:val="16"/>
+          <w:lang w:val="de-AT"/>
+        </w:rPr>
+        <w:t xml:space="preserve"> / DB-Verbindung)</w:t>
       </w:r>
       <w:r>
         <w:rPr>
@@ -7602,9 +8396,17 @@
         <w:rPr>
           <w:lang w:val="de-AT"/>
         </w:rPr>
-        <w:t>Nutzung der Daten in PowerBI</w:t>
+        <w:t xml:space="preserve">Nutzung der Daten in </w:t>
+      </w:r>
+      <w:proofErr w:type="spellStart"/>
+      <w:r>
+        <w:rPr>
+          <w:lang w:val="de-AT"/>
+        </w:rPr>
+        <w:t>PowerBI</w:t>
       </w:r>
       <w:bookmarkEnd w:id="36"/>
+      <w:proofErr w:type="spellEnd"/>
     </w:p>
     <w:p>
       <w:pPr>
@@ -7812,9 +8614,14 @@
         <w:fldChar w:fldCharType="end"/>
       </w:r>
       <w:r>
-        <w:t>: Tabellen laden - dim_bike</w:t>
+        <w:t xml:space="preserve">: Tabellen laden - </w:t>
+      </w:r>
+      <w:proofErr w:type="spellStart"/>
+      <w:r>
+        <w:t>dim_bike</w:t>
       </w:r>
       <w:bookmarkEnd w:id="38"/>
+      <w:proofErr w:type="spellEnd"/>
     </w:p>
     <w:p>
       <w:pPr>
@@ -7994,10 +8801,12 @@
       <w:r>
         <w:t xml:space="preserve">: Tabellen laden - </w:t>
       </w:r>
+      <w:proofErr w:type="spellStart"/>
       <w:r>
         <w:t>dim_station</w:t>
       </w:r>
       <w:bookmarkEnd w:id="40"/>
+      <w:proofErr w:type="spellEnd"/>
     </w:p>
     <w:p>
       <w:pPr>
@@ -8078,10 +8887,12 @@
       <w:r>
         <w:t xml:space="preserve">: Tabellen laden - </w:t>
       </w:r>
+      <w:proofErr w:type="spellStart"/>
       <w:r>
         <w:t>dim_user_type</w:t>
       </w:r>
       <w:bookmarkEnd w:id="41"/>
+      <w:proofErr w:type="spellEnd"/>
     </w:p>
     <w:p>
       <w:pPr>
@@ -8248,10 +9059,12 @@
       <w:r>
         <w:t xml:space="preserve">: Tabellen laden - </w:t>
       </w:r>
+      <w:proofErr w:type="spellStart"/>
       <w:r>
         <w:t>dim_weather</w:t>
       </w:r>
       <w:bookmarkEnd w:id="42"/>
+      <w:proofErr w:type="spellEnd"/>
     </w:p>
     <w:p/>
     <w:p>
@@ -8406,10 +9219,12 @@
       <w:r>
         <w:t xml:space="preserve">: Tabellen laden - </w:t>
       </w:r>
+      <w:proofErr w:type="spellStart"/>
       <w:r>
         <w:t>fact_trips</w:t>
       </w:r>
       <w:bookmarkEnd w:id="43"/>
+      <w:proofErr w:type="spellEnd"/>
     </w:p>
     <w:p>
       <w:pPr>
@@ -8555,9 +9370,14 @@
         <w:fldChar w:fldCharType="end"/>
       </w:r>
       <w:r>
-        <w:t>: Modellansicht PowerBI</w:t>
+        <w:t xml:space="preserve">: Modellansicht </w:t>
+      </w:r>
+      <w:proofErr w:type="spellStart"/>
+      <w:r>
+        <w:t>PowerBI</w:t>
       </w:r>
       <w:bookmarkEnd w:id="44"/>
+      <w:proofErr w:type="spellEnd"/>
     </w:p>
     <w:p>
       <w:pPr>
@@ -8751,55 +9571,634 @@
     </w:p>
     <w:p>
       <w:pPr>
-        <w:rPr>
-          <w:lang w:val="de-AT"/>
-        </w:rPr>
-      </w:pPr>
-      <w:r>
-        <w:rPr>
-          <w:rFonts w:cs="Arial"/>
-          <w:b/>
+        <w:keepNext/>
+      </w:pPr>
+      <w:r>
+        <w:rPr>
+          <w:lang w:val="de-AT"/>
+        </w:rPr>
+        <w:drawing>
+          <wp:inline distT="0" distB="0" distL="0" distR="0" wp14:anchorId="47294B06" wp14:editId="13D6C298">
+            <wp:extent cx="6480810" cy="3634740"/>
+            <wp:effectExtent l="0" t="0" r="0" b="3810"/>
+            <wp:docPr id="920998681" name="Grafik 1"/>
+            <wp:cNvGraphicFramePr>
+              <a:graphicFrameLocks xmlns:a="http://schemas.openxmlformats.org/drawingml/2006/main" noChangeAspect="1"/>
+            </wp:cNvGraphicFramePr>
+            <a:graphic xmlns:a="http://schemas.openxmlformats.org/drawingml/2006/main">
+              <a:graphicData uri="http://schemas.openxmlformats.org/drawingml/2006/picture">
+                <pic:pic xmlns:pic="http://schemas.openxmlformats.org/drawingml/2006/picture">
+                  <pic:nvPicPr>
+                    <pic:cNvPr id="920998681" name=""/>
+                    <pic:cNvPicPr/>
+                  </pic:nvPicPr>
+                  <pic:blipFill>
+                    <a:blip r:embed="rId32"/>
+                    <a:stretch>
+                      <a:fillRect/>
+                    </a:stretch>
+                  </pic:blipFill>
+                  <pic:spPr>
+                    <a:xfrm>
+                      <a:off x="0" y="0"/>
+                      <a:ext cx="6480810" cy="3634740"/>
+                    </a:xfrm>
+                    <a:prstGeom prst="rect">
+                      <a:avLst/>
+                    </a:prstGeom>
+                  </pic:spPr>
+                </pic:pic>
+              </a:graphicData>
+            </a:graphic>
+          </wp:inline>
+        </w:drawing>
+      </w:r>
+    </w:p>
+    <w:p>
+      <w:pPr>
+        <w:pStyle w:val="Beschriftung"/>
+        <w:jc w:val="center"/>
+        <w:rPr>
+          <w:lang w:val="de-AT"/>
+        </w:rPr>
+      </w:pPr>
+      <w:r>
+        <w:t xml:space="preserve">Abbildung </w:t>
+      </w:r>
+      <w:r>
+        <w:fldChar w:fldCharType="begin"/>
+      </w:r>
+      <w:r>
+        <w:instrText xml:space="preserve"> SEQ Abbildung \* ARABIC </w:instrText>
+      </w:r>
+      <w:r>
+        <w:fldChar w:fldCharType="separate"/>
+      </w:r>
+      <w:r>
+        <w:rPr>
+          <w:noProof/>
+        </w:rPr>
+        <w:t>17</w:t>
+      </w:r>
+      <w:r>
+        <w:fldChar w:fldCharType="end"/>
+      </w:r>
+      <w:r>
+        <w:t xml:space="preserve">: </w:t>
+      </w:r>
+      <w:r>
+        <w:t xml:space="preserve">Entwurf </w:t>
+      </w:r>
+      <w:proofErr w:type="spellStart"/>
+      <w:r>
+        <w:t>Overview</w:t>
+      </w:r>
+      <w:proofErr w:type="spellEnd"/>
+      <w:r>
+        <w:t xml:space="preserve"> Tab</w:t>
+      </w:r>
+    </w:p>
+    <w:p>
+      <w:pPr>
+        <w:jc w:val="left"/>
+        <w:rPr>
+          <w:rFonts w:cs="Arial"/>
+          <w:lang w:val="de-AT"/>
+        </w:rPr>
+      </w:pPr>
+    </w:p>
+    <w:p>
+      <w:pPr>
+        <w:pStyle w:val="Listenabsatz"/>
+        <w:numPr>
+          <w:ilvl w:val="0"/>
+          <w:numId w:val="47"/>
+        </w:numPr>
+        <w:rPr>
+          <w:rFonts w:cs="Arial"/>
           <w:bCs/>
-          <w:i/>
+          <w:iCs/>
+          <w:sz w:val="22"/>
+          <w:szCs w:val="22"/>
+          <w:lang w:val="de-AT"/>
+        </w:rPr>
+      </w:pPr>
+      <w:r>
+        <w:rPr>
+          <w:rFonts w:cs="Arial"/>
+          <w:bCs/>
+          <w:iCs/>
+          <w:sz w:val="22"/>
+          <w:szCs w:val="22"/>
+          <w:lang w:val="de-AT"/>
+        </w:rPr>
+        <w:t>Wie verändert sich die Anzahl und Dauer der Fahrten bei unterschiedlichen Wetterbedingungen (Temperatur, Regen, Wind)?</w:t>
+      </w:r>
+    </w:p>
+    <w:p>
+      <w:pPr>
+        <w:pStyle w:val="Listenabsatz"/>
+        <w:numPr>
+          <w:ilvl w:val="0"/>
+          <w:numId w:val="47"/>
+        </w:numPr>
+        <w:rPr>
+          <w:rFonts w:cs="Arial"/>
+          <w:bCs/>
+          <w:iCs/>
+          <w:sz w:val="22"/>
+          <w:szCs w:val="22"/>
+          <w:lang w:val="de-AT"/>
+        </w:rPr>
+      </w:pPr>
+      <w:r>
+        <w:rPr>
+          <w:rFonts w:cs="Arial"/>
+          <w:bCs/>
+          <w:iCs/>
+          <w:sz w:val="22"/>
+          <w:szCs w:val="22"/>
+          <w:lang w:val="de-AT"/>
+        </w:rPr>
+        <w:t>Total Rides pro Wetterkategorie</w:t>
+      </w:r>
+    </w:p>
+    <w:p>
+      <w:pPr>
+        <w:pStyle w:val="Listenabsatz"/>
+        <w:numPr>
+          <w:ilvl w:val="0"/>
+          <w:numId w:val="47"/>
+        </w:numPr>
+        <w:rPr>
+          <w:rFonts w:cs="Arial"/>
+          <w:bCs/>
+          <w:iCs/>
+          <w:sz w:val="22"/>
+          <w:szCs w:val="22"/>
+          <w:lang w:val="de-AT"/>
+        </w:rPr>
+      </w:pPr>
+      <w:r>
+        <w:rPr>
+          <w:rFonts w:cs="Arial"/>
+          <w:bCs/>
+          <w:iCs/>
+          <w:sz w:val="22"/>
+          <w:szCs w:val="22"/>
+          <w:lang w:val="de-AT"/>
+        </w:rPr>
+        <w:t>Average Ride Duration je Wetterlage</w:t>
+      </w:r>
+    </w:p>
+    <w:p>
+      <w:pPr>
+        <w:jc w:val="left"/>
+        <w:rPr>
+          <w:rFonts w:cs="Arial"/>
+          <w:lang w:val="de-AT"/>
+        </w:rPr>
+      </w:pPr>
+    </w:p>
+    <w:p>
+      <w:pPr>
+        <w:keepNext/>
+        <w:jc w:val="left"/>
+      </w:pPr>
+      <w:r>
+        <w:rPr>
+          <w:rFonts w:cs="Arial"/>
+          <w:lang w:val="de-AT"/>
+        </w:rPr>
+        <w:lastRenderedPageBreak/>
+        <w:drawing>
+          <wp:inline distT="0" distB="0" distL="0" distR="0" wp14:anchorId="6E7740D4" wp14:editId="6FFEF136">
+            <wp:extent cx="6480810" cy="3630295"/>
+            <wp:effectExtent l="0" t="0" r="0" b="8255"/>
+            <wp:docPr id="1232410286" name="Grafik 1"/>
+            <wp:cNvGraphicFramePr>
+              <a:graphicFrameLocks xmlns:a="http://schemas.openxmlformats.org/drawingml/2006/main" noChangeAspect="1"/>
+            </wp:cNvGraphicFramePr>
+            <a:graphic xmlns:a="http://schemas.openxmlformats.org/drawingml/2006/main">
+              <a:graphicData uri="http://schemas.openxmlformats.org/drawingml/2006/picture">
+                <pic:pic xmlns:pic="http://schemas.openxmlformats.org/drawingml/2006/picture">
+                  <pic:nvPicPr>
+                    <pic:cNvPr id="1232410286" name=""/>
+                    <pic:cNvPicPr/>
+                  </pic:nvPicPr>
+                  <pic:blipFill>
+                    <a:blip r:embed="rId33"/>
+                    <a:stretch>
+                      <a:fillRect/>
+                    </a:stretch>
+                  </pic:blipFill>
+                  <pic:spPr>
+                    <a:xfrm>
+                      <a:off x="0" y="0"/>
+                      <a:ext cx="6480810" cy="3630295"/>
+                    </a:xfrm>
+                    <a:prstGeom prst="rect">
+                      <a:avLst/>
+                    </a:prstGeom>
+                  </pic:spPr>
+                </pic:pic>
+              </a:graphicData>
+            </a:graphic>
+          </wp:inline>
+        </w:drawing>
+      </w:r>
+    </w:p>
+    <w:p>
+      <w:pPr>
+        <w:pStyle w:val="Beschriftung"/>
+        <w:jc w:val="center"/>
+      </w:pPr>
+      <w:r>
+        <w:t xml:space="preserve">Abbildung </w:t>
+      </w:r>
+      <w:r>
+        <w:fldChar w:fldCharType="begin"/>
+      </w:r>
+      <w:r>
+        <w:instrText xml:space="preserve"> SEQ Abbildung \* ARABIC </w:instrText>
+      </w:r>
+      <w:r>
+        <w:fldChar w:fldCharType="separate"/>
+      </w:r>
+      <w:r>
+        <w:rPr>
           <w:noProof/>
-          <w:color w:val="943634"/>
-          <w:sz w:val="20"/>
-          <w:lang w:val="en-GB"/>
-        </w:rPr>
-        <w:t>Present your BI implementation with a few screenshots, list your questions from section 2 and the answers to those questions.</w:t>
-      </w:r>
-      <w:r>
-        <w:rPr>
-          <w:rFonts w:cs="Arial"/>
-          <w:b/>
+        </w:rPr>
+        <w:t>18</w:t>
+      </w:r>
+      <w:r>
+        <w:fldChar w:fldCharType="end"/>
+      </w:r>
+      <w:r>
+        <w:t xml:space="preserve">: </w:t>
+      </w:r>
+      <w:r>
+        <w:t xml:space="preserve">Entwurf </w:t>
+      </w:r>
+      <w:proofErr w:type="spellStart"/>
+      <w:r>
+        <w:t>Stations</w:t>
+      </w:r>
+      <w:proofErr w:type="spellEnd"/>
+      <w:r>
+        <w:t xml:space="preserve"> Tab</w:t>
+      </w:r>
+    </w:p>
+    <w:p>
+      <w:pPr>
+        <w:jc w:val="left"/>
+        <w:rPr>
+          <w:rFonts w:cs="Arial"/>
+          <w:lang w:val="de-AT"/>
+        </w:rPr>
+      </w:pPr>
+      <w:r>
+        <w:rPr>
+          <w:rFonts w:cs="Arial"/>
+          <w:lang w:val="de-AT"/>
+        </w:rPr>
+        <w:t xml:space="preserve"> </w:t>
+      </w:r>
+    </w:p>
+    <w:p>
+      <w:pPr>
+        <w:pStyle w:val="Listenabsatz"/>
+        <w:numPr>
+          <w:ilvl w:val="0"/>
+          <w:numId w:val="48"/>
+        </w:numPr>
+        <w:rPr>
+          <w:rFonts w:cs="Arial"/>
           <w:bCs/>
-          <w:i/>
+          <w:iCs/>
+          <w:sz w:val="22"/>
+          <w:szCs w:val="22"/>
+          <w:lang w:val="de-AT"/>
+        </w:rPr>
+      </w:pPr>
+      <w:r>
+        <w:rPr>
+          <w:rFonts w:cs="Arial"/>
+          <w:bCs/>
+          <w:iCs/>
+          <w:sz w:val="22"/>
+          <w:szCs w:val="22"/>
+          <w:lang w:val="de-AT"/>
+        </w:rPr>
+        <w:t>Welche Stationen oder Stadtbereiche reagieren besonders stark auf Wetterveränderungen?</w:t>
+      </w:r>
+    </w:p>
+    <w:p>
+      <w:pPr>
+        <w:pStyle w:val="Listenabsatz"/>
+        <w:numPr>
+          <w:ilvl w:val="0"/>
+          <w:numId w:val="48"/>
+        </w:numPr>
+        <w:rPr>
+          <w:rFonts w:cs="Arial"/>
+          <w:bCs/>
+          <w:iCs/>
+          <w:sz w:val="22"/>
+          <w:szCs w:val="22"/>
+          <w:lang w:val="de-AT"/>
+        </w:rPr>
+      </w:pPr>
+      <w:r>
+        <w:rPr>
+          <w:rFonts w:cs="Arial"/>
+          <w:bCs/>
+          <w:iCs/>
+          <w:sz w:val="22"/>
+          <w:szCs w:val="22"/>
+          <w:lang w:val="de-AT"/>
+        </w:rPr>
+        <w:t>Weather-</w:t>
+      </w:r>
+      <w:proofErr w:type="spellStart"/>
+      <w:r>
+        <w:rPr>
+          <w:rFonts w:cs="Arial"/>
+          <w:bCs/>
+          <w:iCs/>
+          <w:sz w:val="22"/>
+          <w:szCs w:val="22"/>
+          <w:lang w:val="de-AT"/>
+        </w:rPr>
+        <w:t>Sensitivity</w:t>
+      </w:r>
+      <w:proofErr w:type="spellEnd"/>
+      <w:r>
+        <w:rPr>
+          <w:rFonts w:cs="Arial"/>
+          <w:bCs/>
+          <w:iCs/>
+          <w:sz w:val="22"/>
+          <w:szCs w:val="22"/>
+          <w:lang w:val="de-AT"/>
+        </w:rPr>
+        <w:t>-Score: Prozentuale Veränderung des Fahrtenvolumens und Fahrtendauer pro Station bei Regen vs. Sonnenschein.</w:t>
+      </w:r>
+    </w:p>
+    <w:p>
+      <w:pPr>
+        <w:jc w:val="left"/>
+        <w:rPr>
+          <w:rFonts w:cs="Arial"/>
+          <w:lang w:val="de-AT"/>
+        </w:rPr>
+      </w:pPr>
+    </w:p>
+    <w:p>
+      <w:pPr>
+        <w:jc w:val="left"/>
+        <w:rPr>
+          <w:rFonts w:cs="Arial"/>
+          <w:lang w:val="de-AT"/>
+        </w:rPr>
+      </w:pPr>
+    </w:p>
+    <w:p>
+      <w:pPr>
+        <w:jc w:val="left"/>
+        <w:rPr>
+          <w:rFonts w:cs="Arial"/>
+          <w:lang w:val="de-AT"/>
+        </w:rPr>
+      </w:pPr>
+    </w:p>
+    <w:p>
+      <w:pPr>
+        <w:keepNext/>
+        <w:jc w:val="left"/>
+      </w:pPr>
+      <w:r>
+        <w:rPr>
+          <w:rFonts w:cs="Arial"/>
+          <w:lang w:val="de-AT"/>
+        </w:rPr>
+        <w:lastRenderedPageBreak/>
+        <w:drawing>
+          <wp:inline distT="0" distB="0" distL="0" distR="0" wp14:anchorId="06F4D3B2" wp14:editId="7969F681">
+            <wp:extent cx="6480810" cy="3636645"/>
+            <wp:effectExtent l="0" t="0" r="0" b="1905"/>
+            <wp:docPr id="1132183477" name="Grafik 1"/>
+            <wp:cNvGraphicFramePr>
+              <a:graphicFrameLocks xmlns:a="http://schemas.openxmlformats.org/drawingml/2006/main" noChangeAspect="1"/>
+            </wp:cNvGraphicFramePr>
+            <a:graphic xmlns:a="http://schemas.openxmlformats.org/drawingml/2006/main">
+              <a:graphicData uri="http://schemas.openxmlformats.org/drawingml/2006/picture">
+                <pic:pic xmlns:pic="http://schemas.openxmlformats.org/drawingml/2006/picture">
+                  <pic:nvPicPr>
+                    <pic:cNvPr id="1132183477" name=""/>
+                    <pic:cNvPicPr/>
+                  </pic:nvPicPr>
+                  <pic:blipFill>
+                    <a:blip r:embed="rId34"/>
+                    <a:stretch>
+                      <a:fillRect/>
+                    </a:stretch>
+                  </pic:blipFill>
+                  <pic:spPr>
+                    <a:xfrm>
+                      <a:off x="0" y="0"/>
+                      <a:ext cx="6480810" cy="3636645"/>
+                    </a:xfrm>
+                    <a:prstGeom prst="rect">
+                      <a:avLst/>
+                    </a:prstGeom>
+                  </pic:spPr>
+                </pic:pic>
+              </a:graphicData>
+            </a:graphic>
+          </wp:inline>
+        </w:drawing>
+      </w:r>
+    </w:p>
+    <w:p>
+      <w:pPr>
+        <w:pStyle w:val="Beschriftung"/>
+        <w:jc w:val="center"/>
+      </w:pPr>
+      <w:r>
+        <w:t xml:space="preserve">Abbildung </w:t>
+      </w:r>
+      <w:r>
+        <w:fldChar w:fldCharType="begin"/>
+      </w:r>
+      <w:r>
+        <w:instrText xml:space="preserve"> SEQ Abbildung \* ARABIC </w:instrText>
+      </w:r>
+      <w:r>
+        <w:fldChar w:fldCharType="separate"/>
+      </w:r>
+      <w:r>
+        <w:rPr>
           <w:noProof/>
-          <w:color w:val="943634"/>
-          <w:sz w:val="20"/>
-          <w:lang w:val="en-GB"/>
+        </w:rPr>
+        <w:t>19</w:t>
+      </w:r>
+      <w:r>
+        <w:fldChar w:fldCharType="end"/>
+      </w:r>
+      <w:r>
+        <w:t xml:space="preserve">: </w:t>
+      </w:r>
+      <w:r>
+        <w:t xml:space="preserve">Entwurf </w:t>
+      </w:r>
+      <w:proofErr w:type="spellStart"/>
+      <w:r>
+        <w:t>Conversion</w:t>
+      </w:r>
+      <w:proofErr w:type="spellEnd"/>
+      <w:r>
+        <w:t xml:space="preserve"> Tab</w:t>
+      </w:r>
+    </w:p>
+    <w:p>
+      <w:pPr>
+        <w:pStyle w:val="Listenabsatz"/>
+        <w:numPr>
+          <w:ilvl w:val="0"/>
+          <w:numId w:val="49"/>
+        </w:numPr>
+        <w:rPr>
+          <w:rFonts w:cs="Arial"/>
+          <w:bCs/>
+          <w:iCs/>
+          <w:sz w:val="22"/>
+          <w:szCs w:val="22"/>
+          <w:lang w:val="de-AT"/>
+        </w:rPr>
+      </w:pPr>
+      <w:proofErr w:type="spellStart"/>
+      <w:r>
+        <w:rPr>
+          <w:rFonts w:cs="Arial"/>
+          <w:bCs/>
+          <w:iCs/>
+          <w:sz w:val="22"/>
+          <w:szCs w:val="22"/>
+          <w:lang w:val="de-AT"/>
+        </w:rPr>
+        <w:t>Conversion</w:t>
+      </w:r>
+      <w:proofErr w:type="spellEnd"/>
+      <w:r>
+        <w:rPr>
+          <w:rFonts w:cs="Arial"/>
+          <w:bCs/>
+          <w:iCs/>
+          <w:sz w:val="22"/>
+          <w:szCs w:val="22"/>
+          <w:lang w:val="de-AT"/>
+        </w:rPr>
+        <w:t>-Rate (</w:t>
+      </w:r>
+      <w:proofErr w:type="spellStart"/>
+      <w:r>
+        <w:rPr>
+          <w:rFonts w:cs="Arial"/>
+          <w:bCs/>
+          <w:iCs/>
+          <w:sz w:val="22"/>
+          <w:szCs w:val="22"/>
+          <w:lang w:val="de-AT"/>
+        </w:rPr>
+        <w:t>Casual</w:t>
+      </w:r>
+      <w:proofErr w:type="spellEnd"/>
+      <w:r>
+        <w:rPr>
+          <w:rFonts w:cs="Arial"/>
+          <w:bCs/>
+          <w:iCs/>
+          <w:sz w:val="22"/>
+          <w:szCs w:val="22"/>
+          <w:lang w:val="de-AT"/>
         </w:rPr>
         <w:t xml:space="preserve"> </w:t>
       </w:r>
-      <w:r>
-        <w:rPr>
-          <w:rFonts w:cs="Arial"/>
-          <w:b/>
+      <w:proofErr w:type="spellStart"/>
+      <w:r>
+        <w:rPr>
+          <w:rFonts w:cs="Arial"/>
           <w:bCs/>
-          <w:i/>
-          <w:noProof/>
-          <w:color w:val="943634"/>
-          <w:sz w:val="20"/>
-          <w:lang w:val="de-AT"/>
-        </w:rPr>
-        <w:t>The screenshots should show that drill-down is supported.</w:t>
-      </w:r>
-    </w:p>
-    <w:p>
-      <w:pPr>
-        <w:rPr>
-          <w:lang w:val="de-AT"/>
-        </w:rPr>
+          <w:iCs/>
+          <w:sz w:val="22"/>
+          <w:szCs w:val="22"/>
+          <w:lang w:val="de-AT"/>
+        </w:rPr>
+        <w:t>to</w:t>
+      </w:r>
+      <w:proofErr w:type="spellEnd"/>
+      <w:r>
+        <w:rPr>
+          <w:rFonts w:cs="Arial"/>
+          <w:bCs/>
+          <w:iCs/>
+          <w:sz w:val="22"/>
+          <w:szCs w:val="22"/>
+          <w:lang w:val="de-AT"/>
+        </w:rPr>
+        <w:t xml:space="preserve"> Member): Der prozentuale Anteil der Gelegenheitsnutzer.</w:t>
+      </w:r>
+    </w:p>
+    <w:p>
+      <w:pPr>
+        <w:pStyle w:val="Listenabsatz"/>
+        <w:numPr>
+          <w:ilvl w:val="0"/>
+          <w:numId w:val="49"/>
+        </w:numPr>
+        <w:rPr>
+          <w:rFonts w:cs="Arial"/>
+          <w:bCs/>
+          <w:iCs/>
+          <w:sz w:val="22"/>
+          <w:szCs w:val="22"/>
+          <w:lang w:val="de-AT"/>
+        </w:rPr>
+      </w:pPr>
+      <w:r>
+        <w:rPr>
+          <w:rFonts w:cs="Arial"/>
+          <w:bCs/>
+          <w:iCs/>
+          <w:sz w:val="22"/>
+          <w:szCs w:val="22"/>
+          <w:lang w:val="de-AT"/>
+        </w:rPr>
+        <w:t xml:space="preserve">Wie viele Gelegenheitsnutzer schließen pro Jahr ein Abo ab? </w:t>
+      </w:r>
+    </w:p>
+    <w:p>
+      <w:pPr>
+        <w:rPr>
+          <w:rFonts w:cs="Arial"/>
+          <w:bCs/>
+          <w:iCs/>
+          <w:sz w:val="22"/>
+          <w:szCs w:val="22"/>
+          <w:lang w:val="de-AT"/>
+        </w:rPr>
+        <w:sectPr>
+          <w:footerReference w:type="first" r:id="rId35"/>
+          <w:pgSz w:w="11907" w:h="16840" w:code="9"/>
+          <w:pgMar w:top="1418" w:right="567" w:bottom="851" w:left="1134" w:header="567" w:footer="567" w:gutter="0"/>
+          <w:paperSrc w:first="7"/>
+          <w:cols w:space="720" w:equalWidth="0">
+            <w:col w:w="10206"/>
+          </w:cols>
+          <w:titlePg/>
+          <w:docGrid w:linePitch="326"/>
+        </w:sectPr>
       </w:pPr>
     </w:p>
     <w:p>
@@ -8815,6 +10214,7 @@
           <w:rFonts w:cs="Arial"/>
           <w:lang w:val="de-AT"/>
         </w:rPr>
+        <w:lastRenderedPageBreak/>
         <w:br w:type="page"/>
       </w:r>
     </w:p>
@@ -10299,6 +11699,7 @@
       </w:r>
     </w:p>
     <w:sectPr>
+      <w:footerReference w:type="first" r:id="rId36"/>
       <w:pgSz w:w="11907" w:h="16840" w:code="9"/>
       <w:pgMar w:top="1418" w:right="567" w:bottom="851" w:left="1134" w:header="567" w:footer="567" w:gutter="0"/>
       <w:paperSrc w:first="7"/>
@@ -10569,6 +11970,7 @@
               <w:szCs w:val="16"/>
             </w:rPr>
           </w:pPr>
+          <w:proofErr w:type="spellStart"/>
           <w:r>
             <w:rPr>
               <w:sz w:val="16"/>
@@ -10576,6 +11978,7 @@
             </w:rPr>
             <w:t>CD_citibike</w:t>
           </w:r>
+          <w:proofErr w:type="spellEnd"/>
         </w:p>
       </w:tc>
       <w:tc>
@@ -11028,6 +12431,7 @@
               <w:szCs w:val="16"/>
             </w:rPr>
           </w:pPr>
+          <w:proofErr w:type="spellStart"/>
           <w:r>
             <w:rPr>
               <w:sz w:val="16"/>
@@ -11035,6 +12439,7 @@
             </w:rPr>
             <w:t>CD_citibike</w:t>
           </w:r>
+          <w:proofErr w:type="spellEnd"/>
         </w:p>
       </w:tc>
       <w:tc>
@@ -11213,6 +12618,824 @@
 </w:ftr>
 </file>
 
+<file path=word/footer4.xml><?xml version="1.0" encoding="utf-8"?>
+<w:ftr xmlns:wpc="http://schemas.microsoft.com/office/word/2010/wordprocessingCanvas" xmlns:cx="http://schemas.microsoft.com/office/drawing/2014/chartex" xmlns:cx1="http://schemas.microsoft.com/office/drawing/2015/9/8/chartex" xmlns:cx2="http://schemas.microsoft.com/office/drawing/2015/10/21/chartex" xmlns:cx3="http://schemas.microsoft.com/office/drawing/2016/5/9/chartex" xmlns:cx4="http://schemas.microsoft.com/office/drawing/2016/5/10/chartex" xmlns:cx5="http://schemas.microsoft.com/office/drawing/2016/5/11/chartex" xmlns:cx6="http://schemas.microsoft.com/office/drawing/2016/5/12/chartex" xmlns:cx7="http://schemas.microsoft.com/office/drawing/2016/5/13/chartex" xmlns:cx8="http://schemas.microsoft.com/office/drawing/2016/5/14/chartex" xmlns:mc="http://schemas.openxmlformats.org/markup-compatibility/2006" xmlns:aink="http://schemas.microsoft.com/office/drawing/2016/ink" xmlns:am3d="http://schemas.microsoft.com/office/drawing/2017/model3d" xmlns:o="urn:schemas-microsoft-com:office:office" xmlns:oel="http://schemas.microsoft.com/office/2019/extlst" xmlns:r="http://schemas.openxmlformats.org/officeDocument/2006/relationships" xmlns:m="http://schemas.openxmlformats.org/officeDocument/2006/math" xmlns:v="urn:schemas-microsoft-com:vml" xmlns:wp14="http://schemas.microsoft.com/office/word/2010/wordprocessingDrawing" xmlns:wp="http://schemas.openxmlformats.org/drawingml/2006/wordprocessingDrawing" xmlns:w10="urn:schemas-microsoft-com:office:word" xmlns:w="http://schemas.openxmlformats.org/wordprocessingml/2006/main" xmlns:w14="http://schemas.microsoft.com/office/word/2010/wordml" xmlns:w15="http://schemas.microsoft.com/office/word/2012/wordml" xmlns:w16cex="http://schemas.microsoft.com/office/word/2018/wordml/cex" xmlns:w16cid="http://schemas.microsoft.com/office/word/2016/wordml/cid" xmlns:w16="http://schemas.microsoft.com/office/word/2018/wordml" xmlns:w16du="http://schemas.microsoft.com/office/word/2023/wordml/word16du" xmlns:w16sdtdh="http://schemas.microsoft.com/office/word/2020/wordml/sdtdatahash" xmlns:w16sdtfl="http://schemas.microsoft.com/office/word/2024/wordml/sdtformatlock" xmlns:w16se="http://schemas.microsoft.com/office/word/2015/wordml/symex" xmlns:wpg="http://schemas.microsoft.com/office/word/2010/wordprocessingGroup" xmlns:wpi="http://schemas.microsoft.com/office/word/2010/wordprocessingInk" xmlns:wne="http://schemas.microsoft.com/office/word/2006/wordml" xmlns:wps="http://schemas.microsoft.com/office/word/2010/wordprocessingShape" mc:Ignorable="w14 w15 w16se w16cid w16 w16cex w16sdtdh w16sdtfl w16du wp14">
+  <w:p>
+    <w:pPr>
+      <w:pStyle w:val="Fuzeile"/>
+      <w:rPr>
+        <w:color w:val="0000FF"/>
+        <w:lang w:val="de-DE"/>
+      </w:rPr>
+    </w:pPr>
+  </w:p>
+  <w:tbl>
+    <w:tblPr>
+      <w:tblW w:w="8930" w:type="dxa"/>
+      <w:jc w:val="center"/>
+      <w:tblBorders>
+        <w:top w:val="single" w:sz="4" w:space="0" w:color="auto"/>
+        <w:left w:val="single" w:sz="4" w:space="0" w:color="auto"/>
+        <w:bottom w:val="single" w:sz="4" w:space="0" w:color="auto"/>
+        <w:right w:val="single" w:sz="4" w:space="0" w:color="auto"/>
+        <w:insideH w:val="single" w:sz="4" w:space="0" w:color="auto"/>
+        <w:insideV w:val="single" w:sz="4" w:space="0" w:color="auto"/>
+      </w:tblBorders>
+      <w:tblLayout w:type="fixed"/>
+      <w:tblLook w:val="0000" w:firstRow="0" w:lastRow="0" w:firstColumn="0" w:lastColumn="0" w:noHBand="0" w:noVBand="0"/>
+    </w:tblPr>
+    <w:tblGrid>
+      <w:gridCol w:w="864"/>
+      <w:gridCol w:w="1688"/>
+      <w:gridCol w:w="2835"/>
+      <w:gridCol w:w="1559"/>
+      <w:gridCol w:w="1276"/>
+      <w:gridCol w:w="708"/>
+    </w:tblGrid>
+    <w:tr>
+      <w:trPr>
+        <w:jc w:val="center"/>
+      </w:trPr>
+      <w:tc>
+        <w:tcPr>
+          <w:tcW w:w="864" w:type="dxa"/>
+        </w:tcPr>
+        <w:p>
+          <w:pPr>
+            <w:pStyle w:val="Fuzeile"/>
+            <w:rPr>
+              <w:sz w:val="16"/>
+              <w:szCs w:val="16"/>
+            </w:rPr>
+          </w:pPr>
+          <w:r>
+            <w:rPr>
+              <w:sz w:val="16"/>
+              <w:szCs w:val="16"/>
+            </w:rPr>
+            <w:t>Version</w:t>
+          </w:r>
+        </w:p>
+      </w:tc>
+      <w:tc>
+        <w:tcPr>
+          <w:tcW w:w="1688" w:type="dxa"/>
+        </w:tcPr>
+        <w:p>
+          <w:pPr>
+            <w:pStyle w:val="Fuzeile"/>
+            <w:rPr>
+              <w:sz w:val="16"/>
+              <w:szCs w:val="16"/>
+            </w:rPr>
+          </w:pPr>
+          <w:r>
+            <w:rPr>
+              <w:sz w:val="16"/>
+              <w:szCs w:val="16"/>
+            </w:rPr>
+            <w:t>Aut</w:t>
+          </w:r>
+          <w:r>
+            <w:rPr>
+              <w:sz w:val="16"/>
+              <w:szCs w:val="16"/>
+            </w:rPr>
+            <w:t>h</w:t>
+          </w:r>
+          <w:r>
+            <w:rPr>
+              <w:sz w:val="16"/>
+              <w:szCs w:val="16"/>
+            </w:rPr>
+            <w:t>or</w:t>
+          </w:r>
+        </w:p>
+      </w:tc>
+      <w:tc>
+        <w:tcPr>
+          <w:tcW w:w="2835" w:type="dxa"/>
+        </w:tcPr>
+        <w:p>
+          <w:pPr>
+            <w:pStyle w:val="Fuzeile"/>
+            <w:rPr>
+              <w:sz w:val="16"/>
+              <w:szCs w:val="16"/>
+            </w:rPr>
+          </w:pPr>
+          <w:r>
+            <w:rPr>
+              <w:sz w:val="16"/>
+              <w:szCs w:val="16"/>
+            </w:rPr>
+            <w:t>Filename</w:t>
+          </w:r>
+        </w:p>
+      </w:tc>
+      <w:tc>
+        <w:tcPr>
+          <w:tcW w:w="1559" w:type="dxa"/>
+          <w:tcMar>
+            <w:left w:w="57" w:type="dxa"/>
+            <w:right w:w="57" w:type="dxa"/>
+          </w:tcMar>
+        </w:tcPr>
+        <w:p>
+          <w:pPr>
+            <w:pStyle w:val="Fuzeile"/>
+            <w:ind w:left="44"/>
+            <w:rPr>
+              <w:sz w:val="16"/>
+              <w:szCs w:val="16"/>
+            </w:rPr>
+          </w:pPr>
+          <w:r>
+            <w:rPr>
+              <w:sz w:val="16"/>
+              <w:szCs w:val="16"/>
+            </w:rPr>
+            <w:t>Last Change</w:t>
+          </w:r>
+        </w:p>
+      </w:tc>
+      <w:tc>
+        <w:tcPr>
+          <w:tcW w:w="1276" w:type="dxa"/>
+        </w:tcPr>
+        <w:p>
+          <w:pPr>
+            <w:pStyle w:val="Fuzeile"/>
+            <w:rPr>
+              <w:sz w:val="16"/>
+              <w:szCs w:val="16"/>
+            </w:rPr>
+          </w:pPr>
+          <w:r>
+            <w:rPr>
+              <w:sz w:val="16"/>
+              <w:szCs w:val="16"/>
+            </w:rPr>
+            <w:t>Print date</w:t>
+          </w:r>
+          <w:r>
+            <w:rPr>
+              <w:sz w:val="16"/>
+              <w:szCs w:val="16"/>
+            </w:rPr>
+            <w:tab/>
+          </w:r>
+        </w:p>
+      </w:tc>
+      <w:tc>
+        <w:tcPr>
+          <w:tcW w:w="708" w:type="dxa"/>
+        </w:tcPr>
+        <w:p>
+          <w:pPr>
+            <w:pStyle w:val="Fuzeile"/>
+            <w:rPr>
+              <w:sz w:val="16"/>
+              <w:szCs w:val="16"/>
+            </w:rPr>
+          </w:pPr>
+          <w:r>
+            <w:rPr>
+              <w:sz w:val="16"/>
+              <w:szCs w:val="16"/>
+            </w:rPr>
+            <w:t>page</w:t>
+          </w:r>
+        </w:p>
+      </w:tc>
+    </w:tr>
+    <w:tr>
+      <w:trPr>
+        <w:trHeight w:val="188"/>
+        <w:jc w:val="center"/>
+      </w:trPr>
+      <w:tc>
+        <w:tcPr>
+          <w:tcW w:w="864" w:type="dxa"/>
+        </w:tcPr>
+        <w:p>
+          <w:pPr>
+            <w:pStyle w:val="Fuzeile"/>
+            <w:rPr>
+              <w:sz w:val="16"/>
+              <w:szCs w:val="16"/>
+            </w:rPr>
+          </w:pPr>
+          <w:r>
+            <w:rPr>
+              <w:sz w:val="16"/>
+              <w:szCs w:val="16"/>
+            </w:rPr>
+            <w:t>0.4</w:t>
+          </w:r>
+        </w:p>
+      </w:tc>
+      <w:tc>
+        <w:tcPr>
+          <w:tcW w:w="1688" w:type="dxa"/>
+        </w:tcPr>
+        <w:p>
+          <w:pPr>
+            <w:pStyle w:val="Fuzeile"/>
+            <w:rPr>
+              <w:sz w:val="16"/>
+              <w:szCs w:val="16"/>
+            </w:rPr>
+          </w:pPr>
+          <w:proofErr w:type="spellStart"/>
+          <w:r>
+            <w:rPr>
+              <w:sz w:val="16"/>
+              <w:szCs w:val="16"/>
+            </w:rPr>
+            <w:t>CD_citibike</w:t>
+          </w:r>
+          <w:proofErr w:type="spellEnd"/>
+        </w:p>
+      </w:tc>
+      <w:tc>
+        <w:tcPr>
+          <w:tcW w:w="2835" w:type="dxa"/>
+        </w:tcPr>
+        <w:p>
+          <w:pPr>
+            <w:pStyle w:val="Fuzeile"/>
+            <w:rPr>
+              <w:sz w:val="16"/>
+              <w:szCs w:val="16"/>
+            </w:rPr>
+          </w:pPr>
+          <w:r>
+            <w:rPr>
+              <w:sz w:val="16"/>
+              <w:szCs w:val="16"/>
+            </w:rPr>
+            <w:t>Citibike.docx</w:t>
+          </w:r>
+        </w:p>
+      </w:tc>
+      <w:tc>
+        <w:tcPr>
+          <w:tcW w:w="1559" w:type="dxa"/>
+        </w:tcPr>
+        <w:p>
+          <w:pPr>
+            <w:pStyle w:val="Fuzeile"/>
+            <w:rPr>
+              <w:sz w:val="16"/>
+              <w:szCs w:val="16"/>
+            </w:rPr>
+          </w:pPr>
+          <w:r>
+            <w:rPr>
+              <w:sz w:val="16"/>
+              <w:szCs w:val="16"/>
+            </w:rPr>
+            <w:t>16.03.2026</w:t>
+          </w:r>
+        </w:p>
+      </w:tc>
+      <w:tc>
+        <w:tcPr>
+          <w:tcW w:w="1276" w:type="dxa"/>
+        </w:tcPr>
+        <w:p>
+          <w:pPr>
+            <w:pStyle w:val="Fuzeile"/>
+            <w:rPr>
+              <w:sz w:val="16"/>
+              <w:szCs w:val="16"/>
+            </w:rPr>
+          </w:pPr>
+        </w:p>
+      </w:tc>
+      <w:tc>
+        <w:tcPr>
+          <w:tcW w:w="708" w:type="dxa"/>
+        </w:tcPr>
+        <w:p>
+          <w:pPr>
+            <w:pStyle w:val="Fuzeile"/>
+            <w:pBdr>
+              <w:top w:val="none" w:sz="0" w:space="0" w:color="auto"/>
+            </w:pBdr>
+            <w:rPr>
+              <w:sz w:val="16"/>
+              <w:szCs w:val="16"/>
+            </w:rPr>
+          </w:pPr>
+          <w:r>
+            <w:rPr>
+              <w:sz w:val="16"/>
+              <w:szCs w:val="16"/>
+            </w:rPr>
+            <w:fldChar w:fldCharType="begin"/>
+          </w:r>
+          <w:r>
+            <w:rPr>
+              <w:sz w:val="16"/>
+              <w:szCs w:val="16"/>
+            </w:rPr>
+            <w:instrText xml:space="preserve"> PAGE </w:instrText>
+          </w:r>
+          <w:r>
+            <w:rPr>
+              <w:sz w:val="16"/>
+              <w:szCs w:val="16"/>
+            </w:rPr>
+            <w:fldChar w:fldCharType="separate"/>
+          </w:r>
+          <w:r>
+            <w:rPr>
+              <w:noProof/>
+              <w:sz w:val="16"/>
+              <w:szCs w:val="16"/>
+            </w:rPr>
+            <w:t>9</w:t>
+          </w:r>
+          <w:r>
+            <w:rPr>
+              <w:sz w:val="16"/>
+              <w:szCs w:val="16"/>
+            </w:rPr>
+            <w:fldChar w:fldCharType="end"/>
+          </w:r>
+          <w:r>
+            <w:rPr>
+              <w:sz w:val="16"/>
+              <w:szCs w:val="16"/>
+            </w:rPr>
+            <w:t xml:space="preserve"> / </w:t>
+          </w:r>
+          <w:r>
+            <w:rPr>
+              <w:sz w:val="16"/>
+              <w:szCs w:val="16"/>
+            </w:rPr>
+            <w:fldChar w:fldCharType="begin"/>
+          </w:r>
+          <w:r>
+            <w:rPr>
+              <w:sz w:val="16"/>
+              <w:szCs w:val="16"/>
+            </w:rPr>
+            <w:instrText xml:space="preserve"> NUMPAGES </w:instrText>
+          </w:r>
+          <w:r>
+            <w:rPr>
+              <w:sz w:val="16"/>
+              <w:szCs w:val="16"/>
+            </w:rPr>
+            <w:fldChar w:fldCharType="separate"/>
+          </w:r>
+          <w:r>
+            <w:rPr>
+              <w:noProof/>
+              <w:sz w:val="16"/>
+              <w:szCs w:val="16"/>
+            </w:rPr>
+            <w:t>9</w:t>
+          </w:r>
+          <w:r>
+            <w:rPr>
+              <w:sz w:val="16"/>
+              <w:szCs w:val="16"/>
+            </w:rPr>
+            <w:fldChar w:fldCharType="end"/>
+          </w:r>
+        </w:p>
+      </w:tc>
+    </w:tr>
+  </w:tbl>
+  <w:p>
+    <w:pPr>
+      <w:pStyle w:val="Fuzeile"/>
+      <w:pBdr>
+        <w:top w:val="none" w:sz="0" w:space="0" w:color="auto"/>
+      </w:pBdr>
+      <w:rPr>
+        <w:color w:val="0000FF"/>
+        <w:lang w:val="de-DE"/>
+      </w:rPr>
+    </w:pPr>
+  </w:p>
+</w:ftr>
+</file>
+
+<file path=word/footer5.xml><?xml version="1.0" encoding="utf-8"?>
+<w:ftr xmlns:wpc="http://schemas.microsoft.com/office/word/2010/wordprocessingCanvas" xmlns:cx="http://schemas.microsoft.com/office/drawing/2014/chartex" xmlns:cx1="http://schemas.microsoft.com/office/drawing/2015/9/8/chartex" xmlns:cx2="http://schemas.microsoft.com/office/drawing/2015/10/21/chartex" xmlns:cx3="http://schemas.microsoft.com/office/drawing/2016/5/9/chartex" xmlns:cx4="http://schemas.microsoft.com/office/drawing/2016/5/10/chartex" xmlns:cx5="http://schemas.microsoft.com/office/drawing/2016/5/11/chartex" xmlns:cx6="http://schemas.microsoft.com/office/drawing/2016/5/12/chartex" xmlns:cx7="http://schemas.microsoft.com/office/drawing/2016/5/13/chartex" xmlns:cx8="http://schemas.microsoft.com/office/drawing/2016/5/14/chartex" xmlns:mc="http://schemas.openxmlformats.org/markup-compatibility/2006" xmlns:aink="http://schemas.microsoft.com/office/drawing/2016/ink" xmlns:am3d="http://schemas.microsoft.com/office/drawing/2017/model3d" xmlns:o="urn:schemas-microsoft-com:office:office" xmlns:oel="http://schemas.microsoft.com/office/2019/extlst" xmlns:r="http://schemas.openxmlformats.org/officeDocument/2006/relationships" xmlns:m="http://schemas.openxmlformats.org/officeDocument/2006/math" xmlns:v="urn:schemas-microsoft-com:vml" xmlns:wp14="http://schemas.microsoft.com/office/word/2010/wordprocessingDrawing" xmlns:wp="http://schemas.openxmlformats.org/drawingml/2006/wordprocessingDrawing" xmlns:w10="urn:schemas-microsoft-com:office:word" xmlns:w="http://schemas.openxmlformats.org/wordprocessingml/2006/main" xmlns:w14="http://schemas.microsoft.com/office/word/2010/wordml" xmlns:w15="http://schemas.microsoft.com/office/word/2012/wordml" xmlns:w16cex="http://schemas.microsoft.com/office/word/2018/wordml/cex" xmlns:w16cid="http://schemas.microsoft.com/office/word/2016/wordml/cid" xmlns:w16="http://schemas.microsoft.com/office/word/2018/wordml" xmlns:w16du="http://schemas.microsoft.com/office/word/2023/wordml/word16du" xmlns:w16sdtdh="http://schemas.microsoft.com/office/word/2020/wordml/sdtdatahash" xmlns:w16sdtfl="http://schemas.microsoft.com/office/word/2024/wordml/sdtformatlock" xmlns:w16se="http://schemas.microsoft.com/office/word/2015/wordml/symex" xmlns:wpg="http://schemas.microsoft.com/office/word/2010/wordprocessingGroup" xmlns:wpi="http://schemas.microsoft.com/office/word/2010/wordprocessingInk" xmlns:wne="http://schemas.microsoft.com/office/word/2006/wordml" xmlns:wps="http://schemas.microsoft.com/office/word/2010/wordprocessingShape" mc:Ignorable="w14 w15 w16se w16cid w16 w16cex w16sdtdh w16sdtfl w16du wp14">
+  <w:p>
+    <w:pPr>
+      <w:pStyle w:val="Fuzeile"/>
+      <w:rPr>
+        <w:color w:val="0000FF"/>
+        <w:lang w:val="de-DE"/>
+      </w:rPr>
+    </w:pPr>
+  </w:p>
+  <w:tbl>
+    <w:tblPr>
+      <w:tblW w:w="8930" w:type="dxa"/>
+      <w:jc w:val="center"/>
+      <w:tblBorders>
+        <w:top w:val="single" w:sz="4" w:space="0" w:color="auto"/>
+        <w:left w:val="single" w:sz="4" w:space="0" w:color="auto"/>
+        <w:bottom w:val="single" w:sz="4" w:space="0" w:color="auto"/>
+        <w:right w:val="single" w:sz="4" w:space="0" w:color="auto"/>
+        <w:insideH w:val="single" w:sz="4" w:space="0" w:color="auto"/>
+        <w:insideV w:val="single" w:sz="4" w:space="0" w:color="auto"/>
+      </w:tblBorders>
+      <w:tblLayout w:type="fixed"/>
+      <w:tblLook w:val="0000" w:firstRow="0" w:lastRow="0" w:firstColumn="0" w:lastColumn="0" w:noHBand="0" w:noVBand="0"/>
+    </w:tblPr>
+    <w:tblGrid>
+      <w:gridCol w:w="864"/>
+      <w:gridCol w:w="1688"/>
+      <w:gridCol w:w="2835"/>
+      <w:gridCol w:w="1559"/>
+      <w:gridCol w:w="1276"/>
+      <w:gridCol w:w="708"/>
+    </w:tblGrid>
+    <w:tr>
+      <w:trPr>
+        <w:jc w:val="center"/>
+      </w:trPr>
+      <w:tc>
+        <w:tcPr>
+          <w:tcW w:w="864" w:type="dxa"/>
+        </w:tcPr>
+        <w:p>
+          <w:pPr>
+            <w:pStyle w:val="Fuzeile"/>
+            <w:rPr>
+              <w:sz w:val="16"/>
+              <w:szCs w:val="16"/>
+            </w:rPr>
+          </w:pPr>
+          <w:r>
+            <w:rPr>
+              <w:sz w:val="16"/>
+              <w:szCs w:val="16"/>
+            </w:rPr>
+            <w:t>Version</w:t>
+          </w:r>
+        </w:p>
+      </w:tc>
+      <w:tc>
+        <w:tcPr>
+          <w:tcW w:w="1688" w:type="dxa"/>
+        </w:tcPr>
+        <w:p>
+          <w:pPr>
+            <w:pStyle w:val="Fuzeile"/>
+            <w:rPr>
+              <w:sz w:val="16"/>
+              <w:szCs w:val="16"/>
+            </w:rPr>
+          </w:pPr>
+          <w:r>
+            <w:rPr>
+              <w:sz w:val="16"/>
+              <w:szCs w:val="16"/>
+            </w:rPr>
+            <w:t>Aut</w:t>
+          </w:r>
+          <w:r>
+            <w:rPr>
+              <w:sz w:val="16"/>
+              <w:szCs w:val="16"/>
+            </w:rPr>
+            <w:t>h</w:t>
+          </w:r>
+          <w:r>
+            <w:rPr>
+              <w:sz w:val="16"/>
+              <w:szCs w:val="16"/>
+            </w:rPr>
+            <w:t>or</w:t>
+          </w:r>
+        </w:p>
+      </w:tc>
+      <w:tc>
+        <w:tcPr>
+          <w:tcW w:w="2835" w:type="dxa"/>
+        </w:tcPr>
+        <w:p>
+          <w:pPr>
+            <w:pStyle w:val="Fuzeile"/>
+            <w:rPr>
+              <w:sz w:val="16"/>
+              <w:szCs w:val="16"/>
+            </w:rPr>
+          </w:pPr>
+          <w:r>
+            <w:rPr>
+              <w:sz w:val="16"/>
+              <w:szCs w:val="16"/>
+            </w:rPr>
+            <w:t>Filename</w:t>
+          </w:r>
+        </w:p>
+      </w:tc>
+      <w:tc>
+        <w:tcPr>
+          <w:tcW w:w="1559" w:type="dxa"/>
+          <w:tcMar>
+            <w:left w:w="57" w:type="dxa"/>
+            <w:right w:w="57" w:type="dxa"/>
+          </w:tcMar>
+        </w:tcPr>
+        <w:p>
+          <w:pPr>
+            <w:pStyle w:val="Fuzeile"/>
+            <w:ind w:left="44"/>
+            <w:rPr>
+              <w:sz w:val="16"/>
+              <w:szCs w:val="16"/>
+            </w:rPr>
+          </w:pPr>
+          <w:r>
+            <w:rPr>
+              <w:sz w:val="16"/>
+              <w:szCs w:val="16"/>
+            </w:rPr>
+            <w:t>Last Change</w:t>
+          </w:r>
+        </w:p>
+      </w:tc>
+      <w:tc>
+        <w:tcPr>
+          <w:tcW w:w="1276" w:type="dxa"/>
+        </w:tcPr>
+        <w:p>
+          <w:pPr>
+            <w:pStyle w:val="Fuzeile"/>
+            <w:rPr>
+              <w:sz w:val="16"/>
+              <w:szCs w:val="16"/>
+            </w:rPr>
+          </w:pPr>
+          <w:r>
+            <w:rPr>
+              <w:sz w:val="16"/>
+              <w:szCs w:val="16"/>
+            </w:rPr>
+            <w:t>Print date</w:t>
+          </w:r>
+          <w:r>
+            <w:rPr>
+              <w:sz w:val="16"/>
+              <w:szCs w:val="16"/>
+            </w:rPr>
+            <w:tab/>
+          </w:r>
+        </w:p>
+      </w:tc>
+      <w:tc>
+        <w:tcPr>
+          <w:tcW w:w="708" w:type="dxa"/>
+        </w:tcPr>
+        <w:p>
+          <w:pPr>
+            <w:pStyle w:val="Fuzeile"/>
+            <w:rPr>
+              <w:sz w:val="16"/>
+              <w:szCs w:val="16"/>
+            </w:rPr>
+          </w:pPr>
+          <w:r>
+            <w:rPr>
+              <w:sz w:val="16"/>
+              <w:szCs w:val="16"/>
+            </w:rPr>
+            <w:t>page</w:t>
+          </w:r>
+        </w:p>
+      </w:tc>
+    </w:tr>
+    <w:tr>
+      <w:trPr>
+        <w:trHeight w:val="188"/>
+        <w:jc w:val="center"/>
+      </w:trPr>
+      <w:tc>
+        <w:tcPr>
+          <w:tcW w:w="864" w:type="dxa"/>
+        </w:tcPr>
+        <w:p>
+          <w:pPr>
+            <w:pStyle w:val="Fuzeile"/>
+            <w:rPr>
+              <w:sz w:val="16"/>
+              <w:szCs w:val="16"/>
+            </w:rPr>
+          </w:pPr>
+          <w:r>
+            <w:rPr>
+              <w:sz w:val="16"/>
+              <w:szCs w:val="16"/>
+            </w:rPr>
+            <w:t>0.4</w:t>
+          </w:r>
+        </w:p>
+      </w:tc>
+      <w:tc>
+        <w:tcPr>
+          <w:tcW w:w="1688" w:type="dxa"/>
+        </w:tcPr>
+        <w:p>
+          <w:pPr>
+            <w:pStyle w:val="Fuzeile"/>
+            <w:rPr>
+              <w:sz w:val="16"/>
+              <w:szCs w:val="16"/>
+            </w:rPr>
+          </w:pPr>
+          <w:proofErr w:type="spellStart"/>
+          <w:r>
+            <w:rPr>
+              <w:sz w:val="16"/>
+              <w:szCs w:val="16"/>
+            </w:rPr>
+            <w:t>CD_citibike</w:t>
+          </w:r>
+          <w:proofErr w:type="spellEnd"/>
+        </w:p>
+      </w:tc>
+      <w:tc>
+        <w:tcPr>
+          <w:tcW w:w="2835" w:type="dxa"/>
+        </w:tcPr>
+        <w:p>
+          <w:pPr>
+            <w:pStyle w:val="Fuzeile"/>
+            <w:rPr>
+              <w:sz w:val="16"/>
+              <w:szCs w:val="16"/>
+            </w:rPr>
+          </w:pPr>
+          <w:r>
+            <w:rPr>
+              <w:sz w:val="16"/>
+              <w:szCs w:val="16"/>
+            </w:rPr>
+            <w:t>Citibike.docx</w:t>
+          </w:r>
+        </w:p>
+      </w:tc>
+      <w:tc>
+        <w:tcPr>
+          <w:tcW w:w="1559" w:type="dxa"/>
+        </w:tcPr>
+        <w:p>
+          <w:pPr>
+            <w:pStyle w:val="Fuzeile"/>
+            <w:rPr>
+              <w:sz w:val="16"/>
+              <w:szCs w:val="16"/>
+            </w:rPr>
+          </w:pPr>
+          <w:r>
+            <w:rPr>
+              <w:sz w:val="16"/>
+              <w:szCs w:val="16"/>
+            </w:rPr>
+            <w:t>16.03.2026</w:t>
+          </w:r>
+        </w:p>
+      </w:tc>
+      <w:tc>
+        <w:tcPr>
+          <w:tcW w:w="1276" w:type="dxa"/>
+        </w:tcPr>
+        <w:p>
+          <w:pPr>
+            <w:pStyle w:val="Fuzeile"/>
+            <w:rPr>
+              <w:sz w:val="16"/>
+              <w:szCs w:val="16"/>
+            </w:rPr>
+          </w:pPr>
+        </w:p>
+      </w:tc>
+      <w:tc>
+        <w:tcPr>
+          <w:tcW w:w="708" w:type="dxa"/>
+        </w:tcPr>
+        <w:p>
+          <w:pPr>
+            <w:pStyle w:val="Fuzeile"/>
+            <w:pBdr>
+              <w:top w:val="none" w:sz="0" w:space="0" w:color="auto"/>
+            </w:pBdr>
+            <w:rPr>
+              <w:sz w:val="16"/>
+              <w:szCs w:val="16"/>
+            </w:rPr>
+          </w:pPr>
+          <w:r>
+            <w:rPr>
+              <w:sz w:val="16"/>
+              <w:szCs w:val="16"/>
+            </w:rPr>
+            <w:fldChar w:fldCharType="begin"/>
+          </w:r>
+          <w:r>
+            <w:rPr>
+              <w:sz w:val="16"/>
+              <w:szCs w:val="16"/>
+            </w:rPr>
+            <w:instrText xml:space="preserve"> PAGE </w:instrText>
+          </w:r>
+          <w:r>
+            <w:rPr>
+              <w:sz w:val="16"/>
+              <w:szCs w:val="16"/>
+            </w:rPr>
+            <w:fldChar w:fldCharType="separate"/>
+          </w:r>
+          <w:r>
+            <w:rPr>
+              <w:noProof/>
+              <w:sz w:val="16"/>
+              <w:szCs w:val="16"/>
+            </w:rPr>
+            <w:t>9</w:t>
+          </w:r>
+          <w:r>
+            <w:rPr>
+              <w:sz w:val="16"/>
+              <w:szCs w:val="16"/>
+            </w:rPr>
+            <w:fldChar w:fldCharType="end"/>
+          </w:r>
+          <w:r>
+            <w:rPr>
+              <w:sz w:val="16"/>
+              <w:szCs w:val="16"/>
+            </w:rPr>
+            <w:t xml:space="preserve"> / </w:t>
+          </w:r>
+          <w:r>
+            <w:rPr>
+              <w:sz w:val="16"/>
+              <w:szCs w:val="16"/>
+            </w:rPr>
+            <w:fldChar w:fldCharType="begin"/>
+          </w:r>
+          <w:r>
+            <w:rPr>
+              <w:sz w:val="16"/>
+              <w:szCs w:val="16"/>
+            </w:rPr>
+            <w:instrText xml:space="preserve"> NUMPAGES </w:instrText>
+          </w:r>
+          <w:r>
+            <w:rPr>
+              <w:sz w:val="16"/>
+              <w:szCs w:val="16"/>
+            </w:rPr>
+            <w:fldChar w:fldCharType="separate"/>
+          </w:r>
+          <w:r>
+            <w:rPr>
+              <w:noProof/>
+              <w:sz w:val="16"/>
+              <w:szCs w:val="16"/>
+            </w:rPr>
+            <w:t>9</w:t>
+          </w:r>
+          <w:r>
+            <w:rPr>
+              <w:sz w:val="16"/>
+              <w:szCs w:val="16"/>
+            </w:rPr>
+            <w:fldChar w:fldCharType="end"/>
+          </w:r>
+        </w:p>
+      </w:tc>
+    </w:tr>
+  </w:tbl>
+  <w:p>
+    <w:pPr>
+      <w:pStyle w:val="Fuzeile"/>
+      <w:pBdr>
+        <w:top w:val="none" w:sz="0" w:space="0" w:color="auto"/>
+      </w:pBdr>
+      <w:rPr>
+        <w:color w:val="0000FF"/>
+        <w:lang w:val="de-DE"/>
+      </w:rPr>
+    </w:pPr>
+  </w:p>
+</w:ftr>
+</file>
+
 <file path=word/footnotes.xml><?xml version="1.0" encoding="utf-8"?>
 <w:footnotes xmlns:wpc="http://schemas.microsoft.com/office/word/2010/wordprocessingCanvas" xmlns:cx="http://schemas.microsoft.com/office/drawing/2014/chartex" xmlns:cx1="http://schemas.microsoft.com/office/drawing/2015/9/8/chartex" xmlns:cx2="http://schemas.microsoft.com/office/drawing/2015/10/21/chartex" xmlns:cx3="http://schemas.microsoft.com/office/drawing/2016/5/9/chartex" xmlns:cx4="http://schemas.microsoft.com/office/drawing/2016/5/10/chartex" xmlns:cx5="http://schemas.microsoft.com/office/drawing/2016/5/11/chartex" xmlns:cx6="http://schemas.microsoft.com/office/drawing/2016/5/12/chartex" xmlns:cx7="http://schemas.microsoft.com/office/drawing/2016/5/13/chartex" xmlns:cx8="http://schemas.microsoft.com/office/drawing/2016/5/14/chartex" xmlns:mc="http://schemas.openxmlformats.org/markup-compatibility/2006" xmlns:aink="http://schemas.microsoft.com/office/drawing/2016/ink" xmlns:am3d="http://schemas.microsoft.com/office/drawing/2017/model3d" xmlns:o="urn:schemas-microsoft-com:office:office" xmlns:oel="http://schemas.microsoft.com/office/2019/extlst" xmlns:r="http://schemas.openxmlformats.org/officeDocument/2006/relationships" xmlns:m="http://schemas.openxmlformats.org/officeDocument/2006/math" xmlns:v="urn:schemas-microsoft-com:vml" xmlns:wp14="http://schemas.microsoft.com/office/word/2010/wordprocessingDrawing" xmlns:wp="http://schemas.openxmlformats.org/drawingml/2006/wordprocessingDrawing" xmlns:w10="urn:schemas-microsoft-com:office:word" xmlns:w="http://schemas.openxmlformats.org/wordprocessingml/2006/main" xmlns:w14="http://schemas.microsoft.com/office/word/2010/wordml" xmlns:w15="http://schemas.microsoft.com/office/word/2012/wordml" xmlns:w16cex="http://schemas.microsoft.com/office/word/2018/wordml/cex" xmlns:w16cid="http://schemas.microsoft.com/office/word/2016/wordml/cid" xmlns:w16="http://schemas.microsoft.com/office/word/2018/wordml" xmlns:w16du="http://schemas.microsoft.com/office/word/2023/wordml/word16du" xmlns:w16sdtdh="http://schemas.microsoft.com/office/word/2020/wordml/sdtdatahash" xmlns:w16sdtfl="http://schemas.microsoft.com/office/word/2024/wordml/sdtformatlock" xmlns:w16se="http://schemas.microsoft.com/office/word/2015/wordml/symex" xmlns:wpg="http://schemas.microsoft.com/office/word/2010/wordprocessingGroup" xmlns:wpi="http://schemas.microsoft.com/office/word/2010/wordprocessingInk" xmlns:wne="http://schemas.microsoft.com/office/word/2006/wordml" xmlns:wps="http://schemas.microsoft.com/office/word/2010/wordprocessingShape" mc:Ignorable="w14 w15 w16se w16cid w16 w16cex w16sdtdh w16sdtfl w16du wp14">
   <w:footnote w:type="separator" w:id="-1">
@@ -14063,6 +16286,119 @@
     </w:lvl>
   </w:abstractNum>
   <w:abstractNum w:abstractNumId="27" w15:restartNumberingAfterBreak="0">
+    <w:nsid w:val="4DA16CA8"/>
+    <w:multiLevelType w:val="hybridMultilevel"/>
+    <w:tmpl w:val="4EEC232C"/>
+    <w:lvl w:ilvl="0" w:tplc="0C070001">
+      <w:start w:val="1"/>
+      <w:numFmt w:val="bullet"/>
+      <w:lvlText w:val=""/>
+      <w:lvlJc w:val="left"/>
+      <w:pPr>
+        <w:ind w:left="720" w:hanging="360"/>
+      </w:pPr>
+      <w:rPr>
+        <w:rFonts w:ascii="Symbol" w:hAnsi="Symbol" w:hint="default"/>
+      </w:rPr>
+    </w:lvl>
+    <w:lvl w:ilvl="1" w:tplc="0C070003" w:tentative="1">
+      <w:start w:val="1"/>
+      <w:numFmt w:val="bullet"/>
+      <w:lvlText w:val="o"/>
+      <w:lvlJc w:val="left"/>
+      <w:pPr>
+        <w:ind w:left="1440" w:hanging="360"/>
+      </w:pPr>
+      <w:rPr>
+        <w:rFonts w:ascii="Courier New" w:hAnsi="Courier New" w:cs="Courier New" w:hint="default"/>
+      </w:rPr>
+    </w:lvl>
+    <w:lvl w:ilvl="2" w:tplc="0C070005" w:tentative="1">
+      <w:start w:val="1"/>
+      <w:numFmt w:val="bullet"/>
+      <w:lvlText w:val=""/>
+      <w:lvlJc w:val="left"/>
+      <w:pPr>
+        <w:ind w:left="2160" w:hanging="360"/>
+      </w:pPr>
+      <w:rPr>
+        <w:rFonts w:ascii="Wingdings" w:hAnsi="Wingdings" w:hint="default"/>
+      </w:rPr>
+    </w:lvl>
+    <w:lvl w:ilvl="3" w:tplc="0C070001" w:tentative="1">
+      <w:start w:val="1"/>
+      <w:numFmt w:val="bullet"/>
+      <w:lvlText w:val=""/>
+      <w:lvlJc w:val="left"/>
+      <w:pPr>
+        <w:ind w:left="2880" w:hanging="360"/>
+      </w:pPr>
+      <w:rPr>
+        <w:rFonts w:ascii="Symbol" w:hAnsi="Symbol" w:hint="default"/>
+      </w:rPr>
+    </w:lvl>
+    <w:lvl w:ilvl="4" w:tplc="0C070003" w:tentative="1">
+      <w:start w:val="1"/>
+      <w:numFmt w:val="bullet"/>
+      <w:lvlText w:val="o"/>
+      <w:lvlJc w:val="left"/>
+      <w:pPr>
+        <w:ind w:left="3600" w:hanging="360"/>
+      </w:pPr>
+      <w:rPr>
+        <w:rFonts w:ascii="Courier New" w:hAnsi="Courier New" w:cs="Courier New" w:hint="default"/>
+      </w:rPr>
+    </w:lvl>
+    <w:lvl w:ilvl="5" w:tplc="0C070005" w:tentative="1">
+      <w:start w:val="1"/>
+      <w:numFmt w:val="bullet"/>
+      <w:lvlText w:val=""/>
+      <w:lvlJc w:val="left"/>
+      <w:pPr>
+        <w:ind w:left="4320" w:hanging="360"/>
+      </w:pPr>
+      <w:rPr>
+        <w:rFonts w:ascii="Wingdings" w:hAnsi="Wingdings" w:hint="default"/>
+      </w:rPr>
+    </w:lvl>
+    <w:lvl w:ilvl="6" w:tplc="0C070001" w:tentative="1">
+      <w:start w:val="1"/>
+      <w:numFmt w:val="bullet"/>
+      <w:lvlText w:val=""/>
+      <w:lvlJc w:val="left"/>
+      <w:pPr>
+        <w:ind w:left="5040" w:hanging="360"/>
+      </w:pPr>
+      <w:rPr>
+        <w:rFonts w:ascii="Symbol" w:hAnsi="Symbol" w:hint="default"/>
+      </w:rPr>
+    </w:lvl>
+    <w:lvl w:ilvl="7" w:tplc="0C070003" w:tentative="1">
+      <w:start w:val="1"/>
+      <w:numFmt w:val="bullet"/>
+      <w:lvlText w:val="o"/>
+      <w:lvlJc w:val="left"/>
+      <w:pPr>
+        <w:ind w:left="5760" w:hanging="360"/>
+      </w:pPr>
+      <w:rPr>
+        <w:rFonts w:ascii="Courier New" w:hAnsi="Courier New" w:cs="Courier New" w:hint="default"/>
+      </w:rPr>
+    </w:lvl>
+    <w:lvl w:ilvl="8" w:tplc="0C070005" w:tentative="1">
+      <w:start w:val="1"/>
+      <w:numFmt w:val="bullet"/>
+      <w:lvlText w:val=""/>
+      <w:lvlJc w:val="left"/>
+      <w:pPr>
+        <w:ind w:left="6480" w:hanging="360"/>
+      </w:pPr>
+      <w:rPr>
+        <w:rFonts w:ascii="Wingdings" w:hAnsi="Wingdings" w:hint="default"/>
+      </w:rPr>
+    </w:lvl>
+  </w:abstractNum>
+  <w:abstractNum w:abstractNumId="28" w15:restartNumberingAfterBreak="0">
     <w:nsid w:val="50A9383F"/>
     <w:multiLevelType w:val="multilevel"/>
     <w:tmpl w:val="34E80CFC"/>
@@ -14211,7 +16547,7 @@
       </w:rPr>
     </w:lvl>
   </w:abstractNum>
-  <w:abstractNum w:abstractNumId="28" w15:restartNumberingAfterBreak="0">
+  <w:abstractNum w:abstractNumId="29" w15:restartNumberingAfterBreak="0">
     <w:nsid w:val="5438219B"/>
     <w:multiLevelType w:val="hybridMultilevel"/>
     <w:tmpl w:val="5C8E198C"/>
@@ -14325,7 +16661,7 @@
       </w:rPr>
     </w:lvl>
   </w:abstractNum>
-  <w:abstractNum w:abstractNumId="29" w15:restartNumberingAfterBreak="0">
+  <w:abstractNum w:abstractNumId="30" w15:restartNumberingAfterBreak="0">
     <w:nsid w:val="5CCB0E9F"/>
     <w:multiLevelType w:val="multilevel"/>
     <w:tmpl w:val="D196FE48"/>
@@ -14465,7 +16801,7 @@
       </w:rPr>
     </w:lvl>
   </w:abstractNum>
-  <w:abstractNum w:abstractNumId="30" w15:restartNumberingAfterBreak="0">
+  <w:abstractNum w:abstractNumId="31" w15:restartNumberingAfterBreak="0">
     <w:nsid w:val="5E187B2D"/>
     <w:multiLevelType w:val="hybridMultilevel"/>
     <w:tmpl w:val="9F66B0DA"/>
@@ -14578,7 +16914,120 @@
       </w:rPr>
     </w:lvl>
   </w:abstractNum>
-  <w:abstractNum w:abstractNumId="31" w15:restartNumberingAfterBreak="0">
+  <w:abstractNum w:abstractNumId="32" w15:restartNumberingAfterBreak="0">
+    <w:nsid w:val="627453DC"/>
+    <w:multiLevelType w:val="hybridMultilevel"/>
+    <w:tmpl w:val="D7FA0F36"/>
+    <w:lvl w:ilvl="0" w:tplc="0C070001">
+      <w:start w:val="1"/>
+      <w:numFmt w:val="bullet"/>
+      <w:lvlText w:val=""/>
+      <w:lvlJc w:val="left"/>
+      <w:pPr>
+        <w:ind w:left="720" w:hanging="360"/>
+      </w:pPr>
+      <w:rPr>
+        <w:rFonts w:ascii="Symbol" w:hAnsi="Symbol" w:hint="default"/>
+      </w:rPr>
+    </w:lvl>
+    <w:lvl w:ilvl="1" w:tplc="0C070003" w:tentative="1">
+      <w:start w:val="1"/>
+      <w:numFmt w:val="bullet"/>
+      <w:lvlText w:val="o"/>
+      <w:lvlJc w:val="left"/>
+      <w:pPr>
+        <w:ind w:left="1440" w:hanging="360"/>
+      </w:pPr>
+      <w:rPr>
+        <w:rFonts w:ascii="Courier New" w:hAnsi="Courier New" w:cs="Courier New" w:hint="default"/>
+      </w:rPr>
+    </w:lvl>
+    <w:lvl w:ilvl="2" w:tplc="0C070005" w:tentative="1">
+      <w:start w:val="1"/>
+      <w:numFmt w:val="bullet"/>
+      <w:lvlText w:val=""/>
+      <w:lvlJc w:val="left"/>
+      <w:pPr>
+        <w:ind w:left="2160" w:hanging="360"/>
+      </w:pPr>
+      <w:rPr>
+        <w:rFonts w:ascii="Wingdings" w:hAnsi="Wingdings" w:hint="default"/>
+      </w:rPr>
+    </w:lvl>
+    <w:lvl w:ilvl="3" w:tplc="0C070001" w:tentative="1">
+      <w:start w:val="1"/>
+      <w:numFmt w:val="bullet"/>
+      <w:lvlText w:val=""/>
+      <w:lvlJc w:val="left"/>
+      <w:pPr>
+        <w:ind w:left="2880" w:hanging="360"/>
+      </w:pPr>
+      <w:rPr>
+        <w:rFonts w:ascii="Symbol" w:hAnsi="Symbol" w:hint="default"/>
+      </w:rPr>
+    </w:lvl>
+    <w:lvl w:ilvl="4" w:tplc="0C070003" w:tentative="1">
+      <w:start w:val="1"/>
+      <w:numFmt w:val="bullet"/>
+      <w:lvlText w:val="o"/>
+      <w:lvlJc w:val="left"/>
+      <w:pPr>
+        <w:ind w:left="3600" w:hanging="360"/>
+      </w:pPr>
+      <w:rPr>
+        <w:rFonts w:ascii="Courier New" w:hAnsi="Courier New" w:cs="Courier New" w:hint="default"/>
+      </w:rPr>
+    </w:lvl>
+    <w:lvl w:ilvl="5" w:tplc="0C070005" w:tentative="1">
+      <w:start w:val="1"/>
+      <w:numFmt w:val="bullet"/>
+      <w:lvlText w:val=""/>
+      <w:lvlJc w:val="left"/>
+      <w:pPr>
+        <w:ind w:left="4320" w:hanging="360"/>
+      </w:pPr>
+      <w:rPr>
+        <w:rFonts w:ascii="Wingdings" w:hAnsi="Wingdings" w:hint="default"/>
+      </w:rPr>
+    </w:lvl>
+    <w:lvl w:ilvl="6" w:tplc="0C070001" w:tentative="1">
+      <w:start w:val="1"/>
+      <w:numFmt w:val="bullet"/>
+      <w:lvlText w:val=""/>
+      <w:lvlJc w:val="left"/>
+      <w:pPr>
+        <w:ind w:left="5040" w:hanging="360"/>
+      </w:pPr>
+      <w:rPr>
+        <w:rFonts w:ascii="Symbol" w:hAnsi="Symbol" w:hint="default"/>
+      </w:rPr>
+    </w:lvl>
+    <w:lvl w:ilvl="7" w:tplc="0C070003" w:tentative="1">
+      <w:start w:val="1"/>
+      <w:numFmt w:val="bullet"/>
+      <w:lvlText w:val="o"/>
+      <w:lvlJc w:val="left"/>
+      <w:pPr>
+        <w:ind w:left="5760" w:hanging="360"/>
+      </w:pPr>
+      <w:rPr>
+        <w:rFonts w:ascii="Courier New" w:hAnsi="Courier New" w:cs="Courier New" w:hint="default"/>
+      </w:rPr>
+    </w:lvl>
+    <w:lvl w:ilvl="8" w:tplc="0C070005" w:tentative="1">
+      <w:start w:val="1"/>
+      <w:numFmt w:val="bullet"/>
+      <w:lvlText w:val=""/>
+      <w:lvlJc w:val="left"/>
+      <w:pPr>
+        <w:ind w:left="6480" w:hanging="360"/>
+      </w:pPr>
+      <w:rPr>
+        <w:rFonts w:ascii="Wingdings" w:hAnsi="Wingdings" w:hint="default"/>
+      </w:rPr>
+    </w:lvl>
+  </w:abstractNum>
+  <w:abstractNum w:abstractNumId="33" w15:restartNumberingAfterBreak="0">
     <w:nsid w:val="670B61F4"/>
     <w:multiLevelType w:val="hybridMultilevel"/>
     <w:tmpl w:val="4404CA6A"/>
@@ -14691,7 +17140,7 @@
       </w:rPr>
     </w:lvl>
   </w:abstractNum>
-  <w:abstractNum w:abstractNumId="32" w15:restartNumberingAfterBreak="0">
+  <w:abstractNum w:abstractNumId="34" w15:restartNumberingAfterBreak="0">
     <w:nsid w:val="67EA4A3B"/>
     <w:multiLevelType w:val="hybridMultilevel"/>
     <w:tmpl w:val="ED686DCA"/>
@@ -14777,7 +17226,120 @@
       </w:pPr>
     </w:lvl>
   </w:abstractNum>
-  <w:abstractNum w:abstractNumId="33" w15:restartNumberingAfterBreak="0">
+  <w:abstractNum w:abstractNumId="35" w15:restartNumberingAfterBreak="0">
+    <w:nsid w:val="6EF87454"/>
+    <w:multiLevelType w:val="hybridMultilevel"/>
+    <w:tmpl w:val="014C3FF2"/>
+    <w:lvl w:ilvl="0" w:tplc="0C070001">
+      <w:start w:val="1"/>
+      <w:numFmt w:val="bullet"/>
+      <w:lvlText w:val=""/>
+      <w:lvlJc w:val="left"/>
+      <w:pPr>
+        <w:ind w:left="720" w:hanging="360"/>
+      </w:pPr>
+      <w:rPr>
+        <w:rFonts w:ascii="Symbol" w:hAnsi="Symbol" w:hint="default"/>
+      </w:rPr>
+    </w:lvl>
+    <w:lvl w:ilvl="1" w:tplc="0C070003" w:tentative="1">
+      <w:start w:val="1"/>
+      <w:numFmt w:val="bullet"/>
+      <w:lvlText w:val="o"/>
+      <w:lvlJc w:val="left"/>
+      <w:pPr>
+        <w:ind w:left="1440" w:hanging="360"/>
+      </w:pPr>
+      <w:rPr>
+        <w:rFonts w:ascii="Courier New" w:hAnsi="Courier New" w:cs="Courier New" w:hint="default"/>
+      </w:rPr>
+    </w:lvl>
+    <w:lvl w:ilvl="2" w:tplc="0C070005" w:tentative="1">
+      <w:start w:val="1"/>
+      <w:numFmt w:val="bullet"/>
+      <w:lvlText w:val=""/>
+      <w:lvlJc w:val="left"/>
+      <w:pPr>
+        <w:ind w:left="2160" w:hanging="360"/>
+      </w:pPr>
+      <w:rPr>
+        <w:rFonts w:ascii="Wingdings" w:hAnsi="Wingdings" w:hint="default"/>
+      </w:rPr>
+    </w:lvl>
+    <w:lvl w:ilvl="3" w:tplc="0C070001" w:tentative="1">
+      <w:start w:val="1"/>
+      <w:numFmt w:val="bullet"/>
+      <w:lvlText w:val=""/>
+      <w:lvlJc w:val="left"/>
+      <w:pPr>
+        <w:ind w:left="2880" w:hanging="360"/>
+      </w:pPr>
+      <w:rPr>
+        <w:rFonts w:ascii="Symbol" w:hAnsi="Symbol" w:hint="default"/>
+      </w:rPr>
+    </w:lvl>
+    <w:lvl w:ilvl="4" w:tplc="0C070003" w:tentative="1">
+      <w:start w:val="1"/>
+      <w:numFmt w:val="bullet"/>
+      <w:lvlText w:val="o"/>
+      <w:lvlJc w:val="left"/>
+      <w:pPr>
+        <w:ind w:left="3600" w:hanging="360"/>
+      </w:pPr>
+      <w:rPr>
+        <w:rFonts w:ascii="Courier New" w:hAnsi="Courier New" w:cs="Courier New" w:hint="default"/>
+      </w:rPr>
+    </w:lvl>
+    <w:lvl w:ilvl="5" w:tplc="0C070005" w:tentative="1">
+      <w:start w:val="1"/>
+      <w:numFmt w:val="bullet"/>
+      <w:lvlText w:val=""/>
+      <w:lvlJc w:val="left"/>
+      <w:pPr>
+        <w:ind w:left="4320" w:hanging="360"/>
+      </w:pPr>
+      <w:rPr>
+        <w:rFonts w:ascii="Wingdings" w:hAnsi="Wingdings" w:hint="default"/>
+      </w:rPr>
+    </w:lvl>
+    <w:lvl w:ilvl="6" w:tplc="0C070001" w:tentative="1">
+      <w:start w:val="1"/>
+      <w:numFmt w:val="bullet"/>
+      <w:lvlText w:val=""/>
+      <w:lvlJc w:val="left"/>
+      <w:pPr>
+        <w:ind w:left="5040" w:hanging="360"/>
+      </w:pPr>
+      <w:rPr>
+        <w:rFonts w:ascii="Symbol" w:hAnsi="Symbol" w:hint="default"/>
+      </w:rPr>
+    </w:lvl>
+    <w:lvl w:ilvl="7" w:tplc="0C070003" w:tentative="1">
+      <w:start w:val="1"/>
+      <w:numFmt w:val="bullet"/>
+      <w:lvlText w:val="o"/>
+      <w:lvlJc w:val="left"/>
+      <w:pPr>
+        <w:ind w:left="5760" w:hanging="360"/>
+      </w:pPr>
+      <w:rPr>
+        <w:rFonts w:ascii="Courier New" w:hAnsi="Courier New" w:cs="Courier New" w:hint="default"/>
+      </w:rPr>
+    </w:lvl>
+    <w:lvl w:ilvl="8" w:tplc="0C070005" w:tentative="1">
+      <w:start w:val="1"/>
+      <w:numFmt w:val="bullet"/>
+      <w:lvlText w:val=""/>
+      <w:lvlJc w:val="left"/>
+      <w:pPr>
+        <w:ind w:left="6480" w:hanging="360"/>
+      </w:pPr>
+      <w:rPr>
+        <w:rFonts w:ascii="Wingdings" w:hAnsi="Wingdings" w:hint="default"/>
+      </w:rPr>
+    </w:lvl>
+  </w:abstractNum>
+  <w:abstractNum w:abstractNumId="36" w15:restartNumberingAfterBreak="0">
     <w:nsid w:val="70455666"/>
     <w:multiLevelType w:val="hybridMultilevel"/>
     <w:tmpl w:val="BC34A878"/>
@@ -14917,7 +17479,7 @@
       </w:rPr>
     </w:lvl>
   </w:abstractNum>
-  <w:abstractNum w:abstractNumId="34" w15:restartNumberingAfterBreak="0">
+  <w:abstractNum w:abstractNumId="37" w15:restartNumberingAfterBreak="0">
     <w:nsid w:val="72015218"/>
     <w:multiLevelType w:val="singleLevel"/>
     <w:tmpl w:val="383CCA8E"/>
@@ -14932,7 +17494,7 @@
       </w:pPr>
     </w:lvl>
   </w:abstractNum>
-  <w:abstractNum w:abstractNumId="35" w15:restartNumberingAfterBreak="0">
+  <w:abstractNum w:abstractNumId="38" w15:restartNumberingAfterBreak="0">
     <w:nsid w:val="79E929D9"/>
     <w:multiLevelType w:val="hybridMultilevel"/>
     <w:tmpl w:val="38FA3CB6"/>
@@ -15061,7 +17623,7 @@
     <w:abstractNumId w:val="9"/>
   </w:num>
   <w:num w:numId="5" w16cid:durableId="925698747">
-    <w:abstractNumId w:val="34"/>
+    <w:abstractNumId w:val="37"/>
   </w:num>
   <w:num w:numId="6" w16cid:durableId="1948923310">
     <w:abstractNumId w:val="10"/>
@@ -15076,7 +17638,7 @@
     <w:abstractNumId w:val="1"/>
   </w:num>
   <w:num w:numId="10" w16cid:durableId="241257727">
-    <w:abstractNumId w:val="33"/>
+    <w:abstractNumId w:val="36"/>
   </w:num>
   <w:num w:numId="11" w16cid:durableId="1422334676">
     <w:abstractNumId w:val="26"/>
@@ -15097,13 +17659,13 @@
     <w:abstractNumId w:val="1"/>
   </w:num>
   <w:num w:numId="17" w16cid:durableId="284432957">
-    <w:abstractNumId w:val="29"/>
+    <w:abstractNumId w:val="30"/>
   </w:num>
   <w:num w:numId="18" w16cid:durableId="475996212">
     <w:abstractNumId w:val="1"/>
   </w:num>
   <w:num w:numId="19" w16cid:durableId="374281165">
-    <w:abstractNumId w:val="35"/>
+    <w:abstractNumId w:val="38"/>
   </w:num>
   <w:num w:numId="20" w16cid:durableId="1435245974">
     <w:abstractNumId w:val="1"/>
@@ -15121,7 +17683,7 @@
     <w:abstractNumId w:val="3"/>
   </w:num>
   <w:num w:numId="25" w16cid:durableId="1068186474">
-    <w:abstractNumId w:val="28"/>
+    <w:abstractNumId w:val="29"/>
   </w:num>
   <w:num w:numId="26" w16cid:durableId="581334647">
     <w:abstractNumId w:val="20"/>
@@ -15139,7 +17701,7 @@
     <w:abstractNumId w:val="16"/>
   </w:num>
   <w:num w:numId="31" w16cid:durableId="539129105">
-    <w:abstractNumId w:val="32"/>
+    <w:abstractNumId w:val="34"/>
   </w:num>
   <w:num w:numId="32" w16cid:durableId="1012417078">
     <w:abstractNumId w:val="1"/>
@@ -15238,7 +17800,7 @@
     </w:lvlOverride>
   </w:num>
   <w:num w:numId="37" w16cid:durableId="1670668246">
-    <w:abstractNumId w:val="27"/>
+    <w:abstractNumId w:val="28"/>
   </w:num>
   <w:num w:numId="38" w16cid:durableId="169368827">
     <w:abstractNumId w:val="25"/>
@@ -15280,7 +17842,7 @@
     </w:lvlOverride>
   </w:num>
   <w:num w:numId="42" w16cid:durableId="1659843403">
-    <w:abstractNumId w:val="30"/>
+    <w:abstractNumId w:val="31"/>
   </w:num>
   <w:num w:numId="43" w16cid:durableId="223832730">
     <w:abstractNumId w:val="24"/>
@@ -15316,10 +17878,19 @@
     <w:abstractNumId w:val="18"/>
   </w:num>
   <w:num w:numId="45" w16cid:durableId="486559503">
-    <w:abstractNumId w:val="31"/>
+    <w:abstractNumId w:val="33"/>
   </w:num>
   <w:num w:numId="46" w16cid:durableId="260996650">
     <w:abstractNumId w:val="11"/>
+  </w:num>
+  <w:num w:numId="47" w16cid:durableId="2002269950">
+    <w:abstractNumId w:val="35"/>
+  </w:num>
+  <w:num w:numId="48" w16cid:durableId="2142531363">
+    <w:abstractNumId w:val="32"/>
+  </w:num>
+  <w:num w:numId="49" w16cid:durableId="673847662">
+    <w:abstractNumId w:val="27"/>
   </w:num>
 </w:numbering>
 </file>
@@ -15922,6 +18493,7 @@
   <w:style w:type="paragraph" w:styleId="Fuzeile">
     <w:name w:val="footer"/>
     <w:basedOn w:val="Standard"/>
+    <w:link w:val="FuzeileZchn"/>
     <w:rsid w:val="00E3174E"/>
     <w:pPr>
       <w:pBdr>
@@ -16976,6 +19548,17 @@
       <w:shd w:val="clear" w:color="auto" w:fill="E1DFDD"/>
     </w:rPr>
   </w:style>
+  <w:style w:type="character" w:customStyle="1" w:styleId="FuzeileZchn">
+    <w:name w:val="Fußzeile Zchn"/>
+    <w:basedOn w:val="Absatz-Standardschriftart"/>
+    <w:link w:val="Fuzeile"/>
+    <w:rsid w:val="004F6EEC"/>
+    <w:rPr>
+      <w:rFonts w:ascii="Arial" w:hAnsi="Arial" w:cs="Arial"/>
+      <w:sz w:val="18"/>
+      <w:lang w:val="en-GB"/>
+    </w:rPr>
+  </w:style>
 </w:styles>
 </file>
 

</xml_diff>